<commit_message>
docs(formation): check-list, sigle DEI et délais confrontés au manuel des procédures
- check-list : les 22 libellés du manuel remplacent le texte provisoire
- glossaire : DEI = Département d'Enquête et d'Investigation (le tableau des abréviations
  du manuel de l'ASCE-LC est décalé et donne un autre intitulé)
- annexe E : délais conformes au manuel, deux écarts à confirmer (approbation CGEA, complément)

Co-Authored-By: Claude Sonnet 5.5 <noreply@anthropic.com>
</commit_message>
<xml_diff>
--- a/docs/formation/Manuel-de-formation-INTEGRITE-plus.docx
+++ b/docs/formation/Manuel-de-formation-INTEGRITE-plus.docx
@@ -17,7 +17,7 @@
           <w:noProof/>
         </w:rPr>
         <w:drawing>
-          <wp:inline distT="0" distB="0" distL="0" distR="0" wp14:anchorId="04DA7C1D" wp14:editId="4CD80C8C">
+          <wp:inline distT="0" distB="0" distL="0" distR="0" wp14:anchorId="5D4CD703" wp14:editId="67E17F87">
             <wp:extent cx="2476500" cy="1190625"/>
             <wp:effectExtent l="0" t="0" r="0" b="0"/>
             <wp:docPr id="62" name="logo" descr="Logo ASCE-LC" title="Logo ASCE-LC"/>
@@ -190,7 +190,7 @@
     <w:sdt>
       <w:sdtPr>
         <w:alias w:val="Table des matières"/>
-        <w:id w:val="90909186"/>
+        <w:id w:val="-1603107605"/>
       </w:sdtPr>
       <w:sdtEndPr/>
       <w:sdtContent>
@@ -213,7 +213,7 @@
           <w:r>
             <w:fldChar w:fldCharType="separate"/>
           </w:r>
-          <w:hyperlink w:anchor="_Toc242295202" w:history="1">
+          <w:hyperlink w:anchor="_Toc242302430" w:history="1">
             <w:r>
               <w:rPr>
                 <w:rStyle w:val="Lienhypertexte"/>
@@ -237,7 +237,7 @@
               <w:rPr>
                 <w:noProof/>
               </w:rPr>
-              <w:instrText xml:space="preserve"> PAGEREF _Toc242295202 \h </w:instrText>
+              <w:instrText xml:space="preserve"> PAGEREF _Toc242302430 \h </w:instrText>
             </w:r>
             <w:r>
               <w:rPr>
@@ -274,7 +274,7 @@
               <w:noProof/>
             </w:rPr>
           </w:pPr>
-          <w:hyperlink w:anchor="_Toc242295203" w:history="1">
+          <w:hyperlink w:anchor="_Toc242302431" w:history="1">
             <w:r>
               <w:rPr>
                 <w:rStyle w:val="Lienhypertexte"/>
@@ -298,7 +298,7 @@
               <w:rPr>
                 <w:noProof/>
               </w:rPr>
-              <w:instrText xml:space="preserve"> PAGEREF _Toc242295203 \h </w:instrText>
+              <w:instrText xml:space="preserve"> PAGEREF _Toc242302431 \h </w:instrText>
             </w:r>
             <w:r>
               <w:rPr>
@@ -335,7 +335,7 @@
               <w:noProof/>
             </w:rPr>
           </w:pPr>
-          <w:hyperlink w:anchor="_Toc242295204" w:history="1">
+          <w:hyperlink w:anchor="_Toc242302432" w:history="1">
             <w:r>
               <w:rPr>
                 <w:rStyle w:val="Lienhypertexte"/>
@@ -359,7 +359,7 @@
               <w:rPr>
                 <w:noProof/>
               </w:rPr>
-              <w:instrText xml:space="preserve"> PAGEREF _Toc242295204 \h </w:instrText>
+              <w:instrText xml:space="preserve"> PAGEREF _Toc242302432 \h </w:instrText>
             </w:r>
             <w:r>
               <w:rPr>
@@ -396,7 +396,7 @@
               <w:noProof/>
             </w:rPr>
           </w:pPr>
-          <w:hyperlink w:anchor="_Toc242295205" w:history="1">
+          <w:hyperlink w:anchor="_Toc242302433" w:history="1">
             <w:r>
               <w:rPr>
                 <w:rStyle w:val="Lienhypertexte"/>
@@ -420,7 +420,7 @@
               <w:rPr>
                 <w:noProof/>
               </w:rPr>
-              <w:instrText xml:space="preserve"> PAGEREF _Toc242295205 \h </w:instrText>
+              <w:instrText xml:space="preserve"> PAGEREF _Toc242302433 \h </w:instrText>
             </w:r>
             <w:r>
               <w:rPr>
@@ -457,7 +457,7 @@
               <w:noProof/>
             </w:rPr>
           </w:pPr>
-          <w:hyperlink w:anchor="_Toc242295206" w:history="1">
+          <w:hyperlink w:anchor="_Toc242302434" w:history="1">
             <w:r>
               <w:rPr>
                 <w:rStyle w:val="Lienhypertexte"/>
@@ -481,7 +481,7 @@
               <w:rPr>
                 <w:noProof/>
               </w:rPr>
-              <w:instrText xml:space="preserve"> PAGEREF _Toc242295206 \h </w:instrText>
+              <w:instrText xml:space="preserve"> PAGEREF _Toc242302434 \h </w:instrText>
             </w:r>
             <w:r>
               <w:rPr>
@@ -518,7 +518,7 @@
               <w:noProof/>
             </w:rPr>
           </w:pPr>
-          <w:hyperlink w:anchor="_Toc242295207" w:history="1">
+          <w:hyperlink w:anchor="_Toc242302435" w:history="1">
             <w:r>
               <w:rPr>
                 <w:rStyle w:val="Lienhypertexte"/>
@@ -542,7 +542,7 @@
               <w:rPr>
                 <w:noProof/>
               </w:rPr>
-              <w:instrText xml:space="preserve"> PAGEREF _Toc242295207 \h </w:instrText>
+              <w:instrText xml:space="preserve"> PAGEREF _Toc242302435 \h </w:instrText>
             </w:r>
             <w:r>
               <w:rPr>
@@ -579,7 +579,7 @@
               <w:noProof/>
             </w:rPr>
           </w:pPr>
-          <w:hyperlink w:anchor="_Toc242295208" w:history="1">
+          <w:hyperlink w:anchor="_Toc242302436" w:history="1">
             <w:r>
               <w:rPr>
                 <w:rStyle w:val="Lienhypertexte"/>
@@ -603,7 +603,7 @@
               <w:rPr>
                 <w:noProof/>
               </w:rPr>
-              <w:instrText xml:space="preserve"> PAGEREF _Toc242295208 \h </w:instrText>
+              <w:instrText xml:space="preserve"> PAGEREF _Toc242302436 \h </w:instrText>
             </w:r>
             <w:r>
               <w:rPr>
@@ -640,7 +640,7 @@
               <w:noProof/>
             </w:rPr>
           </w:pPr>
-          <w:hyperlink w:anchor="_Toc242295209" w:history="1">
+          <w:hyperlink w:anchor="_Toc242302437" w:history="1">
             <w:r>
               <w:rPr>
                 <w:rStyle w:val="Lienhypertexte"/>
@@ -664,7 +664,7 @@
               <w:rPr>
                 <w:noProof/>
               </w:rPr>
-              <w:instrText xml:space="preserve"> PAGEREF _Toc242295209 \h </w:instrText>
+              <w:instrText xml:space="preserve"> PAGEREF _Toc242302437 \h </w:instrText>
             </w:r>
             <w:r>
               <w:rPr>
@@ -701,7 +701,7 @@
               <w:noProof/>
             </w:rPr>
           </w:pPr>
-          <w:hyperlink w:anchor="_Toc242295210" w:history="1">
+          <w:hyperlink w:anchor="_Toc242302438" w:history="1">
             <w:r>
               <w:rPr>
                 <w:rStyle w:val="Lienhypertexte"/>
@@ -725,7 +725,7 @@
               <w:rPr>
                 <w:noProof/>
               </w:rPr>
-              <w:instrText xml:space="preserve"> PAGEREF _Toc242295210 \h </w:instrText>
+              <w:instrText xml:space="preserve"> PAGEREF _Toc242302438 \h </w:instrText>
             </w:r>
             <w:r>
               <w:rPr>
@@ -762,7 +762,7 @@
               <w:noProof/>
             </w:rPr>
           </w:pPr>
-          <w:hyperlink w:anchor="_Toc242295211" w:history="1">
+          <w:hyperlink w:anchor="_Toc242302439" w:history="1">
             <w:r>
               <w:rPr>
                 <w:rStyle w:val="Lienhypertexte"/>
@@ -786,7 +786,7 @@
               <w:rPr>
                 <w:noProof/>
               </w:rPr>
-              <w:instrText xml:space="preserve"> PAGEREF _Toc242295211 \h </w:instrText>
+              <w:instrText xml:space="preserve"> PAGEREF _Toc242302439 \h </w:instrText>
             </w:r>
             <w:r>
               <w:rPr>
@@ -823,7 +823,7 @@
               <w:noProof/>
             </w:rPr>
           </w:pPr>
-          <w:hyperlink w:anchor="_Toc242295212" w:history="1">
+          <w:hyperlink w:anchor="_Toc242302440" w:history="1">
             <w:r>
               <w:rPr>
                 <w:rStyle w:val="Lienhypertexte"/>
@@ -847,7 +847,7 @@
               <w:rPr>
                 <w:noProof/>
               </w:rPr>
-              <w:instrText xml:space="preserve"> PAGEREF _Toc242295212 \h </w:instrText>
+              <w:instrText xml:space="preserve"> PAGEREF _Toc242302440 \h </w:instrText>
             </w:r>
             <w:r>
               <w:rPr>
@@ -884,7 +884,7 @@
               <w:noProof/>
             </w:rPr>
           </w:pPr>
-          <w:hyperlink w:anchor="_Toc242295213" w:history="1">
+          <w:hyperlink w:anchor="_Toc242302441" w:history="1">
             <w:r>
               <w:rPr>
                 <w:rStyle w:val="Lienhypertexte"/>
@@ -908,7 +908,7 @@
               <w:rPr>
                 <w:noProof/>
               </w:rPr>
-              <w:instrText xml:space="preserve"> PAGEREF _Toc242295213 \h </w:instrText>
+              <w:instrText xml:space="preserve"> PAGEREF _Toc242302441 \h </w:instrText>
             </w:r>
             <w:r>
               <w:rPr>
@@ -945,7 +945,7 @@
               <w:noProof/>
             </w:rPr>
           </w:pPr>
-          <w:hyperlink w:anchor="_Toc242295214" w:history="1">
+          <w:hyperlink w:anchor="_Toc242302442" w:history="1">
             <w:r>
               <w:rPr>
                 <w:rStyle w:val="Lienhypertexte"/>
@@ -969,7 +969,7 @@
               <w:rPr>
                 <w:noProof/>
               </w:rPr>
-              <w:instrText xml:space="preserve"> PAGEREF _Toc242295214 \h </w:instrText>
+              <w:instrText xml:space="preserve"> PAGEREF _Toc242302442 \h </w:instrText>
             </w:r>
             <w:r>
               <w:rPr>
@@ -1006,7 +1006,7 @@
               <w:noProof/>
             </w:rPr>
           </w:pPr>
-          <w:hyperlink w:anchor="_Toc242295215" w:history="1">
+          <w:hyperlink w:anchor="_Toc242302443" w:history="1">
             <w:r>
               <w:rPr>
                 <w:rStyle w:val="Lienhypertexte"/>
@@ -1030,7 +1030,7 @@
               <w:rPr>
                 <w:noProof/>
               </w:rPr>
-              <w:instrText xml:space="preserve"> PAGEREF _Toc242295215 \h </w:instrText>
+              <w:instrText xml:space="preserve"> PAGEREF _Toc242302443 \h </w:instrText>
             </w:r>
             <w:r>
               <w:rPr>
@@ -1067,7 +1067,7 @@
               <w:noProof/>
             </w:rPr>
           </w:pPr>
-          <w:hyperlink w:anchor="_Toc242295216" w:history="1">
+          <w:hyperlink w:anchor="_Toc242302444" w:history="1">
             <w:r>
               <w:rPr>
                 <w:rStyle w:val="Lienhypertexte"/>
@@ -1091,7 +1091,7 @@
               <w:rPr>
                 <w:noProof/>
               </w:rPr>
-              <w:instrText xml:space="preserve"> PAGEREF _Toc242295216 \h </w:instrText>
+              <w:instrText xml:space="preserve"> PAGEREF _Toc242302444 \h </w:instrText>
             </w:r>
             <w:r>
               <w:rPr>
@@ -1128,7 +1128,7 @@
               <w:noProof/>
             </w:rPr>
           </w:pPr>
-          <w:hyperlink w:anchor="_Toc242295217" w:history="1">
+          <w:hyperlink w:anchor="_Toc242302445" w:history="1">
             <w:r>
               <w:rPr>
                 <w:rStyle w:val="Lienhypertexte"/>
@@ -1152,7 +1152,7 @@
               <w:rPr>
                 <w:noProof/>
               </w:rPr>
-              <w:instrText xml:space="preserve"> PAGEREF _Toc242295217 \h </w:instrText>
+              <w:instrText xml:space="preserve"> PAGEREF _Toc242302445 \h </w:instrText>
             </w:r>
             <w:r>
               <w:rPr>
@@ -1189,7 +1189,7 @@
               <w:noProof/>
             </w:rPr>
           </w:pPr>
-          <w:hyperlink w:anchor="_Toc242295218" w:history="1">
+          <w:hyperlink w:anchor="_Toc242302446" w:history="1">
             <w:r>
               <w:rPr>
                 <w:rStyle w:val="Lienhypertexte"/>
@@ -1213,7 +1213,7 @@
               <w:rPr>
                 <w:noProof/>
               </w:rPr>
-              <w:instrText xml:space="preserve"> PAGEREF _Toc242295218 \h </w:instrText>
+              <w:instrText xml:space="preserve"> PAGEREF _Toc242302446 \h </w:instrText>
             </w:r>
             <w:r>
               <w:rPr>
@@ -1250,7 +1250,7 @@
               <w:noProof/>
             </w:rPr>
           </w:pPr>
-          <w:hyperlink w:anchor="_Toc242295219" w:history="1">
+          <w:hyperlink w:anchor="_Toc242302447" w:history="1">
             <w:r>
               <w:rPr>
                 <w:rStyle w:val="Lienhypertexte"/>
@@ -1274,7 +1274,7 @@
               <w:rPr>
                 <w:noProof/>
               </w:rPr>
-              <w:instrText xml:space="preserve"> PAGEREF _Toc242295219 \h </w:instrText>
+              <w:instrText xml:space="preserve"> PAGEREF _Toc242302447 \h </w:instrText>
             </w:r>
             <w:r>
               <w:rPr>
@@ -1311,7 +1311,7 @@
               <w:noProof/>
             </w:rPr>
           </w:pPr>
-          <w:hyperlink w:anchor="_Toc242295220" w:history="1">
+          <w:hyperlink w:anchor="_Toc242302448" w:history="1">
             <w:r>
               <w:rPr>
                 <w:rStyle w:val="Lienhypertexte"/>
@@ -1335,7 +1335,7 @@
               <w:rPr>
                 <w:noProof/>
               </w:rPr>
-              <w:instrText xml:space="preserve"> PAGEREF _Toc242295220 \h </w:instrText>
+              <w:instrText xml:space="preserve"> PAGEREF _Toc242302448 \h </w:instrText>
             </w:r>
             <w:r>
               <w:rPr>
@@ -1372,7 +1372,7 @@
               <w:noProof/>
             </w:rPr>
           </w:pPr>
-          <w:hyperlink w:anchor="_Toc242295221" w:history="1">
+          <w:hyperlink w:anchor="_Toc242302449" w:history="1">
             <w:r>
               <w:rPr>
                 <w:rStyle w:val="Lienhypertexte"/>
@@ -1396,7 +1396,7 @@
               <w:rPr>
                 <w:noProof/>
               </w:rPr>
-              <w:instrText xml:space="preserve"> PAGEREF _Toc242295221 \h </w:instrText>
+              <w:instrText xml:space="preserve"> PAGEREF _Toc242302449 \h </w:instrText>
             </w:r>
             <w:r>
               <w:rPr>
@@ -1433,7 +1433,7 @@
               <w:noProof/>
             </w:rPr>
           </w:pPr>
-          <w:hyperlink w:anchor="_Toc242295222" w:history="1">
+          <w:hyperlink w:anchor="_Toc242302450" w:history="1">
             <w:r>
               <w:rPr>
                 <w:rStyle w:val="Lienhypertexte"/>
@@ -1457,7 +1457,7 @@
               <w:rPr>
                 <w:noProof/>
               </w:rPr>
-              <w:instrText xml:space="preserve"> PAGEREF _Toc242295222 \h </w:instrText>
+              <w:instrText xml:space="preserve"> PAGEREF _Toc242302450 \h </w:instrText>
             </w:r>
             <w:r>
               <w:rPr>
@@ -1494,7 +1494,7 @@
               <w:noProof/>
             </w:rPr>
           </w:pPr>
-          <w:hyperlink w:anchor="_Toc242295223" w:history="1">
+          <w:hyperlink w:anchor="_Toc242302451" w:history="1">
             <w:r>
               <w:rPr>
                 <w:rStyle w:val="Lienhypertexte"/>
@@ -1518,7 +1518,7 @@
               <w:rPr>
                 <w:noProof/>
               </w:rPr>
-              <w:instrText xml:space="preserve"> PAGEREF _Toc242295223 \h </w:instrText>
+              <w:instrText xml:space="preserve"> PAGEREF _Toc242302451 \h </w:instrText>
             </w:r>
             <w:r>
               <w:rPr>
@@ -1555,7 +1555,7 @@
               <w:noProof/>
             </w:rPr>
           </w:pPr>
-          <w:hyperlink w:anchor="_Toc242295224" w:history="1">
+          <w:hyperlink w:anchor="_Toc242302452" w:history="1">
             <w:r>
               <w:rPr>
                 <w:rStyle w:val="Lienhypertexte"/>
@@ -1579,7 +1579,7 @@
               <w:rPr>
                 <w:noProof/>
               </w:rPr>
-              <w:instrText xml:space="preserve"> PAGEREF _Toc242295224 \h </w:instrText>
+              <w:instrText xml:space="preserve"> PAGEREF _Toc242302452 \h </w:instrText>
             </w:r>
             <w:r>
               <w:rPr>
@@ -1616,7 +1616,7 @@
               <w:noProof/>
             </w:rPr>
           </w:pPr>
-          <w:hyperlink w:anchor="_Toc242295225" w:history="1">
+          <w:hyperlink w:anchor="_Toc242302453" w:history="1">
             <w:r>
               <w:rPr>
                 <w:rStyle w:val="Lienhypertexte"/>
@@ -1640,7 +1640,7 @@
               <w:rPr>
                 <w:noProof/>
               </w:rPr>
-              <w:instrText xml:space="preserve"> PAGEREF _Toc242295225 \h </w:instrText>
+              <w:instrText xml:space="preserve"> PAGEREF _Toc242302453 \h </w:instrText>
             </w:r>
             <w:r>
               <w:rPr>
@@ -1677,7 +1677,7 @@
               <w:noProof/>
             </w:rPr>
           </w:pPr>
-          <w:hyperlink w:anchor="_Toc242295226" w:history="1">
+          <w:hyperlink w:anchor="_Toc242302454" w:history="1">
             <w:r>
               <w:rPr>
                 <w:rStyle w:val="Lienhypertexte"/>
@@ -1701,7 +1701,7 @@
               <w:rPr>
                 <w:noProof/>
               </w:rPr>
-              <w:instrText xml:space="preserve"> PAGEREF _Toc242295226 \h </w:instrText>
+              <w:instrText xml:space="preserve"> PAGEREF _Toc242302454 \h </w:instrText>
             </w:r>
             <w:r>
               <w:rPr>
@@ -1738,7 +1738,7 @@
               <w:noProof/>
             </w:rPr>
           </w:pPr>
-          <w:hyperlink w:anchor="_Toc242295227" w:history="1">
+          <w:hyperlink w:anchor="_Toc242302455" w:history="1">
             <w:r>
               <w:rPr>
                 <w:rStyle w:val="Lienhypertexte"/>
@@ -1762,7 +1762,7 @@
               <w:rPr>
                 <w:noProof/>
               </w:rPr>
-              <w:instrText xml:space="preserve"> PAGEREF _Toc242295227 \h </w:instrText>
+              <w:instrText xml:space="preserve"> PAGEREF _Toc242302455 \h </w:instrText>
             </w:r>
             <w:r>
               <w:rPr>
@@ -1799,7 +1799,7 @@
               <w:noProof/>
             </w:rPr>
           </w:pPr>
-          <w:hyperlink w:anchor="_Toc242295228" w:history="1">
+          <w:hyperlink w:anchor="_Toc242302456" w:history="1">
             <w:r>
               <w:rPr>
                 <w:rStyle w:val="Lienhypertexte"/>
@@ -1823,7 +1823,7 @@
               <w:rPr>
                 <w:noProof/>
               </w:rPr>
-              <w:instrText xml:space="preserve"> PAGEREF _Toc242295228 \h </w:instrText>
+              <w:instrText xml:space="preserve"> PAGEREF _Toc242302456 \h </w:instrText>
             </w:r>
             <w:r>
               <w:rPr>
@@ -1860,7 +1860,7 @@
               <w:noProof/>
             </w:rPr>
           </w:pPr>
-          <w:hyperlink w:anchor="_Toc242295229" w:history="1">
+          <w:hyperlink w:anchor="_Toc242302457" w:history="1">
             <w:r>
               <w:rPr>
                 <w:rStyle w:val="Lienhypertexte"/>
@@ -1884,7 +1884,7 @@
               <w:rPr>
                 <w:noProof/>
               </w:rPr>
-              <w:instrText xml:space="preserve"> PAGEREF _Toc242295229 \h </w:instrText>
+              <w:instrText xml:space="preserve"> PAGEREF _Toc242302457 \h </w:instrText>
             </w:r>
             <w:r>
               <w:rPr>
@@ -1921,7 +1921,7 @@
               <w:noProof/>
             </w:rPr>
           </w:pPr>
-          <w:hyperlink w:anchor="_Toc242295230" w:history="1">
+          <w:hyperlink w:anchor="_Toc242302458" w:history="1">
             <w:r>
               <w:rPr>
                 <w:rStyle w:val="Lienhypertexte"/>
@@ -1945,7 +1945,7 @@
               <w:rPr>
                 <w:noProof/>
               </w:rPr>
-              <w:instrText xml:space="preserve"> PAGEREF _Toc242295230 \h </w:instrText>
+              <w:instrText xml:space="preserve"> PAGEREF _Toc242302458 \h </w:instrText>
             </w:r>
             <w:r>
               <w:rPr>
@@ -1982,7 +1982,7 @@
               <w:noProof/>
             </w:rPr>
           </w:pPr>
-          <w:hyperlink w:anchor="_Toc242295231" w:history="1">
+          <w:hyperlink w:anchor="_Toc242302459" w:history="1">
             <w:r>
               <w:rPr>
                 <w:rStyle w:val="Lienhypertexte"/>
@@ -2006,7 +2006,7 @@
               <w:rPr>
                 <w:noProof/>
               </w:rPr>
-              <w:instrText xml:space="preserve"> PAGEREF _Toc242295231 \h </w:instrText>
+              <w:instrText xml:space="preserve"> PAGEREF _Toc242302459 \h </w:instrText>
             </w:r>
             <w:r>
               <w:rPr>
@@ -2043,7 +2043,7 @@
               <w:noProof/>
             </w:rPr>
           </w:pPr>
-          <w:hyperlink w:anchor="_Toc242295232" w:history="1">
+          <w:hyperlink w:anchor="_Toc242302460" w:history="1">
             <w:r>
               <w:rPr>
                 <w:rStyle w:val="Lienhypertexte"/>
@@ -2067,7 +2067,7 @@
               <w:rPr>
                 <w:noProof/>
               </w:rPr>
-              <w:instrText xml:space="preserve"> PAGEREF _Toc242295232 \h </w:instrText>
+              <w:instrText xml:space="preserve"> PAGEREF _Toc242302460 \h </w:instrText>
             </w:r>
             <w:r>
               <w:rPr>
@@ -2104,7 +2104,7 @@
               <w:noProof/>
             </w:rPr>
           </w:pPr>
-          <w:hyperlink w:anchor="_Toc242295233" w:history="1">
+          <w:hyperlink w:anchor="_Toc242302461" w:history="1">
             <w:r>
               <w:rPr>
                 <w:rStyle w:val="Lienhypertexte"/>
@@ -2128,7 +2128,7 @@
               <w:rPr>
                 <w:noProof/>
               </w:rPr>
-              <w:instrText xml:space="preserve"> PAGEREF _Toc242295233 \h </w:instrText>
+              <w:instrText xml:space="preserve"> PAGEREF _Toc242302461 \h </w:instrText>
             </w:r>
             <w:r>
               <w:rPr>
@@ -2165,7 +2165,7 @@
               <w:noProof/>
             </w:rPr>
           </w:pPr>
-          <w:hyperlink w:anchor="_Toc242295234" w:history="1">
+          <w:hyperlink w:anchor="_Toc242302462" w:history="1">
             <w:r>
               <w:rPr>
                 <w:rStyle w:val="Lienhypertexte"/>
@@ -2189,7 +2189,7 @@
               <w:rPr>
                 <w:noProof/>
               </w:rPr>
-              <w:instrText xml:space="preserve"> PAGEREF _Toc242295234 \h </w:instrText>
+              <w:instrText xml:space="preserve"> PAGEREF _Toc242302462 \h </w:instrText>
             </w:r>
             <w:r>
               <w:rPr>
@@ -2226,7 +2226,7 @@
               <w:noProof/>
             </w:rPr>
           </w:pPr>
-          <w:hyperlink w:anchor="_Toc242295235" w:history="1">
+          <w:hyperlink w:anchor="_Toc242302463" w:history="1">
             <w:r>
               <w:rPr>
                 <w:rStyle w:val="Lienhypertexte"/>
@@ -2250,7 +2250,7 @@
               <w:rPr>
                 <w:noProof/>
               </w:rPr>
-              <w:instrText xml:space="preserve"> PAGEREF _Toc242295235 \h </w:instrText>
+              <w:instrText xml:space="preserve"> PAGEREF _Toc242302463 \h </w:instrText>
             </w:r>
             <w:r>
               <w:rPr>
@@ -2287,7 +2287,7 @@
               <w:noProof/>
             </w:rPr>
           </w:pPr>
-          <w:hyperlink w:anchor="_Toc242295236" w:history="1">
+          <w:hyperlink w:anchor="_Toc242302464" w:history="1">
             <w:r>
               <w:rPr>
                 <w:rStyle w:val="Lienhypertexte"/>
@@ -2311,7 +2311,7 @@
               <w:rPr>
                 <w:noProof/>
               </w:rPr>
-              <w:instrText xml:space="preserve"> PAGEREF _Toc242295236 \h </w:instrText>
+              <w:instrText xml:space="preserve"> PAGEREF _Toc242302464 \h </w:instrText>
             </w:r>
             <w:r>
               <w:rPr>
@@ -2348,7 +2348,7 @@
               <w:noProof/>
             </w:rPr>
           </w:pPr>
-          <w:hyperlink w:anchor="_Toc242295237" w:history="1">
+          <w:hyperlink w:anchor="_Toc242302465" w:history="1">
             <w:r>
               <w:rPr>
                 <w:rStyle w:val="Lienhypertexte"/>
@@ -2372,7 +2372,7 @@
               <w:rPr>
                 <w:noProof/>
               </w:rPr>
-              <w:instrText xml:space="preserve"> PAGEREF _Toc242295237 \h </w:instrText>
+              <w:instrText xml:space="preserve"> PAGEREF _Toc242302465 \h </w:instrText>
             </w:r>
             <w:r>
               <w:rPr>
@@ -2409,7 +2409,7 @@
               <w:noProof/>
             </w:rPr>
           </w:pPr>
-          <w:hyperlink w:anchor="_Toc242295238" w:history="1">
+          <w:hyperlink w:anchor="_Toc242302466" w:history="1">
             <w:r>
               <w:rPr>
                 <w:rStyle w:val="Lienhypertexte"/>
@@ -2433,7 +2433,7 @@
               <w:rPr>
                 <w:noProof/>
               </w:rPr>
-              <w:instrText xml:space="preserve"> PAGEREF _Toc242295238 \h </w:instrText>
+              <w:instrText xml:space="preserve"> PAGEREF _Toc242302466 \h </w:instrText>
             </w:r>
             <w:r>
               <w:rPr>
@@ -2470,7 +2470,7 @@
               <w:noProof/>
             </w:rPr>
           </w:pPr>
-          <w:hyperlink w:anchor="_Toc242295239" w:history="1">
+          <w:hyperlink w:anchor="_Toc242302467" w:history="1">
             <w:r>
               <w:rPr>
                 <w:rStyle w:val="Lienhypertexte"/>
@@ -2494,7 +2494,7 @@
               <w:rPr>
                 <w:noProof/>
               </w:rPr>
-              <w:instrText xml:space="preserve"> PAGEREF _Toc242295239 \h </w:instrText>
+              <w:instrText xml:space="preserve"> PAGEREF _Toc242302467 \h </w:instrText>
             </w:r>
             <w:r>
               <w:rPr>
@@ -2531,7 +2531,7 @@
               <w:noProof/>
             </w:rPr>
           </w:pPr>
-          <w:hyperlink w:anchor="_Toc242295240" w:history="1">
+          <w:hyperlink w:anchor="_Toc242302468" w:history="1">
             <w:r>
               <w:rPr>
                 <w:rStyle w:val="Lienhypertexte"/>
@@ -2555,7 +2555,7 @@
               <w:rPr>
                 <w:noProof/>
               </w:rPr>
-              <w:instrText xml:space="preserve"> PAGEREF _Toc242295240 \h </w:instrText>
+              <w:instrText xml:space="preserve"> PAGEREF _Toc242302468 \h </w:instrText>
             </w:r>
             <w:r>
               <w:rPr>
@@ -2592,7 +2592,7 @@
               <w:noProof/>
             </w:rPr>
           </w:pPr>
-          <w:hyperlink w:anchor="_Toc242295241" w:history="1">
+          <w:hyperlink w:anchor="_Toc242302469" w:history="1">
             <w:r>
               <w:rPr>
                 <w:rStyle w:val="Lienhypertexte"/>
@@ -2616,7 +2616,7 @@
               <w:rPr>
                 <w:noProof/>
               </w:rPr>
-              <w:instrText xml:space="preserve"> PAGEREF _Toc242295241 \h </w:instrText>
+              <w:instrText xml:space="preserve"> PAGEREF _Toc242302469 \h </w:instrText>
             </w:r>
             <w:r>
               <w:rPr>
@@ -2653,7 +2653,7 @@
               <w:noProof/>
             </w:rPr>
           </w:pPr>
-          <w:hyperlink w:anchor="_Toc242295242" w:history="1">
+          <w:hyperlink w:anchor="_Toc242302470" w:history="1">
             <w:r>
               <w:rPr>
                 <w:rStyle w:val="Lienhypertexte"/>
@@ -2677,7 +2677,7 @@
               <w:rPr>
                 <w:noProof/>
               </w:rPr>
-              <w:instrText xml:space="preserve"> PAGEREF _Toc242295242 \h </w:instrText>
+              <w:instrText xml:space="preserve"> PAGEREF _Toc242302470 \h </w:instrText>
             </w:r>
             <w:r>
               <w:rPr>
@@ -2714,7 +2714,7 @@
               <w:noProof/>
             </w:rPr>
           </w:pPr>
-          <w:hyperlink w:anchor="_Toc242295243" w:history="1">
+          <w:hyperlink w:anchor="_Toc242302471" w:history="1">
             <w:r>
               <w:rPr>
                 <w:rStyle w:val="Lienhypertexte"/>
@@ -2738,7 +2738,7 @@
               <w:rPr>
                 <w:noProof/>
               </w:rPr>
-              <w:instrText xml:space="preserve"> PAGEREF _Toc242295243 \h </w:instrText>
+              <w:instrText xml:space="preserve"> PAGEREF _Toc242302471 \h </w:instrText>
             </w:r>
             <w:r>
               <w:rPr>
@@ -2775,7 +2775,7 @@
               <w:noProof/>
             </w:rPr>
           </w:pPr>
-          <w:hyperlink w:anchor="_Toc242295244" w:history="1">
+          <w:hyperlink w:anchor="_Toc242302472" w:history="1">
             <w:r>
               <w:rPr>
                 <w:rStyle w:val="Lienhypertexte"/>
@@ -2799,7 +2799,7 @@
               <w:rPr>
                 <w:noProof/>
               </w:rPr>
-              <w:instrText xml:space="preserve"> PAGEREF _Toc242295244 \h </w:instrText>
+              <w:instrText xml:space="preserve"> PAGEREF _Toc242302472 \h </w:instrText>
             </w:r>
             <w:r>
               <w:rPr>
@@ -2836,7 +2836,7 @@
               <w:noProof/>
             </w:rPr>
           </w:pPr>
-          <w:hyperlink w:anchor="_Toc242295245" w:history="1">
+          <w:hyperlink w:anchor="_Toc242302473" w:history="1">
             <w:r>
               <w:rPr>
                 <w:rStyle w:val="Lienhypertexte"/>
@@ -2860,7 +2860,7 @@
               <w:rPr>
                 <w:noProof/>
               </w:rPr>
-              <w:instrText xml:space="preserve"> PAGEREF _Toc242295245 \h </w:instrText>
+              <w:instrText xml:space="preserve"> PAGEREF _Toc242302473 \h </w:instrText>
             </w:r>
             <w:r>
               <w:rPr>
@@ -2897,7 +2897,7 @@
               <w:noProof/>
             </w:rPr>
           </w:pPr>
-          <w:hyperlink w:anchor="_Toc242295246" w:history="1">
+          <w:hyperlink w:anchor="_Toc242302474" w:history="1">
             <w:r>
               <w:rPr>
                 <w:rStyle w:val="Lienhypertexte"/>
@@ -2921,7 +2921,7 @@
               <w:rPr>
                 <w:noProof/>
               </w:rPr>
-              <w:instrText xml:space="preserve"> PAGEREF _Toc242295246 \h </w:instrText>
+              <w:instrText xml:space="preserve"> PAGEREF _Toc242302474 \h </w:instrText>
             </w:r>
             <w:r>
               <w:rPr>
@@ -2958,7 +2958,7 @@
               <w:noProof/>
             </w:rPr>
           </w:pPr>
-          <w:hyperlink w:anchor="_Toc242295247" w:history="1">
+          <w:hyperlink w:anchor="_Toc242302475" w:history="1">
             <w:r>
               <w:rPr>
                 <w:rStyle w:val="Lienhypertexte"/>
@@ -2982,7 +2982,7 @@
               <w:rPr>
                 <w:noProof/>
               </w:rPr>
-              <w:instrText xml:space="preserve"> PAGEREF _Toc242295247 \h </w:instrText>
+              <w:instrText xml:space="preserve"> PAGEREF _Toc242302475 \h </w:instrText>
             </w:r>
             <w:r>
               <w:rPr>
@@ -3019,7 +3019,7 @@
               <w:noProof/>
             </w:rPr>
           </w:pPr>
-          <w:hyperlink w:anchor="_Toc242295248" w:history="1">
+          <w:hyperlink w:anchor="_Toc242302476" w:history="1">
             <w:r>
               <w:rPr>
                 <w:rStyle w:val="Lienhypertexte"/>
@@ -3043,7 +3043,7 @@
               <w:rPr>
                 <w:noProof/>
               </w:rPr>
-              <w:instrText xml:space="preserve"> PAGEREF _Toc242295248 \h </w:instrText>
+              <w:instrText xml:space="preserve"> PAGEREF _Toc242302476 \h </w:instrText>
             </w:r>
             <w:r>
               <w:rPr>
@@ -3080,7 +3080,7 @@
               <w:noProof/>
             </w:rPr>
           </w:pPr>
-          <w:hyperlink w:anchor="_Toc242295249" w:history="1">
+          <w:hyperlink w:anchor="_Toc242302477" w:history="1">
             <w:r>
               <w:rPr>
                 <w:rStyle w:val="Lienhypertexte"/>
@@ -3104,7 +3104,7 @@
               <w:rPr>
                 <w:noProof/>
               </w:rPr>
-              <w:instrText xml:space="preserve"> PAGEREF _Toc242295249 \h </w:instrText>
+              <w:instrText xml:space="preserve"> PAGEREF _Toc242302477 \h </w:instrText>
             </w:r>
             <w:r>
               <w:rPr>
@@ -3141,7 +3141,7 @@
               <w:noProof/>
             </w:rPr>
           </w:pPr>
-          <w:hyperlink w:anchor="_Toc242295250" w:history="1">
+          <w:hyperlink w:anchor="_Toc242302478" w:history="1">
             <w:r>
               <w:rPr>
                 <w:rStyle w:val="Lienhypertexte"/>
@@ -3165,7 +3165,7 @@
               <w:rPr>
                 <w:noProof/>
               </w:rPr>
-              <w:instrText xml:space="preserve"> PAGEREF _Toc242295250 \h </w:instrText>
+              <w:instrText xml:space="preserve"> PAGEREF _Toc242302478 \h </w:instrText>
             </w:r>
             <w:r>
               <w:rPr>
@@ -3202,7 +3202,7 @@
               <w:noProof/>
             </w:rPr>
           </w:pPr>
-          <w:hyperlink w:anchor="_Toc242295251" w:history="1">
+          <w:hyperlink w:anchor="_Toc242302479" w:history="1">
             <w:r>
               <w:rPr>
                 <w:rStyle w:val="Lienhypertexte"/>
@@ -3226,7 +3226,7 @@
               <w:rPr>
                 <w:noProof/>
               </w:rPr>
-              <w:instrText xml:space="preserve"> PAGEREF _Toc242295251 \h </w:instrText>
+              <w:instrText xml:space="preserve"> PAGEREF _Toc242302479 \h </w:instrText>
             </w:r>
             <w:r>
               <w:rPr>
@@ -3263,7 +3263,7 @@
               <w:noProof/>
             </w:rPr>
           </w:pPr>
-          <w:hyperlink w:anchor="_Toc242295252" w:history="1">
+          <w:hyperlink w:anchor="_Toc242302480" w:history="1">
             <w:r>
               <w:rPr>
                 <w:rStyle w:val="Lienhypertexte"/>
@@ -3287,7 +3287,7 @@
               <w:rPr>
                 <w:noProof/>
               </w:rPr>
-              <w:instrText xml:space="preserve"> PAGEREF _Toc242295252 \h </w:instrText>
+              <w:instrText xml:space="preserve"> PAGEREF _Toc242302480 \h </w:instrText>
             </w:r>
             <w:r>
               <w:rPr>
@@ -3324,7 +3324,7 @@
               <w:noProof/>
             </w:rPr>
           </w:pPr>
-          <w:hyperlink w:anchor="_Toc242295253" w:history="1">
+          <w:hyperlink w:anchor="_Toc242302481" w:history="1">
             <w:r>
               <w:rPr>
                 <w:rStyle w:val="Lienhypertexte"/>
@@ -3348,7 +3348,7 @@
               <w:rPr>
                 <w:noProof/>
               </w:rPr>
-              <w:instrText xml:space="preserve"> PAGEREF _Toc242295253 \h </w:instrText>
+              <w:instrText xml:space="preserve"> PAGEREF _Toc242302481 \h </w:instrText>
             </w:r>
             <w:r>
               <w:rPr>
@@ -3385,7 +3385,7 @@
               <w:noProof/>
             </w:rPr>
           </w:pPr>
-          <w:hyperlink w:anchor="_Toc242295254" w:history="1">
+          <w:hyperlink w:anchor="_Toc242302482" w:history="1">
             <w:r>
               <w:rPr>
                 <w:rStyle w:val="Lienhypertexte"/>
@@ -3409,7 +3409,7 @@
               <w:rPr>
                 <w:noProof/>
               </w:rPr>
-              <w:instrText xml:space="preserve"> PAGEREF _Toc242295254 \h </w:instrText>
+              <w:instrText xml:space="preserve"> PAGEREF _Toc242302482 \h </w:instrText>
             </w:r>
             <w:r>
               <w:rPr>
@@ -3446,7 +3446,7 @@
               <w:noProof/>
             </w:rPr>
           </w:pPr>
-          <w:hyperlink w:anchor="_Toc242295255" w:history="1">
+          <w:hyperlink w:anchor="_Toc242302483" w:history="1">
             <w:r>
               <w:rPr>
                 <w:rStyle w:val="Lienhypertexte"/>
@@ -3470,7 +3470,7 @@
               <w:rPr>
                 <w:noProof/>
               </w:rPr>
-              <w:instrText xml:space="preserve"> PAGEREF _Toc242295255 \h </w:instrText>
+              <w:instrText xml:space="preserve"> PAGEREF _Toc242302483 \h </w:instrText>
             </w:r>
             <w:r>
               <w:rPr>
@@ -3507,7 +3507,7 @@
               <w:noProof/>
             </w:rPr>
           </w:pPr>
-          <w:hyperlink w:anchor="_Toc242295256" w:history="1">
+          <w:hyperlink w:anchor="_Toc242302484" w:history="1">
             <w:r>
               <w:rPr>
                 <w:rStyle w:val="Lienhypertexte"/>
@@ -3531,7 +3531,7 @@
               <w:rPr>
                 <w:noProof/>
               </w:rPr>
-              <w:instrText xml:space="preserve"> PAGEREF _Toc242295256 \h </w:instrText>
+              <w:instrText xml:space="preserve"> PAGEREF _Toc242302484 \h </w:instrText>
             </w:r>
             <w:r>
               <w:rPr>
@@ -3568,7 +3568,7 @@
               <w:noProof/>
             </w:rPr>
           </w:pPr>
-          <w:hyperlink w:anchor="_Toc242295257" w:history="1">
+          <w:hyperlink w:anchor="_Toc242302485" w:history="1">
             <w:r>
               <w:rPr>
                 <w:rStyle w:val="Lienhypertexte"/>
@@ -3592,7 +3592,7 @@
               <w:rPr>
                 <w:noProof/>
               </w:rPr>
-              <w:instrText xml:space="preserve"> PAGEREF _Toc242295257 \h </w:instrText>
+              <w:instrText xml:space="preserve"> PAGEREF _Toc242302485 \h </w:instrText>
             </w:r>
             <w:r>
               <w:rPr>
@@ -3629,7 +3629,7 @@
               <w:noProof/>
             </w:rPr>
           </w:pPr>
-          <w:hyperlink w:anchor="_Toc242295258" w:history="1">
+          <w:hyperlink w:anchor="_Toc242302486" w:history="1">
             <w:r>
               <w:rPr>
                 <w:rStyle w:val="Lienhypertexte"/>
@@ -3653,7 +3653,7 @@
               <w:rPr>
                 <w:noProof/>
               </w:rPr>
-              <w:instrText xml:space="preserve"> PAGEREF _Toc242295258 \h </w:instrText>
+              <w:instrText xml:space="preserve"> PAGEREF _Toc242302486 \h </w:instrText>
             </w:r>
             <w:r>
               <w:rPr>
@@ -3690,7 +3690,7 @@
               <w:noProof/>
             </w:rPr>
           </w:pPr>
-          <w:hyperlink w:anchor="_Toc242295259" w:history="1">
+          <w:hyperlink w:anchor="_Toc242302487" w:history="1">
             <w:r>
               <w:rPr>
                 <w:rStyle w:val="Lienhypertexte"/>
@@ -3714,7 +3714,7 @@
               <w:rPr>
                 <w:noProof/>
               </w:rPr>
-              <w:instrText xml:space="preserve"> PAGEREF _Toc242295259 \h </w:instrText>
+              <w:instrText xml:space="preserve"> PAGEREF _Toc242302487 \h </w:instrText>
             </w:r>
             <w:r>
               <w:rPr>
@@ -3751,7 +3751,7 @@
               <w:noProof/>
             </w:rPr>
           </w:pPr>
-          <w:hyperlink w:anchor="_Toc242295260" w:history="1">
+          <w:hyperlink w:anchor="_Toc242302488" w:history="1">
             <w:r>
               <w:rPr>
                 <w:rStyle w:val="Lienhypertexte"/>
@@ -3775,7 +3775,7 @@
               <w:rPr>
                 <w:noProof/>
               </w:rPr>
-              <w:instrText xml:space="preserve"> PAGEREF _Toc242295260 \h </w:instrText>
+              <w:instrText xml:space="preserve"> PAGEREF _Toc242302488 \h </w:instrText>
             </w:r>
             <w:r>
               <w:rPr>
@@ -3812,7 +3812,7 @@
               <w:noProof/>
             </w:rPr>
           </w:pPr>
-          <w:hyperlink w:anchor="_Toc242295261" w:history="1">
+          <w:hyperlink w:anchor="_Toc242302489" w:history="1">
             <w:r>
               <w:rPr>
                 <w:rStyle w:val="Lienhypertexte"/>
@@ -3836,7 +3836,7 @@
               <w:rPr>
                 <w:noProof/>
               </w:rPr>
-              <w:instrText xml:space="preserve"> PAGEREF _Toc242295261 \h </w:instrText>
+              <w:instrText xml:space="preserve"> PAGEREF _Toc242302489 \h </w:instrText>
             </w:r>
             <w:r>
               <w:rPr>
@@ -3873,7 +3873,7 @@
               <w:noProof/>
             </w:rPr>
           </w:pPr>
-          <w:hyperlink w:anchor="_Toc242295262" w:history="1">
+          <w:hyperlink w:anchor="_Toc242302490" w:history="1">
             <w:r>
               <w:rPr>
                 <w:rStyle w:val="Lienhypertexte"/>
@@ -3897,7 +3897,7 @@
               <w:rPr>
                 <w:noProof/>
               </w:rPr>
-              <w:instrText xml:space="preserve"> PAGEREF _Toc242295262 \h </w:instrText>
+              <w:instrText xml:space="preserve"> PAGEREF _Toc242302490 \h </w:instrText>
             </w:r>
             <w:r>
               <w:rPr>
@@ -3934,7 +3934,7 @@
               <w:noProof/>
             </w:rPr>
           </w:pPr>
-          <w:hyperlink w:anchor="_Toc242295263" w:history="1">
+          <w:hyperlink w:anchor="_Toc242302491" w:history="1">
             <w:r>
               <w:rPr>
                 <w:rStyle w:val="Lienhypertexte"/>
@@ -3958,7 +3958,7 @@
               <w:rPr>
                 <w:noProof/>
               </w:rPr>
-              <w:instrText xml:space="preserve"> PAGEREF _Toc242295263 \h </w:instrText>
+              <w:instrText xml:space="preserve"> PAGEREF _Toc242302491 \h </w:instrText>
             </w:r>
             <w:r>
               <w:rPr>
@@ -3995,7 +3995,7 @@
               <w:noProof/>
             </w:rPr>
           </w:pPr>
-          <w:hyperlink w:anchor="_Toc242295264" w:history="1">
+          <w:hyperlink w:anchor="_Toc242302492" w:history="1">
             <w:r>
               <w:rPr>
                 <w:rStyle w:val="Lienhypertexte"/>
@@ -4019,7 +4019,7 @@
               <w:rPr>
                 <w:noProof/>
               </w:rPr>
-              <w:instrText xml:space="preserve"> PAGEREF _Toc242295264 \h </w:instrText>
+              <w:instrText xml:space="preserve"> PAGEREF _Toc242302492 \h </w:instrText>
             </w:r>
             <w:r>
               <w:rPr>
@@ -4056,7 +4056,7 @@
               <w:noProof/>
             </w:rPr>
           </w:pPr>
-          <w:hyperlink w:anchor="_Toc242295265" w:history="1">
+          <w:hyperlink w:anchor="_Toc242302493" w:history="1">
             <w:r>
               <w:rPr>
                 <w:rStyle w:val="Lienhypertexte"/>
@@ -4080,7 +4080,7 @@
               <w:rPr>
                 <w:noProof/>
               </w:rPr>
-              <w:instrText xml:space="preserve"> PAGEREF _Toc242295265 \h </w:instrText>
+              <w:instrText xml:space="preserve"> PAGEREF _Toc242302493 \h </w:instrText>
             </w:r>
             <w:r>
               <w:rPr>
@@ -4117,7 +4117,7 @@
               <w:noProof/>
             </w:rPr>
           </w:pPr>
-          <w:hyperlink w:anchor="_Toc242295266" w:history="1">
+          <w:hyperlink w:anchor="_Toc242302494" w:history="1">
             <w:r>
               <w:rPr>
                 <w:rStyle w:val="Lienhypertexte"/>
@@ -4141,7 +4141,7 @@
               <w:rPr>
                 <w:noProof/>
               </w:rPr>
-              <w:instrText xml:space="preserve"> PAGEREF _Toc242295266 \h </w:instrText>
+              <w:instrText xml:space="preserve"> PAGEREF _Toc242302494 \h </w:instrText>
             </w:r>
             <w:r>
               <w:rPr>
@@ -4178,7 +4178,7 @@
               <w:noProof/>
             </w:rPr>
           </w:pPr>
-          <w:hyperlink w:anchor="_Toc242295267" w:history="1">
+          <w:hyperlink w:anchor="_Toc242302495" w:history="1">
             <w:r>
               <w:rPr>
                 <w:rStyle w:val="Lienhypertexte"/>
@@ -4202,7 +4202,7 @@
               <w:rPr>
                 <w:noProof/>
               </w:rPr>
-              <w:instrText xml:space="preserve"> PAGEREF _Toc242295267 \h </w:instrText>
+              <w:instrText xml:space="preserve"> PAGEREF _Toc242302495 \h </w:instrText>
             </w:r>
             <w:r>
               <w:rPr>
@@ -4239,7 +4239,7 @@
               <w:noProof/>
             </w:rPr>
           </w:pPr>
-          <w:hyperlink w:anchor="_Toc242295268" w:history="1">
+          <w:hyperlink w:anchor="_Toc242302496" w:history="1">
             <w:r>
               <w:rPr>
                 <w:rStyle w:val="Lienhypertexte"/>
@@ -4263,7 +4263,7 @@
               <w:rPr>
                 <w:noProof/>
               </w:rPr>
-              <w:instrText xml:space="preserve"> PAGEREF _Toc242295268 \h </w:instrText>
+              <w:instrText xml:space="preserve"> PAGEREF _Toc242302496 \h </w:instrText>
             </w:r>
             <w:r>
               <w:rPr>
@@ -4300,7 +4300,7 @@
               <w:noProof/>
             </w:rPr>
           </w:pPr>
-          <w:hyperlink w:anchor="_Toc242295269" w:history="1">
+          <w:hyperlink w:anchor="_Toc242302497" w:history="1">
             <w:r>
               <w:rPr>
                 <w:rStyle w:val="Lienhypertexte"/>
@@ -4324,7 +4324,7 @@
               <w:rPr>
                 <w:noProof/>
               </w:rPr>
-              <w:instrText xml:space="preserve"> PAGEREF _Toc242295269 \h </w:instrText>
+              <w:instrText xml:space="preserve"> PAGEREF _Toc242302497 \h </w:instrText>
             </w:r>
             <w:r>
               <w:rPr>
@@ -4361,7 +4361,7 @@
               <w:noProof/>
             </w:rPr>
           </w:pPr>
-          <w:hyperlink w:anchor="_Toc242295270" w:history="1">
+          <w:hyperlink w:anchor="_Toc242302498" w:history="1">
             <w:r>
               <w:rPr>
                 <w:rStyle w:val="Lienhypertexte"/>
@@ -4385,7 +4385,7 @@
               <w:rPr>
                 <w:noProof/>
               </w:rPr>
-              <w:instrText xml:space="preserve"> PAGEREF _Toc242295270 \h </w:instrText>
+              <w:instrText xml:space="preserve"> PAGEREF _Toc242302498 \h </w:instrText>
             </w:r>
             <w:r>
               <w:rPr>
@@ -4422,7 +4422,7 @@
               <w:noProof/>
             </w:rPr>
           </w:pPr>
-          <w:hyperlink w:anchor="_Toc242295271" w:history="1">
+          <w:hyperlink w:anchor="_Toc242302499" w:history="1">
             <w:r>
               <w:rPr>
                 <w:rStyle w:val="Lienhypertexte"/>
@@ -4446,7 +4446,7 @@
               <w:rPr>
                 <w:noProof/>
               </w:rPr>
-              <w:instrText xml:space="preserve"> PAGEREF _Toc242295271 \h </w:instrText>
+              <w:instrText xml:space="preserve"> PAGEREF _Toc242302499 \h </w:instrText>
             </w:r>
             <w:r>
               <w:rPr>
@@ -4483,7 +4483,7 @@
               <w:noProof/>
             </w:rPr>
           </w:pPr>
-          <w:hyperlink w:anchor="_Toc242295272" w:history="1">
+          <w:hyperlink w:anchor="_Toc242302500" w:history="1">
             <w:r>
               <w:rPr>
                 <w:rStyle w:val="Lienhypertexte"/>
@@ -4507,7 +4507,7 @@
               <w:rPr>
                 <w:noProof/>
               </w:rPr>
-              <w:instrText xml:space="preserve"> PAGEREF _Toc242295272 \h </w:instrText>
+              <w:instrText xml:space="preserve"> PAGEREF _Toc242302500 \h </w:instrText>
             </w:r>
             <w:r>
               <w:rPr>
@@ -4544,7 +4544,7 @@
               <w:noProof/>
             </w:rPr>
           </w:pPr>
-          <w:hyperlink w:anchor="_Toc242295273" w:history="1">
+          <w:hyperlink w:anchor="_Toc242302501" w:history="1">
             <w:r>
               <w:rPr>
                 <w:rStyle w:val="Lienhypertexte"/>
@@ -4568,7 +4568,7 @@
               <w:rPr>
                 <w:noProof/>
               </w:rPr>
-              <w:instrText xml:space="preserve"> PAGEREF _Toc242295273 \h </w:instrText>
+              <w:instrText xml:space="preserve"> PAGEREF _Toc242302501 \h </w:instrText>
             </w:r>
             <w:r>
               <w:rPr>
@@ -4605,7 +4605,7 @@
               <w:noProof/>
             </w:rPr>
           </w:pPr>
-          <w:hyperlink w:anchor="_Toc242295274" w:history="1">
+          <w:hyperlink w:anchor="_Toc242302502" w:history="1">
             <w:r>
               <w:rPr>
                 <w:rStyle w:val="Lienhypertexte"/>
@@ -4629,7 +4629,7 @@
               <w:rPr>
                 <w:noProof/>
               </w:rPr>
-              <w:instrText xml:space="preserve"> PAGEREF _Toc242295274 \h </w:instrText>
+              <w:instrText xml:space="preserve"> PAGEREF _Toc242302502 \h </w:instrText>
             </w:r>
             <w:r>
               <w:rPr>
@@ -4666,7 +4666,7 @@
               <w:noProof/>
             </w:rPr>
           </w:pPr>
-          <w:hyperlink w:anchor="_Toc242295275" w:history="1">
+          <w:hyperlink w:anchor="_Toc242302503" w:history="1">
             <w:r>
               <w:rPr>
                 <w:rStyle w:val="Lienhypertexte"/>
@@ -4690,7 +4690,7 @@
               <w:rPr>
                 <w:noProof/>
               </w:rPr>
-              <w:instrText xml:space="preserve"> PAGEREF _Toc242295275 \h </w:instrText>
+              <w:instrText xml:space="preserve"> PAGEREF _Toc242302503 \h </w:instrText>
             </w:r>
             <w:r>
               <w:rPr>
@@ -4727,7 +4727,7 @@
               <w:noProof/>
             </w:rPr>
           </w:pPr>
-          <w:hyperlink w:anchor="_Toc242295276" w:history="1">
+          <w:hyperlink w:anchor="_Toc242302504" w:history="1">
             <w:r>
               <w:rPr>
                 <w:rStyle w:val="Lienhypertexte"/>
@@ -4751,7 +4751,7 @@
               <w:rPr>
                 <w:noProof/>
               </w:rPr>
-              <w:instrText xml:space="preserve"> PAGEREF _Toc242295276 \h </w:instrText>
+              <w:instrText xml:space="preserve"> PAGEREF _Toc242302504 \h </w:instrText>
             </w:r>
             <w:r>
               <w:rPr>
@@ -4788,7 +4788,7 @@
               <w:noProof/>
             </w:rPr>
           </w:pPr>
-          <w:hyperlink w:anchor="_Toc242295277" w:history="1">
+          <w:hyperlink w:anchor="_Toc242302505" w:history="1">
             <w:r>
               <w:rPr>
                 <w:rStyle w:val="Lienhypertexte"/>
@@ -4812,7 +4812,7 @@
               <w:rPr>
                 <w:noProof/>
               </w:rPr>
-              <w:instrText xml:space="preserve"> PAGEREF _Toc242295277 \h </w:instrText>
+              <w:instrText xml:space="preserve"> PAGEREF _Toc242302505 \h </w:instrText>
             </w:r>
             <w:r>
               <w:rPr>
@@ -4864,7 +4864,7 @@
         <w:pStyle w:val="Titre1"/>
         <w:pageBreakBefore/>
       </w:pPr>
-      <w:bookmarkStart w:id="0" w:name="_Toc242295202"/>
+      <w:bookmarkStart w:id="0" w:name="_Toc242302430"/>
       <w:r>
         <w:lastRenderedPageBreak/>
         <w:t>1. Comment utiliser ce manuel</w:t>
@@ -4876,7 +4876,7 @@
         <w:pStyle w:val="Titre2"/>
         <w:keepNext/>
       </w:pPr>
-      <w:bookmarkStart w:id="1" w:name="_Toc242295203"/>
+      <w:bookmarkStart w:id="1" w:name="_Toc242302431"/>
       <w:r>
         <w:t>1.1 À qui s'adresse-t-il ?</w:t>
       </w:r>
@@ -4923,7 +4923,7 @@
         <w:pStyle w:val="Titre2"/>
         <w:keepNext/>
       </w:pPr>
-      <w:bookmarkStart w:id="2" w:name="_Toc242295204"/>
+      <w:bookmarkStart w:id="2" w:name="_Toc242302432"/>
       <w:r>
         <w:t>1.2 Les profils</w:t>
       </w:r>
@@ -5921,7 +5921,7 @@
         <w:pStyle w:val="Titre2"/>
         <w:keepNext/>
       </w:pPr>
-      <w:bookmarkStart w:id="3" w:name="_Toc242295205"/>
+      <w:bookmarkStart w:id="3" w:name="_Toc242302433"/>
       <w:r>
         <w:t>1.3 Les comptes de formation</w:t>
       </w:r>
@@ -6909,7 +6909,7 @@
         <w:pStyle w:val="Titre2"/>
         <w:keepNext/>
       </w:pPr>
-      <w:bookmarkStart w:id="4" w:name="_Toc242295206"/>
+      <w:bookmarkStart w:id="4" w:name="_Toc242302434"/>
       <w:r>
         <w:t>1.4 Les encadrés</w:t>
       </w:r>
@@ -7118,7 +7118,7 @@
         <w:pStyle w:val="Titre1"/>
         <w:pageBreakBefore/>
       </w:pPr>
-      <w:bookmarkStart w:id="5" w:name="_Toc242295207"/>
+      <w:bookmarkStart w:id="5" w:name="_Toc242302435"/>
       <w:r>
         <w:lastRenderedPageBreak/>
         <w:t>2. Présentation de la plateforme</w:t>
@@ -7130,7 +7130,7 @@
         <w:pStyle w:val="Titre2"/>
         <w:keepNext/>
       </w:pPr>
-      <w:bookmarkStart w:id="6" w:name="_Toc242295208"/>
+      <w:bookmarkStart w:id="6" w:name="_Toc242302436"/>
       <w:r>
         <w:t>2.1 Deux espaces</w:t>
       </w:r>
@@ -7189,7 +7189,7 @@
         <w:pStyle w:val="Titre2"/>
         <w:keepNext/>
       </w:pPr>
-      <w:bookmarkStart w:id="7" w:name="_Toc242295209"/>
+      <w:bookmarkStart w:id="7" w:name="_Toc242302437"/>
       <w:r>
         <w:t>2.2 Le circuit de traitement d'un dossier</w:t>
       </w:r>
@@ -8383,7 +8383,7 @@
         <w:pStyle w:val="Titre2"/>
         <w:keepNext/>
       </w:pPr>
-      <w:bookmarkStart w:id="8" w:name="_Toc242295210"/>
+      <w:bookmarkStart w:id="8" w:name="_Toc242302438"/>
       <w:r>
         <w:t>2.3 Les règles à connaître</w:t>
       </w:r>
@@ -8703,7 +8703,7 @@
         <w:pStyle w:val="Titre1"/>
         <w:pageBreakBefore/>
       </w:pPr>
-      <w:bookmarkStart w:id="9" w:name="_Toc242295211"/>
+      <w:bookmarkStart w:id="9" w:name="_Toc242302439"/>
       <w:r>
         <w:lastRenderedPageBreak/>
         <w:t>3. Se connecter et se repérer</w:t>
@@ -8715,7 +8715,7 @@
         <w:pStyle w:val="Titre2"/>
         <w:keepNext/>
       </w:pPr>
-      <w:bookmarkStart w:id="10" w:name="_Toc242295212"/>
+      <w:bookmarkStart w:id="10" w:name="_Toc242302440"/>
       <w:r>
         <w:t>3.1 La connexion</w:t>
       </w:r>
@@ -8740,7 +8740,7 @@
           <w:noProof/>
         </w:rPr>
         <w:drawing>
-          <wp:inline distT="0" distB="0" distL="0" distR="0" wp14:anchorId="1766308D" wp14:editId="466154F5">
+          <wp:inline distT="0" distB="0" distL="0" distR="0" wp14:anchorId="50E65E65" wp14:editId="30C0284D">
             <wp:extent cx="4953000" cy="2886075"/>
             <wp:effectExtent l="0" t="0" r="0" b="0"/>
             <wp:docPr id="1" name="con-01-page-connexion" descr="La page de connexion (l'aspect peut varier légèrement selon l'installation)" title="La page de connexion (l'aspect peut varier légèrement selon l'installation)"/>
@@ -8945,7 +8945,7 @@
         <w:pStyle w:val="Titre2"/>
         <w:keepNext/>
       </w:pPr>
-      <w:bookmarkStart w:id="11" w:name="_Toc242295213"/>
+      <w:bookmarkStart w:id="11" w:name="_Toc242302441"/>
       <w:r>
         <w:lastRenderedPageBreak/>
         <w:t>3.2 L'écran de travail</w:t>
@@ -8963,7 +8963,7 @@
           <w:noProof/>
         </w:rPr>
         <w:drawing>
-          <wp:inline distT="0" distB="0" distL="0" distR="0" wp14:anchorId="1F051CA3" wp14:editId="222866B1">
+          <wp:inline distT="0" distB="0" distL="0" distR="0" wp14:anchorId="56D6E31E" wp14:editId="0CD3EB3D">
             <wp:extent cx="5810250" cy="3467100"/>
             <wp:effectExtent l="0" t="0" r="0" b="0"/>
             <wp:docPr id="2" name="adm-01-tableau-de-bord" descr="Le tableau de bord de l'administrateur" title="Le tableau de bord de l'administrateur"/>
@@ -9103,7 +9103,7 @@
         <w:pStyle w:val="Titre2"/>
         <w:keepNext/>
       </w:pPr>
-      <w:bookmarkStart w:id="12" w:name="_Toc242295214"/>
+      <w:bookmarkStart w:id="12" w:name="_Toc242302442"/>
       <w:r>
         <w:t>3.3 Le tableau de bord</w:t>
       </w:r>
@@ -9251,7 +9251,7 @@
         <w:pStyle w:val="Titre2"/>
         <w:keepNext/>
       </w:pPr>
-      <w:bookmarkStart w:id="13" w:name="_Toc242295215"/>
+      <w:bookmarkStart w:id="13" w:name="_Toc242302443"/>
       <w:r>
         <w:t>3.4 Votre profil, vos notifications, la déconnexion</w:t>
       </w:r>
@@ -9322,7 +9322,7 @@
         <w:pStyle w:val="Titre1"/>
         <w:pageBreakBefore/>
       </w:pPr>
-      <w:bookmarkStart w:id="14" w:name="_Toc242295216"/>
+      <w:bookmarkStart w:id="14" w:name="_Toc242302444"/>
       <w:r>
         <w:lastRenderedPageBreak/>
         <w:t>4. Profil citoyen : le portail public</w:t>
@@ -9342,7 +9342,7 @@
         <w:pStyle w:val="Titre2"/>
         <w:keepNext/>
       </w:pPr>
-      <w:bookmarkStart w:id="15" w:name="_Toc242295217"/>
+      <w:bookmarkStart w:id="15" w:name="_Toc242302445"/>
       <w:r>
         <w:t>4.1 L'accueil</w:t>
       </w:r>
@@ -9359,7 +9359,7 @@
           <w:noProof/>
         </w:rPr>
         <w:drawing>
-          <wp:inline distT="0" distB="0" distL="0" distR="0" wp14:anchorId="02F8671A" wp14:editId="0E97F8E9">
+          <wp:inline distT="0" distB="0" distL="0" distR="0" wp14:anchorId="38F447DF" wp14:editId="0E75FF25">
             <wp:extent cx="5334000" cy="3333750"/>
             <wp:effectExtent l="0" t="0" r="0" b="0"/>
             <wp:docPr id="3" name="por-01-accueil-haut" descr="L'accueil du portail" title="L'accueil du portail"/>
@@ -9539,7 +9539,7 @@
         </w:rPr>
         <w:lastRenderedPageBreak/>
         <w:drawing>
-          <wp:inline distT="0" distB="0" distL="0" distR="0" wp14:anchorId="7734B96B" wp14:editId="3CBA263F">
+          <wp:inline distT="0" distB="0" distL="0" distR="0" wp14:anchorId="5FC9ECB5" wp14:editId="608AB36B">
             <wp:extent cx="5334000" cy="2628900"/>
             <wp:effectExtent l="0" t="0" r="0" b="0"/>
             <wp:docPr id="4" name="por-02-accueil-chiffres" descr="La section « En chiffres » de l'accueil" title="La section « En chiffres » de l'accueil"/>
@@ -9633,7 +9633,7 @@
           <w:noProof/>
         </w:rPr>
         <w:drawing>
-          <wp:inline distT="0" distB="0" distL="0" distR="0" wp14:anchorId="4C5A19C6" wp14:editId="379BA76F">
+          <wp:inline distT="0" distB="0" distL="0" distR="0" wp14:anchorId="4411FDA4" wp14:editId="013C5A64">
             <wp:extent cx="5334000" cy="2152650"/>
             <wp:effectExtent l="0" t="0" r="0" b="0"/>
             <wp:docPr id="5" name="por-03-accueil-avant-de-signaler" descr="Les repères « Avant de signaler »" title="Les repères « Avant de signaler »"/>
@@ -9693,7 +9693,7 @@
         <w:pStyle w:val="Titre2"/>
         <w:keepNext/>
       </w:pPr>
-      <w:bookmarkStart w:id="16" w:name="_Toc242295218"/>
+      <w:bookmarkStart w:id="16" w:name="_Toc242302446"/>
       <w:r>
         <w:t>4.2 Déposer un signalement écrit</w:t>
       </w:r>
@@ -9738,7 +9738,7 @@
           <w:noProof/>
         </w:rPr>
         <w:drawing>
-          <wp:inline distT="0" distB="0" distL="0" distR="0" wp14:anchorId="69731361" wp14:editId="7EBB6A11">
+          <wp:inline distT="0" distB="0" distL="0" distR="0" wp14:anchorId="036471B1" wp14:editId="3F6A5218">
             <wp:extent cx="4953000" cy="5419725"/>
             <wp:effectExtent l="0" t="0" r="0" b="0"/>
             <wp:docPr id="6" name="por-14-depot-etape1-rempli" descr="Étape 1 du dépôt : décrire les faits" title="Étape 1 du dépôt : décrire les faits"/>
@@ -10010,7 +10010,7 @@
           <w:noProof/>
         </w:rPr>
         <w:drawing>
-          <wp:inline distT="0" distB="0" distL="0" distR="0" wp14:anchorId="76E11BB6" wp14:editId="34F119F7">
+          <wp:inline distT="0" distB="0" distL="0" distR="0" wp14:anchorId="6CDC29EE" wp14:editId="55418DCA">
             <wp:extent cx="4953000" cy="3867150"/>
             <wp:effectExtent l="0" t="0" r="0" b="0"/>
             <wp:docPr id="7" name="por-15-depot-etape2-identite" descr="Étape 2 du dépôt : choisir de s'identifier ou non" title="Étape 2 du dépôt : choisir de s'identifier ou non"/>
@@ -10210,7 +10210,7 @@
           <w:noProof/>
         </w:rPr>
         <w:drawing>
-          <wp:inline distT="0" distB="0" distL="0" distR="0" wp14:anchorId="207DF485" wp14:editId="1B1A595A">
+          <wp:inline distT="0" distB="0" distL="0" distR="0" wp14:anchorId="4EE961D0" wp14:editId="6A5A43D3">
             <wp:extent cx="4953000" cy="3019425"/>
             <wp:effectExtent l="0" t="0" r="0" b="0"/>
             <wp:docPr id="8" name="por-17-depot-etape3-confirmation" descr="Étape 3 du dépôt : relire et soumettre" title="Étape 3 du dépôt : relire et soumettre"/>
@@ -10303,7 +10303,7 @@
           <w:noProof/>
         </w:rPr>
         <w:drawing>
-          <wp:inline distT="0" distB="0" distL="0" distR="0" wp14:anchorId="5CE28CAA" wp14:editId="7A3B2DB8">
+          <wp:inline distT="0" distB="0" distL="0" distR="0" wp14:anchorId="23E8D8A2" wp14:editId="36CB96AB">
             <wp:extent cx="4953000" cy="3095625"/>
             <wp:effectExtent l="0" t="0" r="0" b="0"/>
             <wp:docPr id="9" name="por-18-depot-code-suivi" descr="Le code de suivi remis à la fin du dépôt" title="Le code de suivi remis à la fin du dépôt"/>
@@ -10439,7 +10439,7 @@
         <w:pStyle w:val="Titre2"/>
         <w:keepNext/>
       </w:pPr>
-      <w:bookmarkStart w:id="17" w:name="_Toc242295219"/>
+      <w:bookmarkStart w:id="17" w:name="_Toc242302447"/>
       <w:r>
         <w:lastRenderedPageBreak/>
         <w:t>4.3 Le témoignage vocal</w:t>
@@ -10465,7 +10465,7 @@
           <w:noProof/>
         </w:rPr>
         <w:drawing>
-          <wp:inline distT="0" distB="0" distL="0" distR="0" wp14:anchorId="4B55F57D" wp14:editId="3BB789D0">
+          <wp:inline distT="0" distB="0" distL="0" distR="0" wp14:anchorId="3B5FF377" wp14:editId="6B0BF1CC">
             <wp:extent cx="4953000" cy="3486150"/>
             <wp:effectExtent l="0" t="0" r="0" b="0"/>
             <wp:docPr id="10" name="por-21-vocal" descr="La page du témoignage vocal" title="La page du témoignage vocal"/>
@@ -10525,7 +10525,7 @@
         <w:pStyle w:val="Titre2"/>
         <w:keepNext/>
       </w:pPr>
-      <w:bookmarkStart w:id="18" w:name="_Toc242295220"/>
+      <w:bookmarkStart w:id="18" w:name="_Toc242302448"/>
       <w:r>
         <w:t>4.4 Suivre son dossier</w:t>
       </w:r>
@@ -10542,7 +10542,7 @@
           <w:noProof/>
         </w:rPr>
         <w:drawing>
-          <wp:inline distT="0" distB="0" distL="0" distR="0" wp14:anchorId="0B2EBC65" wp14:editId="1AFE1B47">
+          <wp:inline distT="0" distB="0" distL="0" distR="0" wp14:anchorId="44480995" wp14:editId="1AA47751">
             <wp:extent cx="4572000" cy="2857500"/>
             <wp:effectExtent l="0" t="0" r="0" b="0"/>
             <wp:docPr id="11" name="por-19-suivi-recherche" descr="Le suivi par code" title="Le suivi par code"/>
@@ -10627,7 +10627,7 @@
         </w:rPr>
         <w:lastRenderedPageBreak/>
         <w:drawing>
-          <wp:inline distT="0" distB="0" distL="0" distR="0" wp14:anchorId="21692931" wp14:editId="5A5E11B1">
+          <wp:inline distT="0" distB="0" distL="0" distR="0" wp14:anchorId="32821E44" wp14:editId="44CFE740">
             <wp:extent cx="4572000" cy="2505075"/>
             <wp:effectExtent l="0" t="0" r="0" b="0"/>
             <wp:docPr id="12" name="por-20-suivi-resultat" descr="Le suivi d'un dossier déposé" title="Le suivi d'un dossier déposé"/>
@@ -10763,7 +10763,7 @@
         <w:pStyle w:val="Titre2"/>
         <w:keepNext/>
       </w:pPr>
-      <w:bookmarkStart w:id="19" w:name="_Toc242295221"/>
+      <w:bookmarkStart w:id="19" w:name="_Toc242302449"/>
       <w:r>
         <w:t>4.5 La foire aux questions, les chiffres et les pages d'information</w:t>
       </w:r>
@@ -10780,7 +10780,7 @@
           <w:noProof/>
         </w:rPr>
         <w:drawing>
-          <wp:inline distT="0" distB="0" distL="0" distR="0" wp14:anchorId="65D9ABC9" wp14:editId="6AA01ADA">
+          <wp:inline distT="0" distB="0" distL="0" distR="0" wp14:anchorId="76E76634" wp14:editId="2648BE92">
             <wp:extent cx="4953000" cy="2943225"/>
             <wp:effectExtent l="0" t="0" r="0" b="0"/>
             <wp:docPr id="13" name="por-09-faq" descr="La foire aux questions" title="La foire aux questions"/>
@@ -10915,7 +10915,7 @@
         </w:rPr>
         <w:lastRenderedPageBreak/>
         <w:drawing>
-          <wp:inline distT="0" distB="0" distL="0" distR="0" wp14:anchorId="1B331F6C" wp14:editId="1349403D">
+          <wp:inline distT="0" distB="0" distL="0" distR="0" wp14:anchorId="4FC3AD3F" wp14:editId="20DA2B4C">
             <wp:extent cx="5334000" cy="3505200"/>
             <wp:effectExtent l="0" t="0" r="0" b="0"/>
             <wp:docPr id="14" name="por-10-chiffres" descr="La page des chiffres publics" title="La page des chiffres publics"/>
@@ -10975,7 +10975,7 @@
         <w:pStyle w:val="Titre2"/>
         <w:keepNext/>
       </w:pPr>
-      <w:bookmarkStart w:id="20" w:name="_Toc242295222"/>
+      <w:bookmarkStart w:id="20" w:name="_Toc242302450"/>
       <w:r>
         <w:t>4.6 Ce que les agents doivent répondre au public</w:t>
       </w:r>
@@ -11206,7 +11206,7 @@
         <w:pStyle w:val="Titre1"/>
         <w:pageBreakBefore/>
       </w:pPr>
-      <w:bookmarkStart w:id="21" w:name="_Toc242295223"/>
+      <w:bookmarkStart w:id="21" w:name="_Toc242302451"/>
       <w:r>
         <w:lastRenderedPageBreak/>
         <w:t>5. Profil agent du BRPD</w:t>
@@ -11246,7 +11246,7 @@
         <w:pStyle w:val="Titre2"/>
         <w:keepNext/>
       </w:pPr>
-      <w:bookmarkStart w:id="22" w:name="_Toc242295224"/>
+      <w:bookmarkStart w:id="22" w:name="_Toc242302452"/>
       <w:r>
         <w:t>5.1 Vos dossiers</w:t>
       </w:r>
@@ -11263,7 +11263,7 @@
           <w:noProof/>
         </w:rPr>
         <w:drawing>
-          <wp:inline distT="0" distB="0" distL="0" distR="0" wp14:anchorId="7C321B01" wp14:editId="2942F412">
+          <wp:inline distT="0" distB="0" distL="0" distR="0" wp14:anchorId="6CBBBB2E" wp14:editId="7908B2DE">
             <wp:extent cx="5810250" cy="3876675"/>
             <wp:effectExtent l="0" t="0" r="0" b="0"/>
             <wp:docPr id="15" name="brpd-02-liste-dossiers" descr="La liste des dossiers" title="La liste des dossiers"/>
@@ -11557,7 +11557,7 @@
         <w:pStyle w:val="Titre2"/>
         <w:keepNext/>
       </w:pPr>
-      <w:bookmarkStart w:id="23" w:name="_Toc242295225"/>
+      <w:bookmarkStart w:id="23" w:name="_Toc242302453"/>
       <w:r>
         <w:t>5.2 Saisir un dossier reçu par un autre canal</w:t>
       </w:r>
@@ -11593,7 +11593,7 @@
         </w:rPr>
         <w:lastRenderedPageBreak/>
         <w:drawing>
-          <wp:inline distT="0" distB="0" distL="0" distR="0" wp14:anchorId="089A1003" wp14:editId="196502C8">
+          <wp:inline distT="0" distB="0" distL="0" distR="0" wp14:anchorId="5DC2E2DC" wp14:editId="188607A3">
             <wp:extent cx="5810250" cy="4505325"/>
             <wp:effectExtent l="0" t="0" r="0" b="0"/>
             <wp:docPr id="16" name="brpd-07-nouveau-dossier-vide" descr="Nouveau dossier : étape 1, le dossier" title="Nouveau dossier : étape 1, le dossier"/>
@@ -11822,7 +11822,7 @@
         </w:rPr>
         <w:lastRenderedPageBreak/>
         <w:drawing>
-          <wp:inline distT="0" distB="0" distL="0" distR="0" wp14:anchorId="53287544" wp14:editId="52279DE6">
+          <wp:inline distT="0" distB="0" distL="0" distR="0" wp14:anchorId="68DFB966" wp14:editId="69D87F4E">
             <wp:extent cx="5810250" cy="4714875"/>
             <wp:effectExtent l="0" t="0" r="0" b="0"/>
             <wp:docPr id="17" name="brpd-09-nouveau-dossier-declarant" descr="Nouveau dossier : étape 2, le déclarant" title="Nouveau dossier : étape 2, le déclarant"/>
@@ -11976,7 +11976,7 @@
         <w:pStyle w:val="Titre2"/>
         <w:keepNext/>
       </w:pPr>
-      <w:bookmarkStart w:id="24" w:name="_Toc242295226"/>
+      <w:bookmarkStart w:id="24" w:name="_Toc242302454"/>
       <w:r>
         <w:t>5.3 Enregistrer un dépôt en ligne</w:t>
       </w:r>
@@ -12012,7 +12012,7 @@
         </w:rPr>
         <w:lastRenderedPageBreak/>
         <w:drawing>
-          <wp:inline distT="0" distB="0" distL="0" distR="0" wp14:anchorId="54E1657B" wp14:editId="65FF1339">
+          <wp:inline distT="0" distB="0" distL="0" distR="0" wp14:anchorId="3198B9D7" wp14:editId="4B1E332A">
             <wp:extent cx="5810250" cy="4505325"/>
             <wp:effectExtent l="0" t="0" r="0" b="0"/>
             <wp:docPr id="18" name="brpd-04-dossier-soumis" descr="La fiche d'un dossier « Soumis » : le bouton Enregistrer" title="La fiche d'un dossier « Soumis » : le bouton Enregistrer"/>
@@ -12191,7 +12191,7 @@
         </w:rPr>
         <w:lastRenderedPageBreak/>
         <w:drawing>
-          <wp:inline distT="0" distB="0" distL="0" distR="0" wp14:anchorId="05914EFF" wp14:editId="32904595">
+          <wp:inline distT="0" distB="0" distL="0" distR="0" wp14:anchorId="609DA5BA" wp14:editId="1AEBB7C0">
             <wp:extent cx="5810250" cy="4505325"/>
             <wp:effectExtent l="0" t="0" r="0" b="0"/>
             <wp:docPr id="19" name="brpd-05-enregistrer-dialogue" descr="La fenêtre d'enregistrement" title="La fenêtre d'enregistrement"/>
@@ -12395,7 +12395,7 @@
         <w:pStyle w:val="Titre2"/>
         <w:keepNext/>
       </w:pPr>
-      <w:bookmarkStart w:id="25" w:name="_Toc242295227"/>
+      <w:bookmarkStart w:id="25" w:name="_Toc242302455"/>
       <w:r>
         <w:t>5.4 Lire la fiche d'un dossier</w:t>
       </w:r>
@@ -12421,7 +12421,7 @@
         </w:rPr>
         <w:lastRenderedPageBreak/>
         <w:drawing>
-          <wp:inline distT="0" distB="0" distL="0" distR="0" wp14:anchorId="63CA40C4" wp14:editId="61237EA9">
+          <wp:inline distT="0" distB="0" distL="0" distR="0" wp14:anchorId="5FF4F8CB" wp14:editId="53F97EDA">
             <wp:extent cx="5810250" cy="6591300"/>
             <wp:effectExtent l="0" t="0" r="0" b="0"/>
             <wp:docPr id="20" name="adm-23-dossier-recevable" descr="La fiche d'un dossier en investigation" title="La fiche d'un dossier en investigation"/>
@@ -12661,7 +12661,7 @@
         <w:pStyle w:val="Titre2"/>
         <w:keepNext/>
       </w:pPr>
-      <w:bookmarkStart w:id="26" w:name="_Toc242295228"/>
+      <w:bookmarkStart w:id="26" w:name="_Toc242302456"/>
       <w:r>
         <w:lastRenderedPageBreak/>
         <w:t>5.5 Compléments d'information</w:t>
@@ -12711,7 +12711,7 @@
         <w:pStyle w:val="Titre2"/>
         <w:keepNext/>
       </w:pPr>
-      <w:bookmarkStart w:id="27" w:name="_Toc242295229"/>
+      <w:bookmarkStart w:id="27" w:name="_Toc242302457"/>
       <w:r>
         <w:t>5.6 Dépôt audio</w:t>
       </w:r>
@@ -12746,7 +12746,7 @@
           <w:noProof/>
         </w:rPr>
         <w:drawing>
-          <wp:inline distT="0" distB="0" distL="0" distR="0" wp14:anchorId="29BF02F8" wp14:editId="1FE1BB50">
+          <wp:inline distT="0" distB="0" distL="0" distR="0" wp14:anchorId="25845BBF" wp14:editId="61C06D1A">
             <wp:extent cx="5810250" cy="4714875"/>
             <wp:effectExtent l="0" t="0" r="0" b="0"/>
             <wp:docPr id="21" name="brpd-10-depot-audio" descr="La page de dépôt audio" title="La page de dépôt audio"/>
@@ -12806,7 +12806,7 @@
         <w:pStyle w:val="Titre2"/>
         <w:keepNext/>
       </w:pPr>
-      <w:bookmarkStart w:id="28" w:name="_Toc242295230"/>
+      <w:bookmarkStart w:id="28" w:name="_Toc242302458"/>
       <w:r>
         <w:t>5.7 Informations préoccupantes</w:t>
       </w:r>
@@ -12852,7 +12852,7 @@
         </w:rPr>
         <w:lastRenderedPageBreak/>
         <w:drawing>
-          <wp:inline distT="0" distB="0" distL="0" distR="0" wp14:anchorId="31DBB006" wp14:editId="53FCA65A">
+          <wp:inline distT="0" distB="0" distL="0" distR="0" wp14:anchorId="2E26598F" wp14:editId="104697FF">
             <wp:extent cx="5810250" cy="2724150"/>
             <wp:effectExtent l="0" t="0" r="0" b="0"/>
             <wp:docPr id="22" name="brpd-11-infos-preoccupantes" descr="La liste des informations préoccupantes" title="La liste des informations préoccupantes"/>
@@ -13148,7 +13148,7 @@
         <w:pStyle w:val="Titre1"/>
         <w:pageBreakBefore/>
       </w:pPr>
-      <w:bookmarkStart w:id="29" w:name="_Toc242295231"/>
+      <w:bookmarkStart w:id="29" w:name="_Toc242302459"/>
       <w:r>
         <w:lastRenderedPageBreak/>
         <w:t>6. Profil conseiller juridique</w:t>
@@ -13178,7 +13178,7 @@
         <w:pStyle w:val="Titre2"/>
         <w:keepNext/>
       </w:pPr>
-      <w:bookmarkStart w:id="30" w:name="_Toc242295232"/>
+      <w:bookmarkStart w:id="30" w:name="_Toc242302460"/>
       <w:r>
         <w:t>6.1 Vos dossiers</w:t>
       </w:r>
@@ -13195,7 +13195,7 @@
           <w:noProof/>
         </w:rPr>
         <w:drawing>
-          <wp:inline distT="0" distB="0" distL="0" distR="0" wp14:anchorId="1E86B22C" wp14:editId="306E15E8">
+          <wp:inline distT="0" distB="0" distL="0" distR="0" wp14:anchorId="7F41CB54" wp14:editId="1A22507A">
             <wp:extent cx="5810250" cy="3667125"/>
             <wp:effectExtent l="0" t="0" r="0" b="0"/>
             <wp:docPr id="23" name="cj-02-liste-dossiers" descr="La liste des dossiers du conseiller juridique" title="La liste des dossiers du conseiller juridique"/>
@@ -13273,7 +13273,7 @@
         <w:pStyle w:val="Titre2"/>
         <w:keepNext/>
       </w:pPr>
-      <w:bookmarkStart w:id="31" w:name="_Toc242295233"/>
+      <w:bookmarkStart w:id="31" w:name="_Toc242302461"/>
       <w:r>
         <w:t>6.2 Démarrer l'étude</w:t>
       </w:r>
@@ -13329,7 +13329,7 @@
         </w:rPr>
         <w:lastRenderedPageBreak/>
         <w:drawing>
-          <wp:inline distT="0" distB="0" distL="0" distR="0" wp14:anchorId="0A4B298B" wp14:editId="00857F2F">
+          <wp:inline distT="0" distB="0" distL="0" distR="0" wp14:anchorId="31760EA5" wp14:editId="191C9DDF">
             <wp:extent cx="5810250" cy="5238750"/>
             <wp:effectExtent l="0" t="0" r="0" b="0"/>
             <wp:docPr id="24" name="cj-03-dossier-en-etude" descr="La fiche d'un dossier en étude" title="La fiche d'un dossier en étude"/>
@@ -13447,7 +13447,7 @@
         <w:pStyle w:val="Titre2"/>
         <w:keepNext/>
       </w:pPr>
-      <w:bookmarkStart w:id="32" w:name="_Toc242295234"/>
+      <w:bookmarkStart w:id="32" w:name="_Toc242302462"/>
       <w:r>
         <w:t>6.3 Les onglets de la fiche</w:t>
       </w:r>
@@ -13464,7 +13464,7 @@
           <w:noProof/>
         </w:rPr>
         <w:drawing>
-          <wp:inline distT="0" distB="0" distL="0" distR="0" wp14:anchorId="1C6CDEB5" wp14:editId="17A874D0">
+          <wp:inline distT="0" distB="0" distL="0" distR="0" wp14:anchorId="79E123E3" wp14:editId="4D2ABE4A">
             <wp:extent cx="5334000" cy="1933575"/>
             <wp:effectExtent l="0" t="0" r="0" b="0"/>
             <wp:docPr id="25" name="cj-06-onglet-parties" descr="L'onglet « Parties visées »" title="L'onglet « Parties visées »"/>
@@ -13681,7 +13681,7 @@
           <w:noProof/>
         </w:rPr>
         <w:drawing>
-          <wp:inline distT="0" distB="0" distL="0" distR="0" wp14:anchorId="3496113D" wp14:editId="7C201FCB">
+          <wp:inline distT="0" distB="0" distL="0" distR="0" wp14:anchorId="7BD2FC6A" wp14:editId="682A5F0C">
             <wp:extent cx="5334000" cy="1638300"/>
             <wp:effectExtent l="0" t="0" r="0" b="0"/>
             <wp:docPr id="26" name="cj-08-onglet-observations" descr="L'onglet « Observations »" title="L'onglet « Observations »"/>
@@ -13747,7 +13747,7 @@
           <w:noProof/>
         </w:rPr>
         <w:drawing>
-          <wp:inline distT="0" distB="0" distL="0" distR="0" wp14:anchorId="7770B401" wp14:editId="39B67955">
+          <wp:inline distT="0" distB="0" distL="0" distR="0" wp14:anchorId="3C8D48F8" wp14:editId="1335245E">
             <wp:extent cx="5334000" cy="3362325"/>
             <wp:effectExtent l="0" t="0" r="0" b="0"/>
             <wp:docPr id="27" name="cj-13-ajouter-observation" descr="Ajouter une observation" title="Ajouter une observation"/>
@@ -13807,7 +13807,7 @@
         <w:pStyle w:val="Titre2"/>
         <w:keepNext/>
       </w:pPr>
-      <w:bookmarkStart w:id="33" w:name="_Toc242295235"/>
+      <w:bookmarkStart w:id="33" w:name="_Toc242302463"/>
       <w:r>
         <w:t>6.4 L'étude d'opportunité</w:t>
       </w:r>
@@ -13853,7 +13853,7 @@
         </w:rPr>
         <w:lastRenderedPageBreak/>
         <w:drawing>
-          <wp:inline distT="0" distB="0" distL="0" distR="0" wp14:anchorId="28598C2B" wp14:editId="0E6322BE">
+          <wp:inline distT="0" distB="0" distL="0" distR="0" wp14:anchorId="78C0EE8E" wp14:editId="1C8CB792">
             <wp:extent cx="4953000" cy="1800225"/>
             <wp:effectExtent l="0" t="0" r="0" b="0"/>
             <wp:docPr id="28" name="cj-11-onglet-analyse" descr="L'onglet « Analyse » avant la création de l'étude" title="L'onglet « Analyse » avant la création de l'étude"/>
@@ -13919,7 +13919,7 @@
           <w:noProof/>
         </w:rPr>
         <w:drawing>
-          <wp:inline distT="0" distB="0" distL="0" distR="0" wp14:anchorId="0C3893B1" wp14:editId="71869768">
+          <wp:inline distT="0" distB="0" distL="0" distR="0" wp14:anchorId="5D6B2ACA" wp14:editId="73555D8C">
             <wp:extent cx="5810250" cy="4505325"/>
             <wp:effectExtent l="0" t="0" r="0" b="0"/>
             <wp:docPr id="29" name="cj-12-etude-opportunite-dialogue" descr="La fiche d'analyse première" title="La fiche d'analyse première"/>
@@ -14271,7 +14271,7 @@
         <w:pStyle w:val="Titre2"/>
         <w:keepNext/>
       </w:pPr>
-      <w:bookmarkStart w:id="34" w:name="_Toc242295236"/>
+      <w:bookmarkStart w:id="34" w:name="_Toc242302464"/>
       <w:r>
         <w:t>6.5 Demander un complément d'information</w:t>
       </w:r>
@@ -14288,7 +14288,7 @@
           <w:noProof/>
         </w:rPr>
         <w:drawing>
-          <wp:inline distT="0" distB="0" distL="0" distR="0" wp14:anchorId="536B7421" wp14:editId="5C52FFDC">
+          <wp:inline distT="0" distB="0" distL="0" distR="0" wp14:anchorId="2CF2BFB8" wp14:editId="77B1B30F">
             <wp:extent cx="5810250" cy="4505325"/>
             <wp:effectExtent l="0" t="0" r="0" b="0"/>
             <wp:docPr id="30" name="cj-04-demander-complement" descr="La demande de complément au déclarant" title="La demande de complément au déclarant"/>
@@ -14417,7 +14417,7 @@
         <w:pStyle w:val="Titre2"/>
         <w:keepNext/>
       </w:pPr>
-      <w:bookmarkStart w:id="35" w:name="_Toc242295237"/>
+      <w:bookmarkStart w:id="35" w:name="_Toc242302465"/>
       <w:r>
         <w:lastRenderedPageBreak/>
         <w:t>6.6 Soumettre au comité (CTADP)</w:t>
@@ -14435,7 +14435,7 @@
           <w:noProof/>
         </w:rPr>
         <w:drawing>
-          <wp:inline distT="0" distB="0" distL="0" distR="0" wp14:anchorId="772E8E02" wp14:editId="500AE2EE">
+          <wp:inline distT="0" distB="0" distL="0" distR="0" wp14:anchorId="772F2FA5" wp14:editId="6843CE0A">
             <wp:extent cx="5810250" cy="4505325"/>
             <wp:effectExtent l="0" t="0" r="0" b="0"/>
             <wp:docPr id="31" name="cj-05-soumettre-ctadp" descr="La soumission au comité" title="La soumission au comité"/>
@@ -14719,7 +14719,7 @@
         <w:pStyle w:val="Titre1"/>
         <w:pageBreakBefore/>
       </w:pPr>
-      <w:bookmarkStart w:id="36" w:name="_Toc242295238"/>
+      <w:bookmarkStart w:id="36" w:name="_Toc242302466"/>
       <w:r>
         <w:lastRenderedPageBreak/>
         <w:t>7. Profil CGEA</w:t>
@@ -14759,7 +14759,7 @@
         <w:pStyle w:val="Titre2"/>
         <w:keepNext/>
       </w:pPr>
-      <w:bookmarkStart w:id="37" w:name="_Toc242295239"/>
+      <w:bookmarkStart w:id="37" w:name="_Toc242302467"/>
       <w:r>
         <w:t>7.1 Votre tableau de bord</w:t>
       </w:r>
@@ -14776,7 +14776,7 @@
           <w:noProof/>
         </w:rPr>
         <w:drawing>
-          <wp:inline distT="0" distB="0" distL="0" distR="0" wp14:anchorId="4CB09635" wp14:editId="2D7F4F9D">
+          <wp:inline distT="0" distB="0" distL="0" distR="0" wp14:anchorId="0C4454A4" wp14:editId="346FC67C">
             <wp:extent cx="5810250" cy="4505325"/>
             <wp:effectExtent l="0" t="0" r="0" b="0"/>
             <wp:docPr id="32" name="cgea-01-tableau-de-bord" descr="Le tableau de bord du CGEA" title="Le tableau de bord du CGEA"/>
@@ -14854,7 +14854,7 @@
         <w:pStyle w:val="Titre2"/>
         <w:keepNext/>
       </w:pPr>
-      <w:bookmarkStart w:id="38" w:name="_Toc242295240"/>
+      <w:bookmarkStart w:id="38" w:name="_Toc242302468"/>
       <w:r>
         <w:t>7.2 Affecter un dossier</w:t>
       </w:r>
@@ -14890,7 +14890,7 @@
         </w:rPr>
         <w:lastRenderedPageBreak/>
         <w:drawing>
-          <wp:inline distT="0" distB="0" distL="0" distR="0" wp14:anchorId="081E0425" wp14:editId="0291A536">
+          <wp:inline distT="0" distB="0" distL="0" distR="0" wp14:anchorId="3F1E51A6" wp14:editId="092F158A">
             <wp:extent cx="5334000" cy="2752725"/>
             <wp:effectExtent l="0" t="0" r="0" b="0"/>
             <wp:docPr id="33" name="cge-06-onglet-affectation" descr="L'onglet « Affectation » : décision du CGE puis affectation du CGEA" title="L'onglet « Affectation » : décision du CGE puis affectation du CGEA"/>
@@ -15117,7 +15117,7 @@
         <w:pStyle w:val="Titre2"/>
         <w:keepNext/>
       </w:pPr>
-      <w:bookmarkStart w:id="39" w:name="_Toc242295241"/>
+      <w:bookmarkStart w:id="39" w:name="_Toc242302469"/>
       <w:r>
         <w:t>7.3 Les séances du comité (CTADP)</w:t>
       </w:r>
@@ -15134,7 +15134,7 @@
           <w:noProof/>
         </w:rPr>
         <w:drawing>
-          <wp:inline distT="0" distB="0" distL="0" distR="0" wp14:anchorId="287BAAB6" wp14:editId="2B50D466">
+          <wp:inline distT="0" distB="0" distL="0" distR="0" wp14:anchorId="6E5A0681" wp14:editId="0EB8659F">
             <wp:extent cx="5810250" cy="2200275"/>
             <wp:effectExtent l="0" t="0" r="0" b="0"/>
             <wp:docPr id="34" name="cgea-02-seances" descr="La liste des séances du comité" title="La liste des séances du comité"/>
@@ -15210,7 +15210,7 @@
           <w:noProof/>
         </w:rPr>
         <w:drawing>
-          <wp:inline distT="0" distB="0" distL="0" distR="0" wp14:anchorId="56F11416" wp14:editId="799C7152">
+          <wp:inline distT="0" distB="0" distL="0" distR="0" wp14:anchorId="531F47D2" wp14:editId="721332EE">
             <wp:extent cx="5810250" cy="4505325"/>
             <wp:effectExtent l="0" t="0" r="0" b="0"/>
             <wp:docPr id="35" name="cgea-03-nouvelle-seance" descr="La création d'une séance" title="La création d'une séance"/>
@@ -15362,7 +15362,7 @@
           <w:noProof/>
         </w:rPr>
         <w:drawing>
-          <wp:inline distT="0" distB="0" distL="0" distR="0" wp14:anchorId="01B4551F" wp14:editId="7E324353">
+          <wp:inline distT="0" distB="0" distL="0" distR="0" wp14:anchorId="6595C706" wp14:editId="3E01270B">
             <wp:extent cx="5810250" cy="3667125"/>
             <wp:effectExtent l="0" t="0" r="0" b="0"/>
             <wp:docPr id="36" name="cgea-04-seance-detail" descr="Le détail d'une séance" title="Le détail d'une séance"/>
@@ -15502,7 +15502,7 @@
         </w:rPr>
         <w:lastRenderedPageBreak/>
         <w:drawing>
-          <wp:inline distT="0" distB="0" distL="0" distR="0" wp14:anchorId="694DC8C7" wp14:editId="681C7459">
+          <wp:inline distT="0" distB="0" distL="0" distR="0" wp14:anchorId="4D43A01F" wp14:editId="366297E9">
             <wp:extent cx="5810250" cy="4505325"/>
             <wp:effectExtent l="0" t="0" r="0" b="0"/>
             <wp:docPr id="37" name="cgea-07-seance-ajouter-dossier" descr="Ajouter un dossier à la séance" title="Ajouter un dossier à la séance"/>
@@ -15578,7 +15578,7 @@
           <w:noProof/>
         </w:rPr>
         <w:drawing>
-          <wp:inline distT="0" distB="0" distL="0" distR="0" wp14:anchorId="26A8766A" wp14:editId="27D3928E">
+          <wp:inline distT="0" distB="0" distL="0" distR="0" wp14:anchorId="7F6A8687" wp14:editId="34B7F4C9">
             <wp:extent cx="5810250" cy="4505325"/>
             <wp:effectExtent l="0" t="0" r="0" b="0"/>
             <wp:docPr id="38" name="cgea-08-seance-tenir" descr="La fenêtre « Tenir la séance »" title="La fenêtre « Tenir la séance »"/>
@@ -15762,7 +15762,7 @@
         <w:pStyle w:val="Titre2"/>
         <w:keepNext/>
       </w:pPr>
-      <w:bookmarkStart w:id="40" w:name="_Toc242295242"/>
+      <w:bookmarkStart w:id="40" w:name="_Toc242302470"/>
       <w:r>
         <w:t>7.4 Ouvrir une enquête</w:t>
       </w:r>
@@ -15897,7 +15897,7 @@
         <w:pStyle w:val="Titre2"/>
         <w:keepNext/>
       </w:pPr>
-      <w:bookmarkStart w:id="41" w:name="_Toc242295243"/>
+      <w:bookmarkStart w:id="41" w:name="_Toc242302471"/>
       <w:r>
         <w:lastRenderedPageBreak/>
         <w:t>7.5 Transférer, clôturer</w:t>
@@ -15957,7 +15957,7 @@
         <w:pStyle w:val="Titre2"/>
         <w:keepNext/>
       </w:pPr>
-      <w:bookmarkStart w:id="42" w:name="_Toc242295244"/>
+      <w:bookmarkStart w:id="42" w:name="_Toc242302472"/>
       <w:r>
         <w:t>7.6 Surveiller les retards</w:t>
       </w:r>
@@ -15974,7 +15974,7 @@
           <w:noProof/>
         </w:rPr>
         <w:drawing>
-          <wp:inline distT="0" distB="0" distL="0" distR="0" wp14:anchorId="7AAA2773" wp14:editId="6CB86D1F">
+          <wp:inline distT="0" distB="0" distL="0" distR="0" wp14:anchorId="103693B8" wp14:editId="18CDC560">
             <wp:extent cx="5810250" cy="4505325"/>
             <wp:effectExtent l="0" t="0" r="0" b="0"/>
             <wp:docPr id="39" name="adm-15-depassements" descr="Les dépassements par acteur" title="Les dépassements par acteur"/>
@@ -16318,7 +16318,7 @@
         <w:pStyle w:val="Titre1"/>
         <w:pageBreakBefore/>
       </w:pPr>
-      <w:bookmarkStart w:id="43" w:name="_Toc242295245"/>
+      <w:bookmarkStart w:id="43" w:name="_Toc242302473"/>
       <w:r>
         <w:lastRenderedPageBreak/>
         <w:t>8. Profil CGE</w:t>
@@ -16348,7 +16348,7 @@
         <w:pStyle w:val="Titre2"/>
         <w:keepNext/>
       </w:pPr>
-      <w:bookmarkStart w:id="44" w:name="_Toc242295246"/>
+      <w:bookmarkStart w:id="44" w:name="_Toc242302474"/>
       <w:r>
         <w:t>8.1 Votre tableau de bord</w:t>
       </w:r>
@@ -16365,7 +16365,7 @@
           <w:noProof/>
         </w:rPr>
         <w:drawing>
-          <wp:inline distT="0" distB="0" distL="0" distR="0" wp14:anchorId="7A3F3253" wp14:editId="657A81ED">
+          <wp:inline distT="0" distB="0" distL="0" distR="0" wp14:anchorId="2919AAF3" wp14:editId="58BFF329">
             <wp:extent cx="5810250" cy="4505325"/>
             <wp:effectExtent l="0" t="0" r="0" b="0"/>
             <wp:docPr id="40" name="cge-01-tableau-de-bord" descr="Le tableau de bord du CGE" title="Le tableau de bord du CGE"/>
@@ -16425,7 +16425,7 @@
         <w:pStyle w:val="Titre2"/>
         <w:keepNext/>
       </w:pPr>
-      <w:bookmarkStart w:id="45" w:name="_Toc242295247"/>
+      <w:bookmarkStart w:id="45" w:name="_Toc242302475"/>
       <w:r>
         <w:t>8.2 Déclarer un dossier recevable ou irrecevable</w:t>
       </w:r>
@@ -16461,7 +16461,7 @@
         </w:rPr>
         <w:lastRenderedPageBreak/>
         <w:drawing>
-          <wp:inline distT="0" distB="0" distL="0" distR="0" wp14:anchorId="27D750F8" wp14:editId="0A49F4D7">
+          <wp:inline distT="0" distB="0" distL="0" distR="0" wp14:anchorId="56E03F4A" wp14:editId="73E8DA17">
             <wp:extent cx="5810250" cy="2933700"/>
             <wp:effectExtent l="0" t="0" r="0" b="0"/>
             <wp:docPr id="41" name="cge-02-dossier-ctadp" descr="La fiche d'un dossier en revue CTADP" title="La fiche d'un dossier en revue CTADP"/>
@@ -16527,7 +16527,7 @@
           <w:noProof/>
         </w:rPr>
         <w:drawing>
-          <wp:inline distT="0" distB="0" distL="0" distR="0" wp14:anchorId="52429F2A" wp14:editId="60E0FDE6">
+          <wp:inline distT="0" distB="0" distL="0" distR="0" wp14:anchorId="470386E3" wp14:editId="6D5A86E8">
             <wp:extent cx="5810250" cy="4505325"/>
             <wp:effectExtent l="0" t="0" r="0" b="0"/>
             <wp:docPr id="42" name="cge-03-declarer-recevable" descr="La décision « Déclarer recevable »" title="La décision « Déclarer recevable »"/>
@@ -16734,7 +16734,7 @@
         <w:pStyle w:val="Titre2"/>
         <w:keepNext/>
       </w:pPr>
-      <w:bookmarkStart w:id="46" w:name="_Toc242295248"/>
+      <w:bookmarkStart w:id="46" w:name="_Toc242302476"/>
       <w:r>
         <w:t>8.3 Fixer la priorité</w:t>
       </w:r>
@@ -16751,7 +16751,7 @@
           <w:noProof/>
         </w:rPr>
         <w:drawing>
-          <wp:inline distT="0" distB="0" distL="0" distR="0" wp14:anchorId="3279531F" wp14:editId="73769BAF">
+          <wp:inline distT="0" distB="0" distL="0" distR="0" wp14:anchorId="44F66752" wp14:editId="3BE68424">
             <wp:extent cx="5810250" cy="4505325"/>
             <wp:effectExtent l="0" t="0" r="0" b="0"/>
             <wp:docPr id="43" name="cge-04-priorite" descr="La fenêtre de priorité" title="La fenêtre de priorité"/>
@@ -16869,7 +16869,7 @@
         <w:pStyle w:val="Titre2"/>
         <w:keepNext/>
       </w:pPr>
-      <w:bookmarkStart w:id="47" w:name="_Toc242295249"/>
+      <w:bookmarkStart w:id="47" w:name="_Toc242302477"/>
       <w:r>
         <w:lastRenderedPageBreak/>
         <w:t>8.4 Protéger un dossier : la confidentialité</w:t>
@@ -16887,7 +16887,7 @@
           <w:noProof/>
         </w:rPr>
         <w:drawing>
-          <wp:inline distT="0" distB="0" distL="0" distR="0" wp14:anchorId="283F7718" wp14:editId="25C8AA90">
+          <wp:inline distT="0" distB="0" distL="0" distR="0" wp14:anchorId="15681A45" wp14:editId="55C47D97">
             <wp:extent cx="5810250" cy="4505325"/>
             <wp:effectExtent l="0" t="0" r="0" b="0"/>
             <wp:docPr id="44" name="cge-05-confidentiel" descr="Marquer un dossier confidentiel" title="Marquer un dossier confidentiel"/>
@@ -16972,7 +16972,7 @@
         <w:pStyle w:val="Titre2"/>
         <w:keepNext/>
       </w:pPr>
-      <w:bookmarkStart w:id="48" w:name="_Toc242295250"/>
+      <w:bookmarkStart w:id="48" w:name="_Toc242302478"/>
       <w:r>
         <w:lastRenderedPageBreak/>
         <w:t>8.5 Les onglets d'analyse et d'affectation</w:t>
@@ -16990,7 +16990,7 @@
           <w:noProof/>
         </w:rPr>
         <w:drawing>
-          <wp:inline distT="0" distB="0" distL="0" distR="0" wp14:anchorId="1E441DCC" wp14:editId="3637D987">
+          <wp:inline distT="0" distB="0" distL="0" distR="0" wp14:anchorId="6E12F05B" wp14:editId="679BBF7A">
             <wp:extent cx="5334000" cy="5210175"/>
             <wp:effectExtent l="0" t="0" r="0" b="0"/>
             <wp:docPr id="45" name="cge-07-onglet-analyse" descr="L'onglet « Analyse » vu par le CGE" title="L'onglet « Analyse » vu par le CGE"/>
@@ -17078,7 +17078,7 @@
         <w:pStyle w:val="Titre2"/>
         <w:keepNext/>
       </w:pPr>
-      <w:bookmarkStart w:id="49" w:name="_Toc242295251"/>
+      <w:bookmarkStart w:id="49" w:name="_Toc242302479"/>
       <w:r>
         <w:t>8.6 Décision finale et quitus</w:t>
       </w:r>
@@ -17147,7 +17147,7 @@
         <w:pStyle w:val="Titre2"/>
         <w:keepNext/>
       </w:pPr>
-      <w:bookmarkStart w:id="50" w:name="_Toc242295252"/>
+      <w:bookmarkStart w:id="50" w:name="_Toc242302480"/>
       <w:r>
         <w:t>8.7 Gérer les agents</w:t>
       </w:r>
@@ -17442,7 +17442,7 @@
         <w:pStyle w:val="Titre1"/>
         <w:pageBreakBefore/>
       </w:pPr>
-      <w:bookmarkStart w:id="51" w:name="_Toc242295253"/>
+      <w:bookmarkStart w:id="51" w:name="_Toc242302481"/>
       <w:r>
         <w:lastRenderedPageBreak/>
         <w:t>9. Profil membre du comité (CTADP)</w:t>
@@ -17482,7 +17482,7 @@
         <w:pStyle w:val="Titre2"/>
         <w:keepNext/>
       </w:pPr>
-      <w:bookmarkStart w:id="52" w:name="_Toc242295254"/>
+      <w:bookmarkStart w:id="52" w:name="_Toc242302482"/>
       <w:r>
         <w:t>9.1 Votre espace</w:t>
       </w:r>
@@ -17499,7 +17499,7 @@
           <w:noProof/>
         </w:rPr>
         <w:drawing>
-          <wp:inline distT="0" distB="0" distL="0" distR="0" wp14:anchorId="17A0CF49" wp14:editId="0F3CE2B0">
+          <wp:inline distT="0" distB="0" distL="0" distR="0" wp14:anchorId="5D0DA53A" wp14:editId="6F889036">
             <wp:extent cx="5810250" cy="4505325"/>
             <wp:effectExtent l="0" t="0" r="0" b="0"/>
             <wp:docPr id="46" name="ctadp-01-tableau-de-bord" descr="Le tableau de bord du membre du comité" title="Le tableau de bord du membre du comité"/>
@@ -17577,7 +17577,7 @@
         <w:pStyle w:val="Titre2"/>
         <w:keepNext/>
       </w:pPr>
-      <w:bookmarkStart w:id="53" w:name="_Toc242295255"/>
+      <w:bookmarkStart w:id="53" w:name="_Toc242302483"/>
       <w:r>
         <w:lastRenderedPageBreak/>
         <w:t>9.2 Les séances</w:t>
@@ -17595,7 +17595,7 @@
           <w:noProof/>
         </w:rPr>
         <w:drawing>
-          <wp:inline distT="0" distB="0" distL="0" distR="0" wp14:anchorId="2DD13223" wp14:editId="4D7D2508">
+          <wp:inline distT="0" distB="0" distL="0" distR="0" wp14:anchorId="65116844" wp14:editId="67D9F442">
             <wp:extent cx="5810250" cy="2200275"/>
             <wp:effectExtent l="0" t="0" r="0" b="0"/>
             <wp:docPr id="47" name="ctadp-02-seances" descr="La liste des séances" title="La liste des séances"/>
@@ -17695,7 +17695,7 @@
           <w:noProof/>
         </w:rPr>
         <w:drawing>
-          <wp:inline distT="0" distB="0" distL="0" distR="0" wp14:anchorId="55028636" wp14:editId="5CE3AB71">
+          <wp:inline distT="0" distB="0" distL="0" distR="0" wp14:anchorId="2F7C75F9" wp14:editId="54C69DCF">
             <wp:extent cx="5810250" cy="3667125"/>
             <wp:effectExtent l="0" t="0" r="0" b="0"/>
             <wp:docPr id="48" name="ctadp-03-seance-detail" descr="Le détail d'une séance" title="Le détail d'une séance"/>
@@ -17755,7 +17755,7 @@
         <w:pStyle w:val="Titre2"/>
         <w:keepNext/>
       </w:pPr>
-      <w:bookmarkStart w:id="54" w:name="_Toc242295256"/>
+      <w:bookmarkStart w:id="54" w:name="_Toc242302484"/>
       <w:r>
         <w:t>9.3 Ce que vous pouvez faire sur un dossier</w:t>
       </w:r>
@@ -18035,7 +18035,7 @@
         <w:pStyle w:val="Titre1"/>
         <w:pageBreakBefore/>
       </w:pPr>
-      <w:bookmarkStart w:id="55" w:name="_Toc242295257"/>
+      <w:bookmarkStart w:id="55" w:name="_Toc242302485"/>
       <w:r>
         <w:lastRenderedPageBreak/>
         <w:t>10. Profil contrôleur d'État (enquêteur)</w:t>
@@ -18065,7 +18065,7 @@
         <w:pStyle w:val="Titre2"/>
         <w:keepNext/>
       </w:pPr>
-      <w:bookmarkStart w:id="56" w:name="_Toc242295258"/>
+      <w:bookmarkStart w:id="56" w:name="_Toc242302486"/>
       <w:r>
         <w:t>10.1 Vos enquêtes</w:t>
       </w:r>
@@ -18082,7 +18082,7 @@
           <w:noProof/>
         </w:rPr>
         <w:drawing>
-          <wp:inline distT="0" distB="0" distL="0" distR="0" wp14:anchorId="2535087C" wp14:editId="7E934F3D">
+          <wp:inline distT="0" distB="0" distL="0" distR="0" wp14:anchorId="62A0EB8F" wp14:editId="5279B33A">
             <wp:extent cx="5810250" cy="2724150"/>
             <wp:effectExtent l="0" t="0" r="0" b="0"/>
             <wp:docPr id="49" name="ce-02-enquetes-liste" descr="La liste des enquêtes" title="La liste des enquêtes"/>
@@ -18281,7 +18281,7 @@
         <w:pStyle w:val="Titre2"/>
         <w:keepNext/>
       </w:pPr>
-      <w:bookmarkStart w:id="57" w:name="_Toc242295259"/>
+      <w:bookmarkStart w:id="57" w:name="_Toc242302487"/>
       <w:r>
         <w:t>10.2 Avant de commencer : l'engagement préalable</w:t>
       </w:r>
@@ -18320,7 +18320,7 @@
         <w:pStyle w:val="Titre2"/>
         <w:keepNext/>
       </w:pPr>
-      <w:bookmarkStart w:id="58" w:name="_Toc242295260"/>
+      <w:bookmarkStart w:id="58" w:name="_Toc242302488"/>
       <w:r>
         <w:lastRenderedPageBreak/>
         <w:t>10.3 La page d'une enquête</w:t>
@@ -18338,7 +18338,7 @@
           <w:noProof/>
         </w:rPr>
         <w:drawing>
-          <wp:inline distT="0" distB="0" distL="0" distR="0" wp14:anchorId="7453E153" wp14:editId="50F82B42">
+          <wp:inline distT="0" distB="0" distL="0" distR="0" wp14:anchorId="21DD8F97" wp14:editId="4BDA4D53">
             <wp:extent cx="5076825" cy="6858000"/>
             <wp:effectExtent l="0" t="0" r="0" b="0"/>
             <wp:docPr id="50" name="ce-03-enquete-detail" descr="La page d'une enquête" title="La page d'une enquête"/>
@@ -18690,78 +18690,20 @@
         <w:t xml:space="preserve"> : chef de mission, investigateurs, personnes ressources.</w:t>
       </w:r>
     </w:p>
-    <w:tbl>
-      <w:tblPr>
-        <w:tblW w:w="9638" w:type="dxa"/>
-        <w:tblBorders>
-          <w:top w:val="single" w:sz="4" w:space="0" w:color="auto"/>
-          <w:left w:val="single" w:sz="4" w:space="0" w:color="auto"/>
-          <w:bottom w:val="single" w:sz="4" w:space="0" w:color="auto"/>
-          <w:right w:val="single" w:sz="4" w:space="0" w:color="auto"/>
-          <w:insideH w:val="single" w:sz="4" w:space="0" w:color="auto"/>
-          <w:insideV w:val="single" w:sz="4" w:space="0" w:color="auto"/>
-        </w:tblBorders>
-        <w:tblLook w:val="04A0" w:firstRow="1" w:lastRow="0" w:firstColumn="1" w:lastColumn="0" w:noHBand="0" w:noVBand="1"/>
-      </w:tblPr>
-      <w:tblGrid>
-        <w:gridCol w:w="9638"/>
-      </w:tblGrid>
-      <w:tr>
-        <w:trPr>
-          <w:cantSplit/>
-        </w:trPr>
-        <w:tc>
-          <w:tcPr>
-            <w:tcW w:w="9638" w:type="dxa"/>
-            <w:tcBorders>
-              <w:top w:val="none" w:sz="0" w:space="0" w:color="FFFFFF"/>
-              <w:left w:val="single" w:sz="24" w:space="0" w:color="B3261E"/>
-              <w:bottom w:val="none" w:sz="0" w:space="0" w:color="FFFFFF"/>
-              <w:right w:val="none" w:sz="0" w:space="0" w:color="FFFFFF"/>
-            </w:tcBorders>
-            <w:shd w:val="clear" w:color="auto" w:fill="FDECEA"/>
-            <w:tcMar>
-              <w:top w:w="100" w:type="dxa"/>
-              <w:left w:w="180" w:type="dxa"/>
-              <w:bottom w:w="100" w:type="dxa"/>
-              <w:right w:w="160" w:type="dxa"/>
-            </w:tcMar>
-          </w:tcPr>
-          <w:p>
-            <w:pPr>
-              <w:spacing w:after="60"/>
-            </w:pPr>
-            <w:r>
-              <w:rPr>
-                <w:b/>
-                <w:bCs/>
-                <w:color w:val="B3261E"/>
-              </w:rPr>
-              <w:t>À confirmer avant diffusion</w:t>
-            </w:r>
-          </w:p>
-          <w:p>
-            <w:pPr>
-              <w:spacing w:after="60" w:line="276" w:lineRule="auto"/>
-            </w:pPr>
-            <w:r>
-              <w:t>Les 22 points de la check-list affichent le texte provisoire « contenu à confirmer avec le manuel de procédures ASCE-LC ». Leur libellé définitif doit être saisi (menu Administration &gt; Paramètres métier &gt; Check-list dossier) avant la formation.</w:t>
-            </w:r>
-          </w:p>
-        </w:tc>
-      </w:tr>
-    </w:tbl>
-    <w:p>
-      <w:pPr>
-        <w:spacing w:line="100" w:lineRule="exact"/>
-      </w:pPr>
+    <w:p>
+      <w:pPr>
+        <w:spacing w:after="120" w:line="288" w:lineRule="auto"/>
+      </w:pPr>
+      <w:r>
+        <w:t>Les 22 points reprennent la « Liste de vérification du dossier de travail » du manuel des procédures de l'ASCE-LC (rencontre des témoins, théorie de l'infraction, PV d'audition signés, contrôle qualité interne du rapport, etc.). Le rapport ne peut pas être soumis tant qu'un point actif n'est pas coché.</w:t>
+      </w:r>
     </w:p>
     <w:p>
       <w:pPr>
         <w:pStyle w:val="Titre2"/>
         <w:keepNext/>
       </w:pPr>
-      <w:bookmarkStart w:id="59" w:name="_Toc242295261"/>
+      <w:bookmarkStart w:id="59" w:name="_Toc242302489"/>
       <w:r>
         <w:t>10.4 L'équipe d'enquête</w:t>
       </w:r>
@@ -18866,7 +18808,7 @@
         <w:pStyle w:val="Titre2"/>
         <w:keepNext/>
       </w:pPr>
-      <w:bookmarkStart w:id="60" w:name="_Toc242295262"/>
+      <w:bookmarkStart w:id="60" w:name="_Toc242302490"/>
       <w:r>
         <w:t>10.5 Suspendre, prolonger, rendre compte</w:t>
       </w:r>
@@ -18945,7 +18887,7 @@
         <w:pStyle w:val="Titre2"/>
         <w:keepNext/>
       </w:pPr>
-      <w:bookmarkStart w:id="61" w:name="_Toc242295263"/>
+      <w:bookmarkStart w:id="61" w:name="_Toc242302491"/>
       <w:r>
         <w:t>10.6 Les rapports et les leçons à partager</w:t>
       </w:r>
@@ -18999,9 +18941,8 @@
         <w:rPr>
           <w:noProof/>
         </w:rPr>
-        <w:lastRenderedPageBreak/>
         <w:drawing>
-          <wp:inline distT="0" distB="0" distL="0" distR="0" wp14:anchorId="5BA0516D" wp14:editId="3060A342">
+          <wp:inline distT="0" distB="0" distL="0" distR="0" wp14:anchorId="10D54F35" wp14:editId="624C66DD">
             <wp:extent cx="5334000" cy="2019300"/>
             <wp:effectExtent l="0" t="0" r="0" b="0"/>
             <wp:docPr id="51" name="ce-08-lecons" descr="Les leçons à partager" title="Les leçons à partager"/>
@@ -19103,6 +19044,7 @@
                 <w:bCs/>
                 <w:color w:val="0B6B3A"/>
               </w:rPr>
+              <w:lastRenderedPageBreak/>
               <w:t>À retenir</w:t>
             </w:r>
           </w:p>
@@ -19337,7 +19279,7 @@
         <w:pStyle w:val="Titre1"/>
         <w:pageBreakBefore/>
       </w:pPr>
-      <w:bookmarkStart w:id="62" w:name="_Toc242295264"/>
+      <w:bookmarkStart w:id="62" w:name="_Toc242302492"/>
       <w:r>
         <w:lastRenderedPageBreak/>
         <w:t>11. Profil DCP</w:t>
@@ -19383,7 +19325,7 @@
           <w:noProof/>
         </w:rPr>
         <w:drawing>
-          <wp:inline distT="0" distB="0" distL="0" distR="0" wp14:anchorId="0663DA98" wp14:editId="3FC5B4DD">
+          <wp:inline distT="0" distB="0" distL="0" distR="0" wp14:anchorId="2813187C" wp14:editId="7F9F0B9C">
             <wp:extent cx="5810250" cy="3467100"/>
             <wp:effectExtent l="0" t="0" r="0" b="0"/>
             <wp:docPr id="52" name="dcp-01-accueil" descr="L'espace de la DCP : un menu réduit aux statistiques" title="L'espace de la DCP : un menu réduit aux statistiques"/>
@@ -19562,7 +19504,7 @@
         </w:rPr>
         <w:lastRenderedPageBreak/>
         <w:drawing>
-          <wp:inline distT="0" distB="0" distL="0" distR="0" wp14:anchorId="1EB84C3E" wp14:editId="1F51A4B7">
+          <wp:inline distT="0" distB="0" distL="0" distR="0" wp14:anchorId="138D5337" wp14:editId="2FBE1C0E">
             <wp:extent cx="4476750" cy="6858000"/>
             <wp:effectExtent l="0" t="0" r="0" b="0"/>
             <wp:docPr id="53" name="dcp-02-statistiques" descr="La page des statistiques" title="La page des statistiques"/>
@@ -19810,7 +19752,7 @@
         <w:pStyle w:val="Titre1"/>
         <w:pageBreakBefore/>
       </w:pPr>
-      <w:bookmarkStart w:id="63" w:name="_Toc242295265"/>
+      <w:bookmarkStart w:id="63" w:name="_Toc242302493"/>
       <w:r>
         <w:lastRenderedPageBreak/>
         <w:t>12. Profil administrateur DDIC</w:t>
@@ -19840,7 +19782,7 @@
         <w:pStyle w:val="Titre2"/>
         <w:keepNext/>
       </w:pPr>
-      <w:bookmarkStart w:id="64" w:name="_Toc242295266"/>
+      <w:bookmarkStart w:id="64" w:name="_Toc242302494"/>
       <w:r>
         <w:t>12.1 Gérer les agents</w:t>
       </w:r>
@@ -19857,7 +19799,7 @@
           <w:noProof/>
         </w:rPr>
         <w:drawing>
-          <wp:inline distT="0" distB="0" distL="0" distR="0" wp14:anchorId="1A28D12E" wp14:editId="2AED9D3E">
+          <wp:inline distT="0" distB="0" distL="0" distR="0" wp14:anchorId="2B470BF8" wp14:editId="5FA2FC7D">
             <wp:extent cx="5810250" cy="4505325"/>
             <wp:effectExtent l="0" t="0" r="0" b="0"/>
             <wp:docPr id="54" name="adm-09-agents" descr="La gestion des agents" title="La gestion des agents"/>
@@ -19971,7 +19913,7 @@
           <w:noProof/>
         </w:rPr>
         <w:drawing>
-          <wp:inline distT="0" distB="0" distL="0" distR="0" wp14:anchorId="78B60A98" wp14:editId="7AC15676">
+          <wp:inline distT="0" distB="0" distL="0" distR="0" wp14:anchorId="0ABD279F" wp14:editId="15A5BAEF">
             <wp:extent cx="5810250" cy="5238750"/>
             <wp:effectExtent l="0" t="0" r="0" b="0"/>
             <wp:docPr id="55" name="adm-10-agent-nouveau" descr="Créer un agent" title="Créer un agent"/>
@@ -20249,7 +20191,7 @@
         <w:pStyle w:val="Titre2"/>
         <w:keepNext/>
       </w:pPr>
-      <w:bookmarkStart w:id="65" w:name="_Toc242295267"/>
+      <w:bookmarkStart w:id="65" w:name="_Toc242302495"/>
       <w:r>
         <w:lastRenderedPageBreak/>
         <w:t>12.2 Rôles et permissions</w:t>
@@ -20267,7 +20209,7 @@
           <w:noProof/>
         </w:rPr>
         <w:drawing>
-          <wp:inline distT="0" distB="0" distL="0" distR="0" wp14:anchorId="661EE6C6" wp14:editId="4A882826">
+          <wp:inline distT="0" distB="0" distL="0" distR="0" wp14:anchorId="120110D5" wp14:editId="4DEF8316">
             <wp:extent cx="5810250" cy="4714875"/>
             <wp:effectExtent l="0" t="0" r="0" b="0"/>
             <wp:docPr id="56" name="adm-11-roles" descr="Les rôles et leurs permissions" title="Les rôles et leurs permissions"/>
@@ -20355,7 +20297,7 @@
         <w:pStyle w:val="Titre2"/>
         <w:keepNext/>
       </w:pPr>
-      <w:bookmarkStart w:id="66" w:name="_Toc242295268"/>
+      <w:bookmarkStart w:id="66" w:name="_Toc242302496"/>
       <w:r>
         <w:lastRenderedPageBreak/>
         <w:t>12.3 Le journal d'audit</w:t>
@@ -20373,7 +20315,7 @@
           <w:noProof/>
         </w:rPr>
         <w:drawing>
-          <wp:inline distT="0" distB="0" distL="0" distR="0" wp14:anchorId="64791B0F" wp14:editId="151005D0">
+          <wp:inline distT="0" distB="0" distL="0" distR="0" wp14:anchorId="7884B64F" wp14:editId="1652F44E">
             <wp:extent cx="5810250" cy="5238750"/>
             <wp:effectExtent l="0" t="0" r="0" b="0"/>
             <wp:docPr id="57" name="adm-12-journal-audit" descr="Le journal d'audit" title="Le journal d'audit"/>
@@ -20547,7 +20489,7 @@
         <w:pStyle w:val="Titre2"/>
         <w:keepNext/>
       </w:pPr>
-      <w:bookmarkStart w:id="67" w:name="_Toc242295269"/>
+      <w:bookmarkStart w:id="67" w:name="_Toc242302497"/>
       <w:r>
         <w:lastRenderedPageBreak/>
         <w:t>12.4 Les paramètres du portail</w:t>
@@ -20565,7 +20507,7 @@
           <w:noProof/>
         </w:rPr>
         <w:drawing>
-          <wp:inline distT="0" distB="0" distL="0" distR="0" wp14:anchorId="22BBBD9A" wp14:editId="176589E6">
+          <wp:inline distT="0" distB="0" distL="0" distR="0" wp14:anchorId="077314B4" wp14:editId="64EDF1FD">
             <wp:extent cx="5810250" cy="6543675"/>
             <wp:effectExtent l="0" t="0" r="0" b="0"/>
             <wp:docPr id="58" name="adm-13-parametres-portail" descr="Les paramètres du portail" title="Les paramètres du portail"/>
@@ -20838,7 +20780,7 @@
         <w:pStyle w:val="Titre2"/>
         <w:keepNext/>
       </w:pPr>
-      <w:bookmarkStart w:id="68" w:name="_Toc242295270"/>
+      <w:bookmarkStart w:id="68" w:name="_Toc242302498"/>
       <w:r>
         <w:t>12.5 Les paramètres métier</w:t>
       </w:r>
@@ -20855,7 +20797,7 @@
           <w:noProof/>
         </w:rPr>
         <w:drawing>
-          <wp:inline distT="0" distB="0" distL="0" distR="0" wp14:anchorId="2D6804F0" wp14:editId="0A923080">
+          <wp:inline distT="0" distB="0" distL="0" distR="0" wp14:anchorId="17696462" wp14:editId="413CC58A">
             <wp:extent cx="5810250" cy="5762625"/>
             <wp:effectExtent l="0" t="0" r="0" b="0"/>
             <wp:docPr id="59" name="adm-20-parametres-metier" descr="Les paramètres métier : les délais" title="Les paramètres métier : les délais"/>
@@ -21944,7 +21886,7 @@
         <w:pStyle w:val="Titre2"/>
         <w:keepNext/>
       </w:pPr>
-      <w:bookmarkStart w:id="69" w:name="_Toc242295271"/>
+      <w:bookmarkStart w:id="69" w:name="_Toc242302499"/>
       <w:r>
         <w:t>12.6 La file des notifications</w:t>
       </w:r>
@@ -21961,7 +21903,7 @@
           <w:noProof/>
         </w:rPr>
         <w:drawing>
-          <wp:inline distT="0" distB="0" distL="0" distR="0" wp14:anchorId="255B52A7" wp14:editId="3B7E9454">
+          <wp:inline distT="0" distB="0" distL="0" distR="0" wp14:anchorId="537312FA" wp14:editId="00ABE47B">
             <wp:extent cx="5810250" cy="2933700"/>
             <wp:effectExtent l="0" t="0" r="0" b="0"/>
             <wp:docPr id="60" name="adm-21-file-notifications" descr="La file d'attente des notifications" title="La file d'attente des notifications"/>
@@ -22069,7 +22011,7 @@
         <w:pStyle w:val="Titre2"/>
         <w:keepNext/>
       </w:pPr>
-      <w:bookmarkStart w:id="70" w:name="_Toc242295272"/>
+      <w:bookmarkStart w:id="70" w:name="_Toc242302500"/>
       <w:r>
         <w:lastRenderedPageBreak/>
         <w:t>12.7 Mon profil</w:t>
@@ -22087,7 +22029,7 @@
           <w:noProof/>
         </w:rPr>
         <w:drawing>
-          <wp:inline distT="0" distB="0" distL="0" distR="0" wp14:anchorId="020D352F" wp14:editId="4FBDF74F">
+          <wp:inline distT="0" distB="0" distL="0" distR="0" wp14:anchorId="5D68E620" wp14:editId="1C51303F">
             <wp:extent cx="5810250" cy="5286375"/>
             <wp:effectExtent l="0" t="0" r="0" b="0"/>
             <wp:docPr id="61" name="adm-14-profil" descr="La page « Mon profil »" title="La page « Mon profil »"/>
@@ -22325,7 +22267,7 @@
         <w:pStyle w:val="Titre1"/>
         <w:pageBreakBefore/>
       </w:pPr>
-      <w:bookmarkStart w:id="71" w:name="_Toc242295273"/>
+      <w:bookmarkStart w:id="71" w:name="_Toc242302501"/>
       <w:r>
         <w:lastRenderedPageBreak/>
         <w:t>Annexe A. Qui peut faire quoi</w:t>
@@ -23482,7 +23424,7 @@
         <w:pStyle w:val="Titre1"/>
         <w:pageBreakBefore/>
       </w:pPr>
-      <w:bookmarkStart w:id="72" w:name="_Toc242295274"/>
+      <w:bookmarkStart w:id="72" w:name="_Toc242302502"/>
       <w:r>
         <w:lastRenderedPageBreak/>
         <w:t>Annexe B. Les statuts d'un dossier</w:t>
@@ -24371,7 +24313,7 @@
         <w:pStyle w:val="Titre1"/>
         <w:pageBreakBefore/>
       </w:pPr>
-      <w:bookmarkStart w:id="73" w:name="_Toc242295275"/>
+      <w:bookmarkStart w:id="73" w:name="_Toc242302503"/>
       <w:r>
         <w:lastRenderedPageBreak/>
         <w:t>Annexe C. Glossaire</w:t>
@@ -24629,7 +24571,7 @@
                 <w:sz w:val="20"/>
                 <w:szCs w:val="20"/>
               </w:rPr>
-              <w:t>B4 (code de suivi)</w:t>
+              <w:t>DEI</w:t>
             </w:r>
           </w:p>
         </w:tc>
@@ -24659,7 +24601,7 @@
                 <w:sz w:val="20"/>
                 <w:szCs w:val="20"/>
               </w:rPr>
-              <w:t>Code de 8 caractères remis au déclarant pour suivre son dossier</w:t>
+              <w:t>Département d'Enquête et d'Investigation : il fait l'analyse finale de fond et de forme des rapports d'enquête (15 jours ouvrables)</w:t>
             </w:r>
           </w:p>
         </w:tc>
@@ -24694,7 +24636,7 @@
                 <w:sz w:val="20"/>
                 <w:szCs w:val="20"/>
               </w:rPr>
-              <w:t>CGE / CGEA</w:t>
+              <w:t>B4 (code de suivi)</w:t>
             </w:r>
           </w:p>
         </w:tc>
@@ -24724,7 +24666,7 @@
                 <w:sz w:val="20"/>
                 <w:szCs w:val="20"/>
               </w:rPr>
-              <w:t>Contrôleur Général d'État / Contrôleur Général d'État Adjoint</w:t>
+              <w:t>Code de 8 caractères remis au déclarant pour suivre son dossier</w:t>
             </w:r>
           </w:p>
         </w:tc>
@@ -24759,7 +24701,7 @@
                 <w:sz w:val="20"/>
                 <w:szCs w:val="20"/>
               </w:rPr>
-              <w:t>CTADP</w:t>
+              <w:t>CGE / CGEA</w:t>
             </w:r>
           </w:p>
         </w:tc>
@@ -24789,7 +24731,7 @@
                 <w:sz w:val="20"/>
                 <w:szCs w:val="20"/>
               </w:rPr>
-              <w:t>Comité de Traitement et d'Analyse des Dossiers de Plaintes</w:t>
+              <w:t>Contrôleur Général d'État / Contrôleur Général d'État Adjoint</w:t>
             </w:r>
           </w:p>
         </w:tc>
@@ -24824,7 +24766,7 @@
                 <w:sz w:val="20"/>
                 <w:szCs w:val="20"/>
               </w:rPr>
-              <w:t>DCP</w:t>
+              <w:t>CTADP</w:t>
             </w:r>
           </w:p>
         </w:tc>
@@ -24854,7 +24796,7 @@
                 <w:sz w:val="20"/>
                 <w:szCs w:val="20"/>
               </w:rPr>
-              <w:t>Direction de la Communication et de la Presse</w:t>
+              <w:t>Comité de Traitement et d'Analyse des Dossiers de Plaintes</w:t>
             </w:r>
           </w:p>
         </w:tc>
@@ -24889,7 +24831,7 @@
                 <w:sz w:val="20"/>
                 <w:szCs w:val="20"/>
               </w:rPr>
-              <w:t>DDIC</w:t>
+              <w:t>DCP</w:t>
             </w:r>
           </w:p>
         </w:tc>
@@ -24919,7 +24861,7 @@
                 <w:sz w:val="20"/>
                 <w:szCs w:val="20"/>
               </w:rPr>
-              <w:t>Direction chargée de l'administration de la plateforme (rôle administrateur)</w:t>
+              <w:t>Direction de la Communication et de la Presse</w:t>
             </w:r>
           </w:p>
         </w:tc>
@@ -24954,7 +24896,7 @@
                 <w:sz w:val="20"/>
                 <w:szCs w:val="20"/>
               </w:rPr>
-              <w:t>Dénonciation</w:t>
+              <w:t>DDIC</w:t>
             </w:r>
           </w:p>
         </w:tc>
@@ -24984,7 +24926,7 @@
                 <w:sz w:val="20"/>
                 <w:szCs w:val="20"/>
               </w:rPr>
-              <w:t>Information donnée par une personne extérieure aux faits, identifiée ou anonyme</w:t>
+              <w:t>Direction chargée de l'administration de la plateforme (rôle administrateur)</w:t>
             </w:r>
           </w:p>
         </w:tc>
@@ -25019,7 +24961,7 @@
                 <w:sz w:val="20"/>
                 <w:szCs w:val="20"/>
               </w:rPr>
-              <w:t>Plainte</w:t>
+              <w:t>Dénonciation</w:t>
             </w:r>
           </w:p>
         </w:tc>
@@ -25049,7 +24991,7 @@
                 <w:sz w:val="20"/>
                 <w:szCs w:val="20"/>
               </w:rPr>
-              <w:t>Signalement d'une victime ou de son représentant, identifiée, qui demande réparation</w:t>
+              <w:t>Information donnée par une personne extérieure aux faits, identifiée ou anonyme</w:t>
             </w:r>
           </w:p>
         </w:tc>
@@ -25084,7 +25026,7 @@
                 <w:sz w:val="20"/>
                 <w:szCs w:val="20"/>
               </w:rPr>
-              <w:t>Habilitation</w:t>
+              <w:t>Plainte</w:t>
             </w:r>
           </w:p>
         </w:tc>
@@ -25114,7 +25056,7 @@
                 <w:sz w:val="20"/>
                 <w:szCs w:val="20"/>
               </w:rPr>
-              <w:t>Autorisation nominative d'accéder à un dossier</w:t>
+              <w:t>Signalement d'une victime ou de son représentant, identifiée, qui demande réparation</w:t>
             </w:r>
           </w:p>
         </w:tc>
@@ -25149,7 +25091,7 @@
                 <w:sz w:val="20"/>
                 <w:szCs w:val="20"/>
               </w:rPr>
-              <w:t>Étude d'opportunité</w:t>
+              <w:t>Habilitation</w:t>
             </w:r>
           </w:p>
         </w:tc>
@@ -25179,7 +25121,7 @@
                 <w:sz w:val="20"/>
                 <w:szCs w:val="20"/>
               </w:rPr>
-              <w:t>Fiche d'analyse du conseiller juridique avant le passage au comité</w:t>
+              <w:t>Autorisation nominative d'accéder à un dossier</w:t>
             </w:r>
           </w:p>
         </w:tc>
@@ -25214,7 +25156,7 @@
                 <w:sz w:val="20"/>
                 <w:szCs w:val="20"/>
               </w:rPr>
-              <w:t>Investigation</w:t>
+              <w:t>Étude d'opportunité</w:t>
             </w:r>
           </w:p>
         </w:tc>
@@ -25244,7 +25186,7 @@
                 <w:sz w:val="20"/>
                 <w:szCs w:val="20"/>
               </w:rPr>
-              <w:t>Enquête menée sur un dossier déclaré recevable</w:t>
+              <w:t>Fiche d'analyse du conseiller juridique avant le passage au comité</w:t>
             </w:r>
           </w:p>
         </w:tc>
@@ -25279,7 +25221,7 @@
                 <w:sz w:val="20"/>
                 <w:szCs w:val="20"/>
               </w:rPr>
-              <w:t>Quitus</w:t>
+              <w:t>Investigation</w:t>
             </w:r>
           </w:p>
         </w:tc>
@@ -25309,7 +25251,7 @@
                 <w:sz w:val="20"/>
                 <w:szCs w:val="20"/>
               </w:rPr>
-              <w:t>Document du CGE établi après la décision, à partir de la décision enregistrée</w:t>
+              <w:t>Enquête menée sur un dossier déclaré recevable</w:t>
             </w:r>
           </w:p>
         </w:tc>
@@ -25344,7 +25286,7 @@
                 <w:sz w:val="20"/>
                 <w:szCs w:val="20"/>
               </w:rPr>
-              <w:t>RETEX</w:t>
+              <w:t>Quitus</w:t>
             </w:r>
           </w:p>
         </w:tc>
@@ -25374,7 +25316,7 @@
                 <w:sz w:val="20"/>
                 <w:szCs w:val="20"/>
               </w:rPr>
-              <w:t>Fiche de retour d'expérience d'une enquête close</w:t>
+              <w:t>Document du CGE établi après la décision, à partir de la décision enregistrée</w:t>
             </w:r>
           </w:p>
         </w:tc>
@@ -25409,7 +25351,7 @@
                 <w:sz w:val="20"/>
                 <w:szCs w:val="20"/>
               </w:rPr>
-              <w:t>Jours ouvrables</w:t>
+              <w:t>RETEX</w:t>
             </w:r>
           </w:p>
         </w:tc>
@@ -25439,6 +25381,71 @@
                 <w:sz w:val="20"/>
                 <w:szCs w:val="20"/>
               </w:rPr>
+              <w:t>Fiche de retour d'expérience d'une enquête close</w:t>
+            </w:r>
+          </w:p>
+        </w:tc>
+      </w:tr>
+      <w:tr>
+        <w:trPr>
+          <w:cantSplit/>
+        </w:trPr>
+        <w:tc>
+          <w:tcPr>
+            <w:tcW w:w="2800" w:type="dxa"/>
+            <w:tcBorders>
+              <w:top w:val="single" w:sz="4" w:space="0" w:color="D5DDD8"/>
+              <w:left w:val="single" w:sz="4" w:space="0" w:color="D5DDD8"/>
+              <w:bottom w:val="single" w:sz="4" w:space="0" w:color="D5DDD8"/>
+              <w:right w:val="single" w:sz="4" w:space="0" w:color="D5DDD8"/>
+            </w:tcBorders>
+            <w:tcMar>
+              <w:top w:w="60" w:type="dxa"/>
+              <w:left w:w="100" w:type="dxa"/>
+              <w:bottom w:w="60" w:type="dxa"/>
+              <w:right w:w="100" w:type="dxa"/>
+            </w:tcMar>
+            <w:vAlign w:val="center"/>
+          </w:tcPr>
+          <w:p>
+            <w:pPr>
+              <w:spacing w:after="20"/>
+            </w:pPr>
+            <w:r>
+              <w:rPr>
+                <w:sz w:val="20"/>
+                <w:szCs w:val="20"/>
+              </w:rPr>
+              <w:t>Jours ouvrables</w:t>
+            </w:r>
+          </w:p>
+        </w:tc>
+        <w:tc>
+          <w:tcPr>
+            <w:tcW w:w="6838" w:type="dxa"/>
+            <w:tcBorders>
+              <w:top w:val="single" w:sz="4" w:space="0" w:color="D5DDD8"/>
+              <w:left w:val="single" w:sz="4" w:space="0" w:color="D5DDD8"/>
+              <w:bottom w:val="single" w:sz="4" w:space="0" w:color="D5DDD8"/>
+              <w:right w:val="single" w:sz="4" w:space="0" w:color="D5DDD8"/>
+            </w:tcBorders>
+            <w:tcMar>
+              <w:top w:w="60" w:type="dxa"/>
+              <w:left w:w="100" w:type="dxa"/>
+              <w:bottom w:w="60" w:type="dxa"/>
+              <w:right w:w="100" w:type="dxa"/>
+            </w:tcMar>
+            <w:vAlign w:val="center"/>
+          </w:tcPr>
+          <w:p>
+            <w:pPr>
+              <w:spacing w:after="20"/>
+            </w:pPr>
+            <w:r>
+              <w:rPr>
+                <w:sz w:val="20"/>
+                <w:szCs w:val="20"/>
+              </w:rPr>
               <w:t>Jours hors week-end et hors jours fériés du calendrier de la plateforme</w:t>
             </w:r>
           </w:p>
@@ -25455,7 +25462,7 @@
         <w:pStyle w:val="Titre1"/>
         <w:pageBreakBefore/>
       </w:pPr>
-      <w:bookmarkStart w:id="74" w:name="_Toc242295276"/>
+      <w:bookmarkStart w:id="74" w:name="_Toc242302504"/>
       <w:r>
         <w:lastRenderedPageBreak/>
         <w:t>Annexe D. En cas de difficulté</w:t>
@@ -26084,7 +26091,7 @@
         <w:pStyle w:val="Titre1"/>
         <w:pageBreakBefore/>
       </w:pPr>
-      <w:bookmarkStart w:id="75" w:name="_Toc242295277"/>
+      <w:bookmarkStart w:id="75" w:name="_Toc242302505"/>
       <w:r>
         <w:lastRenderedPageBreak/>
         <w:t>Annexe E. Points à confirmer avant diffusion</w:t>
@@ -26505,7 +26512,7 @@
                 <w:sz w:val="20"/>
                 <w:szCs w:val="20"/>
               </w:rPr>
-              <w:t>Les 22 points affichent un texte provisoire à remplacer par ceux du manuel de procédures.</w:t>
+              <w:t>Les 22 libellés du manuel des procédures sont repris dans la plateforme (migration 025 du back). À vérifier après le déploiement du back : ouvrir la check-list d'une investigation.</w:t>
             </w:r>
           </w:p>
         </w:tc>
@@ -26600,7 +26607,7 @@
                 <w:sz w:val="20"/>
                 <w:szCs w:val="20"/>
               </w:rPr>
-              <w:t>Le circuit de validation d'une enquête cite une étape « DEI ». Préciser son intitulé complet dans le glossaire.</w:t>
+              <w:t>Le corps du manuel des procédures dit « Département d'Enquête et d'Investigation », mais son tableau des abréviations donne « Direction de la Documentation et de la Communication » (tableau décalé). L'ASCE-LC doit corriger cette ligne de son manuel.</w:t>
             </w:r>
           </w:p>
         </w:tc>
@@ -26695,7 +26702,7 @@
                 <w:sz w:val="20"/>
                 <w:szCs w:val="20"/>
               </w:rPr>
-              <w:t>Les valeurs de l'annexe sont celles de l'installation décrite ; confirmer qu'elles correspondent au manuel de procédures.</w:t>
+              <w:t>Conformes au manuel des procédures, sauf deux écarts à confirmer : l'approbation du rapport par le CGEA (10 jours dans la plateforme, 20 jours pour le CGE et le CGEA ensemble dans le manuel) et la réponse à une demande de complément (14 jours dans la plateforme, 7 jours évoqués dans le manuel).</w:t>
             </w:r>
           </w:p>
         </w:tc>
@@ -26933,10 +26940,10 @@
 <file path=word/numbering.xml><?xml version="1.0" encoding="utf-8"?>
 <w:numbering xmlns:wpc="http://schemas.microsoft.com/office/word/2010/wordprocessingCanvas" xmlns:cx="http://schemas.microsoft.com/office/drawing/2014/chartex" xmlns:cx1="http://schemas.microsoft.com/office/drawing/2015/9/8/chartex" xmlns:cx2="http://schemas.microsoft.com/office/drawing/2015/10/21/chartex" xmlns:cx3="http://schemas.microsoft.com/office/drawing/2016/5/9/chartex" xmlns:cx4="http://schemas.microsoft.com/office/drawing/2016/5/10/chartex" xmlns:cx5="http://schemas.microsoft.com/office/drawing/2016/5/11/chartex" xmlns:cx6="http://schemas.microsoft.com/office/drawing/2016/5/12/chartex" xmlns:cx7="http://schemas.microsoft.com/office/drawing/2016/5/13/chartex" xmlns:cx8="http://schemas.microsoft.com/office/drawing/2016/5/14/chartex" xmlns:mc="http://schemas.openxmlformats.org/markup-compatibility/2006" xmlns:aink="http://schemas.microsoft.com/office/drawing/2016/ink" xmlns:am3d="http://schemas.microsoft.com/office/drawing/2017/model3d" xmlns:o="urn:schemas-microsoft-com:office:office" xmlns:oel="http://schemas.microsoft.com/office/2019/extlst" xmlns:r="http://schemas.openxmlformats.org/officeDocument/2006/relationships" xmlns:m="http://schemas.openxmlformats.org/officeDocument/2006/math" xmlns:v="urn:schemas-microsoft-com:vml" xmlns:wp14="http://schemas.microsoft.com/office/word/2010/wordprocessingDrawing" xmlns:wp="http://schemas.openxmlformats.org/drawingml/2006/wordprocessingDrawing" xmlns:w10="urn:schemas-microsoft-com:office:word" xmlns:w="http://schemas.openxmlformats.org/wordprocessingml/2006/main" xmlns:w14="http://schemas.microsoft.com/office/word/2010/wordml" xmlns:w15="http://schemas.microsoft.com/office/word/2012/wordml" xmlns:w16cex="http://schemas.microsoft.com/office/word/2018/wordml/cex" xmlns:w16cid="http://schemas.microsoft.com/office/word/2016/wordml/cid" xmlns:w16="http://schemas.microsoft.com/office/word/2018/wordml" xmlns:w16du="http://schemas.microsoft.com/office/word/2023/wordml/word16du" xmlns:w16sdtdh="http://schemas.microsoft.com/office/word/2020/wordml/sdtdatahash" xmlns:w16sdtfl="http://schemas.microsoft.com/office/word/2024/wordml/sdtformatlock" xmlns:w16se="http://schemas.microsoft.com/office/word/2015/wordml/symex" xmlns:wpg="http://schemas.microsoft.com/office/word/2010/wordprocessingGroup" xmlns:wpi="http://schemas.microsoft.com/office/word/2010/wordprocessingInk" xmlns:wne="http://schemas.microsoft.com/office/word/2006/wordml" xmlns:wps="http://schemas.microsoft.com/office/word/2010/wordprocessingShape" mc:Ignorable="w14 w15 w16se w16cid w16 w16cex w16sdtdh w16sdtfl w16du wp14">
   <w:abstractNum w:abstractNumId="0" w15:restartNumberingAfterBreak="0">
-    <w:nsid w:val="087F333F"/>
+    <w:nsid w:val="145C47B5"/>
     <w:multiLevelType w:val="hybridMultilevel"/>
-    <w:tmpl w:val="86864DAE"/>
-    <w:lvl w:ilvl="0" w:tplc="7EE8289C">
+    <w:tmpl w:val="6F96548C"/>
+    <w:lvl w:ilvl="0" w:tplc="E3584140">
       <w:start w:val="1"/>
       <w:numFmt w:val="decimal"/>
       <w:lvlText w:val="%1."/>
@@ -26945,52 +26952,52 @@
         <w:ind w:left="540" w:hanging="360"/>
       </w:pPr>
     </w:lvl>
-    <w:lvl w:ilvl="1" w:tplc="4AC6E060">
+    <w:lvl w:ilvl="1" w:tplc="CA3E43E8">
       <w:numFmt w:val="decimal"/>
       <w:lvlText w:val=""/>
       <w:lvlJc w:val="left"/>
     </w:lvl>
-    <w:lvl w:ilvl="2" w:tplc="491C3240">
+    <w:lvl w:ilvl="2" w:tplc="6900C3A6">
       <w:numFmt w:val="decimal"/>
       <w:lvlText w:val=""/>
       <w:lvlJc w:val="left"/>
     </w:lvl>
-    <w:lvl w:ilvl="3" w:tplc="4FC84652">
+    <w:lvl w:ilvl="3" w:tplc="400A2480">
       <w:numFmt w:val="decimal"/>
       <w:lvlText w:val=""/>
       <w:lvlJc w:val="left"/>
     </w:lvl>
-    <w:lvl w:ilvl="4" w:tplc="35985096">
+    <w:lvl w:ilvl="4" w:tplc="C21E7DB6">
       <w:numFmt w:val="decimal"/>
       <w:lvlText w:val=""/>
       <w:lvlJc w:val="left"/>
     </w:lvl>
-    <w:lvl w:ilvl="5" w:tplc="0504D5FC">
+    <w:lvl w:ilvl="5" w:tplc="434ADB20">
       <w:numFmt w:val="decimal"/>
       <w:lvlText w:val=""/>
       <w:lvlJc w:val="left"/>
     </w:lvl>
-    <w:lvl w:ilvl="6" w:tplc="E258DE4C">
+    <w:lvl w:ilvl="6" w:tplc="FD1A75B2">
       <w:numFmt w:val="decimal"/>
       <w:lvlText w:val=""/>
       <w:lvlJc w:val="left"/>
     </w:lvl>
-    <w:lvl w:ilvl="7" w:tplc="9798443A">
+    <w:lvl w:ilvl="7" w:tplc="8EC815B6">
       <w:numFmt w:val="decimal"/>
       <w:lvlText w:val=""/>
       <w:lvlJc w:val="left"/>
     </w:lvl>
-    <w:lvl w:ilvl="8" w:tplc="E5268C14">
+    <w:lvl w:ilvl="8" w:tplc="66FA1FD0">
       <w:numFmt w:val="decimal"/>
       <w:lvlText w:val=""/>
       <w:lvlJc w:val="left"/>
     </w:lvl>
   </w:abstractNum>
   <w:abstractNum w:abstractNumId="1" w15:restartNumberingAfterBreak="0">
-    <w:nsid w:val="09EE1CF5"/>
+    <w:nsid w:val="268A3E85"/>
     <w:multiLevelType w:val="hybridMultilevel"/>
-    <w:tmpl w:val="4FD28DDE"/>
-    <w:lvl w:ilvl="0" w:tplc="0F9E6638">
+    <w:tmpl w:val="69007B44"/>
+    <w:lvl w:ilvl="0" w:tplc="8540791C">
       <w:start w:val="1"/>
       <w:numFmt w:val="decimal"/>
       <w:lvlText w:val="%1."/>
@@ -26999,196 +27006,160 @@
         <w:ind w:left="540" w:hanging="360"/>
       </w:pPr>
     </w:lvl>
-    <w:lvl w:ilvl="1" w:tplc="DAB61060">
+    <w:lvl w:ilvl="1" w:tplc="A03EEAF0">
       <w:numFmt w:val="decimal"/>
       <w:lvlText w:val=""/>
       <w:lvlJc w:val="left"/>
     </w:lvl>
-    <w:lvl w:ilvl="2" w:tplc="8D7C34FE">
+    <w:lvl w:ilvl="2" w:tplc="827897BE">
       <w:numFmt w:val="decimal"/>
       <w:lvlText w:val=""/>
       <w:lvlJc w:val="left"/>
     </w:lvl>
-    <w:lvl w:ilvl="3" w:tplc="5F26AE40">
+    <w:lvl w:ilvl="3" w:tplc="DC9E49E6">
       <w:numFmt w:val="decimal"/>
       <w:lvlText w:val=""/>
       <w:lvlJc w:val="left"/>
     </w:lvl>
-    <w:lvl w:ilvl="4" w:tplc="766215D4">
+    <w:lvl w:ilvl="4" w:tplc="685879C4">
       <w:numFmt w:val="decimal"/>
       <w:lvlText w:val=""/>
       <w:lvlJc w:val="left"/>
     </w:lvl>
-    <w:lvl w:ilvl="5" w:tplc="BF6E6420">
+    <w:lvl w:ilvl="5" w:tplc="E03CFE3C">
       <w:numFmt w:val="decimal"/>
       <w:lvlText w:val=""/>
       <w:lvlJc w:val="left"/>
     </w:lvl>
-    <w:lvl w:ilvl="6" w:tplc="BC2C5C1C">
+    <w:lvl w:ilvl="6" w:tplc="C67AB8A2">
       <w:numFmt w:val="decimal"/>
       <w:lvlText w:val=""/>
       <w:lvlJc w:val="left"/>
     </w:lvl>
-    <w:lvl w:ilvl="7" w:tplc="196497B6">
+    <w:lvl w:ilvl="7" w:tplc="B0705F98">
       <w:numFmt w:val="decimal"/>
       <w:lvlText w:val=""/>
       <w:lvlJc w:val="left"/>
     </w:lvl>
-    <w:lvl w:ilvl="8" w:tplc="C4A2F9B8">
+    <w:lvl w:ilvl="8" w:tplc="E3AA9886">
       <w:numFmt w:val="decimal"/>
       <w:lvlText w:val=""/>
       <w:lvlJc w:val="left"/>
     </w:lvl>
   </w:abstractNum>
   <w:abstractNum w:abstractNumId="2" w15:restartNumberingAfterBreak="0">
-    <w:nsid w:val="1DDD5061"/>
+    <w:nsid w:val="342943BE"/>
     <w:multiLevelType w:val="hybridMultilevel"/>
-    <w:tmpl w:val="7BD048B6"/>
-    <w:lvl w:ilvl="0" w:tplc="D33A0264" w:tentative="1">
+    <w:tmpl w:val="177E8932"/>
+    <w:lvl w:ilvl="0" w:tplc="D9FC5650">
       <w:start w:val="1"/>
-      <w:numFmt w:val="bullet"/>
-      <w:lvlText w:val="●"/>
+      <w:numFmt w:val="decimal"/>
+      <w:lvlText w:val="%1."/>
       <w:lvlJc w:val="left"/>
       <w:pPr>
-        <w:ind w:left="720" w:hanging="360"/>
+        <w:ind w:left="540" w:hanging="360"/>
       </w:pPr>
     </w:lvl>
-    <w:lvl w:ilvl="1" w:tplc="175C935A" w:tentative="1">
-      <w:start w:val="1"/>
-      <w:numFmt w:val="bullet"/>
-      <w:lvlText w:val="○"/>
-      <w:lvlJc w:val="left"/>
-      <w:pPr>
-        <w:ind w:left="1440" w:hanging="360"/>
-      </w:pPr>
-    </w:lvl>
-    <w:lvl w:ilvl="2" w:tplc="48FE915E" w:tentative="1">
-      <w:start w:val="1"/>
-      <w:numFmt w:val="bullet"/>
-      <w:lvlText w:val="■"/>
-      <w:lvlJc w:val="left"/>
-      <w:pPr>
-        <w:ind w:left="2160" w:hanging="360"/>
-      </w:pPr>
-    </w:lvl>
-    <w:lvl w:ilvl="3" w:tplc="34BA2CD4" w:tentative="1">
-      <w:start w:val="1"/>
-      <w:numFmt w:val="bullet"/>
-      <w:lvlText w:val="●"/>
-      <w:lvlJc w:val="left"/>
-      <w:pPr>
-        <w:ind w:left="2880" w:hanging="360"/>
-      </w:pPr>
-    </w:lvl>
-    <w:lvl w:ilvl="4" w:tplc="2D90459C" w:tentative="1">
-      <w:start w:val="1"/>
-      <w:numFmt w:val="bullet"/>
-      <w:lvlText w:val="○"/>
-      <w:lvlJc w:val="left"/>
-      <w:pPr>
-        <w:ind w:left="3600" w:hanging="360"/>
-      </w:pPr>
-    </w:lvl>
-    <w:lvl w:ilvl="5" w:tplc="C518A49C" w:tentative="1">
-      <w:start w:val="1"/>
-      <w:numFmt w:val="bullet"/>
-      <w:lvlText w:val="■"/>
-      <w:lvlJc w:val="left"/>
-      <w:pPr>
-        <w:ind w:left="4320" w:hanging="360"/>
-      </w:pPr>
-    </w:lvl>
-    <w:lvl w:ilvl="6" w:tplc="83605E76" w:tentative="1">
-      <w:start w:val="1"/>
-      <w:numFmt w:val="bullet"/>
-      <w:lvlText w:val="●"/>
-      <w:lvlJc w:val="left"/>
-      <w:pPr>
-        <w:ind w:left="5040" w:hanging="360"/>
-      </w:pPr>
-    </w:lvl>
-    <w:lvl w:ilvl="7" w:tplc="357C613E" w:tentative="1">
-      <w:start w:val="1"/>
-      <w:numFmt w:val="bullet"/>
-      <w:lvlText w:val="●"/>
-      <w:lvlJc w:val="left"/>
-      <w:pPr>
-        <w:ind w:left="5760" w:hanging="360"/>
-      </w:pPr>
-    </w:lvl>
-    <w:lvl w:ilvl="8" w:tplc="10A49FC4" w:tentative="1">
-      <w:start w:val="1"/>
-      <w:numFmt w:val="bullet"/>
-      <w:lvlText w:val="●"/>
-      <w:lvlJc w:val="left"/>
-      <w:pPr>
-        <w:ind w:left="6480" w:hanging="360"/>
-      </w:pPr>
-    </w:lvl>
-  </w:abstractNum>
-  <w:abstractNum w:abstractNumId="3" w15:restartNumberingAfterBreak="0">
-    <w:nsid w:val="1DF75699"/>
-    <w:multiLevelType w:val="hybridMultilevel"/>
-    <w:tmpl w:val="DCFE76B0"/>
-    <w:lvl w:ilvl="0" w:tplc="9DC2C086">
-      <w:start w:val="1"/>
-      <w:numFmt w:val="bullet"/>
-      <w:lvlText w:val="•"/>
-      <w:lvlJc w:val="left"/>
-      <w:pPr>
-        <w:ind w:left="540" w:hanging="270"/>
-      </w:pPr>
-    </w:lvl>
-    <w:lvl w:ilvl="1" w:tplc="6EAAFCA6" w:tentative="1">
-      <w:start w:val="1"/>
-      <w:numFmt w:val="bullet"/>
-      <w:lvlText w:val="–"/>
-      <w:lvlJc w:val="left"/>
-      <w:pPr>
-        <w:ind w:left="1000" w:hanging="270"/>
-      </w:pPr>
-    </w:lvl>
-    <w:lvl w:ilvl="2" w:tplc="1A1CEA9E">
+    <w:lvl w:ilvl="1" w:tplc="B3707610">
       <w:numFmt w:val="decimal"/>
       <w:lvlText w:val=""/>
       <w:lvlJc w:val="left"/>
     </w:lvl>
-    <w:lvl w:ilvl="3" w:tplc="35AED916">
+    <w:lvl w:ilvl="2" w:tplc="D76AAECA">
       <w:numFmt w:val="decimal"/>
       <w:lvlText w:val=""/>
       <w:lvlJc w:val="left"/>
     </w:lvl>
-    <w:lvl w:ilvl="4" w:tplc="D00606EE">
+    <w:lvl w:ilvl="3" w:tplc="2E840CDC">
       <w:numFmt w:val="decimal"/>
       <w:lvlText w:val=""/>
       <w:lvlJc w:val="left"/>
     </w:lvl>
-    <w:lvl w:ilvl="5" w:tplc="5CA23FDE">
+    <w:lvl w:ilvl="4" w:tplc="C652E064">
       <w:numFmt w:val="decimal"/>
       <w:lvlText w:val=""/>
       <w:lvlJc w:val="left"/>
     </w:lvl>
-    <w:lvl w:ilvl="6" w:tplc="7D50E56A">
+    <w:lvl w:ilvl="5" w:tplc="09BEFD0E">
       <w:numFmt w:val="decimal"/>
       <w:lvlText w:val=""/>
       <w:lvlJc w:val="left"/>
     </w:lvl>
-    <w:lvl w:ilvl="7" w:tplc="AECAF6E0">
+    <w:lvl w:ilvl="6" w:tplc="AC280C08">
       <w:numFmt w:val="decimal"/>
       <w:lvlText w:val=""/>
       <w:lvlJc w:val="left"/>
     </w:lvl>
-    <w:lvl w:ilvl="8" w:tplc="B07C16DA">
+    <w:lvl w:ilvl="7" w:tplc="EBF6FDE0">
+      <w:numFmt w:val="decimal"/>
+      <w:lvlText w:val=""/>
+      <w:lvlJc w:val="left"/>
+    </w:lvl>
+    <w:lvl w:ilvl="8" w:tplc="39BA203A">
+      <w:numFmt w:val="decimal"/>
+      <w:lvlText w:val=""/>
+      <w:lvlJc w:val="left"/>
+    </w:lvl>
+  </w:abstractNum>
+  <w:abstractNum w:abstractNumId="3" w15:restartNumberingAfterBreak="0">
+    <w:nsid w:val="496B501C"/>
+    <w:multiLevelType w:val="hybridMultilevel"/>
+    <w:tmpl w:val="275082E4"/>
+    <w:lvl w:ilvl="0" w:tplc="F4703806">
+      <w:start w:val="1"/>
+      <w:numFmt w:val="decimal"/>
+      <w:lvlText w:val="%1."/>
+      <w:lvlJc w:val="left"/>
+      <w:pPr>
+        <w:ind w:left="540" w:hanging="360"/>
+      </w:pPr>
+    </w:lvl>
+    <w:lvl w:ilvl="1" w:tplc="93269842">
+      <w:numFmt w:val="decimal"/>
+      <w:lvlText w:val=""/>
+      <w:lvlJc w:val="left"/>
+    </w:lvl>
+    <w:lvl w:ilvl="2" w:tplc="A306C9F2">
+      <w:numFmt w:val="decimal"/>
+      <w:lvlText w:val=""/>
+      <w:lvlJc w:val="left"/>
+    </w:lvl>
+    <w:lvl w:ilvl="3" w:tplc="D7B018A0">
+      <w:numFmt w:val="decimal"/>
+      <w:lvlText w:val=""/>
+      <w:lvlJc w:val="left"/>
+    </w:lvl>
+    <w:lvl w:ilvl="4" w:tplc="FA4E471C">
+      <w:numFmt w:val="decimal"/>
+      <w:lvlText w:val=""/>
+      <w:lvlJc w:val="left"/>
+    </w:lvl>
+    <w:lvl w:ilvl="5" w:tplc="7C2AD7F0">
+      <w:numFmt w:val="decimal"/>
+      <w:lvlText w:val=""/>
+      <w:lvlJc w:val="left"/>
+    </w:lvl>
+    <w:lvl w:ilvl="6" w:tplc="B398754A">
+      <w:numFmt w:val="decimal"/>
+      <w:lvlText w:val=""/>
+      <w:lvlJc w:val="left"/>
+    </w:lvl>
+    <w:lvl w:ilvl="7" w:tplc="2FE26224">
+      <w:numFmt w:val="decimal"/>
+      <w:lvlText w:val=""/>
+      <w:lvlJc w:val="left"/>
+    </w:lvl>
+    <w:lvl w:ilvl="8" w:tplc="6C02E2F0">
       <w:numFmt w:val="decimal"/>
       <w:lvlText w:val=""/>
       <w:lvlJc w:val="left"/>
     </w:lvl>
   </w:abstractNum>
   <w:abstractNum w:abstractNumId="4" w15:restartNumberingAfterBreak="0">
-    <w:nsid w:val="3F351265"/>
+    <w:nsid w:val="57FF1EE8"/>
     <w:multiLevelType w:val="hybridMultilevel"/>
-    <w:tmpl w:val="DD361CD8"/>
-    <w:lvl w:ilvl="0" w:tplc="FD6A7CE0">
+    <w:tmpl w:val="CB74D4A2"/>
+    <w:lvl w:ilvl="0" w:tplc="D654DE6A">
       <w:start w:val="1"/>
       <w:numFmt w:val="decimal"/>
       <w:lvlText w:val="%1."/>
@@ -27197,52 +27168,52 @@
         <w:ind w:left="540" w:hanging="360"/>
       </w:pPr>
     </w:lvl>
-    <w:lvl w:ilvl="1" w:tplc="FCC6D21E">
+    <w:lvl w:ilvl="1" w:tplc="48C4FED4">
       <w:numFmt w:val="decimal"/>
       <w:lvlText w:val=""/>
       <w:lvlJc w:val="left"/>
     </w:lvl>
-    <w:lvl w:ilvl="2" w:tplc="5EE61542">
+    <w:lvl w:ilvl="2" w:tplc="986A8854">
       <w:numFmt w:val="decimal"/>
       <w:lvlText w:val=""/>
       <w:lvlJc w:val="left"/>
     </w:lvl>
-    <w:lvl w:ilvl="3" w:tplc="E4DA0ADE">
+    <w:lvl w:ilvl="3" w:tplc="6B564B72">
       <w:numFmt w:val="decimal"/>
       <w:lvlText w:val=""/>
       <w:lvlJc w:val="left"/>
     </w:lvl>
-    <w:lvl w:ilvl="4" w:tplc="463E4CCE">
+    <w:lvl w:ilvl="4" w:tplc="D702228A">
       <w:numFmt w:val="decimal"/>
       <w:lvlText w:val=""/>
       <w:lvlJc w:val="left"/>
     </w:lvl>
-    <w:lvl w:ilvl="5" w:tplc="0F8842FE">
+    <w:lvl w:ilvl="5" w:tplc="53E4B94A">
       <w:numFmt w:val="decimal"/>
       <w:lvlText w:val=""/>
       <w:lvlJc w:val="left"/>
     </w:lvl>
-    <w:lvl w:ilvl="6" w:tplc="9F90F8D6">
+    <w:lvl w:ilvl="6" w:tplc="F8625C84">
       <w:numFmt w:val="decimal"/>
       <w:lvlText w:val=""/>
       <w:lvlJc w:val="left"/>
     </w:lvl>
-    <w:lvl w:ilvl="7" w:tplc="DFE84410">
+    <w:lvl w:ilvl="7" w:tplc="CB8C6BE4">
       <w:numFmt w:val="decimal"/>
       <w:lvlText w:val=""/>
       <w:lvlJc w:val="left"/>
     </w:lvl>
-    <w:lvl w:ilvl="8" w:tplc="B068379C">
+    <w:lvl w:ilvl="8" w:tplc="9692D46E">
       <w:numFmt w:val="decimal"/>
       <w:lvlText w:val=""/>
       <w:lvlJc w:val="left"/>
     </w:lvl>
   </w:abstractNum>
   <w:abstractNum w:abstractNumId="5" w15:restartNumberingAfterBreak="0">
-    <w:nsid w:val="463E0319"/>
+    <w:nsid w:val="5B1B70E2"/>
     <w:multiLevelType w:val="hybridMultilevel"/>
-    <w:tmpl w:val="253493F6"/>
-    <w:lvl w:ilvl="0" w:tplc="B5983A98">
+    <w:tmpl w:val="D888605E"/>
+    <w:lvl w:ilvl="0" w:tplc="934C601A">
       <w:start w:val="1"/>
       <w:numFmt w:val="decimal"/>
       <w:lvlText w:val="%1."/>
@@ -27251,52 +27222,52 @@
         <w:ind w:left="540" w:hanging="360"/>
       </w:pPr>
     </w:lvl>
-    <w:lvl w:ilvl="1" w:tplc="6472EF52">
+    <w:lvl w:ilvl="1" w:tplc="4F12BEA0">
       <w:numFmt w:val="decimal"/>
       <w:lvlText w:val=""/>
       <w:lvlJc w:val="left"/>
     </w:lvl>
-    <w:lvl w:ilvl="2" w:tplc="D8F48FAA">
+    <w:lvl w:ilvl="2" w:tplc="A6383234">
       <w:numFmt w:val="decimal"/>
       <w:lvlText w:val=""/>
       <w:lvlJc w:val="left"/>
     </w:lvl>
-    <w:lvl w:ilvl="3" w:tplc="E32CA956">
+    <w:lvl w:ilvl="3" w:tplc="6930C388">
       <w:numFmt w:val="decimal"/>
       <w:lvlText w:val=""/>
       <w:lvlJc w:val="left"/>
     </w:lvl>
-    <w:lvl w:ilvl="4" w:tplc="EEAA84F8">
+    <w:lvl w:ilvl="4" w:tplc="DFD0BD7E">
       <w:numFmt w:val="decimal"/>
       <w:lvlText w:val=""/>
       <w:lvlJc w:val="left"/>
     </w:lvl>
-    <w:lvl w:ilvl="5" w:tplc="948683B8">
+    <w:lvl w:ilvl="5" w:tplc="0DF007E6">
       <w:numFmt w:val="decimal"/>
       <w:lvlText w:val=""/>
       <w:lvlJc w:val="left"/>
     </w:lvl>
-    <w:lvl w:ilvl="6" w:tplc="90CC6066">
+    <w:lvl w:ilvl="6" w:tplc="69AC66E2">
       <w:numFmt w:val="decimal"/>
       <w:lvlText w:val=""/>
       <w:lvlJc w:val="left"/>
     </w:lvl>
-    <w:lvl w:ilvl="7" w:tplc="8C6EEFB0">
+    <w:lvl w:ilvl="7" w:tplc="67F6BEEA">
       <w:numFmt w:val="decimal"/>
       <w:lvlText w:val=""/>
       <w:lvlJc w:val="left"/>
     </w:lvl>
-    <w:lvl w:ilvl="8" w:tplc="CAC2F772">
+    <w:lvl w:ilvl="8" w:tplc="AD12025E">
       <w:numFmt w:val="decimal"/>
       <w:lvlText w:val=""/>
       <w:lvlJc w:val="left"/>
     </w:lvl>
   </w:abstractNum>
   <w:abstractNum w:abstractNumId="6" w15:restartNumberingAfterBreak="0">
-    <w:nsid w:val="59B70CB1"/>
+    <w:nsid w:val="65053160"/>
     <w:multiLevelType w:val="hybridMultilevel"/>
-    <w:tmpl w:val="04CEAC8E"/>
-    <w:lvl w:ilvl="0" w:tplc="4E0C80EC">
+    <w:tmpl w:val="FB6AC9B8"/>
+    <w:lvl w:ilvl="0" w:tplc="2D98985A">
       <w:start w:val="1"/>
       <w:numFmt w:val="decimal"/>
       <w:lvlText w:val="%1."/>
@@ -27305,205 +27276,241 @@
         <w:ind w:left="540" w:hanging="360"/>
       </w:pPr>
     </w:lvl>
-    <w:lvl w:ilvl="1" w:tplc="735AA2CA">
+    <w:lvl w:ilvl="1" w:tplc="259E920A">
       <w:numFmt w:val="decimal"/>
       <w:lvlText w:val=""/>
       <w:lvlJc w:val="left"/>
     </w:lvl>
-    <w:lvl w:ilvl="2" w:tplc="B8FAC462">
+    <w:lvl w:ilvl="2" w:tplc="095C77A6">
       <w:numFmt w:val="decimal"/>
       <w:lvlText w:val=""/>
       <w:lvlJc w:val="left"/>
     </w:lvl>
-    <w:lvl w:ilvl="3" w:tplc="672C8E40">
+    <w:lvl w:ilvl="3" w:tplc="AC269FFC">
       <w:numFmt w:val="decimal"/>
       <w:lvlText w:val=""/>
       <w:lvlJc w:val="left"/>
     </w:lvl>
-    <w:lvl w:ilvl="4" w:tplc="A4BEA824">
+    <w:lvl w:ilvl="4" w:tplc="0F2C78E4">
       <w:numFmt w:val="decimal"/>
       <w:lvlText w:val=""/>
       <w:lvlJc w:val="left"/>
     </w:lvl>
-    <w:lvl w:ilvl="5" w:tplc="20943774">
+    <w:lvl w:ilvl="5" w:tplc="2C40E044">
       <w:numFmt w:val="decimal"/>
       <w:lvlText w:val=""/>
       <w:lvlJc w:val="left"/>
     </w:lvl>
-    <w:lvl w:ilvl="6" w:tplc="E9A88862">
+    <w:lvl w:ilvl="6" w:tplc="4FACDAE6">
       <w:numFmt w:val="decimal"/>
       <w:lvlText w:val=""/>
       <w:lvlJc w:val="left"/>
     </w:lvl>
-    <w:lvl w:ilvl="7" w:tplc="90569D20">
+    <w:lvl w:ilvl="7" w:tplc="4D1CBFD4">
       <w:numFmt w:val="decimal"/>
       <w:lvlText w:val=""/>
       <w:lvlJc w:val="left"/>
     </w:lvl>
-    <w:lvl w:ilvl="8" w:tplc="78BAF020">
+    <w:lvl w:ilvl="8" w:tplc="A476B708">
       <w:numFmt w:val="decimal"/>
       <w:lvlText w:val=""/>
       <w:lvlJc w:val="left"/>
     </w:lvl>
   </w:abstractNum>
   <w:abstractNum w:abstractNumId="7" w15:restartNumberingAfterBreak="0">
-    <w:nsid w:val="619B553D"/>
+    <w:nsid w:val="76D05EB0"/>
     <w:multiLevelType w:val="hybridMultilevel"/>
-    <w:tmpl w:val="92124024"/>
-    <w:lvl w:ilvl="0" w:tplc="30E648B2">
+    <w:tmpl w:val="B92A1658"/>
+    <w:lvl w:ilvl="0" w:tplc="A1BACDEC" w:tentative="1">
       <w:start w:val="1"/>
-      <w:numFmt w:val="decimal"/>
-      <w:lvlText w:val="%1."/>
+      <w:numFmt w:val="bullet"/>
+      <w:lvlText w:val="●"/>
       <w:lvlJc w:val="left"/>
       <w:pPr>
-        <w:ind w:left="540" w:hanging="360"/>
+        <w:ind w:left="720" w:hanging="360"/>
       </w:pPr>
     </w:lvl>
-    <w:lvl w:ilvl="1" w:tplc="2960C43E">
+    <w:lvl w:ilvl="1" w:tplc="57A00CF8" w:tentative="1">
+      <w:start w:val="1"/>
+      <w:numFmt w:val="bullet"/>
+      <w:lvlText w:val="○"/>
+      <w:lvlJc w:val="left"/>
+      <w:pPr>
+        <w:ind w:left="1440" w:hanging="360"/>
+      </w:pPr>
+    </w:lvl>
+    <w:lvl w:ilvl="2" w:tplc="CA0E31B8" w:tentative="1">
+      <w:start w:val="1"/>
+      <w:numFmt w:val="bullet"/>
+      <w:lvlText w:val="■"/>
+      <w:lvlJc w:val="left"/>
+      <w:pPr>
+        <w:ind w:left="2160" w:hanging="360"/>
+      </w:pPr>
+    </w:lvl>
+    <w:lvl w:ilvl="3" w:tplc="C0946D0A" w:tentative="1">
+      <w:start w:val="1"/>
+      <w:numFmt w:val="bullet"/>
+      <w:lvlText w:val="●"/>
+      <w:lvlJc w:val="left"/>
+      <w:pPr>
+        <w:ind w:left="2880" w:hanging="360"/>
+      </w:pPr>
+    </w:lvl>
+    <w:lvl w:ilvl="4" w:tplc="853A789A" w:tentative="1">
+      <w:start w:val="1"/>
+      <w:numFmt w:val="bullet"/>
+      <w:lvlText w:val="○"/>
+      <w:lvlJc w:val="left"/>
+      <w:pPr>
+        <w:ind w:left="3600" w:hanging="360"/>
+      </w:pPr>
+    </w:lvl>
+    <w:lvl w:ilvl="5" w:tplc="0FC8AF3A" w:tentative="1">
+      <w:start w:val="1"/>
+      <w:numFmt w:val="bullet"/>
+      <w:lvlText w:val="■"/>
+      <w:lvlJc w:val="left"/>
+      <w:pPr>
+        <w:ind w:left="4320" w:hanging="360"/>
+      </w:pPr>
+    </w:lvl>
+    <w:lvl w:ilvl="6" w:tplc="E07210E0" w:tentative="1">
+      <w:start w:val="1"/>
+      <w:numFmt w:val="bullet"/>
+      <w:lvlText w:val="●"/>
+      <w:lvlJc w:val="left"/>
+      <w:pPr>
+        <w:ind w:left="5040" w:hanging="360"/>
+      </w:pPr>
+    </w:lvl>
+    <w:lvl w:ilvl="7" w:tplc="9D762A92" w:tentative="1">
+      <w:start w:val="1"/>
+      <w:numFmt w:val="bullet"/>
+      <w:lvlText w:val="●"/>
+      <w:lvlJc w:val="left"/>
+      <w:pPr>
+        <w:ind w:left="5760" w:hanging="360"/>
+      </w:pPr>
+    </w:lvl>
+    <w:lvl w:ilvl="8" w:tplc="8A044560" w:tentative="1">
+      <w:start w:val="1"/>
+      <w:numFmt w:val="bullet"/>
+      <w:lvlText w:val="●"/>
+      <w:lvlJc w:val="left"/>
+      <w:pPr>
+        <w:ind w:left="6480" w:hanging="360"/>
+      </w:pPr>
+    </w:lvl>
+  </w:abstractNum>
+  <w:abstractNum w:abstractNumId="8" w15:restartNumberingAfterBreak="0">
+    <w:nsid w:val="7AAD7EBD"/>
+    <w:multiLevelType w:val="hybridMultilevel"/>
+    <w:tmpl w:val="C2084E6E"/>
+    <w:lvl w:ilvl="0" w:tplc="5CACA3F4">
+      <w:start w:val="1"/>
+      <w:numFmt w:val="bullet"/>
+      <w:lvlText w:val="•"/>
+      <w:lvlJc w:val="left"/>
+      <w:pPr>
+        <w:ind w:left="540" w:hanging="270"/>
+      </w:pPr>
+    </w:lvl>
+    <w:lvl w:ilvl="1" w:tplc="40B830AA" w:tentative="1">
+      <w:start w:val="1"/>
+      <w:numFmt w:val="bullet"/>
+      <w:lvlText w:val="–"/>
+      <w:lvlJc w:val="left"/>
+      <w:pPr>
+        <w:ind w:left="1000" w:hanging="270"/>
+      </w:pPr>
+    </w:lvl>
+    <w:lvl w:ilvl="2" w:tplc="50B0D08C">
       <w:numFmt w:val="decimal"/>
       <w:lvlText w:val=""/>
       <w:lvlJc w:val="left"/>
     </w:lvl>
-    <w:lvl w:ilvl="2" w:tplc="379EF69A">
+    <w:lvl w:ilvl="3" w:tplc="4BE05AA8">
       <w:numFmt w:val="decimal"/>
       <w:lvlText w:val=""/>
       <w:lvlJc w:val="left"/>
     </w:lvl>
-    <w:lvl w:ilvl="3" w:tplc="02BC5FB0">
+    <w:lvl w:ilvl="4" w:tplc="6F00AED2">
       <w:numFmt w:val="decimal"/>
       <w:lvlText w:val=""/>
       <w:lvlJc w:val="left"/>
     </w:lvl>
-    <w:lvl w:ilvl="4" w:tplc="82380DEA">
+    <w:lvl w:ilvl="5" w:tplc="1F183356">
       <w:numFmt w:val="decimal"/>
       <w:lvlText w:val=""/>
       <w:lvlJc w:val="left"/>
     </w:lvl>
-    <w:lvl w:ilvl="5" w:tplc="1FF20CA0">
+    <w:lvl w:ilvl="6" w:tplc="CEC26F08">
       <w:numFmt w:val="decimal"/>
       <w:lvlText w:val=""/>
       <w:lvlJc w:val="left"/>
     </w:lvl>
-    <w:lvl w:ilvl="6" w:tplc="C6FE794E">
+    <w:lvl w:ilvl="7" w:tplc="1EF4ECF6">
       <w:numFmt w:val="decimal"/>
       <w:lvlText w:val=""/>
       <w:lvlJc w:val="left"/>
     </w:lvl>
-    <w:lvl w:ilvl="7" w:tplc="3B5ECE48">
-      <w:numFmt w:val="decimal"/>
-      <w:lvlText w:val=""/>
-      <w:lvlJc w:val="left"/>
-    </w:lvl>
-    <w:lvl w:ilvl="8" w:tplc="4E2E8EC4">
+    <w:lvl w:ilvl="8" w:tplc="5A82C754">
       <w:numFmt w:val="decimal"/>
       <w:lvlText w:val=""/>
       <w:lvlJc w:val="left"/>
     </w:lvl>
   </w:abstractNum>
-  <w:abstractNum w:abstractNumId="8" w15:restartNumberingAfterBreak="0">
-    <w:nsid w:val="7E026873"/>
-    <w:multiLevelType w:val="hybridMultilevel"/>
-    <w:tmpl w:val="7E225E54"/>
-    <w:lvl w:ilvl="0" w:tplc="440E5AF6">
-      <w:start w:val="1"/>
-      <w:numFmt w:val="decimal"/>
-      <w:lvlText w:val="%1."/>
-      <w:lvlJc w:val="left"/>
-      <w:pPr>
-        <w:ind w:left="540" w:hanging="360"/>
-      </w:pPr>
-    </w:lvl>
-    <w:lvl w:ilvl="1" w:tplc="E152B418">
-      <w:numFmt w:val="decimal"/>
-      <w:lvlText w:val=""/>
-      <w:lvlJc w:val="left"/>
-    </w:lvl>
-    <w:lvl w:ilvl="2" w:tplc="80268F2A">
-      <w:numFmt w:val="decimal"/>
-      <w:lvlText w:val=""/>
-      <w:lvlJc w:val="left"/>
-    </w:lvl>
-    <w:lvl w:ilvl="3" w:tplc="B3E04F8C">
-      <w:numFmt w:val="decimal"/>
-      <w:lvlText w:val=""/>
-      <w:lvlJc w:val="left"/>
-    </w:lvl>
-    <w:lvl w:ilvl="4" w:tplc="39AE42A8">
-      <w:numFmt w:val="decimal"/>
-      <w:lvlText w:val=""/>
-      <w:lvlJc w:val="left"/>
-    </w:lvl>
-    <w:lvl w:ilvl="5" w:tplc="A6603A12">
-      <w:numFmt w:val="decimal"/>
-      <w:lvlText w:val=""/>
-      <w:lvlJc w:val="left"/>
-    </w:lvl>
-    <w:lvl w:ilvl="6" w:tplc="370E6C24">
-      <w:numFmt w:val="decimal"/>
-      <w:lvlText w:val=""/>
-      <w:lvlJc w:val="left"/>
-    </w:lvl>
-    <w:lvl w:ilvl="7" w:tplc="0EF8B41C">
-      <w:numFmt w:val="decimal"/>
-      <w:lvlText w:val=""/>
-      <w:lvlJc w:val="left"/>
-    </w:lvl>
-    <w:lvl w:ilvl="8" w:tplc="49E417BA">
-      <w:numFmt w:val="decimal"/>
-      <w:lvlText w:val=""/>
-      <w:lvlJc w:val="left"/>
-    </w:lvl>
-  </w:abstractNum>
-  <w:num w:numId="1" w16cid:durableId="806700512">
-    <w:abstractNumId w:val="2"/>
+  <w:num w:numId="1" w16cid:durableId="537160447">
+    <w:abstractNumId w:val="7"/>
     <w:lvlOverride w:ilvl="0">
       <w:startOverride w:val="1"/>
     </w:lvlOverride>
   </w:num>
-  <w:num w:numId="2" w16cid:durableId="109201025">
+  <w:num w:numId="2" w16cid:durableId="1472946680">
+    <w:abstractNumId w:val="8"/>
+    <w:lvlOverride w:ilvl="0">
+      <w:startOverride w:val="1"/>
+    </w:lvlOverride>
+  </w:num>
+  <w:num w:numId="3" w16cid:durableId="1356923123">
     <w:abstractNumId w:val="3"/>
     <w:lvlOverride w:ilvl="0">
       <w:startOverride w:val="1"/>
     </w:lvlOverride>
   </w:num>
-  <w:num w:numId="3" w16cid:durableId="307364992">
-    <w:abstractNumId w:val="7"/>
-    <w:lvlOverride w:ilvl="0">
-      <w:startOverride w:val="1"/>
-    </w:lvlOverride>
-  </w:num>
-  <w:num w:numId="4" w16cid:durableId="1398043208">
+  <w:num w:numId="4" w16cid:durableId="1173256089">
     <w:abstractNumId w:val="1"/>
     <w:lvlOverride w:ilvl="0">
       <w:startOverride w:val="1"/>
     </w:lvlOverride>
   </w:num>
-  <w:num w:numId="5" w16cid:durableId="110364010">
-    <w:abstractNumId w:val="8"/>
+  <w:num w:numId="5" w16cid:durableId="1581404901">
+    <w:abstractNumId w:val="6"/>
     <w:lvlOverride w:ilvl="0">
       <w:startOverride w:val="1"/>
     </w:lvlOverride>
   </w:num>
-  <w:num w:numId="6" w16cid:durableId="867840993">
+  <w:num w:numId="6" w16cid:durableId="2108841165">
+    <w:abstractNumId w:val="0"/>
+    <w:lvlOverride w:ilvl="0">
+      <w:startOverride w:val="1"/>
+    </w:lvlOverride>
+  </w:num>
+  <w:num w:numId="7" w16cid:durableId="139883464">
+    <w:abstractNumId w:val="5"/>
+    <w:lvlOverride w:ilvl="0">
+      <w:startOverride w:val="1"/>
+    </w:lvlOverride>
+  </w:num>
+  <w:num w:numId="8" w16cid:durableId="614024860">
     <w:abstractNumId w:val="4"/>
     <w:lvlOverride w:ilvl="0">
       <w:startOverride w:val="1"/>
     </w:lvlOverride>
   </w:num>
-  <w:num w:numId="7" w16cid:durableId="75176842">
-    <w:abstractNumId w:val="6"/>
-    <w:lvlOverride w:ilvl="0">
-      <w:startOverride w:val="1"/>
-    </w:lvlOverride>
-  </w:num>
-  <w:num w:numId="8" w16cid:durableId="459153998">
-    <w:abstractNumId w:val="5"/>
-    <w:lvlOverride w:ilvl="0">
-      <w:startOverride w:val="1"/>
-    </w:lvlOverride>
-  </w:num>
-  <w:num w:numId="9" w16cid:durableId="302083993">
-    <w:abstractNumId w:val="0"/>
+  <w:num w:numId="9" w16cid:durableId="955212186">
+    <w:abstractNumId w:val="2"/>
     <w:lvlOverride w:ilvl="0">
       <w:startOverride w:val="1"/>
     </w:lvlOverride>
@@ -28142,7 +28149,7 @@
     <w:autoRedefine/>
     <w:uiPriority w:val="39"/>
     <w:unhideWhenUsed/>
-    <w:rsid w:val="00EA741E"/>
+    <w:rsid w:val="00494E9F"/>
     <w:pPr>
       <w:spacing w:after="100"/>
     </w:pPr>
@@ -28154,7 +28161,7 @@
     <w:autoRedefine/>
     <w:uiPriority w:val="39"/>
     <w:unhideWhenUsed/>
-    <w:rsid w:val="00EA741E"/>
+    <w:rsid w:val="00494E9F"/>
     <w:pPr>
       <w:spacing w:after="100"/>
       <w:ind w:left="220"/>

</xml_diff>

<commit_message>
fix(sigles): CTADP = Comité de Traitement et d'Analyse des Dénonciations et des Plaintes
Intitulé relevé dans le tableau des abréviations du manuel des procédures de l'ASCE-LC.
Corrigé dans l'écran des séances CTADP et dans le manuel de formation. L'annexe E
n'annonce plus d'écart sur le sigle DEI : le manuel dit bien Département d'Enquête et d'Investigation.

Co-Authored-By: Claude Sonnet 5.5 <noreply@anthropic.com>
</commit_message>
<xml_diff>
--- a/docs/formation/Manuel-de-formation-INTEGRITE-plus.docx
+++ b/docs/formation/Manuel-de-formation-INTEGRITE-plus.docx
@@ -17,7 +17,7 @@
           <w:noProof/>
         </w:rPr>
         <w:drawing>
-          <wp:inline distT="0" distB="0" distL="0" distR="0" wp14:anchorId="5D4CD703" wp14:editId="67E17F87">
+          <wp:inline distT="0" distB="0" distL="0" distR="0" wp14:anchorId="34D2CC76" wp14:editId="15FAA875">
             <wp:extent cx="2476500" cy="1190625"/>
             <wp:effectExtent l="0" t="0" r="0" b="0"/>
             <wp:docPr id="62" name="logo" descr="Logo ASCE-LC" title="Logo ASCE-LC"/>
@@ -190,7 +190,7 @@
     <w:sdt>
       <w:sdtPr>
         <w:alias w:val="Table des matières"/>
-        <w:id w:val="-1603107605"/>
+        <w:id w:val="784701481"/>
       </w:sdtPr>
       <w:sdtEndPr/>
       <w:sdtContent>
@@ -213,7 +213,7 @@
           <w:r>
             <w:fldChar w:fldCharType="separate"/>
           </w:r>
-          <w:hyperlink w:anchor="_Toc242302430" w:history="1">
+          <w:hyperlink w:anchor="_Toc242303048" w:history="1">
             <w:r>
               <w:rPr>
                 <w:rStyle w:val="Lienhypertexte"/>
@@ -237,7 +237,7 @@
               <w:rPr>
                 <w:noProof/>
               </w:rPr>
-              <w:instrText xml:space="preserve"> PAGEREF _Toc242302430 \h </w:instrText>
+              <w:instrText xml:space="preserve"> PAGEREF _Toc242303048 \h </w:instrText>
             </w:r>
             <w:r>
               <w:rPr>
@@ -274,7 +274,7 @@
               <w:noProof/>
             </w:rPr>
           </w:pPr>
-          <w:hyperlink w:anchor="_Toc242302431" w:history="1">
+          <w:hyperlink w:anchor="_Toc242303049" w:history="1">
             <w:r>
               <w:rPr>
                 <w:rStyle w:val="Lienhypertexte"/>
@@ -298,7 +298,7 @@
               <w:rPr>
                 <w:noProof/>
               </w:rPr>
-              <w:instrText xml:space="preserve"> PAGEREF _Toc242302431 \h </w:instrText>
+              <w:instrText xml:space="preserve"> PAGEREF _Toc242303049 \h </w:instrText>
             </w:r>
             <w:r>
               <w:rPr>
@@ -335,7 +335,7 @@
               <w:noProof/>
             </w:rPr>
           </w:pPr>
-          <w:hyperlink w:anchor="_Toc242302432" w:history="1">
+          <w:hyperlink w:anchor="_Toc242303050" w:history="1">
             <w:r>
               <w:rPr>
                 <w:rStyle w:val="Lienhypertexte"/>
@@ -359,7 +359,7 @@
               <w:rPr>
                 <w:noProof/>
               </w:rPr>
-              <w:instrText xml:space="preserve"> PAGEREF _Toc242302432 \h </w:instrText>
+              <w:instrText xml:space="preserve"> PAGEREF _Toc242303050 \h </w:instrText>
             </w:r>
             <w:r>
               <w:rPr>
@@ -396,7 +396,7 @@
               <w:noProof/>
             </w:rPr>
           </w:pPr>
-          <w:hyperlink w:anchor="_Toc242302433" w:history="1">
+          <w:hyperlink w:anchor="_Toc242303051" w:history="1">
             <w:r>
               <w:rPr>
                 <w:rStyle w:val="Lienhypertexte"/>
@@ -420,7 +420,7 @@
               <w:rPr>
                 <w:noProof/>
               </w:rPr>
-              <w:instrText xml:space="preserve"> PAGEREF _Toc242302433 \h </w:instrText>
+              <w:instrText xml:space="preserve"> PAGEREF _Toc242303051 \h </w:instrText>
             </w:r>
             <w:r>
               <w:rPr>
@@ -457,7 +457,7 @@
               <w:noProof/>
             </w:rPr>
           </w:pPr>
-          <w:hyperlink w:anchor="_Toc242302434" w:history="1">
+          <w:hyperlink w:anchor="_Toc242303052" w:history="1">
             <w:r>
               <w:rPr>
                 <w:rStyle w:val="Lienhypertexte"/>
@@ -481,7 +481,7 @@
               <w:rPr>
                 <w:noProof/>
               </w:rPr>
-              <w:instrText xml:space="preserve"> PAGEREF _Toc242302434 \h </w:instrText>
+              <w:instrText xml:space="preserve"> PAGEREF _Toc242303052 \h </w:instrText>
             </w:r>
             <w:r>
               <w:rPr>
@@ -518,7 +518,7 @@
               <w:noProof/>
             </w:rPr>
           </w:pPr>
-          <w:hyperlink w:anchor="_Toc242302435" w:history="1">
+          <w:hyperlink w:anchor="_Toc242303053" w:history="1">
             <w:r>
               <w:rPr>
                 <w:rStyle w:val="Lienhypertexte"/>
@@ -542,7 +542,7 @@
               <w:rPr>
                 <w:noProof/>
               </w:rPr>
-              <w:instrText xml:space="preserve"> PAGEREF _Toc242302435 \h </w:instrText>
+              <w:instrText xml:space="preserve"> PAGEREF _Toc242303053 \h </w:instrText>
             </w:r>
             <w:r>
               <w:rPr>
@@ -579,7 +579,7 @@
               <w:noProof/>
             </w:rPr>
           </w:pPr>
-          <w:hyperlink w:anchor="_Toc242302436" w:history="1">
+          <w:hyperlink w:anchor="_Toc242303054" w:history="1">
             <w:r>
               <w:rPr>
                 <w:rStyle w:val="Lienhypertexte"/>
@@ -603,7 +603,7 @@
               <w:rPr>
                 <w:noProof/>
               </w:rPr>
-              <w:instrText xml:space="preserve"> PAGEREF _Toc242302436 \h </w:instrText>
+              <w:instrText xml:space="preserve"> PAGEREF _Toc242303054 \h </w:instrText>
             </w:r>
             <w:r>
               <w:rPr>
@@ -640,7 +640,7 @@
               <w:noProof/>
             </w:rPr>
           </w:pPr>
-          <w:hyperlink w:anchor="_Toc242302437" w:history="1">
+          <w:hyperlink w:anchor="_Toc242303055" w:history="1">
             <w:r>
               <w:rPr>
                 <w:rStyle w:val="Lienhypertexte"/>
@@ -664,7 +664,7 @@
               <w:rPr>
                 <w:noProof/>
               </w:rPr>
-              <w:instrText xml:space="preserve"> PAGEREF _Toc242302437 \h </w:instrText>
+              <w:instrText xml:space="preserve"> PAGEREF _Toc242303055 \h </w:instrText>
             </w:r>
             <w:r>
               <w:rPr>
@@ -701,7 +701,7 @@
               <w:noProof/>
             </w:rPr>
           </w:pPr>
-          <w:hyperlink w:anchor="_Toc242302438" w:history="1">
+          <w:hyperlink w:anchor="_Toc242303056" w:history="1">
             <w:r>
               <w:rPr>
                 <w:rStyle w:val="Lienhypertexte"/>
@@ -725,7 +725,7 @@
               <w:rPr>
                 <w:noProof/>
               </w:rPr>
-              <w:instrText xml:space="preserve"> PAGEREF _Toc242302438 \h </w:instrText>
+              <w:instrText xml:space="preserve"> PAGEREF _Toc242303056 \h </w:instrText>
             </w:r>
             <w:r>
               <w:rPr>
@@ -762,7 +762,7 @@
               <w:noProof/>
             </w:rPr>
           </w:pPr>
-          <w:hyperlink w:anchor="_Toc242302439" w:history="1">
+          <w:hyperlink w:anchor="_Toc242303057" w:history="1">
             <w:r>
               <w:rPr>
                 <w:rStyle w:val="Lienhypertexte"/>
@@ -786,7 +786,7 @@
               <w:rPr>
                 <w:noProof/>
               </w:rPr>
-              <w:instrText xml:space="preserve"> PAGEREF _Toc242302439 \h </w:instrText>
+              <w:instrText xml:space="preserve"> PAGEREF _Toc242303057 \h </w:instrText>
             </w:r>
             <w:r>
               <w:rPr>
@@ -823,7 +823,7 @@
               <w:noProof/>
             </w:rPr>
           </w:pPr>
-          <w:hyperlink w:anchor="_Toc242302440" w:history="1">
+          <w:hyperlink w:anchor="_Toc242303058" w:history="1">
             <w:r>
               <w:rPr>
                 <w:rStyle w:val="Lienhypertexte"/>
@@ -847,7 +847,7 @@
               <w:rPr>
                 <w:noProof/>
               </w:rPr>
-              <w:instrText xml:space="preserve"> PAGEREF _Toc242302440 \h </w:instrText>
+              <w:instrText xml:space="preserve"> PAGEREF _Toc242303058 \h </w:instrText>
             </w:r>
             <w:r>
               <w:rPr>
@@ -884,7 +884,7 @@
               <w:noProof/>
             </w:rPr>
           </w:pPr>
-          <w:hyperlink w:anchor="_Toc242302441" w:history="1">
+          <w:hyperlink w:anchor="_Toc242303059" w:history="1">
             <w:r>
               <w:rPr>
                 <w:rStyle w:val="Lienhypertexte"/>
@@ -908,7 +908,7 @@
               <w:rPr>
                 <w:noProof/>
               </w:rPr>
-              <w:instrText xml:space="preserve"> PAGEREF _Toc242302441 \h </w:instrText>
+              <w:instrText xml:space="preserve"> PAGEREF _Toc242303059 \h </w:instrText>
             </w:r>
             <w:r>
               <w:rPr>
@@ -945,7 +945,7 @@
               <w:noProof/>
             </w:rPr>
           </w:pPr>
-          <w:hyperlink w:anchor="_Toc242302442" w:history="1">
+          <w:hyperlink w:anchor="_Toc242303060" w:history="1">
             <w:r>
               <w:rPr>
                 <w:rStyle w:val="Lienhypertexte"/>
@@ -969,7 +969,7 @@
               <w:rPr>
                 <w:noProof/>
               </w:rPr>
-              <w:instrText xml:space="preserve"> PAGEREF _Toc242302442 \h </w:instrText>
+              <w:instrText xml:space="preserve"> PAGEREF _Toc242303060 \h </w:instrText>
             </w:r>
             <w:r>
               <w:rPr>
@@ -1006,7 +1006,7 @@
               <w:noProof/>
             </w:rPr>
           </w:pPr>
-          <w:hyperlink w:anchor="_Toc242302443" w:history="1">
+          <w:hyperlink w:anchor="_Toc242303061" w:history="1">
             <w:r>
               <w:rPr>
                 <w:rStyle w:val="Lienhypertexte"/>
@@ -1030,7 +1030,7 @@
               <w:rPr>
                 <w:noProof/>
               </w:rPr>
-              <w:instrText xml:space="preserve"> PAGEREF _Toc242302443 \h </w:instrText>
+              <w:instrText xml:space="preserve"> PAGEREF _Toc242303061 \h </w:instrText>
             </w:r>
             <w:r>
               <w:rPr>
@@ -1067,7 +1067,7 @@
               <w:noProof/>
             </w:rPr>
           </w:pPr>
-          <w:hyperlink w:anchor="_Toc242302444" w:history="1">
+          <w:hyperlink w:anchor="_Toc242303062" w:history="1">
             <w:r>
               <w:rPr>
                 <w:rStyle w:val="Lienhypertexte"/>
@@ -1091,7 +1091,7 @@
               <w:rPr>
                 <w:noProof/>
               </w:rPr>
-              <w:instrText xml:space="preserve"> PAGEREF _Toc242302444 \h </w:instrText>
+              <w:instrText xml:space="preserve"> PAGEREF _Toc242303062 \h </w:instrText>
             </w:r>
             <w:r>
               <w:rPr>
@@ -1128,7 +1128,7 @@
               <w:noProof/>
             </w:rPr>
           </w:pPr>
-          <w:hyperlink w:anchor="_Toc242302445" w:history="1">
+          <w:hyperlink w:anchor="_Toc242303063" w:history="1">
             <w:r>
               <w:rPr>
                 <w:rStyle w:val="Lienhypertexte"/>
@@ -1152,7 +1152,7 @@
               <w:rPr>
                 <w:noProof/>
               </w:rPr>
-              <w:instrText xml:space="preserve"> PAGEREF _Toc242302445 \h </w:instrText>
+              <w:instrText xml:space="preserve"> PAGEREF _Toc242303063 \h </w:instrText>
             </w:r>
             <w:r>
               <w:rPr>
@@ -1189,7 +1189,7 @@
               <w:noProof/>
             </w:rPr>
           </w:pPr>
-          <w:hyperlink w:anchor="_Toc242302446" w:history="1">
+          <w:hyperlink w:anchor="_Toc242303064" w:history="1">
             <w:r>
               <w:rPr>
                 <w:rStyle w:val="Lienhypertexte"/>
@@ -1213,7 +1213,7 @@
               <w:rPr>
                 <w:noProof/>
               </w:rPr>
-              <w:instrText xml:space="preserve"> PAGEREF _Toc242302446 \h </w:instrText>
+              <w:instrText xml:space="preserve"> PAGEREF _Toc242303064 \h </w:instrText>
             </w:r>
             <w:r>
               <w:rPr>
@@ -1250,7 +1250,7 @@
               <w:noProof/>
             </w:rPr>
           </w:pPr>
-          <w:hyperlink w:anchor="_Toc242302447" w:history="1">
+          <w:hyperlink w:anchor="_Toc242303065" w:history="1">
             <w:r>
               <w:rPr>
                 <w:rStyle w:val="Lienhypertexte"/>
@@ -1274,7 +1274,7 @@
               <w:rPr>
                 <w:noProof/>
               </w:rPr>
-              <w:instrText xml:space="preserve"> PAGEREF _Toc242302447 \h </w:instrText>
+              <w:instrText xml:space="preserve"> PAGEREF _Toc242303065 \h </w:instrText>
             </w:r>
             <w:r>
               <w:rPr>
@@ -1311,7 +1311,7 @@
               <w:noProof/>
             </w:rPr>
           </w:pPr>
-          <w:hyperlink w:anchor="_Toc242302448" w:history="1">
+          <w:hyperlink w:anchor="_Toc242303066" w:history="1">
             <w:r>
               <w:rPr>
                 <w:rStyle w:val="Lienhypertexte"/>
@@ -1335,7 +1335,7 @@
               <w:rPr>
                 <w:noProof/>
               </w:rPr>
-              <w:instrText xml:space="preserve"> PAGEREF _Toc242302448 \h </w:instrText>
+              <w:instrText xml:space="preserve"> PAGEREF _Toc242303066 \h </w:instrText>
             </w:r>
             <w:r>
               <w:rPr>
@@ -1372,7 +1372,7 @@
               <w:noProof/>
             </w:rPr>
           </w:pPr>
-          <w:hyperlink w:anchor="_Toc242302449" w:history="1">
+          <w:hyperlink w:anchor="_Toc242303067" w:history="1">
             <w:r>
               <w:rPr>
                 <w:rStyle w:val="Lienhypertexte"/>
@@ -1396,7 +1396,7 @@
               <w:rPr>
                 <w:noProof/>
               </w:rPr>
-              <w:instrText xml:space="preserve"> PAGEREF _Toc242302449 \h </w:instrText>
+              <w:instrText xml:space="preserve"> PAGEREF _Toc242303067 \h </w:instrText>
             </w:r>
             <w:r>
               <w:rPr>
@@ -1433,7 +1433,7 @@
               <w:noProof/>
             </w:rPr>
           </w:pPr>
-          <w:hyperlink w:anchor="_Toc242302450" w:history="1">
+          <w:hyperlink w:anchor="_Toc242303068" w:history="1">
             <w:r>
               <w:rPr>
                 <w:rStyle w:val="Lienhypertexte"/>
@@ -1457,7 +1457,7 @@
               <w:rPr>
                 <w:noProof/>
               </w:rPr>
-              <w:instrText xml:space="preserve"> PAGEREF _Toc242302450 \h </w:instrText>
+              <w:instrText xml:space="preserve"> PAGEREF _Toc242303068 \h </w:instrText>
             </w:r>
             <w:r>
               <w:rPr>
@@ -1494,7 +1494,7 @@
               <w:noProof/>
             </w:rPr>
           </w:pPr>
-          <w:hyperlink w:anchor="_Toc242302451" w:history="1">
+          <w:hyperlink w:anchor="_Toc242303069" w:history="1">
             <w:r>
               <w:rPr>
                 <w:rStyle w:val="Lienhypertexte"/>
@@ -1518,7 +1518,7 @@
               <w:rPr>
                 <w:noProof/>
               </w:rPr>
-              <w:instrText xml:space="preserve"> PAGEREF _Toc242302451 \h </w:instrText>
+              <w:instrText xml:space="preserve"> PAGEREF _Toc242303069 \h </w:instrText>
             </w:r>
             <w:r>
               <w:rPr>
@@ -1555,7 +1555,7 @@
               <w:noProof/>
             </w:rPr>
           </w:pPr>
-          <w:hyperlink w:anchor="_Toc242302452" w:history="1">
+          <w:hyperlink w:anchor="_Toc242303070" w:history="1">
             <w:r>
               <w:rPr>
                 <w:rStyle w:val="Lienhypertexte"/>
@@ -1579,7 +1579,7 @@
               <w:rPr>
                 <w:noProof/>
               </w:rPr>
-              <w:instrText xml:space="preserve"> PAGEREF _Toc242302452 \h </w:instrText>
+              <w:instrText xml:space="preserve"> PAGEREF _Toc242303070 \h </w:instrText>
             </w:r>
             <w:r>
               <w:rPr>
@@ -1616,7 +1616,7 @@
               <w:noProof/>
             </w:rPr>
           </w:pPr>
-          <w:hyperlink w:anchor="_Toc242302453" w:history="1">
+          <w:hyperlink w:anchor="_Toc242303071" w:history="1">
             <w:r>
               <w:rPr>
                 <w:rStyle w:val="Lienhypertexte"/>
@@ -1640,7 +1640,7 @@
               <w:rPr>
                 <w:noProof/>
               </w:rPr>
-              <w:instrText xml:space="preserve"> PAGEREF _Toc242302453 \h </w:instrText>
+              <w:instrText xml:space="preserve"> PAGEREF _Toc242303071 \h </w:instrText>
             </w:r>
             <w:r>
               <w:rPr>
@@ -1677,7 +1677,7 @@
               <w:noProof/>
             </w:rPr>
           </w:pPr>
-          <w:hyperlink w:anchor="_Toc242302454" w:history="1">
+          <w:hyperlink w:anchor="_Toc242303072" w:history="1">
             <w:r>
               <w:rPr>
                 <w:rStyle w:val="Lienhypertexte"/>
@@ -1701,7 +1701,7 @@
               <w:rPr>
                 <w:noProof/>
               </w:rPr>
-              <w:instrText xml:space="preserve"> PAGEREF _Toc242302454 \h </w:instrText>
+              <w:instrText xml:space="preserve"> PAGEREF _Toc242303072 \h </w:instrText>
             </w:r>
             <w:r>
               <w:rPr>
@@ -1738,7 +1738,7 @@
               <w:noProof/>
             </w:rPr>
           </w:pPr>
-          <w:hyperlink w:anchor="_Toc242302455" w:history="1">
+          <w:hyperlink w:anchor="_Toc242303073" w:history="1">
             <w:r>
               <w:rPr>
                 <w:rStyle w:val="Lienhypertexte"/>
@@ -1762,7 +1762,7 @@
               <w:rPr>
                 <w:noProof/>
               </w:rPr>
-              <w:instrText xml:space="preserve"> PAGEREF _Toc242302455 \h </w:instrText>
+              <w:instrText xml:space="preserve"> PAGEREF _Toc242303073 \h </w:instrText>
             </w:r>
             <w:r>
               <w:rPr>
@@ -1799,7 +1799,7 @@
               <w:noProof/>
             </w:rPr>
           </w:pPr>
-          <w:hyperlink w:anchor="_Toc242302456" w:history="1">
+          <w:hyperlink w:anchor="_Toc242303074" w:history="1">
             <w:r>
               <w:rPr>
                 <w:rStyle w:val="Lienhypertexte"/>
@@ -1823,7 +1823,7 @@
               <w:rPr>
                 <w:noProof/>
               </w:rPr>
-              <w:instrText xml:space="preserve"> PAGEREF _Toc242302456 \h </w:instrText>
+              <w:instrText xml:space="preserve"> PAGEREF _Toc242303074 \h </w:instrText>
             </w:r>
             <w:r>
               <w:rPr>
@@ -1860,7 +1860,7 @@
               <w:noProof/>
             </w:rPr>
           </w:pPr>
-          <w:hyperlink w:anchor="_Toc242302457" w:history="1">
+          <w:hyperlink w:anchor="_Toc242303075" w:history="1">
             <w:r>
               <w:rPr>
                 <w:rStyle w:val="Lienhypertexte"/>
@@ -1884,7 +1884,7 @@
               <w:rPr>
                 <w:noProof/>
               </w:rPr>
-              <w:instrText xml:space="preserve"> PAGEREF _Toc242302457 \h </w:instrText>
+              <w:instrText xml:space="preserve"> PAGEREF _Toc242303075 \h </w:instrText>
             </w:r>
             <w:r>
               <w:rPr>
@@ -1921,7 +1921,7 @@
               <w:noProof/>
             </w:rPr>
           </w:pPr>
-          <w:hyperlink w:anchor="_Toc242302458" w:history="1">
+          <w:hyperlink w:anchor="_Toc242303076" w:history="1">
             <w:r>
               <w:rPr>
                 <w:rStyle w:val="Lienhypertexte"/>
@@ -1945,7 +1945,7 @@
               <w:rPr>
                 <w:noProof/>
               </w:rPr>
-              <w:instrText xml:space="preserve"> PAGEREF _Toc242302458 \h </w:instrText>
+              <w:instrText xml:space="preserve"> PAGEREF _Toc242303076 \h </w:instrText>
             </w:r>
             <w:r>
               <w:rPr>
@@ -1982,7 +1982,7 @@
               <w:noProof/>
             </w:rPr>
           </w:pPr>
-          <w:hyperlink w:anchor="_Toc242302459" w:history="1">
+          <w:hyperlink w:anchor="_Toc242303077" w:history="1">
             <w:r>
               <w:rPr>
                 <w:rStyle w:val="Lienhypertexte"/>
@@ -2006,7 +2006,7 @@
               <w:rPr>
                 <w:noProof/>
               </w:rPr>
-              <w:instrText xml:space="preserve"> PAGEREF _Toc242302459 \h </w:instrText>
+              <w:instrText xml:space="preserve"> PAGEREF _Toc242303077 \h </w:instrText>
             </w:r>
             <w:r>
               <w:rPr>
@@ -2043,7 +2043,7 @@
               <w:noProof/>
             </w:rPr>
           </w:pPr>
-          <w:hyperlink w:anchor="_Toc242302460" w:history="1">
+          <w:hyperlink w:anchor="_Toc242303078" w:history="1">
             <w:r>
               <w:rPr>
                 <w:rStyle w:val="Lienhypertexte"/>
@@ -2067,7 +2067,7 @@
               <w:rPr>
                 <w:noProof/>
               </w:rPr>
-              <w:instrText xml:space="preserve"> PAGEREF _Toc242302460 \h </w:instrText>
+              <w:instrText xml:space="preserve"> PAGEREF _Toc242303078 \h </w:instrText>
             </w:r>
             <w:r>
               <w:rPr>
@@ -2104,7 +2104,7 @@
               <w:noProof/>
             </w:rPr>
           </w:pPr>
-          <w:hyperlink w:anchor="_Toc242302461" w:history="1">
+          <w:hyperlink w:anchor="_Toc242303079" w:history="1">
             <w:r>
               <w:rPr>
                 <w:rStyle w:val="Lienhypertexte"/>
@@ -2128,7 +2128,7 @@
               <w:rPr>
                 <w:noProof/>
               </w:rPr>
-              <w:instrText xml:space="preserve"> PAGEREF _Toc242302461 \h </w:instrText>
+              <w:instrText xml:space="preserve"> PAGEREF _Toc242303079 \h </w:instrText>
             </w:r>
             <w:r>
               <w:rPr>
@@ -2165,7 +2165,7 @@
               <w:noProof/>
             </w:rPr>
           </w:pPr>
-          <w:hyperlink w:anchor="_Toc242302462" w:history="1">
+          <w:hyperlink w:anchor="_Toc242303080" w:history="1">
             <w:r>
               <w:rPr>
                 <w:rStyle w:val="Lienhypertexte"/>
@@ -2189,7 +2189,7 @@
               <w:rPr>
                 <w:noProof/>
               </w:rPr>
-              <w:instrText xml:space="preserve"> PAGEREF _Toc242302462 \h </w:instrText>
+              <w:instrText xml:space="preserve"> PAGEREF _Toc242303080 \h </w:instrText>
             </w:r>
             <w:r>
               <w:rPr>
@@ -2226,7 +2226,7 @@
               <w:noProof/>
             </w:rPr>
           </w:pPr>
-          <w:hyperlink w:anchor="_Toc242302463" w:history="1">
+          <w:hyperlink w:anchor="_Toc242303081" w:history="1">
             <w:r>
               <w:rPr>
                 <w:rStyle w:val="Lienhypertexte"/>
@@ -2250,7 +2250,7 @@
               <w:rPr>
                 <w:noProof/>
               </w:rPr>
-              <w:instrText xml:space="preserve"> PAGEREF _Toc242302463 \h </w:instrText>
+              <w:instrText xml:space="preserve"> PAGEREF _Toc242303081 \h </w:instrText>
             </w:r>
             <w:r>
               <w:rPr>
@@ -2287,7 +2287,7 @@
               <w:noProof/>
             </w:rPr>
           </w:pPr>
-          <w:hyperlink w:anchor="_Toc242302464" w:history="1">
+          <w:hyperlink w:anchor="_Toc242303082" w:history="1">
             <w:r>
               <w:rPr>
                 <w:rStyle w:val="Lienhypertexte"/>
@@ -2311,7 +2311,7 @@
               <w:rPr>
                 <w:noProof/>
               </w:rPr>
-              <w:instrText xml:space="preserve"> PAGEREF _Toc242302464 \h </w:instrText>
+              <w:instrText xml:space="preserve"> PAGEREF _Toc242303082 \h </w:instrText>
             </w:r>
             <w:r>
               <w:rPr>
@@ -2348,7 +2348,7 @@
               <w:noProof/>
             </w:rPr>
           </w:pPr>
-          <w:hyperlink w:anchor="_Toc242302465" w:history="1">
+          <w:hyperlink w:anchor="_Toc242303083" w:history="1">
             <w:r>
               <w:rPr>
                 <w:rStyle w:val="Lienhypertexte"/>
@@ -2372,7 +2372,7 @@
               <w:rPr>
                 <w:noProof/>
               </w:rPr>
-              <w:instrText xml:space="preserve"> PAGEREF _Toc242302465 \h </w:instrText>
+              <w:instrText xml:space="preserve"> PAGEREF _Toc242303083 \h </w:instrText>
             </w:r>
             <w:r>
               <w:rPr>
@@ -2409,7 +2409,7 @@
               <w:noProof/>
             </w:rPr>
           </w:pPr>
-          <w:hyperlink w:anchor="_Toc242302466" w:history="1">
+          <w:hyperlink w:anchor="_Toc242303084" w:history="1">
             <w:r>
               <w:rPr>
                 <w:rStyle w:val="Lienhypertexte"/>
@@ -2433,7 +2433,7 @@
               <w:rPr>
                 <w:noProof/>
               </w:rPr>
-              <w:instrText xml:space="preserve"> PAGEREF _Toc242302466 \h </w:instrText>
+              <w:instrText xml:space="preserve"> PAGEREF _Toc242303084 \h </w:instrText>
             </w:r>
             <w:r>
               <w:rPr>
@@ -2470,7 +2470,7 @@
               <w:noProof/>
             </w:rPr>
           </w:pPr>
-          <w:hyperlink w:anchor="_Toc242302467" w:history="1">
+          <w:hyperlink w:anchor="_Toc242303085" w:history="1">
             <w:r>
               <w:rPr>
                 <w:rStyle w:val="Lienhypertexte"/>
@@ -2494,7 +2494,7 @@
               <w:rPr>
                 <w:noProof/>
               </w:rPr>
-              <w:instrText xml:space="preserve"> PAGEREF _Toc242302467 \h </w:instrText>
+              <w:instrText xml:space="preserve"> PAGEREF _Toc242303085 \h </w:instrText>
             </w:r>
             <w:r>
               <w:rPr>
@@ -2531,7 +2531,7 @@
               <w:noProof/>
             </w:rPr>
           </w:pPr>
-          <w:hyperlink w:anchor="_Toc242302468" w:history="1">
+          <w:hyperlink w:anchor="_Toc242303086" w:history="1">
             <w:r>
               <w:rPr>
                 <w:rStyle w:val="Lienhypertexte"/>
@@ -2555,7 +2555,7 @@
               <w:rPr>
                 <w:noProof/>
               </w:rPr>
-              <w:instrText xml:space="preserve"> PAGEREF _Toc242302468 \h </w:instrText>
+              <w:instrText xml:space="preserve"> PAGEREF _Toc242303086 \h </w:instrText>
             </w:r>
             <w:r>
               <w:rPr>
@@ -2592,7 +2592,7 @@
               <w:noProof/>
             </w:rPr>
           </w:pPr>
-          <w:hyperlink w:anchor="_Toc242302469" w:history="1">
+          <w:hyperlink w:anchor="_Toc242303087" w:history="1">
             <w:r>
               <w:rPr>
                 <w:rStyle w:val="Lienhypertexte"/>
@@ -2616,7 +2616,7 @@
               <w:rPr>
                 <w:noProof/>
               </w:rPr>
-              <w:instrText xml:space="preserve"> PAGEREF _Toc242302469 \h </w:instrText>
+              <w:instrText xml:space="preserve"> PAGEREF _Toc242303087 \h </w:instrText>
             </w:r>
             <w:r>
               <w:rPr>
@@ -2653,7 +2653,7 @@
               <w:noProof/>
             </w:rPr>
           </w:pPr>
-          <w:hyperlink w:anchor="_Toc242302470" w:history="1">
+          <w:hyperlink w:anchor="_Toc242303088" w:history="1">
             <w:r>
               <w:rPr>
                 <w:rStyle w:val="Lienhypertexte"/>
@@ -2677,7 +2677,7 @@
               <w:rPr>
                 <w:noProof/>
               </w:rPr>
-              <w:instrText xml:space="preserve"> PAGEREF _Toc242302470 \h </w:instrText>
+              <w:instrText xml:space="preserve"> PAGEREF _Toc242303088 \h </w:instrText>
             </w:r>
             <w:r>
               <w:rPr>
@@ -2714,7 +2714,7 @@
               <w:noProof/>
             </w:rPr>
           </w:pPr>
-          <w:hyperlink w:anchor="_Toc242302471" w:history="1">
+          <w:hyperlink w:anchor="_Toc242303089" w:history="1">
             <w:r>
               <w:rPr>
                 <w:rStyle w:val="Lienhypertexte"/>
@@ -2738,7 +2738,7 @@
               <w:rPr>
                 <w:noProof/>
               </w:rPr>
-              <w:instrText xml:space="preserve"> PAGEREF _Toc242302471 \h </w:instrText>
+              <w:instrText xml:space="preserve"> PAGEREF _Toc242303089 \h </w:instrText>
             </w:r>
             <w:r>
               <w:rPr>
@@ -2775,7 +2775,7 @@
               <w:noProof/>
             </w:rPr>
           </w:pPr>
-          <w:hyperlink w:anchor="_Toc242302472" w:history="1">
+          <w:hyperlink w:anchor="_Toc242303090" w:history="1">
             <w:r>
               <w:rPr>
                 <w:rStyle w:val="Lienhypertexte"/>
@@ -2799,7 +2799,7 @@
               <w:rPr>
                 <w:noProof/>
               </w:rPr>
-              <w:instrText xml:space="preserve"> PAGEREF _Toc242302472 \h </w:instrText>
+              <w:instrText xml:space="preserve"> PAGEREF _Toc242303090 \h </w:instrText>
             </w:r>
             <w:r>
               <w:rPr>
@@ -2836,7 +2836,7 @@
               <w:noProof/>
             </w:rPr>
           </w:pPr>
-          <w:hyperlink w:anchor="_Toc242302473" w:history="1">
+          <w:hyperlink w:anchor="_Toc242303091" w:history="1">
             <w:r>
               <w:rPr>
                 <w:rStyle w:val="Lienhypertexte"/>
@@ -2860,7 +2860,7 @@
               <w:rPr>
                 <w:noProof/>
               </w:rPr>
-              <w:instrText xml:space="preserve"> PAGEREF _Toc242302473 \h </w:instrText>
+              <w:instrText xml:space="preserve"> PAGEREF _Toc242303091 \h </w:instrText>
             </w:r>
             <w:r>
               <w:rPr>
@@ -2897,7 +2897,7 @@
               <w:noProof/>
             </w:rPr>
           </w:pPr>
-          <w:hyperlink w:anchor="_Toc242302474" w:history="1">
+          <w:hyperlink w:anchor="_Toc242303092" w:history="1">
             <w:r>
               <w:rPr>
                 <w:rStyle w:val="Lienhypertexte"/>
@@ -2921,7 +2921,7 @@
               <w:rPr>
                 <w:noProof/>
               </w:rPr>
-              <w:instrText xml:space="preserve"> PAGEREF _Toc242302474 \h </w:instrText>
+              <w:instrText xml:space="preserve"> PAGEREF _Toc242303092 \h </w:instrText>
             </w:r>
             <w:r>
               <w:rPr>
@@ -2958,7 +2958,7 @@
               <w:noProof/>
             </w:rPr>
           </w:pPr>
-          <w:hyperlink w:anchor="_Toc242302475" w:history="1">
+          <w:hyperlink w:anchor="_Toc242303093" w:history="1">
             <w:r>
               <w:rPr>
                 <w:rStyle w:val="Lienhypertexte"/>
@@ -2982,7 +2982,7 @@
               <w:rPr>
                 <w:noProof/>
               </w:rPr>
-              <w:instrText xml:space="preserve"> PAGEREF _Toc242302475 \h </w:instrText>
+              <w:instrText xml:space="preserve"> PAGEREF _Toc242303093 \h </w:instrText>
             </w:r>
             <w:r>
               <w:rPr>
@@ -3019,7 +3019,7 @@
               <w:noProof/>
             </w:rPr>
           </w:pPr>
-          <w:hyperlink w:anchor="_Toc242302476" w:history="1">
+          <w:hyperlink w:anchor="_Toc242303094" w:history="1">
             <w:r>
               <w:rPr>
                 <w:rStyle w:val="Lienhypertexte"/>
@@ -3043,7 +3043,7 @@
               <w:rPr>
                 <w:noProof/>
               </w:rPr>
-              <w:instrText xml:space="preserve"> PAGEREF _Toc242302476 \h </w:instrText>
+              <w:instrText xml:space="preserve"> PAGEREF _Toc242303094 \h </w:instrText>
             </w:r>
             <w:r>
               <w:rPr>
@@ -3080,7 +3080,7 @@
               <w:noProof/>
             </w:rPr>
           </w:pPr>
-          <w:hyperlink w:anchor="_Toc242302477" w:history="1">
+          <w:hyperlink w:anchor="_Toc242303095" w:history="1">
             <w:r>
               <w:rPr>
                 <w:rStyle w:val="Lienhypertexte"/>
@@ -3104,7 +3104,7 @@
               <w:rPr>
                 <w:noProof/>
               </w:rPr>
-              <w:instrText xml:space="preserve"> PAGEREF _Toc242302477 \h </w:instrText>
+              <w:instrText xml:space="preserve"> PAGEREF _Toc242303095 \h </w:instrText>
             </w:r>
             <w:r>
               <w:rPr>
@@ -3141,7 +3141,7 @@
               <w:noProof/>
             </w:rPr>
           </w:pPr>
-          <w:hyperlink w:anchor="_Toc242302478" w:history="1">
+          <w:hyperlink w:anchor="_Toc242303096" w:history="1">
             <w:r>
               <w:rPr>
                 <w:rStyle w:val="Lienhypertexte"/>
@@ -3165,7 +3165,7 @@
               <w:rPr>
                 <w:noProof/>
               </w:rPr>
-              <w:instrText xml:space="preserve"> PAGEREF _Toc242302478 \h </w:instrText>
+              <w:instrText xml:space="preserve"> PAGEREF _Toc242303096 \h </w:instrText>
             </w:r>
             <w:r>
               <w:rPr>
@@ -3202,7 +3202,7 @@
               <w:noProof/>
             </w:rPr>
           </w:pPr>
-          <w:hyperlink w:anchor="_Toc242302479" w:history="1">
+          <w:hyperlink w:anchor="_Toc242303097" w:history="1">
             <w:r>
               <w:rPr>
                 <w:rStyle w:val="Lienhypertexte"/>
@@ -3226,7 +3226,7 @@
               <w:rPr>
                 <w:noProof/>
               </w:rPr>
-              <w:instrText xml:space="preserve"> PAGEREF _Toc242302479 \h </w:instrText>
+              <w:instrText xml:space="preserve"> PAGEREF _Toc242303097 \h </w:instrText>
             </w:r>
             <w:r>
               <w:rPr>
@@ -3263,7 +3263,7 @@
               <w:noProof/>
             </w:rPr>
           </w:pPr>
-          <w:hyperlink w:anchor="_Toc242302480" w:history="1">
+          <w:hyperlink w:anchor="_Toc242303098" w:history="1">
             <w:r>
               <w:rPr>
                 <w:rStyle w:val="Lienhypertexte"/>
@@ -3287,7 +3287,7 @@
               <w:rPr>
                 <w:noProof/>
               </w:rPr>
-              <w:instrText xml:space="preserve"> PAGEREF _Toc242302480 \h </w:instrText>
+              <w:instrText xml:space="preserve"> PAGEREF _Toc242303098 \h </w:instrText>
             </w:r>
             <w:r>
               <w:rPr>
@@ -3324,7 +3324,7 @@
               <w:noProof/>
             </w:rPr>
           </w:pPr>
-          <w:hyperlink w:anchor="_Toc242302481" w:history="1">
+          <w:hyperlink w:anchor="_Toc242303099" w:history="1">
             <w:r>
               <w:rPr>
                 <w:rStyle w:val="Lienhypertexte"/>
@@ -3348,7 +3348,7 @@
               <w:rPr>
                 <w:noProof/>
               </w:rPr>
-              <w:instrText xml:space="preserve"> PAGEREF _Toc242302481 \h </w:instrText>
+              <w:instrText xml:space="preserve"> PAGEREF _Toc242303099 \h </w:instrText>
             </w:r>
             <w:r>
               <w:rPr>
@@ -3385,7 +3385,7 @@
               <w:noProof/>
             </w:rPr>
           </w:pPr>
-          <w:hyperlink w:anchor="_Toc242302482" w:history="1">
+          <w:hyperlink w:anchor="_Toc242303100" w:history="1">
             <w:r>
               <w:rPr>
                 <w:rStyle w:val="Lienhypertexte"/>
@@ -3409,7 +3409,7 @@
               <w:rPr>
                 <w:noProof/>
               </w:rPr>
-              <w:instrText xml:space="preserve"> PAGEREF _Toc242302482 \h </w:instrText>
+              <w:instrText xml:space="preserve"> PAGEREF _Toc242303100 \h </w:instrText>
             </w:r>
             <w:r>
               <w:rPr>
@@ -3446,7 +3446,7 @@
               <w:noProof/>
             </w:rPr>
           </w:pPr>
-          <w:hyperlink w:anchor="_Toc242302483" w:history="1">
+          <w:hyperlink w:anchor="_Toc242303101" w:history="1">
             <w:r>
               <w:rPr>
                 <w:rStyle w:val="Lienhypertexte"/>
@@ -3470,7 +3470,7 @@
               <w:rPr>
                 <w:noProof/>
               </w:rPr>
-              <w:instrText xml:space="preserve"> PAGEREF _Toc242302483 \h </w:instrText>
+              <w:instrText xml:space="preserve"> PAGEREF _Toc242303101 \h </w:instrText>
             </w:r>
             <w:r>
               <w:rPr>
@@ -3507,7 +3507,7 @@
               <w:noProof/>
             </w:rPr>
           </w:pPr>
-          <w:hyperlink w:anchor="_Toc242302484" w:history="1">
+          <w:hyperlink w:anchor="_Toc242303102" w:history="1">
             <w:r>
               <w:rPr>
                 <w:rStyle w:val="Lienhypertexte"/>
@@ -3531,7 +3531,7 @@
               <w:rPr>
                 <w:noProof/>
               </w:rPr>
-              <w:instrText xml:space="preserve"> PAGEREF _Toc242302484 \h </w:instrText>
+              <w:instrText xml:space="preserve"> PAGEREF _Toc242303102 \h </w:instrText>
             </w:r>
             <w:r>
               <w:rPr>
@@ -3568,7 +3568,7 @@
               <w:noProof/>
             </w:rPr>
           </w:pPr>
-          <w:hyperlink w:anchor="_Toc242302485" w:history="1">
+          <w:hyperlink w:anchor="_Toc242303103" w:history="1">
             <w:r>
               <w:rPr>
                 <w:rStyle w:val="Lienhypertexte"/>
@@ -3592,7 +3592,7 @@
               <w:rPr>
                 <w:noProof/>
               </w:rPr>
-              <w:instrText xml:space="preserve"> PAGEREF _Toc242302485 \h </w:instrText>
+              <w:instrText xml:space="preserve"> PAGEREF _Toc242303103 \h </w:instrText>
             </w:r>
             <w:r>
               <w:rPr>
@@ -3629,7 +3629,7 @@
               <w:noProof/>
             </w:rPr>
           </w:pPr>
-          <w:hyperlink w:anchor="_Toc242302486" w:history="1">
+          <w:hyperlink w:anchor="_Toc242303104" w:history="1">
             <w:r>
               <w:rPr>
                 <w:rStyle w:val="Lienhypertexte"/>
@@ -3653,7 +3653,7 @@
               <w:rPr>
                 <w:noProof/>
               </w:rPr>
-              <w:instrText xml:space="preserve"> PAGEREF _Toc242302486 \h </w:instrText>
+              <w:instrText xml:space="preserve"> PAGEREF _Toc242303104 \h </w:instrText>
             </w:r>
             <w:r>
               <w:rPr>
@@ -3690,7 +3690,7 @@
               <w:noProof/>
             </w:rPr>
           </w:pPr>
-          <w:hyperlink w:anchor="_Toc242302487" w:history="1">
+          <w:hyperlink w:anchor="_Toc242303105" w:history="1">
             <w:r>
               <w:rPr>
                 <w:rStyle w:val="Lienhypertexte"/>
@@ -3714,7 +3714,7 @@
               <w:rPr>
                 <w:noProof/>
               </w:rPr>
-              <w:instrText xml:space="preserve"> PAGEREF _Toc242302487 \h </w:instrText>
+              <w:instrText xml:space="preserve"> PAGEREF _Toc242303105 \h </w:instrText>
             </w:r>
             <w:r>
               <w:rPr>
@@ -3751,7 +3751,7 @@
               <w:noProof/>
             </w:rPr>
           </w:pPr>
-          <w:hyperlink w:anchor="_Toc242302488" w:history="1">
+          <w:hyperlink w:anchor="_Toc242303106" w:history="1">
             <w:r>
               <w:rPr>
                 <w:rStyle w:val="Lienhypertexte"/>
@@ -3775,7 +3775,7 @@
               <w:rPr>
                 <w:noProof/>
               </w:rPr>
-              <w:instrText xml:space="preserve"> PAGEREF _Toc242302488 \h </w:instrText>
+              <w:instrText xml:space="preserve"> PAGEREF _Toc242303106 \h </w:instrText>
             </w:r>
             <w:r>
               <w:rPr>
@@ -3812,7 +3812,7 @@
               <w:noProof/>
             </w:rPr>
           </w:pPr>
-          <w:hyperlink w:anchor="_Toc242302489" w:history="1">
+          <w:hyperlink w:anchor="_Toc242303107" w:history="1">
             <w:r>
               <w:rPr>
                 <w:rStyle w:val="Lienhypertexte"/>
@@ -3836,7 +3836,7 @@
               <w:rPr>
                 <w:noProof/>
               </w:rPr>
-              <w:instrText xml:space="preserve"> PAGEREF _Toc242302489 \h </w:instrText>
+              <w:instrText xml:space="preserve"> PAGEREF _Toc242303107 \h </w:instrText>
             </w:r>
             <w:r>
               <w:rPr>
@@ -3873,7 +3873,7 @@
               <w:noProof/>
             </w:rPr>
           </w:pPr>
-          <w:hyperlink w:anchor="_Toc242302490" w:history="1">
+          <w:hyperlink w:anchor="_Toc242303108" w:history="1">
             <w:r>
               <w:rPr>
                 <w:rStyle w:val="Lienhypertexte"/>
@@ -3897,7 +3897,7 @@
               <w:rPr>
                 <w:noProof/>
               </w:rPr>
-              <w:instrText xml:space="preserve"> PAGEREF _Toc242302490 \h </w:instrText>
+              <w:instrText xml:space="preserve"> PAGEREF _Toc242303108 \h </w:instrText>
             </w:r>
             <w:r>
               <w:rPr>
@@ -3934,7 +3934,7 @@
               <w:noProof/>
             </w:rPr>
           </w:pPr>
-          <w:hyperlink w:anchor="_Toc242302491" w:history="1">
+          <w:hyperlink w:anchor="_Toc242303109" w:history="1">
             <w:r>
               <w:rPr>
                 <w:rStyle w:val="Lienhypertexte"/>
@@ -3958,7 +3958,7 @@
               <w:rPr>
                 <w:noProof/>
               </w:rPr>
-              <w:instrText xml:space="preserve"> PAGEREF _Toc242302491 \h </w:instrText>
+              <w:instrText xml:space="preserve"> PAGEREF _Toc242303109 \h </w:instrText>
             </w:r>
             <w:r>
               <w:rPr>
@@ -3995,7 +3995,7 @@
               <w:noProof/>
             </w:rPr>
           </w:pPr>
-          <w:hyperlink w:anchor="_Toc242302492" w:history="1">
+          <w:hyperlink w:anchor="_Toc242303110" w:history="1">
             <w:r>
               <w:rPr>
                 <w:rStyle w:val="Lienhypertexte"/>
@@ -4019,7 +4019,7 @@
               <w:rPr>
                 <w:noProof/>
               </w:rPr>
-              <w:instrText xml:space="preserve"> PAGEREF _Toc242302492 \h </w:instrText>
+              <w:instrText xml:space="preserve"> PAGEREF _Toc242303110 \h </w:instrText>
             </w:r>
             <w:r>
               <w:rPr>
@@ -4056,7 +4056,7 @@
               <w:noProof/>
             </w:rPr>
           </w:pPr>
-          <w:hyperlink w:anchor="_Toc242302493" w:history="1">
+          <w:hyperlink w:anchor="_Toc242303111" w:history="1">
             <w:r>
               <w:rPr>
                 <w:rStyle w:val="Lienhypertexte"/>
@@ -4080,7 +4080,7 @@
               <w:rPr>
                 <w:noProof/>
               </w:rPr>
-              <w:instrText xml:space="preserve"> PAGEREF _Toc242302493 \h </w:instrText>
+              <w:instrText xml:space="preserve"> PAGEREF _Toc242303111 \h </w:instrText>
             </w:r>
             <w:r>
               <w:rPr>
@@ -4117,7 +4117,7 @@
               <w:noProof/>
             </w:rPr>
           </w:pPr>
-          <w:hyperlink w:anchor="_Toc242302494" w:history="1">
+          <w:hyperlink w:anchor="_Toc242303112" w:history="1">
             <w:r>
               <w:rPr>
                 <w:rStyle w:val="Lienhypertexte"/>
@@ -4141,7 +4141,7 @@
               <w:rPr>
                 <w:noProof/>
               </w:rPr>
-              <w:instrText xml:space="preserve"> PAGEREF _Toc242302494 \h </w:instrText>
+              <w:instrText xml:space="preserve"> PAGEREF _Toc242303112 \h </w:instrText>
             </w:r>
             <w:r>
               <w:rPr>
@@ -4178,7 +4178,7 @@
               <w:noProof/>
             </w:rPr>
           </w:pPr>
-          <w:hyperlink w:anchor="_Toc242302495" w:history="1">
+          <w:hyperlink w:anchor="_Toc242303113" w:history="1">
             <w:r>
               <w:rPr>
                 <w:rStyle w:val="Lienhypertexte"/>
@@ -4202,7 +4202,7 @@
               <w:rPr>
                 <w:noProof/>
               </w:rPr>
-              <w:instrText xml:space="preserve"> PAGEREF _Toc242302495 \h </w:instrText>
+              <w:instrText xml:space="preserve"> PAGEREF _Toc242303113 \h </w:instrText>
             </w:r>
             <w:r>
               <w:rPr>
@@ -4239,7 +4239,7 @@
               <w:noProof/>
             </w:rPr>
           </w:pPr>
-          <w:hyperlink w:anchor="_Toc242302496" w:history="1">
+          <w:hyperlink w:anchor="_Toc242303114" w:history="1">
             <w:r>
               <w:rPr>
                 <w:rStyle w:val="Lienhypertexte"/>
@@ -4263,7 +4263,7 @@
               <w:rPr>
                 <w:noProof/>
               </w:rPr>
-              <w:instrText xml:space="preserve"> PAGEREF _Toc242302496 \h </w:instrText>
+              <w:instrText xml:space="preserve"> PAGEREF _Toc242303114 \h </w:instrText>
             </w:r>
             <w:r>
               <w:rPr>
@@ -4300,7 +4300,7 @@
               <w:noProof/>
             </w:rPr>
           </w:pPr>
-          <w:hyperlink w:anchor="_Toc242302497" w:history="1">
+          <w:hyperlink w:anchor="_Toc242303115" w:history="1">
             <w:r>
               <w:rPr>
                 <w:rStyle w:val="Lienhypertexte"/>
@@ -4324,7 +4324,7 @@
               <w:rPr>
                 <w:noProof/>
               </w:rPr>
-              <w:instrText xml:space="preserve"> PAGEREF _Toc242302497 \h </w:instrText>
+              <w:instrText xml:space="preserve"> PAGEREF _Toc242303115 \h </w:instrText>
             </w:r>
             <w:r>
               <w:rPr>
@@ -4361,7 +4361,7 @@
               <w:noProof/>
             </w:rPr>
           </w:pPr>
-          <w:hyperlink w:anchor="_Toc242302498" w:history="1">
+          <w:hyperlink w:anchor="_Toc242303116" w:history="1">
             <w:r>
               <w:rPr>
                 <w:rStyle w:val="Lienhypertexte"/>
@@ -4385,7 +4385,7 @@
               <w:rPr>
                 <w:noProof/>
               </w:rPr>
-              <w:instrText xml:space="preserve"> PAGEREF _Toc242302498 \h </w:instrText>
+              <w:instrText xml:space="preserve"> PAGEREF _Toc242303116 \h </w:instrText>
             </w:r>
             <w:r>
               <w:rPr>
@@ -4422,7 +4422,7 @@
               <w:noProof/>
             </w:rPr>
           </w:pPr>
-          <w:hyperlink w:anchor="_Toc242302499" w:history="1">
+          <w:hyperlink w:anchor="_Toc242303117" w:history="1">
             <w:r>
               <w:rPr>
                 <w:rStyle w:val="Lienhypertexte"/>
@@ -4446,7 +4446,7 @@
               <w:rPr>
                 <w:noProof/>
               </w:rPr>
-              <w:instrText xml:space="preserve"> PAGEREF _Toc242302499 \h </w:instrText>
+              <w:instrText xml:space="preserve"> PAGEREF _Toc242303117 \h </w:instrText>
             </w:r>
             <w:r>
               <w:rPr>
@@ -4483,7 +4483,7 @@
               <w:noProof/>
             </w:rPr>
           </w:pPr>
-          <w:hyperlink w:anchor="_Toc242302500" w:history="1">
+          <w:hyperlink w:anchor="_Toc242303118" w:history="1">
             <w:r>
               <w:rPr>
                 <w:rStyle w:val="Lienhypertexte"/>
@@ -4507,7 +4507,7 @@
               <w:rPr>
                 <w:noProof/>
               </w:rPr>
-              <w:instrText xml:space="preserve"> PAGEREF _Toc242302500 \h </w:instrText>
+              <w:instrText xml:space="preserve"> PAGEREF _Toc242303118 \h </w:instrText>
             </w:r>
             <w:r>
               <w:rPr>
@@ -4544,7 +4544,7 @@
               <w:noProof/>
             </w:rPr>
           </w:pPr>
-          <w:hyperlink w:anchor="_Toc242302501" w:history="1">
+          <w:hyperlink w:anchor="_Toc242303119" w:history="1">
             <w:r>
               <w:rPr>
                 <w:rStyle w:val="Lienhypertexte"/>
@@ -4568,7 +4568,7 @@
               <w:rPr>
                 <w:noProof/>
               </w:rPr>
-              <w:instrText xml:space="preserve"> PAGEREF _Toc242302501 \h </w:instrText>
+              <w:instrText xml:space="preserve"> PAGEREF _Toc242303119 \h </w:instrText>
             </w:r>
             <w:r>
               <w:rPr>
@@ -4605,7 +4605,7 @@
               <w:noProof/>
             </w:rPr>
           </w:pPr>
-          <w:hyperlink w:anchor="_Toc242302502" w:history="1">
+          <w:hyperlink w:anchor="_Toc242303120" w:history="1">
             <w:r>
               <w:rPr>
                 <w:rStyle w:val="Lienhypertexte"/>
@@ -4629,7 +4629,7 @@
               <w:rPr>
                 <w:noProof/>
               </w:rPr>
-              <w:instrText xml:space="preserve"> PAGEREF _Toc242302502 \h </w:instrText>
+              <w:instrText xml:space="preserve"> PAGEREF _Toc242303120 \h </w:instrText>
             </w:r>
             <w:r>
               <w:rPr>
@@ -4666,7 +4666,7 @@
               <w:noProof/>
             </w:rPr>
           </w:pPr>
-          <w:hyperlink w:anchor="_Toc242302503" w:history="1">
+          <w:hyperlink w:anchor="_Toc242303121" w:history="1">
             <w:r>
               <w:rPr>
                 <w:rStyle w:val="Lienhypertexte"/>
@@ -4690,7 +4690,7 @@
               <w:rPr>
                 <w:noProof/>
               </w:rPr>
-              <w:instrText xml:space="preserve"> PAGEREF _Toc242302503 \h </w:instrText>
+              <w:instrText xml:space="preserve"> PAGEREF _Toc242303121 \h </w:instrText>
             </w:r>
             <w:r>
               <w:rPr>
@@ -4727,7 +4727,7 @@
               <w:noProof/>
             </w:rPr>
           </w:pPr>
-          <w:hyperlink w:anchor="_Toc242302504" w:history="1">
+          <w:hyperlink w:anchor="_Toc242303122" w:history="1">
             <w:r>
               <w:rPr>
                 <w:rStyle w:val="Lienhypertexte"/>
@@ -4751,7 +4751,7 @@
               <w:rPr>
                 <w:noProof/>
               </w:rPr>
-              <w:instrText xml:space="preserve"> PAGEREF _Toc242302504 \h </w:instrText>
+              <w:instrText xml:space="preserve"> PAGEREF _Toc242303122 \h </w:instrText>
             </w:r>
             <w:r>
               <w:rPr>
@@ -4788,7 +4788,7 @@
               <w:noProof/>
             </w:rPr>
           </w:pPr>
-          <w:hyperlink w:anchor="_Toc242302505" w:history="1">
+          <w:hyperlink w:anchor="_Toc242303123" w:history="1">
             <w:r>
               <w:rPr>
                 <w:rStyle w:val="Lienhypertexte"/>
@@ -4812,7 +4812,7 @@
               <w:rPr>
                 <w:noProof/>
               </w:rPr>
-              <w:instrText xml:space="preserve"> PAGEREF _Toc242302505 \h </w:instrText>
+              <w:instrText xml:space="preserve"> PAGEREF _Toc242303123 \h </w:instrText>
             </w:r>
             <w:r>
               <w:rPr>
@@ -4864,7 +4864,7 @@
         <w:pStyle w:val="Titre1"/>
         <w:pageBreakBefore/>
       </w:pPr>
-      <w:bookmarkStart w:id="0" w:name="_Toc242302430"/>
+      <w:bookmarkStart w:id="0" w:name="_Toc242303048"/>
       <w:r>
         <w:lastRenderedPageBreak/>
         <w:t>1. Comment utiliser ce manuel</w:t>
@@ -4876,7 +4876,7 @@
         <w:pStyle w:val="Titre2"/>
         <w:keepNext/>
       </w:pPr>
-      <w:bookmarkStart w:id="1" w:name="_Toc242302431"/>
+      <w:bookmarkStart w:id="1" w:name="_Toc242303049"/>
       <w:r>
         <w:t>1.1 À qui s'adresse-t-il ?</w:t>
       </w:r>
@@ -4923,7 +4923,7 @@
         <w:pStyle w:val="Titre2"/>
         <w:keepNext/>
       </w:pPr>
-      <w:bookmarkStart w:id="2" w:name="_Toc242302432"/>
+      <w:bookmarkStart w:id="2" w:name="_Toc242303050"/>
       <w:r>
         <w:t>1.2 Les profils</w:t>
       </w:r>
@@ -5921,7 +5921,7 @@
         <w:pStyle w:val="Titre2"/>
         <w:keepNext/>
       </w:pPr>
-      <w:bookmarkStart w:id="3" w:name="_Toc242302433"/>
+      <w:bookmarkStart w:id="3" w:name="_Toc242303051"/>
       <w:r>
         <w:t>1.3 Les comptes de formation</w:t>
       </w:r>
@@ -6909,7 +6909,7 @@
         <w:pStyle w:val="Titre2"/>
         <w:keepNext/>
       </w:pPr>
-      <w:bookmarkStart w:id="4" w:name="_Toc242302434"/>
+      <w:bookmarkStart w:id="4" w:name="_Toc242303052"/>
       <w:r>
         <w:t>1.4 Les encadrés</w:t>
       </w:r>
@@ -7118,7 +7118,7 @@
         <w:pStyle w:val="Titre1"/>
         <w:pageBreakBefore/>
       </w:pPr>
-      <w:bookmarkStart w:id="5" w:name="_Toc242302435"/>
+      <w:bookmarkStart w:id="5" w:name="_Toc242303053"/>
       <w:r>
         <w:lastRenderedPageBreak/>
         <w:t>2. Présentation de la plateforme</w:t>
@@ -7130,7 +7130,7 @@
         <w:pStyle w:val="Titre2"/>
         <w:keepNext/>
       </w:pPr>
-      <w:bookmarkStart w:id="6" w:name="_Toc242302436"/>
+      <w:bookmarkStart w:id="6" w:name="_Toc242303054"/>
       <w:r>
         <w:t>2.1 Deux espaces</w:t>
       </w:r>
@@ -7189,7 +7189,7 @@
         <w:pStyle w:val="Titre2"/>
         <w:keepNext/>
       </w:pPr>
-      <w:bookmarkStart w:id="7" w:name="_Toc242302437"/>
+      <w:bookmarkStart w:id="7" w:name="_Toc242303055"/>
       <w:r>
         <w:t>2.2 Le circuit de traitement d'un dossier</w:t>
       </w:r>
@@ -8383,7 +8383,7 @@
         <w:pStyle w:val="Titre2"/>
         <w:keepNext/>
       </w:pPr>
-      <w:bookmarkStart w:id="8" w:name="_Toc242302438"/>
+      <w:bookmarkStart w:id="8" w:name="_Toc242303056"/>
       <w:r>
         <w:t>2.3 Les règles à connaître</w:t>
       </w:r>
@@ -8703,7 +8703,7 @@
         <w:pStyle w:val="Titre1"/>
         <w:pageBreakBefore/>
       </w:pPr>
-      <w:bookmarkStart w:id="9" w:name="_Toc242302439"/>
+      <w:bookmarkStart w:id="9" w:name="_Toc242303057"/>
       <w:r>
         <w:lastRenderedPageBreak/>
         <w:t>3. Se connecter et se repérer</w:t>
@@ -8715,7 +8715,7 @@
         <w:pStyle w:val="Titre2"/>
         <w:keepNext/>
       </w:pPr>
-      <w:bookmarkStart w:id="10" w:name="_Toc242302440"/>
+      <w:bookmarkStart w:id="10" w:name="_Toc242303058"/>
       <w:r>
         <w:t>3.1 La connexion</w:t>
       </w:r>
@@ -8740,7 +8740,7 @@
           <w:noProof/>
         </w:rPr>
         <w:drawing>
-          <wp:inline distT="0" distB="0" distL="0" distR="0" wp14:anchorId="50E65E65" wp14:editId="30C0284D">
+          <wp:inline distT="0" distB="0" distL="0" distR="0" wp14:anchorId="4C1D3EF6" wp14:editId="19052E86">
             <wp:extent cx="4953000" cy="2886075"/>
             <wp:effectExtent l="0" t="0" r="0" b="0"/>
             <wp:docPr id="1" name="con-01-page-connexion" descr="La page de connexion (l'aspect peut varier légèrement selon l'installation)" title="La page de connexion (l'aspect peut varier légèrement selon l'installation)"/>
@@ -8945,7 +8945,7 @@
         <w:pStyle w:val="Titre2"/>
         <w:keepNext/>
       </w:pPr>
-      <w:bookmarkStart w:id="11" w:name="_Toc242302441"/>
+      <w:bookmarkStart w:id="11" w:name="_Toc242303059"/>
       <w:r>
         <w:lastRenderedPageBreak/>
         <w:t>3.2 L'écran de travail</w:t>
@@ -8963,7 +8963,7 @@
           <w:noProof/>
         </w:rPr>
         <w:drawing>
-          <wp:inline distT="0" distB="0" distL="0" distR="0" wp14:anchorId="56D6E31E" wp14:editId="0CD3EB3D">
+          <wp:inline distT="0" distB="0" distL="0" distR="0" wp14:anchorId="76D68545" wp14:editId="1EC3A9EB">
             <wp:extent cx="5810250" cy="3467100"/>
             <wp:effectExtent l="0" t="0" r="0" b="0"/>
             <wp:docPr id="2" name="adm-01-tableau-de-bord" descr="Le tableau de bord de l'administrateur" title="Le tableau de bord de l'administrateur"/>
@@ -9103,7 +9103,7 @@
         <w:pStyle w:val="Titre2"/>
         <w:keepNext/>
       </w:pPr>
-      <w:bookmarkStart w:id="12" w:name="_Toc242302442"/>
+      <w:bookmarkStart w:id="12" w:name="_Toc242303060"/>
       <w:r>
         <w:t>3.3 Le tableau de bord</w:t>
       </w:r>
@@ -9251,7 +9251,7 @@
         <w:pStyle w:val="Titre2"/>
         <w:keepNext/>
       </w:pPr>
-      <w:bookmarkStart w:id="13" w:name="_Toc242302443"/>
+      <w:bookmarkStart w:id="13" w:name="_Toc242303061"/>
       <w:r>
         <w:t>3.4 Votre profil, vos notifications, la déconnexion</w:t>
       </w:r>
@@ -9322,7 +9322,7 @@
         <w:pStyle w:val="Titre1"/>
         <w:pageBreakBefore/>
       </w:pPr>
-      <w:bookmarkStart w:id="14" w:name="_Toc242302444"/>
+      <w:bookmarkStart w:id="14" w:name="_Toc242303062"/>
       <w:r>
         <w:lastRenderedPageBreak/>
         <w:t>4. Profil citoyen : le portail public</w:t>
@@ -9342,7 +9342,7 @@
         <w:pStyle w:val="Titre2"/>
         <w:keepNext/>
       </w:pPr>
-      <w:bookmarkStart w:id="15" w:name="_Toc242302445"/>
+      <w:bookmarkStart w:id="15" w:name="_Toc242303063"/>
       <w:r>
         <w:t>4.1 L'accueil</w:t>
       </w:r>
@@ -9359,7 +9359,7 @@
           <w:noProof/>
         </w:rPr>
         <w:drawing>
-          <wp:inline distT="0" distB="0" distL="0" distR="0" wp14:anchorId="38F447DF" wp14:editId="0E75FF25">
+          <wp:inline distT="0" distB="0" distL="0" distR="0" wp14:anchorId="535A6DF8" wp14:editId="4F399584">
             <wp:extent cx="5334000" cy="3333750"/>
             <wp:effectExtent l="0" t="0" r="0" b="0"/>
             <wp:docPr id="3" name="por-01-accueil-haut" descr="L'accueil du portail" title="L'accueil du portail"/>
@@ -9539,7 +9539,7 @@
         </w:rPr>
         <w:lastRenderedPageBreak/>
         <w:drawing>
-          <wp:inline distT="0" distB="0" distL="0" distR="0" wp14:anchorId="5FC9ECB5" wp14:editId="608AB36B">
+          <wp:inline distT="0" distB="0" distL="0" distR="0" wp14:anchorId="6F29BB4C" wp14:editId="2F03445A">
             <wp:extent cx="5334000" cy="2628900"/>
             <wp:effectExtent l="0" t="0" r="0" b="0"/>
             <wp:docPr id="4" name="por-02-accueil-chiffres" descr="La section « En chiffres » de l'accueil" title="La section « En chiffres » de l'accueil"/>
@@ -9633,7 +9633,7 @@
           <w:noProof/>
         </w:rPr>
         <w:drawing>
-          <wp:inline distT="0" distB="0" distL="0" distR="0" wp14:anchorId="4411FDA4" wp14:editId="013C5A64">
+          <wp:inline distT="0" distB="0" distL="0" distR="0" wp14:anchorId="2B620058" wp14:editId="69B40D07">
             <wp:extent cx="5334000" cy="2152650"/>
             <wp:effectExtent l="0" t="0" r="0" b="0"/>
             <wp:docPr id="5" name="por-03-accueil-avant-de-signaler" descr="Les repères « Avant de signaler »" title="Les repères « Avant de signaler »"/>
@@ -9693,7 +9693,7 @@
         <w:pStyle w:val="Titre2"/>
         <w:keepNext/>
       </w:pPr>
-      <w:bookmarkStart w:id="16" w:name="_Toc242302446"/>
+      <w:bookmarkStart w:id="16" w:name="_Toc242303064"/>
       <w:r>
         <w:t>4.2 Déposer un signalement écrit</w:t>
       </w:r>
@@ -9738,7 +9738,7 @@
           <w:noProof/>
         </w:rPr>
         <w:drawing>
-          <wp:inline distT="0" distB="0" distL="0" distR="0" wp14:anchorId="036471B1" wp14:editId="3F6A5218">
+          <wp:inline distT="0" distB="0" distL="0" distR="0" wp14:anchorId="3B64B650" wp14:editId="21B2DCB4">
             <wp:extent cx="4953000" cy="5419725"/>
             <wp:effectExtent l="0" t="0" r="0" b="0"/>
             <wp:docPr id="6" name="por-14-depot-etape1-rempli" descr="Étape 1 du dépôt : décrire les faits" title="Étape 1 du dépôt : décrire les faits"/>
@@ -10010,7 +10010,7 @@
           <w:noProof/>
         </w:rPr>
         <w:drawing>
-          <wp:inline distT="0" distB="0" distL="0" distR="0" wp14:anchorId="6CDC29EE" wp14:editId="55418DCA">
+          <wp:inline distT="0" distB="0" distL="0" distR="0" wp14:anchorId="65C99D5C" wp14:editId="02A6C691">
             <wp:extent cx="4953000" cy="3867150"/>
             <wp:effectExtent l="0" t="0" r="0" b="0"/>
             <wp:docPr id="7" name="por-15-depot-etape2-identite" descr="Étape 2 du dépôt : choisir de s'identifier ou non" title="Étape 2 du dépôt : choisir de s'identifier ou non"/>
@@ -10210,7 +10210,7 @@
           <w:noProof/>
         </w:rPr>
         <w:drawing>
-          <wp:inline distT="0" distB="0" distL="0" distR="0" wp14:anchorId="4EE961D0" wp14:editId="6A5A43D3">
+          <wp:inline distT="0" distB="0" distL="0" distR="0" wp14:anchorId="531C4A9E" wp14:editId="7F67741A">
             <wp:extent cx="4953000" cy="3019425"/>
             <wp:effectExtent l="0" t="0" r="0" b="0"/>
             <wp:docPr id="8" name="por-17-depot-etape3-confirmation" descr="Étape 3 du dépôt : relire et soumettre" title="Étape 3 du dépôt : relire et soumettre"/>
@@ -10303,7 +10303,7 @@
           <w:noProof/>
         </w:rPr>
         <w:drawing>
-          <wp:inline distT="0" distB="0" distL="0" distR="0" wp14:anchorId="23E8D8A2" wp14:editId="36CB96AB">
+          <wp:inline distT="0" distB="0" distL="0" distR="0" wp14:anchorId="3EDDFF15" wp14:editId="658FA95C">
             <wp:extent cx="4953000" cy="3095625"/>
             <wp:effectExtent l="0" t="0" r="0" b="0"/>
             <wp:docPr id="9" name="por-18-depot-code-suivi" descr="Le code de suivi remis à la fin du dépôt" title="Le code de suivi remis à la fin du dépôt"/>
@@ -10439,7 +10439,7 @@
         <w:pStyle w:val="Titre2"/>
         <w:keepNext/>
       </w:pPr>
-      <w:bookmarkStart w:id="17" w:name="_Toc242302447"/>
+      <w:bookmarkStart w:id="17" w:name="_Toc242303065"/>
       <w:r>
         <w:lastRenderedPageBreak/>
         <w:t>4.3 Le témoignage vocal</w:t>
@@ -10465,7 +10465,7 @@
           <w:noProof/>
         </w:rPr>
         <w:drawing>
-          <wp:inline distT="0" distB="0" distL="0" distR="0" wp14:anchorId="3B5FF377" wp14:editId="6B0BF1CC">
+          <wp:inline distT="0" distB="0" distL="0" distR="0" wp14:anchorId="53611B5E" wp14:editId="4F63C308">
             <wp:extent cx="4953000" cy="3486150"/>
             <wp:effectExtent l="0" t="0" r="0" b="0"/>
             <wp:docPr id="10" name="por-21-vocal" descr="La page du témoignage vocal" title="La page du témoignage vocal"/>
@@ -10525,7 +10525,7 @@
         <w:pStyle w:val="Titre2"/>
         <w:keepNext/>
       </w:pPr>
-      <w:bookmarkStart w:id="18" w:name="_Toc242302448"/>
+      <w:bookmarkStart w:id="18" w:name="_Toc242303066"/>
       <w:r>
         <w:t>4.4 Suivre son dossier</w:t>
       </w:r>
@@ -10542,7 +10542,7 @@
           <w:noProof/>
         </w:rPr>
         <w:drawing>
-          <wp:inline distT="0" distB="0" distL="0" distR="0" wp14:anchorId="44480995" wp14:editId="1AA47751">
+          <wp:inline distT="0" distB="0" distL="0" distR="0" wp14:anchorId="413DFA99" wp14:editId="01C3A09E">
             <wp:extent cx="4572000" cy="2857500"/>
             <wp:effectExtent l="0" t="0" r="0" b="0"/>
             <wp:docPr id="11" name="por-19-suivi-recherche" descr="Le suivi par code" title="Le suivi par code"/>
@@ -10627,7 +10627,7 @@
         </w:rPr>
         <w:lastRenderedPageBreak/>
         <w:drawing>
-          <wp:inline distT="0" distB="0" distL="0" distR="0" wp14:anchorId="32821E44" wp14:editId="44CFE740">
+          <wp:inline distT="0" distB="0" distL="0" distR="0" wp14:anchorId="48F5897E" wp14:editId="0EA8742E">
             <wp:extent cx="4572000" cy="2505075"/>
             <wp:effectExtent l="0" t="0" r="0" b="0"/>
             <wp:docPr id="12" name="por-20-suivi-resultat" descr="Le suivi d'un dossier déposé" title="Le suivi d'un dossier déposé"/>
@@ -10763,7 +10763,7 @@
         <w:pStyle w:val="Titre2"/>
         <w:keepNext/>
       </w:pPr>
-      <w:bookmarkStart w:id="19" w:name="_Toc242302449"/>
+      <w:bookmarkStart w:id="19" w:name="_Toc242303067"/>
       <w:r>
         <w:t>4.5 La foire aux questions, les chiffres et les pages d'information</w:t>
       </w:r>
@@ -10780,7 +10780,7 @@
           <w:noProof/>
         </w:rPr>
         <w:drawing>
-          <wp:inline distT="0" distB="0" distL="0" distR="0" wp14:anchorId="76E76634" wp14:editId="2648BE92">
+          <wp:inline distT="0" distB="0" distL="0" distR="0" wp14:anchorId="6F7DC52D" wp14:editId="47023F97">
             <wp:extent cx="4953000" cy="2943225"/>
             <wp:effectExtent l="0" t="0" r="0" b="0"/>
             <wp:docPr id="13" name="por-09-faq" descr="La foire aux questions" title="La foire aux questions"/>
@@ -10915,7 +10915,7 @@
         </w:rPr>
         <w:lastRenderedPageBreak/>
         <w:drawing>
-          <wp:inline distT="0" distB="0" distL="0" distR="0" wp14:anchorId="4FC3AD3F" wp14:editId="20DA2B4C">
+          <wp:inline distT="0" distB="0" distL="0" distR="0" wp14:anchorId="3C4E6197" wp14:editId="2602C09D">
             <wp:extent cx="5334000" cy="3505200"/>
             <wp:effectExtent l="0" t="0" r="0" b="0"/>
             <wp:docPr id="14" name="por-10-chiffres" descr="La page des chiffres publics" title="La page des chiffres publics"/>
@@ -10975,7 +10975,7 @@
         <w:pStyle w:val="Titre2"/>
         <w:keepNext/>
       </w:pPr>
-      <w:bookmarkStart w:id="20" w:name="_Toc242302450"/>
+      <w:bookmarkStart w:id="20" w:name="_Toc242303068"/>
       <w:r>
         <w:t>4.6 Ce que les agents doivent répondre au public</w:t>
       </w:r>
@@ -11206,7 +11206,7 @@
         <w:pStyle w:val="Titre1"/>
         <w:pageBreakBefore/>
       </w:pPr>
-      <w:bookmarkStart w:id="21" w:name="_Toc242302451"/>
+      <w:bookmarkStart w:id="21" w:name="_Toc242303069"/>
       <w:r>
         <w:lastRenderedPageBreak/>
         <w:t>5. Profil agent du BRPD</w:t>
@@ -11246,7 +11246,7 @@
         <w:pStyle w:val="Titre2"/>
         <w:keepNext/>
       </w:pPr>
-      <w:bookmarkStart w:id="22" w:name="_Toc242302452"/>
+      <w:bookmarkStart w:id="22" w:name="_Toc242303070"/>
       <w:r>
         <w:t>5.1 Vos dossiers</w:t>
       </w:r>
@@ -11263,7 +11263,7 @@
           <w:noProof/>
         </w:rPr>
         <w:drawing>
-          <wp:inline distT="0" distB="0" distL="0" distR="0" wp14:anchorId="6CBBBB2E" wp14:editId="7908B2DE">
+          <wp:inline distT="0" distB="0" distL="0" distR="0" wp14:anchorId="52A409F2" wp14:editId="7A1E6A9E">
             <wp:extent cx="5810250" cy="3876675"/>
             <wp:effectExtent l="0" t="0" r="0" b="0"/>
             <wp:docPr id="15" name="brpd-02-liste-dossiers" descr="La liste des dossiers" title="La liste des dossiers"/>
@@ -11557,7 +11557,7 @@
         <w:pStyle w:val="Titre2"/>
         <w:keepNext/>
       </w:pPr>
-      <w:bookmarkStart w:id="23" w:name="_Toc242302453"/>
+      <w:bookmarkStart w:id="23" w:name="_Toc242303071"/>
       <w:r>
         <w:t>5.2 Saisir un dossier reçu par un autre canal</w:t>
       </w:r>
@@ -11593,7 +11593,7 @@
         </w:rPr>
         <w:lastRenderedPageBreak/>
         <w:drawing>
-          <wp:inline distT="0" distB="0" distL="0" distR="0" wp14:anchorId="5DC2E2DC" wp14:editId="188607A3">
+          <wp:inline distT="0" distB="0" distL="0" distR="0" wp14:anchorId="7BED2A34" wp14:editId="54790201">
             <wp:extent cx="5810250" cy="4505325"/>
             <wp:effectExtent l="0" t="0" r="0" b="0"/>
             <wp:docPr id="16" name="brpd-07-nouveau-dossier-vide" descr="Nouveau dossier : étape 1, le dossier" title="Nouveau dossier : étape 1, le dossier"/>
@@ -11822,7 +11822,7 @@
         </w:rPr>
         <w:lastRenderedPageBreak/>
         <w:drawing>
-          <wp:inline distT="0" distB="0" distL="0" distR="0" wp14:anchorId="68DFB966" wp14:editId="69D87F4E">
+          <wp:inline distT="0" distB="0" distL="0" distR="0" wp14:anchorId="414EB69B" wp14:editId="03C034C6">
             <wp:extent cx="5810250" cy="4714875"/>
             <wp:effectExtent l="0" t="0" r="0" b="0"/>
             <wp:docPr id="17" name="brpd-09-nouveau-dossier-declarant" descr="Nouveau dossier : étape 2, le déclarant" title="Nouveau dossier : étape 2, le déclarant"/>
@@ -11976,7 +11976,7 @@
         <w:pStyle w:val="Titre2"/>
         <w:keepNext/>
       </w:pPr>
-      <w:bookmarkStart w:id="24" w:name="_Toc242302454"/>
+      <w:bookmarkStart w:id="24" w:name="_Toc242303072"/>
       <w:r>
         <w:t>5.3 Enregistrer un dépôt en ligne</w:t>
       </w:r>
@@ -12012,7 +12012,7 @@
         </w:rPr>
         <w:lastRenderedPageBreak/>
         <w:drawing>
-          <wp:inline distT="0" distB="0" distL="0" distR="0" wp14:anchorId="3198B9D7" wp14:editId="4B1E332A">
+          <wp:inline distT="0" distB="0" distL="0" distR="0" wp14:anchorId="7FB548F2" wp14:editId="68BC74E1">
             <wp:extent cx="5810250" cy="4505325"/>
             <wp:effectExtent l="0" t="0" r="0" b="0"/>
             <wp:docPr id="18" name="brpd-04-dossier-soumis" descr="La fiche d'un dossier « Soumis » : le bouton Enregistrer" title="La fiche d'un dossier « Soumis » : le bouton Enregistrer"/>
@@ -12191,7 +12191,7 @@
         </w:rPr>
         <w:lastRenderedPageBreak/>
         <w:drawing>
-          <wp:inline distT="0" distB="0" distL="0" distR="0" wp14:anchorId="609DA5BA" wp14:editId="1AEBB7C0">
+          <wp:inline distT="0" distB="0" distL="0" distR="0" wp14:anchorId="20DCDD71" wp14:editId="5427FBA3">
             <wp:extent cx="5810250" cy="4505325"/>
             <wp:effectExtent l="0" t="0" r="0" b="0"/>
             <wp:docPr id="19" name="brpd-05-enregistrer-dialogue" descr="La fenêtre d'enregistrement" title="La fenêtre d'enregistrement"/>
@@ -12395,7 +12395,7 @@
         <w:pStyle w:val="Titre2"/>
         <w:keepNext/>
       </w:pPr>
-      <w:bookmarkStart w:id="25" w:name="_Toc242302455"/>
+      <w:bookmarkStart w:id="25" w:name="_Toc242303073"/>
       <w:r>
         <w:t>5.4 Lire la fiche d'un dossier</w:t>
       </w:r>
@@ -12421,7 +12421,7 @@
         </w:rPr>
         <w:lastRenderedPageBreak/>
         <w:drawing>
-          <wp:inline distT="0" distB="0" distL="0" distR="0" wp14:anchorId="5FF4F8CB" wp14:editId="53F97EDA">
+          <wp:inline distT="0" distB="0" distL="0" distR="0" wp14:anchorId="1CED6FEA" wp14:editId="5BEB135C">
             <wp:extent cx="5810250" cy="6591300"/>
             <wp:effectExtent l="0" t="0" r="0" b="0"/>
             <wp:docPr id="20" name="adm-23-dossier-recevable" descr="La fiche d'un dossier en investigation" title="La fiche d'un dossier en investigation"/>
@@ -12661,7 +12661,7 @@
         <w:pStyle w:val="Titre2"/>
         <w:keepNext/>
       </w:pPr>
-      <w:bookmarkStart w:id="26" w:name="_Toc242302456"/>
+      <w:bookmarkStart w:id="26" w:name="_Toc242303074"/>
       <w:r>
         <w:lastRenderedPageBreak/>
         <w:t>5.5 Compléments d'information</w:t>
@@ -12711,7 +12711,7 @@
         <w:pStyle w:val="Titre2"/>
         <w:keepNext/>
       </w:pPr>
-      <w:bookmarkStart w:id="27" w:name="_Toc242302457"/>
+      <w:bookmarkStart w:id="27" w:name="_Toc242303075"/>
       <w:r>
         <w:t>5.6 Dépôt audio</w:t>
       </w:r>
@@ -12746,7 +12746,7 @@
           <w:noProof/>
         </w:rPr>
         <w:drawing>
-          <wp:inline distT="0" distB="0" distL="0" distR="0" wp14:anchorId="25845BBF" wp14:editId="61C06D1A">
+          <wp:inline distT="0" distB="0" distL="0" distR="0" wp14:anchorId="6452A8D4" wp14:editId="5223C93F">
             <wp:extent cx="5810250" cy="4714875"/>
             <wp:effectExtent l="0" t="0" r="0" b="0"/>
             <wp:docPr id="21" name="brpd-10-depot-audio" descr="La page de dépôt audio" title="La page de dépôt audio"/>
@@ -12806,7 +12806,7 @@
         <w:pStyle w:val="Titre2"/>
         <w:keepNext/>
       </w:pPr>
-      <w:bookmarkStart w:id="28" w:name="_Toc242302458"/>
+      <w:bookmarkStart w:id="28" w:name="_Toc242303076"/>
       <w:r>
         <w:t>5.7 Informations préoccupantes</w:t>
       </w:r>
@@ -12852,7 +12852,7 @@
         </w:rPr>
         <w:lastRenderedPageBreak/>
         <w:drawing>
-          <wp:inline distT="0" distB="0" distL="0" distR="0" wp14:anchorId="2E26598F" wp14:editId="104697FF">
+          <wp:inline distT="0" distB="0" distL="0" distR="0" wp14:anchorId="41EC55DF" wp14:editId="22A719A4">
             <wp:extent cx="5810250" cy="2724150"/>
             <wp:effectExtent l="0" t="0" r="0" b="0"/>
             <wp:docPr id="22" name="brpd-11-infos-preoccupantes" descr="La liste des informations préoccupantes" title="La liste des informations préoccupantes"/>
@@ -13148,7 +13148,7 @@
         <w:pStyle w:val="Titre1"/>
         <w:pageBreakBefore/>
       </w:pPr>
-      <w:bookmarkStart w:id="29" w:name="_Toc242302459"/>
+      <w:bookmarkStart w:id="29" w:name="_Toc242303077"/>
       <w:r>
         <w:lastRenderedPageBreak/>
         <w:t>6. Profil conseiller juridique</w:t>
@@ -13178,7 +13178,7 @@
         <w:pStyle w:val="Titre2"/>
         <w:keepNext/>
       </w:pPr>
-      <w:bookmarkStart w:id="30" w:name="_Toc242302460"/>
+      <w:bookmarkStart w:id="30" w:name="_Toc242303078"/>
       <w:r>
         <w:t>6.1 Vos dossiers</w:t>
       </w:r>
@@ -13195,7 +13195,7 @@
           <w:noProof/>
         </w:rPr>
         <w:drawing>
-          <wp:inline distT="0" distB="0" distL="0" distR="0" wp14:anchorId="7F41CB54" wp14:editId="1A22507A">
+          <wp:inline distT="0" distB="0" distL="0" distR="0" wp14:anchorId="7F8F62F2" wp14:editId="3AD3CADC">
             <wp:extent cx="5810250" cy="3667125"/>
             <wp:effectExtent l="0" t="0" r="0" b="0"/>
             <wp:docPr id="23" name="cj-02-liste-dossiers" descr="La liste des dossiers du conseiller juridique" title="La liste des dossiers du conseiller juridique"/>
@@ -13273,7 +13273,7 @@
         <w:pStyle w:val="Titre2"/>
         <w:keepNext/>
       </w:pPr>
-      <w:bookmarkStart w:id="31" w:name="_Toc242302461"/>
+      <w:bookmarkStart w:id="31" w:name="_Toc242303079"/>
       <w:r>
         <w:t>6.2 Démarrer l'étude</w:t>
       </w:r>
@@ -13329,7 +13329,7 @@
         </w:rPr>
         <w:lastRenderedPageBreak/>
         <w:drawing>
-          <wp:inline distT="0" distB="0" distL="0" distR="0" wp14:anchorId="31760EA5" wp14:editId="191C9DDF">
+          <wp:inline distT="0" distB="0" distL="0" distR="0" wp14:anchorId="6A1A37F4" wp14:editId="0AE18A46">
             <wp:extent cx="5810250" cy="5238750"/>
             <wp:effectExtent l="0" t="0" r="0" b="0"/>
             <wp:docPr id="24" name="cj-03-dossier-en-etude" descr="La fiche d'un dossier en étude" title="La fiche d'un dossier en étude"/>
@@ -13447,7 +13447,7 @@
         <w:pStyle w:val="Titre2"/>
         <w:keepNext/>
       </w:pPr>
-      <w:bookmarkStart w:id="32" w:name="_Toc242302462"/>
+      <w:bookmarkStart w:id="32" w:name="_Toc242303080"/>
       <w:r>
         <w:t>6.3 Les onglets de la fiche</w:t>
       </w:r>
@@ -13464,7 +13464,7 @@
           <w:noProof/>
         </w:rPr>
         <w:drawing>
-          <wp:inline distT="0" distB="0" distL="0" distR="0" wp14:anchorId="79E123E3" wp14:editId="4D2ABE4A">
+          <wp:inline distT="0" distB="0" distL="0" distR="0" wp14:anchorId="098251DC" wp14:editId="678B21C3">
             <wp:extent cx="5334000" cy="1933575"/>
             <wp:effectExtent l="0" t="0" r="0" b="0"/>
             <wp:docPr id="25" name="cj-06-onglet-parties" descr="L'onglet « Parties visées »" title="L'onglet « Parties visées »"/>
@@ -13681,7 +13681,7 @@
           <w:noProof/>
         </w:rPr>
         <w:drawing>
-          <wp:inline distT="0" distB="0" distL="0" distR="0" wp14:anchorId="7BD2FC6A" wp14:editId="682A5F0C">
+          <wp:inline distT="0" distB="0" distL="0" distR="0" wp14:anchorId="5F9B228F" wp14:editId="5D89B74B">
             <wp:extent cx="5334000" cy="1638300"/>
             <wp:effectExtent l="0" t="0" r="0" b="0"/>
             <wp:docPr id="26" name="cj-08-onglet-observations" descr="L'onglet « Observations »" title="L'onglet « Observations »"/>
@@ -13747,7 +13747,7 @@
           <w:noProof/>
         </w:rPr>
         <w:drawing>
-          <wp:inline distT="0" distB="0" distL="0" distR="0" wp14:anchorId="3C8D48F8" wp14:editId="1335245E">
+          <wp:inline distT="0" distB="0" distL="0" distR="0" wp14:anchorId="07498EF1" wp14:editId="2BFD6D19">
             <wp:extent cx="5334000" cy="3362325"/>
             <wp:effectExtent l="0" t="0" r="0" b="0"/>
             <wp:docPr id="27" name="cj-13-ajouter-observation" descr="Ajouter une observation" title="Ajouter une observation"/>
@@ -13807,7 +13807,7 @@
         <w:pStyle w:val="Titre2"/>
         <w:keepNext/>
       </w:pPr>
-      <w:bookmarkStart w:id="33" w:name="_Toc242302463"/>
+      <w:bookmarkStart w:id="33" w:name="_Toc242303081"/>
       <w:r>
         <w:t>6.4 L'étude d'opportunité</w:t>
       </w:r>
@@ -13853,7 +13853,7 @@
         </w:rPr>
         <w:lastRenderedPageBreak/>
         <w:drawing>
-          <wp:inline distT="0" distB="0" distL="0" distR="0" wp14:anchorId="78C0EE8E" wp14:editId="1C8CB792">
+          <wp:inline distT="0" distB="0" distL="0" distR="0" wp14:anchorId="344F1EBE" wp14:editId="5A5B1D83">
             <wp:extent cx="4953000" cy="1800225"/>
             <wp:effectExtent l="0" t="0" r="0" b="0"/>
             <wp:docPr id="28" name="cj-11-onglet-analyse" descr="L'onglet « Analyse » avant la création de l'étude" title="L'onglet « Analyse » avant la création de l'étude"/>
@@ -13919,7 +13919,7 @@
           <w:noProof/>
         </w:rPr>
         <w:drawing>
-          <wp:inline distT="0" distB="0" distL="0" distR="0" wp14:anchorId="5D6B2ACA" wp14:editId="73555D8C">
+          <wp:inline distT="0" distB="0" distL="0" distR="0" wp14:anchorId="74881728" wp14:editId="23ED614E">
             <wp:extent cx="5810250" cy="4505325"/>
             <wp:effectExtent l="0" t="0" r="0" b="0"/>
             <wp:docPr id="29" name="cj-12-etude-opportunite-dialogue" descr="La fiche d'analyse première" title="La fiche d'analyse première"/>
@@ -14271,7 +14271,7 @@
         <w:pStyle w:val="Titre2"/>
         <w:keepNext/>
       </w:pPr>
-      <w:bookmarkStart w:id="34" w:name="_Toc242302464"/>
+      <w:bookmarkStart w:id="34" w:name="_Toc242303082"/>
       <w:r>
         <w:t>6.5 Demander un complément d'information</w:t>
       </w:r>
@@ -14288,7 +14288,7 @@
           <w:noProof/>
         </w:rPr>
         <w:drawing>
-          <wp:inline distT="0" distB="0" distL="0" distR="0" wp14:anchorId="2CF2BFB8" wp14:editId="77B1B30F">
+          <wp:inline distT="0" distB="0" distL="0" distR="0" wp14:anchorId="64BAA5E8" wp14:editId="677B9470">
             <wp:extent cx="5810250" cy="4505325"/>
             <wp:effectExtent l="0" t="0" r="0" b="0"/>
             <wp:docPr id="30" name="cj-04-demander-complement" descr="La demande de complément au déclarant" title="La demande de complément au déclarant"/>
@@ -14417,7 +14417,7 @@
         <w:pStyle w:val="Titre2"/>
         <w:keepNext/>
       </w:pPr>
-      <w:bookmarkStart w:id="35" w:name="_Toc242302465"/>
+      <w:bookmarkStart w:id="35" w:name="_Toc242303083"/>
       <w:r>
         <w:lastRenderedPageBreak/>
         <w:t>6.6 Soumettre au comité (CTADP)</w:t>
@@ -14435,7 +14435,7 @@
           <w:noProof/>
         </w:rPr>
         <w:drawing>
-          <wp:inline distT="0" distB="0" distL="0" distR="0" wp14:anchorId="772F2FA5" wp14:editId="6843CE0A">
+          <wp:inline distT="0" distB="0" distL="0" distR="0" wp14:anchorId="0AFA80C1" wp14:editId="472A2D73">
             <wp:extent cx="5810250" cy="4505325"/>
             <wp:effectExtent l="0" t="0" r="0" b="0"/>
             <wp:docPr id="31" name="cj-05-soumettre-ctadp" descr="La soumission au comité" title="La soumission au comité"/>
@@ -14719,7 +14719,7 @@
         <w:pStyle w:val="Titre1"/>
         <w:pageBreakBefore/>
       </w:pPr>
-      <w:bookmarkStart w:id="36" w:name="_Toc242302466"/>
+      <w:bookmarkStart w:id="36" w:name="_Toc242303084"/>
       <w:r>
         <w:lastRenderedPageBreak/>
         <w:t>7. Profil CGEA</w:t>
@@ -14759,7 +14759,7 @@
         <w:pStyle w:val="Titre2"/>
         <w:keepNext/>
       </w:pPr>
-      <w:bookmarkStart w:id="37" w:name="_Toc242302467"/>
+      <w:bookmarkStart w:id="37" w:name="_Toc242303085"/>
       <w:r>
         <w:t>7.1 Votre tableau de bord</w:t>
       </w:r>
@@ -14776,7 +14776,7 @@
           <w:noProof/>
         </w:rPr>
         <w:drawing>
-          <wp:inline distT="0" distB="0" distL="0" distR="0" wp14:anchorId="0C4454A4" wp14:editId="346FC67C">
+          <wp:inline distT="0" distB="0" distL="0" distR="0" wp14:anchorId="381E7D9A" wp14:editId="04C55B36">
             <wp:extent cx="5810250" cy="4505325"/>
             <wp:effectExtent l="0" t="0" r="0" b="0"/>
             <wp:docPr id="32" name="cgea-01-tableau-de-bord" descr="Le tableau de bord du CGEA" title="Le tableau de bord du CGEA"/>
@@ -14854,7 +14854,7 @@
         <w:pStyle w:val="Titre2"/>
         <w:keepNext/>
       </w:pPr>
-      <w:bookmarkStart w:id="38" w:name="_Toc242302468"/>
+      <w:bookmarkStart w:id="38" w:name="_Toc242303086"/>
       <w:r>
         <w:t>7.2 Affecter un dossier</w:t>
       </w:r>
@@ -14890,7 +14890,7 @@
         </w:rPr>
         <w:lastRenderedPageBreak/>
         <w:drawing>
-          <wp:inline distT="0" distB="0" distL="0" distR="0" wp14:anchorId="3F1E51A6" wp14:editId="092F158A">
+          <wp:inline distT="0" distB="0" distL="0" distR="0" wp14:anchorId="2248C710" wp14:editId="5D097D3D">
             <wp:extent cx="5334000" cy="2752725"/>
             <wp:effectExtent l="0" t="0" r="0" b="0"/>
             <wp:docPr id="33" name="cge-06-onglet-affectation" descr="L'onglet « Affectation » : décision du CGE puis affectation du CGEA" title="L'onglet « Affectation » : décision du CGE puis affectation du CGEA"/>
@@ -15117,7 +15117,7 @@
         <w:pStyle w:val="Titre2"/>
         <w:keepNext/>
       </w:pPr>
-      <w:bookmarkStart w:id="39" w:name="_Toc242302469"/>
+      <w:bookmarkStart w:id="39" w:name="_Toc242303087"/>
       <w:r>
         <w:t>7.3 Les séances du comité (CTADP)</w:t>
       </w:r>
@@ -15134,7 +15134,7 @@
           <w:noProof/>
         </w:rPr>
         <w:drawing>
-          <wp:inline distT="0" distB="0" distL="0" distR="0" wp14:anchorId="6E5A0681" wp14:editId="0EB8659F">
+          <wp:inline distT="0" distB="0" distL="0" distR="0" wp14:anchorId="5016717D" wp14:editId="080CAA92">
             <wp:extent cx="5810250" cy="2200275"/>
             <wp:effectExtent l="0" t="0" r="0" b="0"/>
             <wp:docPr id="34" name="cgea-02-seances" descr="La liste des séances du comité" title="La liste des séances du comité"/>
@@ -15210,7 +15210,7 @@
           <w:noProof/>
         </w:rPr>
         <w:drawing>
-          <wp:inline distT="0" distB="0" distL="0" distR="0" wp14:anchorId="531F47D2" wp14:editId="721332EE">
+          <wp:inline distT="0" distB="0" distL="0" distR="0" wp14:anchorId="68F85491" wp14:editId="19D11AFD">
             <wp:extent cx="5810250" cy="4505325"/>
             <wp:effectExtent l="0" t="0" r="0" b="0"/>
             <wp:docPr id="35" name="cgea-03-nouvelle-seance" descr="La création d'une séance" title="La création d'une séance"/>
@@ -15362,7 +15362,7 @@
           <w:noProof/>
         </w:rPr>
         <w:drawing>
-          <wp:inline distT="0" distB="0" distL="0" distR="0" wp14:anchorId="6595C706" wp14:editId="3E01270B">
+          <wp:inline distT="0" distB="0" distL="0" distR="0" wp14:anchorId="06052D5C" wp14:editId="0FA9E6E9">
             <wp:extent cx="5810250" cy="3667125"/>
             <wp:effectExtent l="0" t="0" r="0" b="0"/>
             <wp:docPr id="36" name="cgea-04-seance-detail" descr="Le détail d'une séance" title="Le détail d'une séance"/>
@@ -15502,7 +15502,7 @@
         </w:rPr>
         <w:lastRenderedPageBreak/>
         <w:drawing>
-          <wp:inline distT="0" distB="0" distL="0" distR="0" wp14:anchorId="4D43A01F" wp14:editId="366297E9">
+          <wp:inline distT="0" distB="0" distL="0" distR="0" wp14:anchorId="040C2CE0" wp14:editId="622231A3">
             <wp:extent cx="5810250" cy="4505325"/>
             <wp:effectExtent l="0" t="0" r="0" b="0"/>
             <wp:docPr id="37" name="cgea-07-seance-ajouter-dossier" descr="Ajouter un dossier à la séance" title="Ajouter un dossier à la séance"/>
@@ -15578,7 +15578,7 @@
           <w:noProof/>
         </w:rPr>
         <w:drawing>
-          <wp:inline distT="0" distB="0" distL="0" distR="0" wp14:anchorId="7F6A8687" wp14:editId="34B7F4C9">
+          <wp:inline distT="0" distB="0" distL="0" distR="0" wp14:anchorId="54D7371F" wp14:editId="5F6A723B">
             <wp:extent cx="5810250" cy="4505325"/>
             <wp:effectExtent l="0" t="0" r="0" b="0"/>
             <wp:docPr id="38" name="cgea-08-seance-tenir" descr="La fenêtre « Tenir la séance »" title="La fenêtre « Tenir la séance »"/>
@@ -15762,7 +15762,7 @@
         <w:pStyle w:val="Titre2"/>
         <w:keepNext/>
       </w:pPr>
-      <w:bookmarkStart w:id="40" w:name="_Toc242302470"/>
+      <w:bookmarkStart w:id="40" w:name="_Toc242303088"/>
       <w:r>
         <w:t>7.4 Ouvrir une enquête</w:t>
       </w:r>
@@ -15897,7 +15897,7 @@
         <w:pStyle w:val="Titre2"/>
         <w:keepNext/>
       </w:pPr>
-      <w:bookmarkStart w:id="41" w:name="_Toc242302471"/>
+      <w:bookmarkStart w:id="41" w:name="_Toc242303089"/>
       <w:r>
         <w:lastRenderedPageBreak/>
         <w:t>7.5 Transférer, clôturer</w:t>
@@ -15957,7 +15957,7 @@
         <w:pStyle w:val="Titre2"/>
         <w:keepNext/>
       </w:pPr>
-      <w:bookmarkStart w:id="42" w:name="_Toc242302472"/>
+      <w:bookmarkStart w:id="42" w:name="_Toc242303090"/>
       <w:r>
         <w:t>7.6 Surveiller les retards</w:t>
       </w:r>
@@ -15974,7 +15974,7 @@
           <w:noProof/>
         </w:rPr>
         <w:drawing>
-          <wp:inline distT="0" distB="0" distL="0" distR="0" wp14:anchorId="103693B8" wp14:editId="18CDC560">
+          <wp:inline distT="0" distB="0" distL="0" distR="0" wp14:anchorId="11AD36B3" wp14:editId="3D182EC5">
             <wp:extent cx="5810250" cy="4505325"/>
             <wp:effectExtent l="0" t="0" r="0" b="0"/>
             <wp:docPr id="39" name="adm-15-depassements" descr="Les dépassements par acteur" title="Les dépassements par acteur"/>
@@ -16318,7 +16318,7 @@
         <w:pStyle w:val="Titre1"/>
         <w:pageBreakBefore/>
       </w:pPr>
-      <w:bookmarkStart w:id="43" w:name="_Toc242302473"/>
+      <w:bookmarkStart w:id="43" w:name="_Toc242303091"/>
       <w:r>
         <w:lastRenderedPageBreak/>
         <w:t>8. Profil CGE</w:t>
@@ -16348,7 +16348,7 @@
         <w:pStyle w:val="Titre2"/>
         <w:keepNext/>
       </w:pPr>
-      <w:bookmarkStart w:id="44" w:name="_Toc242302474"/>
+      <w:bookmarkStart w:id="44" w:name="_Toc242303092"/>
       <w:r>
         <w:t>8.1 Votre tableau de bord</w:t>
       </w:r>
@@ -16365,7 +16365,7 @@
           <w:noProof/>
         </w:rPr>
         <w:drawing>
-          <wp:inline distT="0" distB="0" distL="0" distR="0" wp14:anchorId="2919AAF3" wp14:editId="58BFF329">
+          <wp:inline distT="0" distB="0" distL="0" distR="0" wp14:anchorId="63C708D1" wp14:editId="65AA1E2E">
             <wp:extent cx="5810250" cy="4505325"/>
             <wp:effectExtent l="0" t="0" r="0" b="0"/>
             <wp:docPr id="40" name="cge-01-tableau-de-bord" descr="Le tableau de bord du CGE" title="Le tableau de bord du CGE"/>
@@ -16425,7 +16425,7 @@
         <w:pStyle w:val="Titre2"/>
         <w:keepNext/>
       </w:pPr>
-      <w:bookmarkStart w:id="45" w:name="_Toc242302475"/>
+      <w:bookmarkStart w:id="45" w:name="_Toc242303093"/>
       <w:r>
         <w:t>8.2 Déclarer un dossier recevable ou irrecevable</w:t>
       </w:r>
@@ -16461,7 +16461,7 @@
         </w:rPr>
         <w:lastRenderedPageBreak/>
         <w:drawing>
-          <wp:inline distT="0" distB="0" distL="0" distR="0" wp14:anchorId="56E03F4A" wp14:editId="73E8DA17">
+          <wp:inline distT="0" distB="0" distL="0" distR="0" wp14:anchorId="4A54A5E6" wp14:editId="2C6D4491">
             <wp:extent cx="5810250" cy="2933700"/>
             <wp:effectExtent l="0" t="0" r="0" b="0"/>
             <wp:docPr id="41" name="cge-02-dossier-ctadp" descr="La fiche d'un dossier en revue CTADP" title="La fiche d'un dossier en revue CTADP"/>
@@ -16527,7 +16527,7 @@
           <w:noProof/>
         </w:rPr>
         <w:drawing>
-          <wp:inline distT="0" distB="0" distL="0" distR="0" wp14:anchorId="470386E3" wp14:editId="6D5A86E8">
+          <wp:inline distT="0" distB="0" distL="0" distR="0" wp14:anchorId="76EC4A9C" wp14:editId="61F73E01">
             <wp:extent cx="5810250" cy="4505325"/>
             <wp:effectExtent l="0" t="0" r="0" b="0"/>
             <wp:docPr id="42" name="cge-03-declarer-recevable" descr="La décision « Déclarer recevable »" title="La décision « Déclarer recevable »"/>
@@ -16734,7 +16734,7 @@
         <w:pStyle w:val="Titre2"/>
         <w:keepNext/>
       </w:pPr>
-      <w:bookmarkStart w:id="46" w:name="_Toc242302476"/>
+      <w:bookmarkStart w:id="46" w:name="_Toc242303094"/>
       <w:r>
         <w:t>8.3 Fixer la priorité</w:t>
       </w:r>
@@ -16751,7 +16751,7 @@
           <w:noProof/>
         </w:rPr>
         <w:drawing>
-          <wp:inline distT="0" distB="0" distL="0" distR="0" wp14:anchorId="44F66752" wp14:editId="3BE68424">
+          <wp:inline distT="0" distB="0" distL="0" distR="0" wp14:anchorId="6512859A" wp14:editId="129C4B9A">
             <wp:extent cx="5810250" cy="4505325"/>
             <wp:effectExtent l="0" t="0" r="0" b="0"/>
             <wp:docPr id="43" name="cge-04-priorite" descr="La fenêtre de priorité" title="La fenêtre de priorité"/>
@@ -16869,7 +16869,7 @@
         <w:pStyle w:val="Titre2"/>
         <w:keepNext/>
       </w:pPr>
-      <w:bookmarkStart w:id="47" w:name="_Toc242302477"/>
+      <w:bookmarkStart w:id="47" w:name="_Toc242303095"/>
       <w:r>
         <w:lastRenderedPageBreak/>
         <w:t>8.4 Protéger un dossier : la confidentialité</w:t>
@@ -16887,7 +16887,7 @@
           <w:noProof/>
         </w:rPr>
         <w:drawing>
-          <wp:inline distT="0" distB="0" distL="0" distR="0" wp14:anchorId="15681A45" wp14:editId="55C47D97">
+          <wp:inline distT="0" distB="0" distL="0" distR="0" wp14:anchorId="110D0094" wp14:editId="3ADBF8FF">
             <wp:extent cx="5810250" cy="4505325"/>
             <wp:effectExtent l="0" t="0" r="0" b="0"/>
             <wp:docPr id="44" name="cge-05-confidentiel" descr="Marquer un dossier confidentiel" title="Marquer un dossier confidentiel"/>
@@ -16972,7 +16972,7 @@
         <w:pStyle w:val="Titre2"/>
         <w:keepNext/>
       </w:pPr>
-      <w:bookmarkStart w:id="48" w:name="_Toc242302478"/>
+      <w:bookmarkStart w:id="48" w:name="_Toc242303096"/>
       <w:r>
         <w:lastRenderedPageBreak/>
         <w:t>8.5 Les onglets d'analyse et d'affectation</w:t>
@@ -16990,7 +16990,7 @@
           <w:noProof/>
         </w:rPr>
         <w:drawing>
-          <wp:inline distT="0" distB="0" distL="0" distR="0" wp14:anchorId="6E12F05B" wp14:editId="679BBF7A">
+          <wp:inline distT="0" distB="0" distL="0" distR="0" wp14:anchorId="23EC1033" wp14:editId="32364BE5">
             <wp:extent cx="5334000" cy="5210175"/>
             <wp:effectExtent l="0" t="0" r="0" b="0"/>
             <wp:docPr id="45" name="cge-07-onglet-analyse" descr="L'onglet « Analyse » vu par le CGE" title="L'onglet « Analyse » vu par le CGE"/>
@@ -17078,7 +17078,7 @@
         <w:pStyle w:val="Titre2"/>
         <w:keepNext/>
       </w:pPr>
-      <w:bookmarkStart w:id="49" w:name="_Toc242302479"/>
+      <w:bookmarkStart w:id="49" w:name="_Toc242303097"/>
       <w:r>
         <w:t>8.6 Décision finale et quitus</w:t>
       </w:r>
@@ -17147,7 +17147,7 @@
         <w:pStyle w:val="Titre2"/>
         <w:keepNext/>
       </w:pPr>
-      <w:bookmarkStart w:id="50" w:name="_Toc242302480"/>
+      <w:bookmarkStart w:id="50" w:name="_Toc242303098"/>
       <w:r>
         <w:t>8.7 Gérer les agents</w:t>
       </w:r>
@@ -17442,7 +17442,7 @@
         <w:pStyle w:val="Titre1"/>
         <w:pageBreakBefore/>
       </w:pPr>
-      <w:bookmarkStart w:id="51" w:name="_Toc242302481"/>
+      <w:bookmarkStart w:id="51" w:name="_Toc242303099"/>
       <w:r>
         <w:lastRenderedPageBreak/>
         <w:t>9. Profil membre du comité (CTADP)</w:t>
@@ -17454,7 +17454,7 @@
         <w:spacing w:after="120" w:line="288" w:lineRule="auto"/>
       </w:pPr>
       <w:r>
-        <w:t xml:space="preserve">Le Comité de Traitement et d'Analyse des Dossiers de Plaintes (CTADP) examine, en séance, les dossiers que le conseiller juridique lui soumet. Le membre du comité </w:t>
+        <w:t xml:space="preserve">Le Comité de Traitement et d'Analyse des Dénonciations et des Plaintes (CTADP) examine, en séance, les dossiers que le conseiller juridique lui soumet. Le membre du comité </w:t>
       </w:r>
       <w:r>
         <w:rPr>
@@ -17482,7 +17482,7 @@
         <w:pStyle w:val="Titre2"/>
         <w:keepNext/>
       </w:pPr>
-      <w:bookmarkStart w:id="52" w:name="_Toc242302482"/>
+      <w:bookmarkStart w:id="52" w:name="_Toc242303100"/>
       <w:r>
         <w:t>9.1 Votre espace</w:t>
       </w:r>
@@ -17499,7 +17499,7 @@
           <w:noProof/>
         </w:rPr>
         <w:drawing>
-          <wp:inline distT="0" distB="0" distL="0" distR="0" wp14:anchorId="5D0DA53A" wp14:editId="6F889036">
+          <wp:inline distT="0" distB="0" distL="0" distR="0" wp14:anchorId="680A6216" wp14:editId="7161D449">
             <wp:extent cx="5810250" cy="4505325"/>
             <wp:effectExtent l="0" t="0" r="0" b="0"/>
             <wp:docPr id="46" name="ctadp-01-tableau-de-bord" descr="Le tableau de bord du membre du comité" title="Le tableau de bord du membre du comité"/>
@@ -17577,7 +17577,7 @@
         <w:pStyle w:val="Titre2"/>
         <w:keepNext/>
       </w:pPr>
-      <w:bookmarkStart w:id="53" w:name="_Toc242302483"/>
+      <w:bookmarkStart w:id="53" w:name="_Toc242303101"/>
       <w:r>
         <w:lastRenderedPageBreak/>
         <w:t>9.2 Les séances</w:t>
@@ -17595,7 +17595,7 @@
           <w:noProof/>
         </w:rPr>
         <w:drawing>
-          <wp:inline distT="0" distB="0" distL="0" distR="0" wp14:anchorId="65116844" wp14:editId="67D9F442">
+          <wp:inline distT="0" distB="0" distL="0" distR="0" wp14:anchorId="5119DCBE" wp14:editId="68365856">
             <wp:extent cx="5810250" cy="2200275"/>
             <wp:effectExtent l="0" t="0" r="0" b="0"/>
             <wp:docPr id="47" name="ctadp-02-seances" descr="La liste des séances" title="La liste des séances"/>
@@ -17695,7 +17695,7 @@
           <w:noProof/>
         </w:rPr>
         <w:drawing>
-          <wp:inline distT="0" distB="0" distL="0" distR="0" wp14:anchorId="2F7C75F9" wp14:editId="54C69DCF">
+          <wp:inline distT="0" distB="0" distL="0" distR="0" wp14:anchorId="07E7C9FD" wp14:editId="623CB438">
             <wp:extent cx="5810250" cy="3667125"/>
             <wp:effectExtent l="0" t="0" r="0" b="0"/>
             <wp:docPr id="48" name="ctadp-03-seance-detail" descr="Le détail d'une séance" title="Le détail d'une séance"/>
@@ -17755,7 +17755,7 @@
         <w:pStyle w:val="Titre2"/>
         <w:keepNext/>
       </w:pPr>
-      <w:bookmarkStart w:id="54" w:name="_Toc242302484"/>
+      <w:bookmarkStart w:id="54" w:name="_Toc242303102"/>
       <w:r>
         <w:t>9.3 Ce que vous pouvez faire sur un dossier</w:t>
       </w:r>
@@ -18035,7 +18035,7 @@
         <w:pStyle w:val="Titre1"/>
         <w:pageBreakBefore/>
       </w:pPr>
-      <w:bookmarkStart w:id="55" w:name="_Toc242302485"/>
+      <w:bookmarkStart w:id="55" w:name="_Toc242303103"/>
       <w:r>
         <w:lastRenderedPageBreak/>
         <w:t>10. Profil contrôleur d'État (enquêteur)</w:t>
@@ -18065,7 +18065,7 @@
         <w:pStyle w:val="Titre2"/>
         <w:keepNext/>
       </w:pPr>
-      <w:bookmarkStart w:id="56" w:name="_Toc242302486"/>
+      <w:bookmarkStart w:id="56" w:name="_Toc242303104"/>
       <w:r>
         <w:t>10.1 Vos enquêtes</w:t>
       </w:r>
@@ -18082,7 +18082,7 @@
           <w:noProof/>
         </w:rPr>
         <w:drawing>
-          <wp:inline distT="0" distB="0" distL="0" distR="0" wp14:anchorId="62A0EB8F" wp14:editId="5279B33A">
+          <wp:inline distT="0" distB="0" distL="0" distR="0" wp14:anchorId="4DDAA2DB" wp14:editId="57A69595">
             <wp:extent cx="5810250" cy="2724150"/>
             <wp:effectExtent l="0" t="0" r="0" b="0"/>
             <wp:docPr id="49" name="ce-02-enquetes-liste" descr="La liste des enquêtes" title="La liste des enquêtes"/>
@@ -18281,7 +18281,7 @@
         <w:pStyle w:val="Titre2"/>
         <w:keepNext/>
       </w:pPr>
-      <w:bookmarkStart w:id="57" w:name="_Toc242302487"/>
+      <w:bookmarkStart w:id="57" w:name="_Toc242303105"/>
       <w:r>
         <w:t>10.2 Avant de commencer : l'engagement préalable</w:t>
       </w:r>
@@ -18320,7 +18320,7 @@
         <w:pStyle w:val="Titre2"/>
         <w:keepNext/>
       </w:pPr>
-      <w:bookmarkStart w:id="58" w:name="_Toc242302488"/>
+      <w:bookmarkStart w:id="58" w:name="_Toc242303106"/>
       <w:r>
         <w:lastRenderedPageBreak/>
         <w:t>10.3 La page d'une enquête</w:t>
@@ -18338,7 +18338,7 @@
           <w:noProof/>
         </w:rPr>
         <w:drawing>
-          <wp:inline distT="0" distB="0" distL="0" distR="0" wp14:anchorId="21DD8F97" wp14:editId="4BDA4D53">
+          <wp:inline distT="0" distB="0" distL="0" distR="0" wp14:anchorId="2CC54FCB" wp14:editId="2892F058">
             <wp:extent cx="5076825" cy="6858000"/>
             <wp:effectExtent l="0" t="0" r="0" b="0"/>
             <wp:docPr id="50" name="ce-03-enquete-detail" descr="La page d'une enquête" title="La page d'une enquête"/>
@@ -18703,7 +18703,7 @@
         <w:pStyle w:val="Titre2"/>
         <w:keepNext/>
       </w:pPr>
-      <w:bookmarkStart w:id="59" w:name="_Toc242302489"/>
+      <w:bookmarkStart w:id="59" w:name="_Toc242303107"/>
       <w:r>
         <w:t>10.4 L'équipe d'enquête</w:t>
       </w:r>
@@ -18808,7 +18808,7 @@
         <w:pStyle w:val="Titre2"/>
         <w:keepNext/>
       </w:pPr>
-      <w:bookmarkStart w:id="60" w:name="_Toc242302490"/>
+      <w:bookmarkStart w:id="60" w:name="_Toc242303108"/>
       <w:r>
         <w:t>10.5 Suspendre, prolonger, rendre compte</w:t>
       </w:r>
@@ -18887,7 +18887,7 @@
         <w:pStyle w:val="Titre2"/>
         <w:keepNext/>
       </w:pPr>
-      <w:bookmarkStart w:id="61" w:name="_Toc242302491"/>
+      <w:bookmarkStart w:id="61" w:name="_Toc242303109"/>
       <w:r>
         <w:t>10.6 Les rapports et les leçons à partager</w:t>
       </w:r>
@@ -18942,7 +18942,7 @@
           <w:noProof/>
         </w:rPr>
         <w:drawing>
-          <wp:inline distT="0" distB="0" distL="0" distR="0" wp14:anchorId="10D54F35" wp14:editId="624C66DD">
+          <wp:inline distT="0" distB="0" distL="0" distR="0" wp14:anchorId="281B3264" wp14:editId="3668F8AD">
             <wp:extent cx="5334000" cy="2019300"/>
             <wp:effectExtent l="0" t="0" r="0" b="0"/>
             <wp:docPr id="51" name="ce-08-lecons" descr="Les leçons à partager" title="Les leçons à partager"/>
@@ -19279,7 +19279,7 @@
         <w:pStyle w:val="Titre1"/>
         <w:pageBreakBefore/>
       </w:pPr>
-      <w:bookmarkStart w:id="62" w:name="_Toc242302492"/>
+      <w:bookmarkStart w:id="62" w:name="_Toc242303110"/>
       <w:r>
         <w:lastRenderedPageBreak/>
         <w:t>11. Profil DCP</w:t>
@@ -19325,7 +19325,7 @@
           <w:noProof/>
         </w:rPr>
         <w:drawing>
-          <wp:inline distT="0" distB="0" distL="0" distR="0" wp14:anchorId="2813187C" wp14:editId="7F9F0B9C">
+          <wp:inline distT="0" distB="0" distL="0" distR="0" wp14:anchorId="7418D039" wp14:editId="76F91091">
             <wp:extent cx="5810250" cy="3467100"/>
             <wp:effectExtent l="0" t="0" r="0" b="0"/>
             <wp:docPr id="52" name="dcp-01-accueil" descr="L'espace de la DCP : un menu réduit aux statistiques" title="L'espace de la DCP : un menu réduit aux statistiques"/>
@@ -19504,7 +19504,7 @@
         </w:rPr>
         <w:lastRenderedPageBreak/>
         <w:drawing>
-          <wp:inline distT="0" distB="0" distL="0" distR="0" wp14:anchorId="138D5337" wp14:editId="2FBE1C0E">
+          <wp:inline distT="0" distB="0" distL="0" distR="0" wp14:anchorId="4BFD803D" wp14:editId="572D7DD9">
             <wp:extent cx="4476750" cy="6858000"/>
             <wp:effectExtent l="0" t="0" r="0" b="0"/>
             <wp:docPr id="53" name="dcp-02-statistiques" descr="La page des statistiques" title="La page des statistiques"/>
@@ -19752,7 +19752,7 @@
         <w:pStyle w:val="Titre1"/>
         <w:pageBreakBefore/>
       </w:pPr>
-      <w:bookmarkStart w:id="63" w:name="_Toc242302493"/>
+      <w:bookmarkStart w:id="63" w:name="_Toc242303111"/>
       <w:r>
         <w:lastRenderedPageBreak/>
         <w:t>12. Profil administrateur DDIC</w:t>
@@ -19782,7 +19782,7 @@
         <w:pStyle w:val="Titre2"/>
         <w:keepNext/>
       </w:pPr>
-      <w:bookmarkStart w:id="64" w:name="_Toc242302494"/>
+      <w:bookmarkStart w:id="64" w:name="_Toc242303112"/>
       <w:r>
         <w:t>12.1 Gérer les agents</w:t>
       </w:r>
@@ -19799,7 +19799,7 @@
           <w:noProof/>
         </w:rPr>
         <w:drawing>
-          <wp:inline distT="0" distB="0" distL="0" distR="0" wp14:anchorId="2B470BF8" wp14:editId="5FA2FC7D">
+          <wp:inline distT="0" distB="0" distL="0" distR="0" wp14:anchorId="0741D7EF" wp14:editId="0405A719">
             <wp:extent cx="5810250" cy="4505325"/>
             <wp:effectExtent l="0" t="0" r="0" b="0"/>
             <wp:docPr id="54" name="adm-09-agents" descr="La gestion des agents" title="La gestion des agents"/>
@@ -19913,7 +19913,7 @@
           <w:noProof/>
         </w:rPr>
         <w:drawing>
-          <wp:inline distT="0" distB="0" distL="0" distR="0" wp14:anchorId="0ABD279F" wp14:editId="15A5BAEF">
+          <wp:inline distT="0" distB="0" distL="0" distR="0" wp14:anchorId="67E81131" wp14:editId="4CE87DF6">
             <wp:extent cx="5810250" cy="5238750"/>
             <wp:effectExtent l="0" t="0" r="0" b="0"/>
             <wp:docPr id="55" name="adm-10-agent-nouveau" descr="Créer un agent" title="Créer un agent"/>
@@ -20191,7 +20191,7 @@
         <w:pStyle w:val="Titre2"/>
         <w:keepNext/>
       </w:pPr>
-      <w:bookmarkStart w:id="65" w:name="_Toc242302495"/>
+      <w:bookmarkStart w:id="65" w:name="_Toc242303113"/>
       <w:r>
         <w:lastRenderedPageBreak/>
         <w:t>12.2 Rôles et permissions</w:t>
@@ -20209,7 +20209,7 @@
           <w:noProof/>
         </w:rPr>
         <w:drawing>
-          <wp:inline distT="0" distB="0" distL="0" distR="0" wp14:anchorId="120110D5" wp14:editId="4DEF8316">
+          <wp:inline distT="0" distB="0" distL="0" distR="0" wp14:anchorId="0E351532" wp14:editId="257AD5F0">
             <wp:extent cx="5810250" cy="4714875"/>
             <wp:effectExtent l="0" t="0" r="0" b="0"/>
             <wp:docPr id="56" name="adm-11-roles" descr="Les rôles et leurs permissions" title="Les rôles et leurs permissions"/>
@@ -20297,7 +20297,7 @@
         <w:pStyle w:val="Titre2"/>
         <w:keepNext/>
       </w:pPr>
-      <w:bookmarkStart w:id="66" w:name="_Toc242302496"/>
+      <w:bookmarkStart w:id="66" w:name="_Toc242303114"/>
       <w:r>
         <w:lastRenderedPageBreak/>
         <w:t>12.3 Le journal d'audit</w:t>
@@ -20315,7 +20315,7 @@
           <w:noProof/>
         </w:rPr>
         <w:drawing>
-          <wp:inline distT="0" distB="0" distL="0" distR="0" wp14:anchorId="7884B64F" wp14:editId="1652F44E">
+          <wp:inline distT="0" distB="0" distL="0" distR="0" wp14:anchorId="746E298F" wp14:editId="413D36D4">
             <wp:extent cx="5810250" cy="5238750"/>
             <wp:effectExtent l="0" t="0" r="0" b="0"/>
             <wp:docPr id="57" name="adm-12-journal-audit" descr="Le journal d'audit" title="Le journal d'audit"/>
@@ -20489,7 +20489,7 @@
         <w:pStyle w:val="Titre2"/>
         <w:keepNext/>
       </w:pPr>
-      <w:bookmarkStart w:id="67" w:name="_Toc242302497"/>
+      <w:bookmarkStart w:id="67" w:name="_Toc242303115"/>
       <w:r>
         <w:lastRenderedPageBreak/>
         <w:t>12.4 Les paramètres du portail</w:t>
@@ -20507,7 +20507,7 @@
           <w:noProof/>
         </w:rPr>
         <w:drawing>
-          <wp:inline distT="0" distB="0" distL="0" distR="0" wp14:anchorId="077314B4" wp14:editId="64EDF1FD">
+          <wp:inline distT="0" distB="0" distL="0" distR="0" wp14:anchorId="646D41CC" wp14:editId="4E8226B2">
             <wp:extent cx="5810250" cy="6543675"/>
             <wp:effectExtent l="0" t="0" r="0" b="0"/>
             <wp:docPr id="58" name="adm-13-parametres-portail" descr="Les paramètres du portail" title="Les paramètres du portail"/>
@@ -20780,7 +20780,7 @@
         <w:pStyle w:val="Titre2"/>
         <w:keepNext/>
       </w:pPr>
-      <w:bookmarkStart w:id="68" w:name="_Toc242302498"/>
+      <w:bookmarkStart w:id="68" w:name="_Toc242303116"/>
       <w:r>
         <w:t>12.5 Les paramètres métier</w:t>
       </w:r>
@@ -20797,7 +20797,7 @@
           <w:noProof/>
         </w:rPr>
         <w:drawing>
-          <wp:inline distT="0" distB="0" distL="0" distR="0" wp14:anchorId="17696462" wp14:editId="413CC58A">
+          <wp:inline distT="0" distB="0" distL="0" distR="0" wp14:anchorId="7213509B" wp14:editId="6A083142">
             <wp:extent cx="5810250" cy="5762625"/>
             <wp:effectExtent l="0" t="0" r="0" b="0"/>
             <wp:docPr id="59" name="adm-20-parametres-metier" descr="Les paramètres métier : les délais" title="Les paramètres métier : les délais"/>
@@ -21886,7 +21886,7 @@
         <w:pStyle w:val="Titre2"/>
         <w:keepNext/>
       </w:pPr>
-      <w:bookmarkStart w:id="69" w:name="_Toc242302499"/>
+      <w:bookmarkStart w:id="69" w:name="_Toc242303117"/>
       <w:r>
         <w:t>12.6 La file des notifications</w:t>
       </w:r>
@@ -21903,7 +21903,7 @@
           <w:noProof/>
         </w:rPr>
         <w:drawing>
-          <wp:inline distT="0" distB="0" distL="0" distR="0" wp14:anchorId="537312FA" wp14:editId="00ABE47B">
+          <wp:inline distT="0" distB="0" distL="0" distR="0" wp14:anchorId="5756A0FE" wp14:editId="316B1F52">
             <wp:extent cx="5810250" cy="2933700"/>
             <wp:effectExtent l="0" t="0" r="0" b="0"/>
             <wp:docPr id="60" name="adm-21-file-notifications" descr="La file d'attente des notifications" title="La file d'attente des notifications"/>
@@ -22011,7 +22011,7 @@
         <w:pStyle w:val="Titre2"/>
         <w:keepNext/>
       </w:pPr>
-      <w:bookmarkStart w:id="70" w:name="_Toc242302500"/>
+      <w:bookmarkStart w:id="70" w:name="_Toc242303118"/>
       <w:r>
         <w:lastRenderedPageBreak/>
         <w:t>12.7 Mon profil</w:t>
@@ -22029,7 +22029,7 @@
           <w:noProof/>
         </w:rPr>
         <w:drawing>
-          <wp:inline distT="0" distB="0" distL="0" distR="0" wp14:anchorId="5D68E620" wp14:editId="1C51303F">
+          <wp:inline distT="0" distB="0" distL="0" distR="0" wp14:anchorId="759D479B" wp14:editId="2DD0F5B4">
             <wp:extent cx="5810250" cy="5286375"/>
             <wp:effectExtent l="0" t="0" r="0" b="0"/>
             <wp:docPr id="61" name="adm-14-profil" descr="La page « Mon profil »" title="La page « Mon profil »"/>
@@ -22267,7 +22267,7 @@
         <w:pStyle w:val="Titre1"/>
         <w:pageBreakBefore/>
       </w:pPr>
-      <w:bookmarkStart w:id="71" w:name="_Toc242302501"/>
+      <w:bookmarkStart w:id="71" w:name="_Toc242303119"/>
       <w:r>
         <w:lastRenderedPageBreak/>
         <w:t>Annexe A. Qui peut faire quoi</w:t>
@@ -23424,7 +23424,7 @@
         <w:pStyle w:val="Titre1"/>
         <w:pageBreakBefore/>
       </w:pPr>
-      <w:bookmarkStart w:id="72" w:name="_Toc242302502"/>
+      <w:bookmarkStart w:id="72" w:name="_Toc242303120"/>
       <w:r>
         <w:lastRenderedPageBreak/>
         <w:t>Annexe B. Les statuts d'un dossier</w:t>
@@ -24313,7 +24313,7 @@
         <w:pStyle w:val="Titre1"/>
         <w:pageBreakBefore/>
       </w:pPr>
-      <w:bookmarkStart w:id="73" w:name="_Toc242302503"/>
+      <w:bookmarkStart w:id="73" w:name="_Toc242303121"/>
       <w:r>
         <w:lastRenderedPageBreak/>
         <w:t>Annexe C. Glossaire</w:t>
@@ -24796,7 +24796,7 @@
                 <w:sz w:val="20"/>
                 <w:szCs w:val="20"/>
               </w:rPr>
-              <w:t>Comité de Traitement et d'Analyse des Dossiers de Plaintes</w:t>
+              <w:t>Comité de Traitement et d'Analyse des Dénonciations et des Plaintes</w:t>
             </w:r>
           </w:p>
         </w:tc>
@@ -25462,7 +25462,7 @@
         <w:pStyle w:val="Titre1"/>
         <w:pageBreakBefore/>
       </w:pPr>
-      <w:bookmarkStart w:id="74" w:name="_Toc242302504"/>
+      <w:bookmarkStart w:id="74" w:name="_Toc242303122"/>
       <w:r>
         <w:lastRenderedPageBreak/>
         <w:t>Annexe D. En cas de difficulté</w:t>
@@ -26091,7 +26091,7 @@
         <w:pStyle w:val="Titre1"/>
         <w:pageBreakBefore/>
       </w:pPr>
-      <w:bookmarkStart w:id="75" w:name="_Toc242302505"/>
+      <w:bookmarkStart w:id="75" w:name="_Toc242303123"/>
       <w:r>
         <w:lastRenderedPageBreak/>
         <w:t>Annexe E. Points à confirmer avant diffusion</w:t>
@@ -26607,7 +26607,7 @@
                 <w:sz w:val="20"/>
                 <w:szCs w:val="20"/>
               </w:rPr>
-              <w:t>Le corps du manuel des procédures dit « Département d'Enquête et d'Investigation », mais son tableau des abréviations donne « Direction de la Documentation et de la Communication » (tableau décalé). L'ASCE-LC doit corriger cette ligne de son manuel.</w:t>
+              <w:t>Vérifié dans le manuel des procédures : DEI = Département d'Enquête et d'Investigation (intitulé repris dans le glossaire). Rien à confirmer.</w:t>
             </w:r>
           </w:p>
         </w:tc>
@@ -26940,10 +26940,10 @@
 <file path=word/numbering.xml><?xml version="1.0" encoding="utf-8"?>
 <w:numbering xmlns:wpc="http://schemas.microsoft.com/office/word/2010/wordprocessingCanvas" xmlns:cx="http://schemas.microsoft.com/office/drawing/2014/chartex" xmlns:cx1="http://schemas.microsoft.com/office/drawing/2015/9/8/chartex" xmlns:cx2="http://schemas.microsoft.com/office/drawing/2015/10/21/chartex" xmlns:cx3="http://schemas.microsoft.com/office/drawing/2016/5/9/chartex" xmlns:cx4="http://schemas.microsoft.com/office/drawing/2016/5/10/chartex" xmlns:cx5="http://schemas.microsoft.com/office/drawing/2016/5/11/chartex" xmlns:cx6="http://schemas.microsoft.com/office/drawing/2016/5/12/chartex" xmlns:cx7="http://schemas.microsoft.com/office/drawing/2016/5/13/chartex" xmlns:cx8="http://schemas.microsoft.com/office/drawing/2016/5/14/chartex" xmlns:mc="http://schemas.openxmlformats.org/markup-compatibility/2006" xmlns:aink="http://schemas.microsoft.com/office/drawing/2016/ink" xmlns:am3d="http://schemas.microsoft.com/office/drawing/2017/model3d" xmlns:o="urn:schemas-microsoft-com:office:office" xmlns:oel="http://schemas.microsoft.com/office/2019/extlst" xmlns:r="http://schemas.openxmlformats.org/officeDocument/2006/relationships" xmlns:m="http://schemas.openxmlformats.org/officeDocument/2006/math" xmlns:v="urn:schemas-microsoft-com:vml" xmlns:wp14="http://schemas.microsoft.com/office/word/2010/wordprocessingDrawing" xmlns:wp="http://schemas.openxmlformats.org/drawingml/2006/wordprocessingDrawing" xmlns:w10="urn:schemas-microsoft-com:office:word" xmlns:w="http://schemas.openxmlformats.org/wordprocessingml/2006/main" xmlns:w14="http://schemas.microsoft.com/office/word/2010/wordml" xmlns:w15="http://schemas.microsoft.com/office/word/2012/wordml" xmlns:w16cex="http://schemas.microsoft.com/office/word/2018/wordml/cex" xmlns:w16cid="http://schemas.microsoft.com/office/word/2016/wordml/cid" xmlns:w16="http://schemas.microsoft.com/office/word/2018/wordml" xmlns:w16du="http://schemas.microsoft.com/office/word/2023/wordml/word16du" xmlns:w16sdtdh="http://schemas.microsoft.com/office/word/2020/wordml/sdtdatahash" xmlns:w16sdtfl="http://schemas.microsoft.com/office/word/2024/wordml/sdtformatlock" xmlns:w16se="http://schemas.microsoft.com/office/word/2015/wordml/symex" xmlns:wpg="http://schemas.microsoft.com/office/word/2010/wordprocessingGroup" xmlns:wpi="http://schemas.microsoft.com/office/word/2010/wordprocessingInk" xmlns:wne="http://schemas.microsoft.com/office/word/2006/wordml" xmlns:wps="http://schemas.microsoft.com/office/word/2010/wordprocessingShape" mc:Ignorable="w14 w15 w16se w16cid w16 w16cex w16sdtdh w16sdtfl w16du wp14">
   <w:abstractNum w:abstractNumId="0" w15:restartNumberingAfterBreak="0">
-    <w:nsid w:val="145C47B5"/>
+    <w:nsid w:val="07C94E72"/>
     <w:multiLevelType w:val="hybridMultilevel"/>
-    <w:tmpl w:val="6F96548C"/>
-    <w:lvl w:ilvl="0" w:tplc="E3584140">
+    <w:tmpl w:val="612E8436"/>
+    <w:lvl w:ilvl="0" w:tplc="A9B40322">
       <w:start w:val="1"/>
       <w:numFmt w:val="decimal"/>
       <w:lvlText w:val="%1."/>
@@ -26952,52 +26952,52 @@
         <w:ind w:left="540" w:hanging="360"/>
       </w:pPr>
     </w:lvl>
-    <w:lvl w:ilvl="1" w:tplc="CA3E43E8">
+    <w:lvl w:ilvl="1" w:tplc="9F146D08">
       <w:numFmt w:val="decimal"/>
       <w:lvlText w:val=""/>
       <w:lvlJc w:val="left"/>
     </w:lvl>
-    <w:lvl w:ilvl="2" w:tplc="6900C3A6">
+    <w:lvl w:ilvl="2" w:tplc="6F1641B4">
       <w:numFmt w:val="decimal"/>
       <w:lvlText w:val=""/>
       <w:lvlJc w:val="left"/>
     </w:lvl>
-    <w:lvl w:ilvl="3" w:tplc="400A2480">
+    <w:lvl w:ilvl="3" w:tplc="0BA07E4C">
       <w:numFmt w:val="decimal"/>
       <w:lvlText w:val=""/>
       <w:lvlJc w:val="left"/>
     </w:lvl>
-    <w:lvl w:ilvl="4" w:tplc="C21E7DB6">
+    <w:lvl w:ilvl="4" w:tplc="9E4E885C">
       <w:numFmt w:val="decimal"/>
       <w:lvlText w:val=""/>
       <w:lvlJc w:val="left"/>
     </w:lvl>
-    <w:lvl w:ilvl="5" w:tplc="434ADB20">
+    <w:lvl w:ilvl="5" w:tplc="BB2AE14A">
       <w:numFmt w:val="decimal"/>
       <w:lvlText w:val=""/>
       <w:lvlJc w:val="left"/>
     </w:lvl>
-    <w:lvl w:ilvl="6" w:tplc="FD1A75B2">
+    <w:lvl w:ilvl="6" w:tplc="95568E04">
       <w:numFmt w:val="decimal"/>
       <w:lvlText w:val=""/>
       <w:lvlJc w:val="left"/>
     </w:lvl>
-    <w:lvl w:ilvl="7" w:tplc="8EC815B6">
+    <w:lvl w:ilvl="7" w:tplc="BDF4F342">
       <w:numFmt w:val="decimal"/>
       <w:lvlText w:val=""/>
       <w:lvlJc w:val="left"/>
     </w:lvl>
-    <w:lvl w:ilvl="8" w:tplc="66FA1FD0">
+    <w:lvl w:ilvl="8" w:tplc="B8B47986">
       <w:numFmt w:val="decimal"/>
       <w:lvlText w:val=""/>
       <w:lvlJc w:val="left"/>
     </w:lvl>
   </w:abstractNum>
   <w:abstractNum w:abstractNumId="1" w15:restartNumberingAfterBreak="0">
-    <w:nsid w:val="268A3E85"/>
+    <w:nsid w:val="0EAF09DC"/>
     <w:multiLevelType w:val="hybridMultilevel"/>
-    <w:tmpl w:val="69007B44"/>
-    <w:lvl w:ilvl="0" w:tplc="8540791C">
+    <w:tmpl w:val="E9342D7C"/>
+    <w:lvl w:ilvl="0" w:tplc="66E828F4">
       <w:start w:val="1"/>
       <w:numFmt w:val="decimal"/>
       <w:lvlText w:val="%1."/>
@@ -27006,52 +27006,52 @@
         <w:ind w:left="540" w:hanging="360"/>
       </w:pPr>
     </w:lvl>
-    <w:lvl w:ilvl="1" w:tplc="A03EEAF0">
+    <w:lvl w:ilvl="1" w:tplc="9B76ADC0">
       <w:numFmt w:val="decimal"/>
       <w:lvlText w:val=""/>
       <w:lvlJc w:val="left"/>
     </w:lvl>
-    <w:lvl w:ilvl="2" w:tplc="827897BE">
+    <w:lvl w:ilvl="2" w:tplc="292E4E82">
       <w:numFmt w:val="decimal"/>
       <w:lvlText w:val=""/>
       <w:lvlJc w:val="left"/>
     </w:lvl>
-    <w:lvl w:ilvl="3" w:tplc="DC9E49E6">
+    <w:lvl w:ilvl="3" w:tplc="3CF6F8D2">
       <w:numFmt w:val="decimal"/>
       <w:lvlText w:val=""/>
       <w:lvlJc w:val="left"/>
     </w:lvl>
-    <w:lvl w:ilvl="4" w:tplc="685879C4">
+    <w:lvl w:ilvl="4" w:tplc="199A8642">
       <w:numFmt w:val="decimal"/>
       <w:lvlText w:val=""/>
       <w:lvlJc w:val="left"/>
     </w:lvl>
-    <w:lvl w:ilvl="5" w:tplc="E03CFE3C">
+    <w:lvl w:ilvl="5" w:tplc="0D804650">
       <w:numFmt w:val="decimal"/>
       <w:lvlText w:val=""/>
       <w:lvlJc w:val="left"/>
     </w:lvl>
-    <w:lvl w:ilvl="6" w:tplc="C67AB8A2">
+    <w:lvl w:ilvl="6" w:tplc="BE2291CA">
       <w:numFmt w:val="decimal"/>
       <w:lvlText w:val=""/>
       <w:lvlJc w:val="left"/>
     </w:lvl>
-    <w:lvl w:ilvl="7" w:tplc="B0705F98">
+    <w:lvl w:ilvl="7" w:tplc="6B064DE2">
       <w:numFmt w:val="decimal"/>
       <w:lvlText w:val=""/>
       <w:lvlJc w:val="left"/>
     </w:lvl>
-    <w:lvl w:ilvl="8" w:tplc="E3AA9886">
+    <w:lvl w:ilvl="8" w:tplc="4CB06A84">
       <w:numFmt w:val="decimal"/>
       <w:lvlText w:val=""/>
       <w:lvlJc w:val="left"/>
     </w:lvl>
   </w:abstractNum>
   <w:abstractNum w:abstractNumId="2" w15:restartNumberingAfterBreak="0">
-    <w:nsid w:val="342943BE"/>
+    <w:nsid w:val="0F0867D5"/>
     <w:multiLevelType w:val="hybridMultilevel"/>
-    <w:tmpl w:val="177E8932"/>
-    <w:lvl w:ilvl="0" w:tplc="D9FC5650">
+    <w:tmpl w:val="260619F6"/>
+    <w:lvl w:ilvl="0" w:tplc="6E2AAACC">
       <w:start w:val="1"/>
       <w:numFmt w:val="decimal"/>
       <w:lvlText w:val="%1."/>
@@ -27060,52 +27060,52 @@
         <w:ind w:left="540" w:hanging="360"/>
       </w:pPr>
     </w:lvl>
-    <w:lvl w:ilvl="1" w:tplc="B3707610">
+    <w:lvl w:ilvl="1" w:tplc="F1E210A2">
       <w:numFmt w:val="decimal"/>
       <w:lvlText w:val=""/>
       <w:lvlJc w:val="left"/>
     </w:lvl>
-    <w:lvl w:ilvl="2" w:tplc="D76AAECA">
+    <w:lvl w:ilvl="2" w:tplc="6B82D79C">
       <w:numFmt w:val="decimal"/>
       <w:lvlText w:val=""/>
       <w:lvlJc w:val="left"/>
     </w:lvl>
-    <w:lvl w:ilvl="3" w:tplc="2E840CDC">
+    <w:lvl w:ilvl="3" w:tplc="2FB6AFB4">
       <w:numFmt w:val="decimal"/>
       <w:lvlText w:val=""/>
       <w:lvlJc w:val="left"/>
     </w:lvl>
-    <w:lvl w:ilvl="4" w:tplc="C652E064">
+    <w:lvl w:ilvl="4" w:tplc="3C4ED3BC">
       <w:numFmt w:val="decimal"/>
       <w:lvlText w:val=""/>
       <w:lvlJc w:val="left"/>
     </w:lvl>
-    <w:lvl w:ilvl="5" w:tplc="09BEFD0E">
+    <w:lvl w:ilvl="5" w:tplc="57A24AA6">
       <w:numFmt w:val="decimal"/>
       <w:lvlText w:val=""/>
       <w:lvlJc w:val="left"/>
     </w:lvl>
-    <w:lvl w:ilvl="6" w:tplc="AC280C08">
+    <w:lvl w:ilvl="6" w:tplc="439C2284">
       <w:numFmt w:val="decimal"/>
       <w:lvlText w:val=""/>
       <w:lvlJc w:val="left"/>
     </w:lvl>
-    <w:lvl w:ilvl="7" w:tplc="EBF6FDE0">
+    <w:lvl w:ilvl="7" w:tplc="7478B7D4">
       <w:numFmt w:val="decimal"/>
       <w:lvlText w:val=""/>
       <w:lvlJc w:val="left"/>
     </w:lvl>
-    <w:lvl w:ilvl="8" w:tplc="39BA203A">
+    <w:lvl w:ilvl="8" w:tplc="C95ED87C">
       <w:numFmt w:val="decimal"/>
       <w:lvlText w:val=""/>
       <w:lvlJc w:val="left"/>
     </w:lvl>
   </w:abstractNum>
   <w:abstractNum w:abstractNumId="3" w15:restartNumberingAfterBreak="0">
-    <w:nsid w:val="496B501C"/>
+    <w:nsid w:val="1FF37692"/>
     <w:multiLevelType w:val="hybridMultilevel"/>
-    <w:tmpl w:val="275082E4"/>
-    <w:lvl w:ilvl="0" w:tplc="F4703806">
+    <w:tmpl w:val="0E94C654"/>
+    <w:lvl w:ilvl="0" w:tplc="F6246900">
       <w:start w:val="1"/>
       <w:numFmt w:val="decimal"/>
       <w:lvlText w:val="%1."/>
@@ -27114,52 +27114,52 @@
         <w:ind w:left="540" w:hanging="360"/>
       </w:pPr>
     </w:lvl>
-    <w:lvl w:ilvl="1" w:tplc="93269842">
+    <w:lvl w:ilvl="1" w:tplc="9D624AD8">
       <w:numFmt w:val="decimal"/>
       <w:lvlText w:val=""/>
       <w:lvlJc w:val="left"/>
     </w:lvl>
-    <w:lvl w:ilvl="2" w:tplc="A306C9F2">
+    <w:lvl w:ilvl="2" w:tplc="BF20AEE6">
       <w:numFmt w:val="decimal"/>
       <w:lvlText w:val=""/>
       <w:lvlJc w:val="left"/>
     </w:lvl>
-    <w:lvl w:ilvl="3" w:tplc="D7B018A0">
+    <w:lvl w:ilvl="3" w:tplc="3A043D46">
       <w:numFmt w:val="decimal"/>
       <w:lvlText w:val=""/>
       <w:lvlJc w:val="left"/>
     </w:lvl>
-    <w:lvl w:ilvl="4" w:tplc="FA4E471C">
+    <w:lvl w:ilvl="4" w:tplc="0E32D880">
       <w:numFmt w:val="decimal"/>
       <w:lvlText w:val=""/>
       <w:lvlJc w:val="left"/>
     </w:lvl>
-    <w:lvl w:ilvl="5" w:tplc="7C2AD7F0">
+    <w:lvl w:ilvl="5" w:tplc="34168CF0">
       <w:numFmt w:val="decimal"/>
       <w:lvlText w:val=""/>
       <w:lvlJc w:val="left"/>
     </w:lvl>
-    <w:lvl w:ilvl="6" w:tplc="B398754A">
+    <w:lvl w:ilvl="6" w:tplc="462EC994">
       <w:numFmt w:val="decimal"/>
       <w:lvlText w:val=""/>
       <w:lvlJc w:val="left"/>
     </w:lvl>
-    <w:lvl w:ilvl="7" w:tplc="2FE26224">
+    <w:lvl w:ilvl="7" w:tplc="E56614AC">
       <w:numFmt w:val="decimal"/>
       <w:lvlText w:val=""/>
       <w:lvlJc w:val="left"/>
     </w:lvl>
-    <w:lvl w:ilvl="8" w:tplc="6C02E2F0">
+    <w:lvl w:ilvl="8" w:tplc="6F7C5032">
       <w:numFmt w:val="decimal"/>
       <w:lvlText w:val=""/>
       <w:lvlJc w:val="left"/>
     </w:lvl>
   </w:abstractNum>
   <w:abstractNum w:abstractNumId="4" w15:restartNumberingAfterBreak="0">
-    <w:nsid w:val="57FF1EE8"/>
+    <w:nsid w:val="365635FE"/>
     <w:multiLevelType w:val="hybridMultilevel"/>
-    <w:tmpl w:val="CB74D4A2"/>
-    <w:lvl w:ilvl="0" w:tplc="D654DE6A">
+    <w:tmpl w:val="041A9450"/>
+    <w:lvl w:ilvl="0" w:tplc="3BCC6DD0">
       <w:start w:val="1"/>
       <w:numFmt w:val="decimal"/>
       <w:lvlText w:val="%1."/>
@@ -27168,52 +27168,52 @@
         <w:ind w:left="540" w:hanging="360"/>
       </w:pPr>
     </w:lvl>
-    <w:lvl w:ilvl="1" w:tplc="48C4FED4">
+    <w:lvl w:ilvl="1" w:tplc="32B6B912">
       <w:numFmt w:val="decimal"/>
       <w:lvlText w:val=""/>
       <w:lvlJc w:val="left"/>
     </w:lvl>
-    <w:lvl w:ilvl="2" w:tplc="986A8854">
+    <w:lvl w:ilvl="2" w:tplc="628E59BA">
       <w:numFmt w:val="decimal"/>
       <w:lvlText w:val=""/>
       <w:lvlJc w:val="left"/>
     </w:lvl>
-    <w:lvl w:ilvl="3" w:tplc="6B564B72">
+    <w:lvl w:ilvl="3" w:tplc="AD9AA126">
       <w:numFmt w:val="decimal"/>
       <w:lvlText w:val=""/>
       <w:lvlJc w:val="left"/>
     </w:lvl>
-    <w:lvl w:ilvl="4" w:tplc="D702228A">
+    <w:lvl w:ilvl="4" w:tplc="98A0CAB8">
       <w:numFmt w:val="decimal"/>
       <w:lvlText w:val=""/>
       <w:lvlJc w:val="left"/>
     </w:lvl>
-    <w:lvl w:ilvl="5" w:tplc="53E4B94A">
+    <w:lvl w:ilvl="5" w:tplc="A27AB2A2">
       <w:numFmt w:val="decimal"/>
       <w:lvlText w:val=""/>
       <w:lvlJc w:val="left"/>
     </w:lvl>
-    <w:lvl w:ilvl="6" w:tplc="F8625C84">
+    <w:lvl w:ilvl="6" w:tplc="688E7AF0">
       <w:numFmt w:val="decimal"/>
       <w:lvlText w:val=""/>
       <w:lvlJc w:val="left"/>
     </w:lvl>
-    <w:lvl w:ilvl="7" w:tplc="CB8C6BE4">
+    <w:lvl w:ilvl="7" w:tplc="CAA47162">
       <w:numFmt w:val="decimal"/>
       <w:lvlText w:val=""/>
       <w:lvlJc w:val="left"/>
     </w:lvl>
-    <w:lvl w:ilvl="8" w:tplc="9692D46E">
+    <w:lvl w:ilvl="8" w:tplc="57F60524">
       <w:numFmt w:val="decimal"/>
       <w:lvlText w:val=""/>
       <w:lvlJc w:val="left"/>
     </w:lvl>
   </w:abstractNum>
   <w:abstractNum w:abstractNumId="5" w15:restartNumberingAfterBreak="0">
-    <w:nsid w:val="5B1B70E2"/>
+    <w:nsid w:val="40B34AC2"/>
     <w:multiLevelType w:val="hybridMultilevel"/>
-    <w:tmpl w:val="D888605E"/>
-    <w:lvl w:ilvl="0" w:tplc="934C601A">
+    <w:tmpl w:val="8FC27A7A"/>
+    <w:lvl w:ilvl="0" w:tplc="FF8E8582">
       <w:start w:val="1"/>
       <w:numFmt w:val="decimal"/>
       <w:lvlText w:val="%1."/>
@@ -27222,106 +27222,110 @@
         <w:ind w:left="540" w:hanging="360"/>
       </w:pPr>
     </w:lvl>
-    <w:lvl w:ilvl="1" w:tplc="4F12BEA0">
+    <w:lvl w:ilvl="1" w:tplc="3EF0EF22">
       <w:numFmt w:val="decimal"/>
       <w:lvlText w:val=""/>
       <w:lvlJc w:val="left"/>
     </w:lvl>
-    <w:lvl w:ilvl="2" w:tplc="A6383234">
+    <w:lvl w:ilvl="2" w:tplc="6DC6E62E">
       <w:numFmt w:val="decimal"/>
       <w:lvlText w:val=""/>
       <w:lvlJc w:val="left"/>
     </w:lvl>
-    <w:lvl w:ilvl="3" w:tplc="6930C388">
+    <w:lvl w:ilvl="3" w:tplc="2B92FAD6">
       <w:numFmt w:val="decimal"/>
       <w:lvlText w:val=""/>
       <w:lvlJc w:val="left"/>
     </w:lvl>
-    <w:lvl w:ilvl="4" w:tplc="DFD0BD7E">
+    <w:lvl w:ilvl="4" w:tplc="B01CCF9C">
       <w:numFmt w:val="decimal"/>
       <w:lvlText w:val=""/>
       <w:lvlJc w:val="left"/>
     </w:lvl>
-    <w:lvl w:ilvl="5" w:tplc="0DF007E6">
+    <w:lvl w:ilvl="5" w:tplc="50CAB19E">
       <w:numFmt w:val="decimal"/>
       <w:lvlText w:val=""/>
       <w:lvlJc w:val="left"/>
     </w:lvl>
-    <w:lvl w:ilvl="6" w:tplc="69AC66E2">
+    <w:lvl w:ilvl="6" w:tplc="8EC6D0F0">
       <w:numFmt w:val="decimal"/>
       <w:lvlText w:val=""/>
       <w:lvlJc w:val="left"/>
     </w:lvl>
-    <w:lvl w:ilvl="7" w:tplc="67F6BEEA">
+    <w:lvl w:ilvl="7" w:tplc="0284C99C">
       <w:numFmt w:val="decimal"/>
       <w:lvlText w:val=""/>
       <w:lvlJc w:val="left"/>
     </w:lvl>
-    <w:lvl w:ilvl="8" w:tplc="AD12025E">
+    <w:lvl w:ilvl="8" w:tplc="D90424F2">
       <w:numFmt w:val="decimal"/>
       <w:lvlText w:val=""/>
       <w:lvlJc w:val="left"/>
     </w:lvl>
   </w:abstractNum>
   <w:abstractNum w:abstractNumId="6" w15:restartNumberingAfterBreak="0">
-    <w:nsid w:val="65053160"/>
+    <w:nsid w:val="4DD8134E"/>
     <w:multiLevelType w:val="hybridMultilevel"/>
-    <w:tmpl w:val="FB6AC9B8"/>
-    <w:lvl w:ilvl="0" w:tplc="2D98985A">
+    <w:tmpl w:val="AE3834B4"/>
+    <w:lvl w:ilvl="0" w:tplc="622A4344">
       <w:start w:val="1"/>
-      <w:numFmt w:val="decimal"/>
-      <w:lvlText w:val="%1."/>
+      <w:numFmt w:val="bullet"/>
+      <w:lvlText w:val="•"/>
       <w:lvlJc w:val="left"/>
       <w:pPr>
-        <w:ind w:left="540" w:hanging="360"/>
+        <w:ind w:left="540" w:hanging="270"/>
       </w:pPr>
     </w:lvl>
-    <w:lvl w:ilvl="1" w:tplc="259E920A">
+    <w:lvl w:ilvl="1" w:tplc="DFBA92B2" w:tentative="1">
+      <w:start w:val="1"/>
+      <w:numFmt w:val="bullet"/>
+      <w:lvlText w:val="–"/>
+      <w:lvlJc w:val="left"/>
+      <w:pPr>
+        <w:ind w:left="1000" w:hanging="270"/>
+      </w:pPr>
+    </w:lvl>
+    <w:lvl w:ilvl="2" w:tplc="2DAED886">
       <w:numFmt w:val="decimal"/>
       <w:lvlText w:val=""/>
       <w:lvlJc w:val="left"/>
     </w:lvl>
-    <w:lvl w:ilvl="2" w:tplc="095C77A6">
+    <w:lvl w:ilvl="3" w:tplc="1708F6B8">
       <w:numFmt w:val="decimal"/>
       <w:lvlText w:val=""/>
       <w:lvlJc w:val="left"/>
     </w:lvl>
-    <w:lvl w:ilvl="3" w:tplc="AC269FFC">
+    <w:lvl w:ilvl="4" w:tplc="7A7AFA78">
       <w:numFmt w:val="decimal"/>
       <w:lvlText w:val=""/>
       <w:lvlJc w:val="left"/>
     </w:lvl>
-    <w:lvl w:ilvl="4" w:tplc="0F2C78E4">
+    <w:lvl w:ilvl="5" w:tplc="5FC0DD9A">
       <w:numFmt w:val="decimal"/>
       <w:lvlText w:val=""/>
       <w:lvlJc w:val="left"/>
     </w:lvl>
-    <w:lvl w:ilvl="5" w:tplc="2C40E044">
+    <w:lvl w:ilvl="6" w:tplc="15C8E6D2">
       <w:numFmt w:val="decimal"/>
       <w:lvlText w:val=""/>
       <w:lvlJc w:val="left"/>
     </w:lvl>
-    <w:lvl w:ilvl="6" w:tplc="4FACDAE6">
+    <w:lvl w:ilvl="7" w:tplc="A8DC8564">
       <w:numFmt w:val="decimal"/>
       <w:lvlText w:val=""/>
       <w:lvlJc w:val="left"/>
     </w:lvl>
-    <w:lvl w:ilvl="7" w:tplc="4D1CBFD4">
-      <w:numFmt w:val="decimal"/>
-      <w:lvlText w:val=""/>
-      <w:lvlJc w:val="left"/>
-    </w:lvl>
-    <w:lvl w:ilvl="8" w:tplc="A476B708">
+    <w:lvl w:ilvl="8" w:tplc="BBBCC162">
       <w:numFmt w:val="decimal"/>
       <w:lvlText w:val=""/>
       <w:lvlJc w:val="left"/>
     </w:lvl>
   </w:abstractNum>
   <w:abstractNum w:abstractNumId="7" w15:restartNumberingAfterBreak="0">
-    <w:nsid w:val="76D05EB0"/>
+    <w:nsid w:val="580620A8"/>
     <w:multiLevelType w:val="hybridMultilevel"/>
-    <w:tmpl w:val="B92A1658"/>
-    <w:lvl w:ilvl="0" w:tplc="A1BACDEC" w:tentative="1">
+    <w:tmpl w:val="1DBE8A5A"/>
+    <w:lvl w:ilvl="0" w:tplc="1F264E8A" w:tentative="1">
       <w:start w:val="1"/>
       <w:numFmt w:val="bullet"/>
       <w:lvlText w:val="●"/>
@@ -27330,7 +27334,7 @@
         <w:ind w:left="720" w:hanging="360"/>
       </w:pPr>
     </w:lvl>
-    <w:lvl w:ilvl="1" w:tplc="57A00CF8" w:tentative="1">
+    <w:lvl w:ilvl="1" w:tplc="9B2EE020" w:tentative="1">
       <w:start w:val="1"/>
       <w:numFmt w:val="bullet"/>
       <w:lvlText w:val="○"/>
@@ -27339,7 +27343,7 @@
         <w:ind w:left="1440" w:hanging="360"/>
       </w:pPr>
     </w:lvl>
-    <w:lvl w:ilvl="2" w:tplc="CA0E31B8" w:tentative="1">
+    <w:lvl w:ilvl="2" w:tplc="DA940C7A" w:tentative="1">
       <w:start w:val="1"/>
       <w:numFmt w:val="bullet"/>
       <w:lvlText w:val="■"/>
@@ -27348,7 +27352,7 @@
         <w:ind w:left="2160" w:hanging="360"/>
       </w:pPr>
     </w:lvl>
-    <w:lvl w:ilvl="3" w:tplc="C0946D0A" w:tentative="1">
+    <w:lvl w:ilvl="3" w:tplc="15C0E714" w:tentative="1">
       <w:start w:val="1"/>
       <w:numFmt w:val="bullet"/>
       <w:lvlText w:val="●"/>
@@ -27357,7 +27361,7 @@
         <w:ind w:left="2880" w:hanging="360"/>
       </w:pPr>
     </w:lvl>
-    <w:lvl w:ilvl="4" w:tplc="853A789A" w:tentative="1">
+    <w:lvl w:ilvl="4" w:tplc="6BE6E196" w:tentative="1">
       <w:start w:val="1"/>
       <w:numFmt w:val="bullet"/>
       <w:lvlText w:val="○"/>
@@ -27366,7 +27370,7 @@
         <w:ind w:left="3600" w:hanging="360"/>
       </w:pPr>
     </w:lvl>
-    <w:lvl w:ilvl="5" w:tplc="0FC8AF3A" w:tentative="1">
+    <w:lvl w:ilvl="5" w:tplc="F620E5B2" w:tentative="1">
       <w:start w:val="1"/>
       <w:numFmt w:val="bullet"/>
       <w:lvlText w:val="■"/>
@@ -27375,7 +27379,7 @@
         <w:ind w:left="4320" w:hanging="360"/>
       </w:pPr>
     </w:lvl>
-    <w:lvl w:ilvl="6" w:tplc="E07210E0" w:tentative="1">
+    <w:lvl w:ilvl="6" w:tplc="722A416C" w:tentative="1">
       <w:start w:val="1"/>
       <w:numFmt w:val="bullet"/>
       <w:lvlText w:val="●"/>
@@ -27384,7 +27388,7 @@
         <w:ind w:left="5040" w:hanging="360"/>
       </w:pPr>
     </w:lvl>
-    <w:lvl w:ilvl="7" w:tplc="9D762A92" w:tentative="1">
+    <w:lvl w:ilvl="7" w:tplc="4D307C82" w:tentative="1">
       <w:start w:val="1"/>
       <w:numFmt w:val="bullet"/>
       <w:lvlText w:val="●"/>
@@ -27393,7 +27397,7 @@
         <w:ind w:left="5760" w:hanging="360"/>
       </w:pPr>
     </w:lvl>
-    <w:lvl w:ilvl="8" w:tplc="8A044560" w:tentative="1">
+    <w:lvl w:ilvl="8" w:tplc="FE56EC46" w:tentative="1">
       <w:start w:val="1"/>
       <w:numFmt w:val="bullet"/>
       <w:lvlText w:val="●"/>
@@ -27404,113 +27408,109 @@
     </w:lvl>
   </w:abstractNum>
   <w:abstractNum w:abstractNumId="8" w15:restartNumberingAfterBreak="0">
-    <w:nsid w:val="7AAD7EBD"/>
+    <w:nsid w:val="5F406D31"/>
     <w:multiLevelType w:val="hybridMultilevel"/>
-    <w:tmpl w:val="C2084E6E"/>
-    <w:lvl w:ilvl="0" w:tplc="5CACA3F4">
+    <w:tmpl w:val="8E1C43F2"/>
+    <w:lvl w:ilvl="0" w:tplc="1CAA010E">
       <w:start w:val="1"/>
-      <w:numFmt w:val="bullet"/>
-      <w:lvlText w:val="•"/>
+      <w:numFmt w:val="decimal"/>
+      <w:lvlText w:val="%1."/>
       <w:lvlJc w:val="left"/>
       <w:pPr>
-        <w:ind w:left="540" w:hanging="270"/>
+        <w:ind w:left="540" w:hanging="360"/>
       </w:pPr>
     </w:lvl>
-    <w:lvl w:ilvl="1" w:tplc="40B830AA" w:tentative="1">
-      <w:start w:val="1"/>
-      <w:numFmt w:val="bullet"/>
-      <w:lvlText w:val="–"/>
-      <w:lvlJc w:val="left"/>
-      <w:pPr>
-        <w:ind w:left="1000" w:hanging="270"/>
-      </w:pPr>
-    </w:lvl>
-    <w:lvl w:ilvl="2" w:tplc="50B0D08C">
+    <w:lvl w:ilvl="1" w:tplc="D954E566">
       <w:numFmt w:val="decimal"/>
       <w:lvlText w:val=""/>
       <w:lvlJc w:val="left"/>
     </w:lvl>
-    <w:lvl w:ilvl="3" w:tplc="4BE05AA8">
+    <w:lvl w:ilvl="2" w:tplc="2FAAED64">
       <w:numFmt w:val="decimal"/>
       <w:lvlText w:val=""/>
       <w:lvlJc w:val="left"/>
     </w:lvl>
-    <w:lvl w:ilvl="4" w:tplc="6F00AED2">
+    <w:lvl w:ilvl="3" w:tplc="B9A69D18">
       <w:numFmt w:val="decimal"/>
       <w:lvlText w:val=""/>
       <w:lvlJc w:val="left"/>
     </w:lvl>
-    <w:lvl w:ilvl="5" w:tplc="1F183356">
+    <w:lvl w:ilvl="4" w:tplc="3C304E3C">
       <w:numFmt w:val="decimal"/>
       <w:lvlText w:val=""/>
       <w:lvlJc w:val="left"/>
     </w:lvl>
-    <w:lvl w:ilvl="6" w:tplc="CEC26F08">
+    <w:lvl w:ilvl="5" w:tplc="C562DA54">
       <w:numFmt w:val="decimal"/>
       <w:lvlText w:val=""/>
       <w:lvlJc w:val="left"/>
     </w:lvl>
-    <w:lvl w:ilvl="7" w:tplc="1EF4ECF6">
+    <w:lvl w:ilvl="6" w:tplc="4CBE6EA6">
       <w:numFmt w:val="decimal"/>
       <w:lvlText w:val=""/>
       <w:lvlJc w:val="left"/>
     </w:lvl>
-    <w:lvl w:ilvl="8" w:tplc="5A82C754">
+    <w:lvl w:ilvl="7" w:tplc="580E855A">
+      <w:numFmt w:val="decimal"/>
+      <w:lvlText w:val=""/>
+      <w:lvlJc w:val="left"/>
+    </w:lvl>
+    <w:lvl w:ilvl="8" w:tplc="5290D554">
       <w:numFmt w:val="decimal"/>
       <w:lvlText w:val=""/>
       <w:lvlJc w:val="left"/>
     </w:lvl>
   </w:abstractNum>
-  <w:num w:numId="1" w16cid:durableId="537160447">
+  <w:num w:numId="1" w16cid:durableId="538859621">
     <w:abstractNumId w:val="7"/>
     <w:lvlOverride w:ilvl="0">
       <w:startOverride w:val="1"/>
     </w:lvlOverride>
   </w:num>
-  <w:num w:numId="2" w16cid:durableId="1472946680">
+  <w:num w:numId="2" w16cid:durableId="1024205637">
+    <w:abstractNumId w:val="6"/>
+    <w:lvlOverride w:ilvl="0">
+      <w:startOverride w:val="1"/>
+    </w:lvlOverride>
+  </w:num>
+  <w:num w:numId="3" w16cid:durableId="1436100368">
+    <w:abstractNumId w:val="4"/>
+    <w:lvlOverride w:ilvl="0">
+      <w:startOverride w:val="1"/>
+    </w:lvlOverride>
+  </w:num>
+  <w:num w:numId="4" w16cid:durableId="1933271641">
     <w:abstractNumId w:val="8"/>
     <w:lvlOverride w:ilvl="0">
       <w:startOverride w:val="1"/>
     </w:lvlOverride>
   </w:num>
-  <w:num w:numId="3" w16cid:durableId="1356923123">
-    <w:abstractNumId w:val="3"/>
+  <w:num w:numId="5" w16cid:durableId="648629922">
+    <w:abstractNumId w:val="5"/>
     <w:lvlOverride w:ilvl="0">
       <w:startOverride w:val="1"/>
     </w:lvlOverride>
   </w:num>
-  <w:num w:numId="4" w16cid:durableId="1173256089">
+  <w:num w:numId="6" w16cid:durableId="369039953">
+    <w:abstractNumId w:val="2"/>
+    <w:lvlOverride w:ilvl="0">
+      <w:startOverride w:val="1"/>
+    </w:lvlOverride>
+  </w:num>
+  <w:num w:numId="7" w16cid:durableId="1158763776">
+    <w:abstractNumId w:val="0"/>
+    <w:lvlOverride w:ilvl="0">
+      <w:startOverride w:val="1"/>
+    </w:lvlOverride>
+  </w:num>
+  <w:num w:numId="8" w16cid:durableId="1046098987">
     <w:abstractNumId w:val="1"/>
     <w:lvlOverride w:ilvl="0">
       <w:startOverride w:val="1"/>
     </w:lvlOverride>
   </w:num>
-  <w:num w:numId="5" w16cid:durableId="1581404901">
-    <w:abstractNumId w:val="6"/>
-    <w:lvlOverride w:ilvl="0">
-      <w:startOverride w:val="1"/>
-    </w:lvlOverride>
-  </w:num>
-  <w:num w:numId="6" w16cid:durableId="2108841165">
-    <w:abstractNumId w:val="0"/>
-    <w:lvlOverride w:ilvl="0">
-      <w:startOverride w:val="1"/>
-    </w:lvlOverride>
-  </w:num>
-  <w:num w:numId="7" w16cid:durableId="139883464">
-    <w:abstractNumId w:val="5"/>
-    <w:lvlOverride w:ilvl="0">
-      <w:startOverride w:val="1"/>
-    </w:lvlOverride>
-  </w:num>
-  <w:num w:numId="8" w16cid:durableId="614024860">
-    <w:abstractNumId w:val="4"/>
-    <w:lvlOverride w:ilvl="0">
-      <w:startOverride w:val="1"/>
-    </w:lvlOverride>
-  </w:num>
-  <w:num w:numId="9" w16cid:durableId="955212186">
-    <w:abstractNumId w:val="2"/>
+  <w:num w:numId="9" w16cid:durableId="457845572">
+    <w:abstractNumId w:val="3"/>
     <w:lvlOverride w:ilvl="0">
       <w:startOverride w:val="1"/>
     </w:lvlOverride>
@@ -28149,7 +28149,7 @@
     <w:autoRedefine/>
     <w:uiPriority w:val="39"/>
     <w:unhideWhenUsed/>
-    <w:rsid w:val="00494E9F"/>
+    <w:rsid w:val="00D01FD9"/>
     <w:pPr>
       <w:spacing w:after="100"/>
     </w:pPr>
@@ -28161,7 +28161,7 @@
     <w:autoRedefine/>
     <w:uiPriority w:val="39"/>
     <w:unhideWhenUsed/>
-    <w:rsid w:val="00494E9F"/>
+    <w:rsid w:val="00D01FD9"/>
     <w:pPr>
       <w:spacing w:after="100"/>
       <w:ind w:left="220"/>

</xml_diff>

<commit_message>
docs(formation): annexe E, délais confrontés au manuel et au workflow PGPD_GU V3
Approbation du rapport par le CGEA : 20 jours ouvrables dans le manuel et le workflow
(10 dans la plateforme, à ajuster dans Paramètres métier). Réponse à un complément :
14 jours propres à la plateforme, aucun document source, à faire valider.

Co-Authored-By: Claude Sonnet 5.5 <noreply@anthropic.com>
</commit_message>
<xml_diff>
--- a/docs/formation/Manuel-de-formation-INTEGRITE-plus.docx
+++ b/docs/formation/Manuel-de-formation-INTEGRITE-plus.docx
@@ -17,7 +17,7 @@
           <w:noProof/>
         </w:rPr>
         <w:drawing>
-          <wp:inline distT="0" distB="0" distL="0" distR="0" wp14:anchorId="34D2CC76" wp14:editId="15FAA875">
+          <wp:inline distT="0" distB="0" distL="0" distR="0" wp14:anchorId="62FDE496" wp14:editId="41373F69">
             <wp:extent cx="2476500" cy="1190625"/>
             <wp:effectExtent l="0" t="0" r="0" b="0"/>
             <wp:docPr id="62" name="logo" descr="Logo ASCE-LC" title="Logo ASCE-LC"/>
@@ -190,7 +190,7 @@
     <w:sdt>
       <w:sdtPr>
         <w:alias w:val="Table des matières"/>
-        <w:id w:val="784701481"/>
+        <w:id w:val="1446117938"/>
       </w:sdtPr>
       <w:sdtEndPr/>
       <w:sdtContent>
@@ -213,7 +213,7 @@
           <w:r>
             <w:fldChar w:fldCharType="separate"/>
           </w:r>
-          <w:hyperlink w:anchor="_Toc242303048" w:history="1">
+          <w:hyperlink w:anchor="_Toc242303681" w:history="1">
             <w:r>
               <w:rPr>
                 <w:rStyle w:val="Lienhypertexte"/>
@@ -237,7 +237,7 @@
               <w:rPr>
                 <w:noProof/>
               </w:rPr>
-              <w:instrText xml:space="preserve"> PAGEREF _Toc242303048 \h </w:instrText>
+              <w:instrText xml:space="preserve"> PAGEREF _Toc242303681 \h </w:instrText>
             </w:r>
             <w:r>
               <w:rPr>
@@ -274,7 +274,7 @@
               <w:noProof/>
             </w:rPr>
           </w:pPr>
-          <w:hyperlink w:anchor="_Toc242303049" w:history="1">
+          <w:hyperlink w:anchor="_Toc242303682" w:history="1">
             <w:r>
               <w:rPr>
                 <w:rStyle w:val="Lienhypertexte"/>
@@ -298,7 +298,7 @@
               <w:rPr>
                 <w:noProof/>
               </w:rPr>
-              <w:instrText xml:space="preserve"> PAGEREF _Toc242303049 \h </w:instrText>
+              <w:instrText xml:space="preserve"> PAGEREF _Toc242303682 \h </w:instrText>
             </w:r>
             <w:r>
               <w:rPr>
@@ -335,7 +335,7 @@
               <w:noProof/>
             </w:rPr>
           </w:pPr>
-          <w:hyperlink w:anchor="_Toc242303050" w:history="1">
+          <w:hyperlink w:anchor="_Toc242303683" w:history="1">
             <w:r>
               <w:rPr>
                 <w:rStyle w:val="Lienhypertexte"/>
@@ -359,7 +359,7 @@
               <w:rPr>
                 <w:noProof/>
               </w:rPr>
-              <w:instrText xml:space="preserve"> PAGEREF _Toc242303050 \h </w:instrText>
+              <w:instrText xml:space="preserve"> PAGEREF _Toc242303683 \h </w:instrText>
             </w:r>
             <w:r>
               <w:rPr>
@@ -396,7 +396,7 @@
               <w:noProof/>
             </w:rPr>
           </w:pPr>
-          <w:hyperlink w:anchor="_Toc242303051" w:history="1">
+          <w:hyperlink w:anchor="_Toc242303684" w:history="1">
             <w:r>
               <w:rPr>
                 <w:rStyle w:val="Lienhypertexte"/>
@@ -420,7 +420,7 @@
               <w:rPr>
                 <w:noProof/>
               </w:rPr>
-              <w:instrText xml:space="preserve"> PAGEREF _Toc242303051 \h </w:instrText>
+              <w:instrText xml:space="preserve"> PAGEREF _Toc242303684 \h </w:instrText>
             </w:r>
             <w:r>
               <w:rPr>
@@ -457,7 +457,7 @@
               <w:noProof/>
             </w:rPr>
           </w:pPr>
-          <w:hyperlink w:anchor="_Toc242303052" w:history="1">
+          <w:hyperlink w:anchor="_Toc242303685" w:history="1">
             <w:r>
               <w:rPr>
                 <w:rStyle w:val="Lienhypertexte"/>
@@ -481,7 +481,7 @@
               <w:rPr>
                 <w:noProof/>
               </w:rPr>
-              <w:instrText xml:space="preserve"> PAGEREF _Toc242303052 \h </w:instrText>
+              <w:instrText xml:space="preserve"> PAGEREF _Toc242303685 \h </w:instrText>
             </w:r>
             <w:r>
               <w:rPr>
@@ -518,7 +518,7 @@
               <w:noProof/>
             </w:rPr>
           </w:pPr>
-          <w:hyperlink w:anchor="_Toc242303053" w:history="1">
+          <w:hyperlink w:anchor="_Toc242303686" w:history="1">
             <w:r>
               <w:rPr>
                 <w:rStyle w:val="Lienhypertexte"/>
@@ -542,7 +542,7 @@
               <w:rPr>
                 <w:noProof/>
               </w:rPr>
-              <w:instrText xml:space="preserve"> PAGEREF _Toc242303053 \h </w:instrText>
+              <w:instrText xml:space="preserve"> PAGEREF _Toc242303686 \h </w:instrText>
             </w:r>
             <w:r>
               <w:rPr>
@@ -579,7 +579,7 @@
               <w:noProof/>
             </w:rPr>
           </w:pPr>
-          <w:hyperlink w:anchor="_Toc242303054" w:history="1">
+          <w:hyperlink w:anchor="_Toc242303687" w:history="1">
             <w:r>
               <w:rPr>
                 <w:rStyle w:val="Lienhypertexte"/>
@@ -603,7 +603,7 @@
               <w:rPr>
                 <w:noProof/>
               </w:rPr>
-              <w:instrText xml:space="preserve"> PAGEREF _Toc242303054 \h </w:instrText>
+              <w:instrText xml:space="preserve"> PAGEREF _Toc242303687 \h </w:instrText>
             </w:r>
             <w:r>
               <w:rPr>
@@ -640,7 +640,7 @@
               <w:noProof/>
             </w:rPr>
           </w:pPr>
-          <w:hyperlink w:anchor="_Toc242303055" w:history="1">
+          <w:hyperlink w:anchor="_Toc242303688" w:history="1">
             <w:r>
               <w:rPr>
                 <w:rStyle w:val="Lienhypertexte"/>
@@ -664,7 +664,7 @@
               <w:rPr>
                 <w:noProof/>
               </w:rPr>
-              <w:instrText xml:space="preserve"> PAGEREF _Toc242303055 \h </w:instrText>
+              <w:instrText xml:space="preserve"> PAGEREF _Toc242303688 \h </w:instrText>
             </w:r>
             <w:r>
               <w:rPr>
@@ -701,7 +701,7 @@
               <w:noProof/>
             </w:rPr>
           </w:pPr>
-          <w:hyperlink w:anchor="_Toc242303056" w:history="1">
+          <w:hyperlink w:anchor="_Toc242303689" w:history="1">
             <w:r>
               <w:rPr>
                 <w:rStyle w:val="Lienhypertexte"/>
@@ -725,7 +725,7 @@
               <w:rPr>
                 <w:noProof/>
               </w:rPr>
-              <w:instrText xml:space="preserve"> PAGEREF _Toc242303056 \h </w:instrText>
+              <w:instrText xml:space="preserve"> PAGEREF _Toc242303689 \h </w:instrText>
             </w:r>
             <w:r>
               <w:rPr>
@@ -762,7 +762,7 @@
               <w:noProof/>
             </w:rPr>
           </w:pPr>
-          <w:hyperlink w:anchor="_Toc242303057" w:history="1">
+          <w:hyperlink w:anchor="_Toc242303690" w:history="1">
             <w:r>
               <w:rPr>
                 <w:rStyle w:val="Lienhypertexte"/>
@@ -786,7 +786,7 @@
               <w:rPr>
                 <w:noProof/>
               </w:rPr>
-              <w:instrText xml:space="preserve"> PAGEREF _Toc242303057 \h </w:instrText>
+              <w:instrText xml:space="preserve"> PAGEREF _Toc242303690 \h </w:instrText>
             </w:r>
             <w:r>
               <w:rPr>
@@ -823,7 +823,7 @@
               <w:noProof/>
             </w:rPr>
           </w:pPr>
-          <w:hyperlink w:anchor="_Toc242303058" w:history="1">
+          <w:hyperlink w:anchor="_Toc242303691" w:history="1">
             <w:r>
               <w:rPr>
                 <w:rStyle w:val="Lienhypertexte"/>
@@ -847,7 +847,7 @@
               <w:rPr>
                 <w:noProof/>
               </w:rPr>
-              <w:instrText xml:space="preserve"> PAGEREF _Toc242303058 \h </w:instrText>
+              <w:instrText xml:space="preserve"> PAGEREF _Toc242303691 \h </w:instrText>
             </w:r>
             <w:r>
               <w:rPr>
@@ -884,7 +884,7 @@
               <w:noProof/>
             </w:rPr>
           </w:pPr>
-          <w:hyperlink w:anchor="_Toc242303059" w:history="1">
+          <w:hyperlink w:anchor="_Toc242303692" w:history="1">
             <w:r>
               <w:rPr>
                 <w:rStyle w:val="Lienhypertexte"/>
@@ -908,7 +908,7 @@
               <w:rPr>
                 <w:noProof/>
               </w:rPr>
-              <w:instrText xml:space="preserve"> PAGEREF _Toc242303059 \h </w:instrText>
+              <w:instrText xml:space="preserve"> PAGEREF _Toc242303692 \h </w:instrText>
             </w:r>
             <w:r>
               <w:rPr>
@@ -945,7 +945,7 @@
               <w:noProof/>
             </w:rPr>
           </w:pPr>
-          <w:hyperlink w:anchor="_Toc242303060" w:history="1">
+          <w:hyperlink w:anchor="_Toc242303693" w:history="1">
             <w:r>
               <w:rPr>
                 <w:rStyle w:val="Lienhypertexte"/>
@@ -969,7 +969,7 @@
               <w:rPr>
                 <w:noProof/>
               </w:rPr>
-              <w:instrText xml:space="preserve"> PAGEREF _Toc242303060 \h </w:instrText>
+              <w:instrText xml:space="preserve"> PAGEREF _Toc242303693 \h </w:instrText>
             </w:r>
             <w:r>
               <w:rPr>
@@ -1006,7 +1006,7 @@
               <w:noProof/>
             </w:rPr>
           </w:pPr>
-          <w:hyperlink w:anchor="_Toc242303061" w:history="1">
+          <w:hyperlink w:anchor="_Toc242303694" w:history="1">
             <w:r>
               <w:rPr>
                 <w:rStyle w:val="Lienhypertexte"/>
@@ -1030,7 +1030,7 @@
               <w:rPr>
                 <w:noProof/>
               </w:rPr>
-              <w:instrText xml:space="preserve"> PAGEREF _Toc242303061 \h </w:instrText>
+              <w:instrText xml:space="preserve"> PAGEREF _Toc242303694 \h </w:instrText>
             </w:r>
             <w:r>
               <w:rPr>
@@ -1067,7 +1067,7 @@
               <w:noProof/>
             </w:rPr>
           </w:pPr>
-          <w:hyperlink w:anchor="_Toc242303062" w:history="1">
+          <w:hyperlink w:anchor="_Toc242303695" w:history="1">
             <w:r>
               <w:rPr>
                 <w:rStyle w:val="Lienhypertexte"/>
@@ -1091,7 +1091,7 @@
               <w:rPr>
                 <w:noProof/>
               </w:rPr>
-              <w:instrText xml:space="preserve"> PAGEREF _Toc242303062 \h </w:instrText>
+              <w:instrText xml:space="preserve"> PAGEREF _Toc242303695 \h </w:instrText>
             </w:r>
             <w:r>
               <w:rPr>
@@ -1128,7 +1128,7 @@
               <w:noProof/>
             </w:rPr>
           </w:pPr>
-          <w:hyperlink w:anchor="_Toc242303063" w:history="1">
+          <w:hyperlink w:anchor="_Toc242303696" w:history="1">
             <w:r>
               <w:rPr>
                 <w:rStyle w:val="Lienhypertexte"/>
@@ -1152,7 +1152,7 @@
               <w:rPr>
                 <w:noProof/>
               </w:rPr>
-              <w:instrText xml:space="preserve"> PAGEREF _Toc242303063 \h </w:instrText>
+              <w:instrText xml:space="preserve"> PAGEREF _Toc242303696 \h </w:instrText>
             </w:r>
             <w:r>
               <w:rPr>
@@ -1189,7 +1189,7 @@
               <w:noProof/>
             </w:rPr>
           </w:pPr>
-          <w:hyperlink w:anchor="_Toc242303064" w:history="1">
+          <w:hyperlink w:anchor="_Toc242303697" w:history="1">
             <w:r>
               <w:rPr>
                 <w:rStyle w:val="Lienhypertexte"/>
@@ -1213,7 +1213,7 @@
               <w:rPr>
                 <w:noProof/>
               </w:rPr>
-              <w:instrText xml:space="preserve"> PAGEREF _Toc242303064 \h </w:instrText>
+              <w:instrText xml:space="preserve"> PAGEREF _Toc242303697 \h </w:instrText>
             </w:r>
             <w:r>
               <w:rPr>
@@ -1250,7 +1250,7 @@
               <w:noProof/>
             </w:rPr>
           </w:pPr>
-          <w:hyperlink w:anchor="_Toc242303065" w:history="1">
+          <w:hyperlink w:anchor="_Toc242303698" w:history="1">
             <w:r>
               <w:rPr>
                 <w:rStyle w:val="Lienhypertexte"/>
@@ -1274,7 +1274,7 @@
               <w:rPr>
                 <w:noProof/>
               </w:rPr>
-              <w:instrText xml:space="preserve"> PAGEREF _Toc242303065 \h </w:instrText>
+              <w:instrText xml:space="preserve"> PAGEREF _Toc242303698 \h </w:instrText>
             </w:r>
             <w:r>
               <w:rPr>
@@ -1311,7 +1311,7 @@
               <w:noProof/>
             </w:rPr>
           </w:pPr>
-          <w:hyperlink w:anchor="_Toc242303066" w:history="1">
+          <w:hyperlink w:anchor="_Toc242303699" w:history="1">
             <w:r>
               <w:rPr>
                 <w:rStyle w:val="Lienhypertexte"/>
@@ -1335,7 +1335,7 @@
               <w:rPr>
                 <w:noProof/>
               </w:rPr>
-              <w:instrText xml:space="preserve"> PAGEREF _Toc242303066 \h </w:instrText>
+              <w:instrText xml:space="preserve"> PAGEREF _Toc242303699 \h </w:instrText>
             </w:r>
             <w:r>
               <w:rPr>
@@ -1372,7 +1372,7 @@
               <w:noProof/>
             </w:rPr>
           </w:pPr>
-          <w:hyperlink w:anchor="_Toc242303067" w:history="1">
+          <w:hyperlink w:anchor="_Toc242303700" w:history="1">
             <w:r>
               <w:rPr>
                 <w:rStyle w:val="Lienhypertexte"/>
@@ -1396,7 +1396,7 @@
               <w:rPr>
                 <w:noProof/>
               </w:rPr>
-              <w:instrText xml:space="preserve"> PAGEREF _Toc242303067 \h </w:instrText>
+              <w:instrText xml:space="preserve"> PAGEREF _Toc242303700 \h </w:instrText>
             </w:r>
             <w:r>
               <w:rPr>
@@ -1433,7 +1433,7 @@
               <w:noProof/>
             </w:rPr>
           </w:pPr>
-          <w:hyperlink w:anchor="_Toc242303068" w:history="1">
+          <w:hyperlink w:anchor="_Toc242303701" w:history="1">
             <w:r>
               <w:rPr>
                 <w:rStyle w:val="Lienhypertexte"/>
@@ -1457,7 +1457,7 @@
               <w:rPr>
                 <w:noProof/>
               </w:rPr>
-              <w:instrText xml:space="preserve"> PAGEREF _Toc242303068 \h </w:instrText>
+              <w:instrText xml:space="preserve"> PAGEREF _Toc242303701 \h </w:instrText>
             </w:r>
             <w:r>
               <w:rPr>
@@ -1494,7 +1494,7 @@
               <w:noProof/>
             </w:rPr>
           </w:pPr>
-          <w:hyperlink w:anchor="_Toc242303069" w:history="1">
+          <w:hyperlink w:anchor="_Toc242303702" w:history="1">
             <w:r>
               <w:rPr>
                 <w:rStyle w:val="Lienhypertexte"/>
@@ -1518,7 +1518,7 @@
               <w:rPr>
                 <w:noProof/>
               </w:rPr>
-              <w:instrText xml:space="preserve"> PAGEREF _Toc242303069 \h </w:instrText>
+              <w:instrText xml:space="preserve"> PAGEREF _Toc242303702 \h </w:instrText>
             </w:r>
             <w:r>
               <w:rPr>
@@ -1555,7 +1555,7 @@
               <w:noProof/>
             </w:rPr>
           </w:pPr>
-          <w:hyperlink w:anchor="_Toc242303070" w:history="1">
+          <w:hyperlink w:anchor="_Toc242303703" w:history="1">
             <w:r>
               <w:rPr>
                 <w:rStyle w:val="Lienhypertexte"/>
@@ -1579,7 +1579,7 @@
               <w:rPr>
                 <w:noProof/>
               </w:rPr>
-              <w:instrText xml:space="preserve"> PAGEREF _Toc242303070 \h </w:instrText>
+              <w:instrText xml:space="preserve"> PAGEREF _Toc242303703 \h </w:instrText>
             </w:r>
             <w:r>
               <w:rPr>
@@ -1616,7 +1616,7 @@
               <w:noProof/>
             </w:rPr>
           </w:pPr>
-          <w:hyperlink w:anchor="_Toc242303071" w:history="1">
+          <w:hyperlink w:anchor="_Toc242303704" w:history="1">
             <w:r>
               <w:rPr>
                 <w:rStyle w:val="Lienhypertexte"/>
@@ -1640,7 +1640,7 @@
               <w:rPr>
                 <w:noProof/>
               </w:rPr>
-              <w:instrText xml:space="preserve"> PAGEREF _Toc242303071 \h </w:instrText>
+              <w:instrText xml:space="preserve"> PAGEREF _Toc242303704 \h </w:instrText>
             </w:r>
             <w:r>
               <w:rPr>
@@ -1677,7 +1677,7 @@
               <w:noProof/>
             </w:rPr>
           </w:pPr>
-          <w:hyperlink w:anchor="_Toc242303072" w:history="1">
+          <w:hyperlink w:anchor="_Toc242303705" w:history="1">
             <w:r>
               <w:rPr>
                 <w:rStyle w:val="Lienhypertexte"/>
@@ -1701,7 +1701,7 @@
               <w:rPr>
                 <w:noProof/>
               </w:rPr>
-              <w:instrText xml:space="preserve"> PAGEREF _Toc242303072 \h </w:instrText>
+              <w:instrText xml:space="preserve"> PAGEREF _Toc242303705 \h </w:instrText>
             </w:r>
             <w:r>
               <w:rPr>
@@ -1738,7 +1738,7 @@
               <w:noProof/>
             </w:rPr>
           </w:pPr>
-          <w:hyperlink w:anchor="_Toc242303073" w:history="1">
+          <w:hyperlink w:anchor="_Toc242303706" w:history="1">
             <w:r>
               <w:rPr>
                 <w:rStyle w:val="Lienhypertexte"/>
@@ -1762,7 +1762,7 @@
               <w:rPr>
                 <w:noProof/>
               </w:rPr>
-              <w:instrText xml:space="preserve"> PAGEREF _Toc242303073 \h </w:instrText>
+              <w:instrText xml:space="preserve"> PAGEREF _Toc242303706 \h </w:instrText>
             </w:r>
             <w:r>
               <w:rPr>
@@ -1799,7 +1799,7 @@
               <w:noProof/>
             </w:rPr>
           </w:pPr>
-          <w:hyperlink w:anchor="_Toc242303074" w:history="1">
+          <w:hyperlink w:anchor="_Toc242303707" w:history="1">
             <w:r>
               <w:rPr>
                 <w:rStyle w:val="Lienhypertexte"/>
@@ -1823,7 +1823,7 @@
               <w:rPr>
                 <w:noProof/>
               </w:rPr>
-              <w:instrText xml:space="preserve"> PAGEREF _Toc242303074 \h </w:instrText>
+              <w:instrText xml:space="preserve"> PAGEREF _Toc242303707 \h </w:instrText>
             </w:r>
             <w:r>
               <w:rPr>
@@ -1860,7 +1860,7 @@
               <w:noProof/>
             </w:rPr>
           </w:pPr>
-          <w:hyperlink w:anchor="_Toc242303075" w:history="1">
+          <w:hyperlink w:anchor="_Toc242303708" w:history="1">
             <w:r>
               <w:rPr>
                 <w:rStyle w:val="Lienhypertexte"/>
@@ -1884,7 +1884,7 @@
               <w:rPr>
                 <w:noProof/>
               </w:rPr>
-              <w:instrText xml:space="preserve"> PAGEREF _Toc242303075 \h </w:instrText>
+              <w:instrText xml:space="preserve"> PAGEREF _Toc242303708 \h </w:instrText>
             </w:r>
             <w:r>
               <w:rPr>
@@ -1921,7 +1921,7 @@
               <w:noProof/>
             </w:rPr>
           </w:pPr>
-          <w:hyperlink w:anchor="_Toc242303076" w:history="1">
+          <w:hyperlink w:anchor="_Toc242303709" w:history="1">
             <w:r>
               <w:rPr>
                 <w:rStyle w:val="Lienhypertexte"/>
@@ -1945,7 +1945,7 @@
               <w:rPr>
                 <w:noProof/>
               </w:rPr>
-              <w:instrText xml:space="preserve"> PAGEREF _Toc242303076 \h </w:instrText>
+              <w:instrText xml:space="preserve"> PAGEREF _Toc242303709 \h </w:instrText>
             </w:r>
             <w:r>
               <w:rPr>
@@ -1982,7 +1982,7 @@
               <w:noProof/>
             </w:rPr>
           </w:pPr>
-          <w:hyperlink w:anchor="_Toc242303077" w:history="1">
+          <w:hyperlink w:anchor="_Toc242303710" w:history="1">
             <w:r>
               <w:rPr>
                 <w:rStyle w:val="Lienhypertexte"/>
@@ -2006,7 +2006,7 @@
               <w:rPr>
                 <w:noProof/>
               </w:rPr>
-              <w:instrText xml:space="preserve"> PAGEREF _Toc242303077 \h </w:instrText>
+              <w:instrText xml:space="preserve"> PAGEREF _Toc242303710 \h </w:instrText>
             </w:r>
             <w:r>
               <w:rPr>
@@ -2043,7 +2043,7 @@
               <w:noProof/>
             </w:rPr>
           </w:pPr>
-          <w:hyperlink w:anchor="_Toc242303078" w:history="1">
+          <w:hyperlink w:anchor="_Toc242303711" w:history="1">
             <w:r>
               <w:rPr>
                 <w:rStyle w:val="Lienhypertexte"/>
@@ -2067,7 +2067,7 @@
               <w:rPr>
                 <w:noProof/>
               </w:rPr>
-              <w:instrText xml:space="preserve"> PAGEREF _Toc242303078 \h </w:instrText>
+              <w:instrText xml:space="preserve"> PAGEREF _Toc242303711 \h </w:instrText>
             </w:r>
             <w:r>
               <w:rPr>
@@ -2104,7 +2104,7 @@
               <w:noProof/>
             </w:rPr>
           </w:pPr>
-          <w:hyperlink w:anchor="_Toc242303079" w:history="1">
+          <w:hyperlink w:anchor="_Toc242303712" w:history="1">
             <w:r>
               <w:rPr>
                 <w:rStyle w:val="Lienhypertexte"/>
@@ -2128,7 +2128,7 @@
               <w:rPr>
                 <w:noProof/>
               </w:rPr>
-              <w:instrText xml:space="preserve"> PAGEREF _Toc242303079 \h </w:instrText>
+              <w:instrText xml:space="preserve"> PAGEREF _Toc242303712 \h </w:instrText>
             </w:r>
             <w:r>
               <w:rPr>
@@ -2165,7 +2165,7 @@
               <w:noProof/>
             </w:rPr>
           </w:pPr>
-          <w:hyperlink w:anchor="_Toc242303080" w:history="1">
+          <w:hyperlink w:anchor="_Toc242303713" w:history="1">
             <w:r>
               <w:rPr>
                 <w:rStyle w:val="Lienhypertexte"/>
@@ -2189,7 +2189,7 @@
               <w:rPr>
                 <w:noProof/>
               </w:rPr>
-              <w:instrText xml:space="preserve"> PAGEREF _Toc242303080 \h </w:instrText>
+              <w:instrText xml:space="preserve"> PAGEREF _Toc242303713 \h </w:instrText>
             </w:r>
             <w:r>
               <w:rPr>
@@ -2226,7 +2226,7 @@
               <w:noProof/>
             </w:rPr>
           </w:pPr>
-          <w:hyperlink w:anchor="_Toc242303081" w:history="1">
+          <w:hyperlink w:anchor="_Toc242303714" w:history="1">
             <w:r>
               <w:rPr>
                 <w:rStyle w:val="Lienhypertexte"/>
@@ -2250,7 +2250,7 @@
               <w:rPr>
                 <w:noProof/>
               </w:rPr>
-              <w:instrText xml:space="preserve"> PAGEREF _Toc242303081 \h </w:instrText>
+              <w:instrText xml:space="preserve"> PAGEREF _Toc242303714 \h </w:instrText>
             </w:r>
             <w:r>
               <w:rPr>
@@ -2287,7 +2287,7 @@
               <w:noProof/>
             </w:rPr>
           </w:pPr>
-          <w:hyperlink w:anchor="_Toc242303082" w:history="1">
+          <w:hyperlink w:anchor="_Toc242303715" w:history="1">
             <w:r>
               <w:rPr>
                 <w:rStyle w:val="Lienhypertexte"/>
@@ -2311,7 +2311,7 @@
               <w:rPr>
                 <w:noProof/>
               </w:rPr>
-              <w:instrText xml:space="preserve"> PAGEREF _Toc242303082 \h </w:instrText>
+              <w:instrText xml:space="preserve"> PAGEREF _Toc242303715 \h </w:instrText>
             </w:r>
             <w:r>
               <w:rPr>
@@ -2348,7 +2348,7 @@
               <w:noProof/>
             </w:rPr>
           </w:pPr>
-          <w:hyperlink w:anchor="_Toc242303083" w:history="1">
+          <w:hyperlink w:anchor="_Toc242303716" w:history="1">
             <w:r>
               <w:rPr>
                 <w:rStyle w:val="Lienhypertexte"/>
@@ -2372,7 +2372,7 @@
               <w:rPr>
                 <w:noProof/>
               </w:rPr>
-              <w:instrText xml:space="preserve"> PAGEREF _Toc242303083 \h </w:instrText>
+              <w:instrText xml:space="preserve"> PAGEREF _Toc242303716 \h </w:instrText>
             </w:r>
             <w:r>
               <w:rPr>
@@ -2409,7 +2409,7 @@
               <w:noProof/>
             </w:rPr>
           </w:pPr>
-          <w:hyperlink w:anchor="_Toc242303084" w:history="1">
+          <w:hyperlink w:anchor="_Toc242303717" w:history="1">
             <w:r>
               <w:rPr>
                 <w:rStyle w:val="Lienhypertexte"/>
@@ -2433,7 +2433,7 @@
               <w:rPr>
                 <w:noProof/>
               </w:rPr>
-              <w:instrText xml:space="preserve"> PAGEREF _Toc242303084 \h </w:instrText>
+              <w:instrText xml:space="preserve"> PAGEREF _Toc242303717 \h </w:instrText>
             </w:r>
             <w:r>
               <w:rPr>
@@ -2470,7 +2470,7 @@
               <w:noProof/>
             </w:rPr>
           </w:pPr>
-          <w:hyperlink w:anchor="_Toc242303085" w:history="1">
+          <w:hyperlink w:anchor="_Toc242303718" w:history="1">
             <w:r>
               <w:rPr>
                 <w:rStyle w:val="Lienhypertexte"/>
@@ -2494,7 +2494,7 @@
               <w:rPr>
                 <w:noProof/>
               </w:rPr>
-              <w:instrText xml:space="preserve"> PAGEREF _Toc242303085 \h </w:instrText>
+              <w:instrText xml:space="preserve"> PAGEREF _Toc242303718 \h </w:instrText>
             </w:r>
             <w:r>
               <w:rPr>
@@ -2531,7 +2531,7 @@
               <w:noProof/>
             </w:rPr>
           </w:pPr>
-          <w:hyperlink w:anchor="_Toc242303086" w:history="1">
+          <w:hyperlink w:anchor="_Toc242303719" w:history="1">
             <w:r>
               <w:rPr>
                 <w:rStyle w:val="Lienhypertexte"/>
@@ -2555,7 +2555,7 @@
               <w:rPr>
                 <w:noProof/>
               </w:rPr>
-              <w:instrText xml:space="preserve"> PAGEREF _Toc242303086 \h </w:instrText>
+              <w:instrText xml:space="preserve"> PAGEREF _Toc242303719 \h </w:instrText>
             </w:r>
             <w:r>
               <w:rPr>
@@ -2592,7 +2592,7 @@
               <w:noProof/>
             </w:rPr>
           </w:pPr>
-          <w:hyperlink w:anchor="_Toc242303087" w:history="1">
+          <w:hyperlink w:anchor="_Toc242303720" w:history="1">
             <w:r>
               <w:rPr>
                 <w:rStyle w:val="Lienhypertexte"/>
@@ -2616,7 +2616,7 @@
               <w:rPr>
                 <w:noProof/>
               </w:rPr>
-              <w:instrText xml:space="preserve"> PAGEREF _Toc242303087 \h </w:instrText>
+              <w:instrText xml:space="preserve"> PAGEREF _Toc242303720 \h </w:instrText>
             </w:r>
             <w:r>
               <w:rPr>
@@ -2653,7 +2653,7 @@
               <w:noProof/>
             </w:rPr>
           </w:pPr>
-          <w:hyperlink w:anchor="_Toc242303088" w:history="1">
+          <w:hyperlink w:anchor="_Toc242303721" w:history="1">
             <w:r>
               <w:rPr>
                 <w:rStyle w:val="Lienhypertexte"/>
@@ -2677,7 +2677,7 @@
               <w:rPr>
                 <w:noProof/>
               </w:rPr>
-              <w:instrText xml:space="preserve"> PAGEREF _Toc242303088 \h </w:instrText>
+              <w:instrText xml:space="preserve"> PAGEREF _Toc242303721 \h </w:instrText>
             </w:r>
             <w:r>
               <w:rPr>
@@ -2714,7 +2714,7 @@
               <w:noProof/>
             </w:rPr>
           </w:pPr>
-          <w:hyperlink w:anchor="_Toc242303089" w:history="1">
+          <w:hyperlink w:anchor="_Toc242303722" w:history="1">
             <w:r>
               <w:rPr>
                 <w:rStyle w:val="Lienhypertexte"/>
@@ -2738,7 +2738,7 @@
               <w:rPr>
                 <w:noProof/>
               </w:rPr>
-              <w:instrText xml:space="preserve"> PAGEREF _Toc242303089 \h </w:instrText>
+              <w:instrText xml:space="preserve"> PAGEREF _Toc242303722 \h </w:instrText>
             </w:r>
             <w:r>
               <w:rPr>
@@ -2775,7 +2775,7 @@
               <w:noProof/>
             </w:rPr>
           </w:pPr>
-          <w:hyperlink w:anchor="_Toc242303090" w:history="1">
+          <w:hyperlink w:anchor="_Toc242303723" w:history="1">
             <w:r>
               <w:rPr>
                 <w:rStyle w:val="Lienhypertexte"/>
@@ -2799,7 +2799,7 @@
               <w:rPr>
                 <w:noProof/>
               </w:rPr>
-              <w:instrText xml:space="preserve"> PAGEREF _Toc242303090 \h </w:instrText>
+              <w:instrText xml:space="preserve"> PAGEREF _Toc242303723 \h </w:instrText>
             </w:r>
             <w:r>
               <w:rPr>
@@ -2836,7 +2836,7 @@
               <w:noProof/>
             </w:rPr>
           </w:pPr>
-          <w:hyperlink w:anchor="_Toc242303091" w:history="1">
+          <w:hyperlink w:anchor="_Toc242303724" w:history="1">
             <w:r>
               <w:rPr>
                 <w:rStyle w:val="Lienhypertexte"/>
@@ -2860,7 +2860,7 @@
               <w:rPr>
                 <w:noProof/>
               </w:rPr>
-              <w:instrText xml:space="preserve"> PAGEREF _Toc242303091 \h </w:instrText>
+              <w:instrText xml:space="preserve"> PAGEREF _Toc242303724 \h </w:instrText>
             </w:r>
             <w:r>
               <w:rPr>
@@ -2897,7 +2897,7 @@
               <w:noProof/>
             </w:rPr>
           </w:pPr>
-          <w:hyperlink w:anchor="_Toc242303092" w:history="1">
+          <w:hyperlink w:anchor="_Toc242303725" w:history="1">
             <w:r>
               <w:rPr>
                 <w:rStyle w:val="Lienhypertexte"/>
@@ -2921,7 +2921,7 @@
               <w:rPr>
                 <w:noProof/>
               </w:rPr>
-              <w:instrText xml:space="preserve"> PAGEREF _Toc242303092 \h </w:instrText>
+              <w:instrText xml:space="preserve"> PAGEREF _Toc242303725 \h </w:instrText>
             </w:r>
             <w:r>
               <w:rPr>
@@ -2958,7 +2958,7 @@
               <w:noProof/>
             </w:rPr>
           </w:pPr>
-          <w:hyperlink w:anchor="_Toc242303093" w:history="1">
+          <w:hyperlink w:anchor="_Toc242303726" w:history="1">
             <w:r>
               <w:rPr>
                 <w:rStyle w:val="Lienhypertexte"/>
@@ -2982,7 +2982,7 @@
               <w:rPr>
                 <w:noProof/>
               </w:rPr>
-              <w:instrText xml:space="preserve"> PAGEREF _Toc242303093 \h </w:instrText>
+              <w:instrText xml:space="preserve"> PAGEREF _Toc242303726 \h </w:instrText>
             </w:r>
             <w:r>
               <w:rPr>
@@ -3019,7 +3019,7 @@
               <w:noProof/>
             </w:rPr>
           </w:pPr>
-          <w:hyperlink w:anchor="_Toc242303094" w:history="1">
+          <w:hyperlink w:anchor="_Toc242303727" w:history="1">
             <w:r>
               <w:rPr>
                 <w:rStyle w:val="Lienhypertexte"/>
@@ -3043,7 +3043,7 @@
               <w:rPr>
                 <w:noProof/>
               </w:rPr>
-              <w:instrText xml:space="preserve"> PAGEREF _Toc242303094 \h </w:instrText>
+              <w:instrText xml:space="preserve"> PAGEREF _Toc242303727 \h </w:instrText>
             </w:r>
             <w:r>
               <w:rPr>
@@ -3080,7 +3080,7 @@
               <w:noProof/>
             </w:rPr>
           </w:pPr>
-          <w:hyperlink w:anchor="_Toc242303095" w:history="1">
+          <w:hyperlink w:anchor="_Toc242303728" w:history="1">
             <w:r>
               <w:rPr>
                 <w:rStyle w:val="Lienhypertexte"/>
@@ -3104,7 +3104,7 @@
               <w:rPr>
                 <w:noProof/>
               </w:rPr>
-              <w:instrText xml:space="preserve"> PAGEREF _Toc242303095 \h </w:instrText>
+              <w:instrText xml:space="preserve"> PAGEREF _Toc242303728 \h </w:instrText>
             </w:r>
             <w:r>
               <w:rPr>
@@ -3141,7 +3141,7 @@
               <w:noProof/>
             </w:rPr>
           </w:pPr>
-          <w:hyperlink w:anchor="_Toc242303096" w:history="1">
+          <w:hyperlink w:anchor="_Toc242303729" w:history="1">
             <w:r>
               <w:rPr>
                 <w:rStyle w:val="Lienhypertexte"/>
@@ -3165,7 +3165,7 @@
               <w:rPr>
                 <w:noProof/>
               </w:rPr>
-              <w:instrText xml:space="preserve"> PAGEREF _Toc242303096 \h </w:instrText>
+              <w:instrText xml:space="preserve"> PAGEREF _Toc242303729 \h </w:instrText>
             </w:r>
             <w:r>
               <w:rPr>
@@ -3202,7 +3202,7 @@
               <w:noProof/>
             </w:rPr>
           </w:pPr>
-          <w:hyperlink w:anchor="_Toc242303097" w:history="1">
+          <w:hyperlink w:anchor="_Toc242303730" w:history="1">
             <w:r>
               <w:rPr>
                 <w:rStyle w:val="Lienhypertexte"/>
@@ -3226,7 +3226,7 @@
               <w:rPr>
                 <w:noProof/>
               </w:rPr>
-              <w:instrText xml:space="preserve"> PAGEREF _Toc242303097 \h </w:instrText>
+              <w:instrText xml:space="preserve"> PAGEREF _Toc242303730 \h </w:instrText>
             </w:r>
             <w:r>
               <w:rPr>
@@ -3263,7 +3263,7 @@
               <w:noProof/>
             </w:rPr>
           </w:pPr>
-          <w:hyperlink w:anchor="_Toc242303098" w:history="1">
+          <w:hyperlink w:anchor="_Toc242303731" w:history="1">
             <w:r>
               <w:rPr>
                 <w:rStyle w:val="Lienhypertexte"/>
@@ -3287,7 +3287,7 @@
               <w:rPr>
                 <w:noProof/>
               </w:rPr>
-              <w:instrText xml:space="preserve"> PAGEREF _Toc242303098 \h </w:instrText>
+              <w:instrText xml:space="preserve"> PAGEREF _Toc242303731 \h </w:instrText>
             </w:r>
             <w:r>
               <w:rPr>
@@ -3324,7 +3324,7 @@
               <w:noProof/>
             </w:rPr>
           </w:pPr>
-          <w:hyperlink w:anchor="_Toc242303099" w:history="1">
+          <w:hyperlink w:anchor="_Toc242303732" w:history="1">
             <w:r>
               <w:rPr>
                 <w:rStyle w:val="Lienhypertexte"/>
@@ -3348,7 +3348,7 @@
               <w:rPr>
                 <w:noProof/>
               </w:rPr>
-              <w:instrText xml:space="preserve"> PAGEREF _Toc242303099 \h </w:instrText>
+              <w:instrText xml:space="preserve"> PAGEREF _Toc242303732 \h </w:instrText>
             </w:r>
             <w:r>
               <w:rPr>
@@ -3385,7 +3385,7 @@
               <w:noProof/>
             </w:rPr>
           </w:pPr>
-          <w:hyperlink w:anchor="_Toc242303100" w:history="1">
+          <w:hyperlink w:anchor="_Toc242303733" w:history="1">
             <w:r>
               <w:rPr>
                 <w:rStyle w:val="Lienhypertexte"/>
@@ -3409,7 +3409,7 @@
               <w:rPr>
                 <w:noProof/>
               </w:rPr>
-              <w:instrText xml:space="preserve"> PAGEREF _Toc242303100 \h </w:instrText>
+              <w:instrText xml:space="preserve"> PAGEREF _Toc242303733 \h </w:instrText>
             </w:r>
             <w:r>
               <w:rPr>
@@ -3446,7 +3446,7 @@
               <w:noProof/>
             </w:rPr>
           </w:pPr>
-          <w:hyperlink w:anchor="_Toc242303101" w:history="1">
+          <w:hyperlink w:anchor="_Toc242303734" w:history="1">
             <w:r>
               <w:rPr>
                 <w:rStyle w:val="Lienhypertexte"/>
@@ -3470,7 +3470,7 @@
               <w:rPr>
                 <w:noProof/>
               </w:rPr>
-              <w:instrText xml:space="preserve"> PAGEREF _Toc242303101 \h </w:instrText>
+              <w:instrText xml:space="preserve"> PAGEREF _Toc242303734 \h </w:instrText>
             </w:r>
             <w:r>
               <w:rPr>
@@ -3507,7 +3507,7 @@
               <w:noProof/>
             </w:rPr>
           </w:pPr>
-          <w:hyperlink w:anchor="_Toc242303102" w:history="1">
+          <w:hyperlink w:anchor="_Toc242303735" w:history="1">
             <w:r>
               <w:rPr>
                 <w:rStyle w:val="Lienhypertexte"/>
@@ -3531,7 +3531,7 @@
               <w:rPr>
                 <w:noProof/>
               </w:rPr>
-              <w:instrText xml:space="preserve"> PAGEREF _Toc242303102 \h </w:instrText>
+              <w:instrText xml:space="preserve"> PAGEREF _Toc242303735 \h </w:instrText>
             </w:r>
             <w:r>
               <w:rPr>
@@ -3568,7 +3568,7 @@
               <w:noProof/>
             </w:rPr>
           </w:pPr>
-          <w:hyperlink w:anchor="_Toc242303103" w:history="1">
+          <w:hyperlink w:anchor="_Toc242303736" w:history="1">
             <w:r>
               <w:rPr>
                 <w:rStyle w:val="Lienhypertexte"/>
@@ -3592,7 +3592,7 @@
               <w:rPr>
                 <w:noProof/>
               </w:rPr>
-              <w:instrText xml:space="preserve"> PAGEREF _Toc242303103 \h </w:instrText>
+              <w:instrText xml:space="preserve"> PAGEREF _Toc242303736 \h </w:instrText>
             </w:r>
             <w:r>
               <w:rPr>
@@ -3629,7 +3629,7 @@
               <w:noProof/>
             </w:rPr>
           </w:pPr>
-          <w:hyperlink w:anchor="_Toc242303104" w:history="1">
+          <w:hyperlink w:anchor="_Toc242303737" w:history="1">
             <w:r>
               <w:rPr>
                 <w:rStyle w:val="Lienhypertexte"/>
@@ -3653,7 +3653,7 @@
               <w:rPr>
                 <w:noProof/>
               </w:rPr>
-              <w:instrText xml:space="preserve"> PAGEREF _Toc242303104 \h </w:instrText>
+              <w:instrText xml:space="preserve"> PAGEREF _Toc242303737 \h </w:instrText>
             </w:r>
             <w:r>
               <w:rPr>
@@ -3690,7 +3690,7 @@
               <w:noProof/>
             </w:rPr>
           </w:pPr>
-          <w:hyperlink w:anchor="_Toc242303105" w:history="1">
+          <w:hyperlink w:anchor="_Toc242303738" w:history="1">
             <w:r>
               <w:rPr>
                 <w:rStyle w:val="Lienhypertexte"/>
@@ -3714,7 +3714,7 @@
               <w:rPr>
                 <w:noProof/>
               </w:rPr>
-              <w:instrText xml:space="preserve"> PAGEREF _Toc242303105 \h </w:instrText>
+              <w:instrText xml:space="preserve"> PAGEREF _Toc242303738 \h </w:instrText>
             </w:r>
             <w:r>
               <w:rPr>
@@ -3751,7 +3751,7 @@
               <w:noProof/>
             </w:rPr>
           </w:pPr>
-          <w:hyperlink w:anchor="_Toc242303106" w:history="1">
+          <w:hyperlink w:anchor="_Toc242303739" w:history="1">
             <w:r>
               <w:rPr>
                 <w:rStyle w:val="Lienhypertexte"/>
@@ -3775,7 +3775,7 @@
               <w:rPr>
                 <w:noProof/>
               </w:rPr>
-              <w:instrText xml:space="preserve"> PAGEREF _Toc242303106 \h </w:instrText>
+              <w:instrText xml:space="preserve"> PAGEREF _Toc242303739 \h </w:instrText>
             </w:r>
             <w:r>
               <w:rPr>
@@ -3812,7 +3812,7 @@
               <w:noProof/>
             </w:rPr>
           </w:pPr>
-          <w:hyperlink w:anchor="_Toc242303107" w:history="1">
+          <w:hyperlink w:anchor="_Toc242303740" w:history="1">
             <w:r>
               <w:rPr>
                 <w:rStyle w:val="Lienhypertexte"/>
@@ -3836,7 +3836,7 @@
               <w:rPr>
                 <w:noProof/>
               </w:rPr>
-              <w:instrText xml:space="preserve"> PAGEREF _Toc242303107 \h </w:instrText>
+              <w:instrText xml:space="preserve"> PAGEREF _Toc242303740 \h </w:instrText>
             </w:r>
             <w:r>
               <w:rPr>
@@ -3873,7 +3873,7 @@
               <w:noProof/>
             </w:rPr>
           </w:pPr>
-          <w:hyperlink w:anchor="_Toc242303108" w:history="1">
+          <w:hyperlink w:anchor="_Toc242303741" w:history="1">
             <w:r>
               <w:rPr>
                 <w:rStyle w:val="Lienhypertexte"/>
@@ -3897,7 +3897,7 @@
               <w:rPr>
                 <w:noProof/>
               </w:rPr>
-              <w:instrText xml:space="preserve"> PAGEREF _Toc242303108 \h </w:instrText>
+              <w:instrText xml:space="preserve"> PAGEREF _Toc242303741 \h </w:instrText>
             </w:r>
             <w:r>
               <w:rPr>
@@ -3934,7 +3934,7 @@
               <w:noProof/>
             </w:rPr>
           </w:pPr>
-          <w:hyperlink w:anchor="_Toc242303109" w:history="1">
+          <w:hyperlink w:anchor="_Toc242303742" w:history="1">
             <w:r>
               <w:rPr>
                 <w:rStyle w:val="Lienhypertexte"/>
@@ -3958,7 +3958,7 @@
               <w:rPr>
                 <w:noProof/>
               </w:rPr>
-              <w:instrText xml:space="preserve"> PAGEREF _Toc242303109 \h </w:instrText>
+              <w:instrText xml:space="preserve"> PAGEREF _Toc242303742 \h </w:instrText>
             </w:r>
             <w:r>
               <w:rPr>
@@ -3995,7 +3995,7 @@
               <w:noProof/>
             </w:rPr>
           </w:pPr>
-          <w:hyperlink w:anchor="_Toc242303110" w:history="1">
+          <w:hyperlink w:anchor="_Toc242303743" w:history="1">
             <w:r>
               <w:rPr>
                 <w:rStyle w:val="Lienhypertexte"/>
@@ -4019,7 +4019,7 @@
               <w:rPr>
                 <w:noProof/>
               </w:rPr>
-              <w:instrText xml:space="preserve"> PAGEREF _Toc242303110 \h </w:instrText>
+              <w:instrText xml:space="preserve"> PAGEREF _Toc242303743 \h </w:instrText>
             </w:r>
             <w:r>
               <w:rPr>
@@ -4056,7 +4056,7 @@
               <w:noProof/>
             </w:rPr>
           </w:pPr>
-          <w:hyperlink w:anchor="_Toc242303111" w:history="1">
+          <w:hyperlink w:anchor="_Toc242303744" w:history="1">
             <w:r>
               <w:rPr>
                 <w:rStyle w:val="Lienhypertexte"/>
@@ -4080,7 +4080,7 @@
               <w:rPr>
                 <w:noProof/>
               </w:rPr>
-              <w:instrText xml:space="preserve"> PAGEREF _Toc242303111 \h </w:instrText>
+              <w:instrText xml:space="preserve"> PAGEREF _Toc242303744 \h </w:instrText>
             </w:r>
             <w:r>
               <w:rPr>
@@ -4117,7 +4117,7 @@
               <w:noProof/>
             </w:rPr>
           </w:pPr>
-          <w:hyperlink w:anchor="_Toc242303112" w:history="1">
+          <w:hyperlink w:anchor="_Toc242303745" w:history="1">
             <w:r>
               <w:rPr>
                 <w:rStyle w:val="Lienhypertexte"/>
@@ -4141,7 +4141,7 @@
               <w:rPr>
                 <w:noProof/>
               </w:rPr>
-              <w:instrText xml:space="preserve"> PAGEREF _Toc242303112 \h </w:instrText>
+              <w:instrText xml:space="preserve"> PAGEREF _Toc242303745 \h </w:instrText>
             </w:r>
             <w:r>
               <w:rPr>
@@ -4178,7 +4178,7 @@
               <w:noProof/>
             </w:rPr>
           </w:pPr>
-          <w:hyperlink w:anchor="_Toc242303113" w:history="1">
+          <w:hyperlink w:anchor="_Toc242303746" w:history="1">
             <w:r>
               <w:rPr>
                 <w:rStyle w:val="Lienhypertexte"/>
@@ -4202,7 +4202,7 @@
               <w:rPr>
                 <w:noProof/>
               </w:rPr>
-              <w:instrText xml:space="preserve"> PAGEREF _Toc242303113 \h </w:instrText>
+              <w:instrText xml:space="preserve"> PAGEREF _Toc242303746 \h </w:instrText>
             </w:r>
             <w:r>
               <w:rPr>
@@ -4239,7 +4239,7 @@
               <w:noProof/>
             </w:rPr>
           </w:pPr>
-          <w:hyperlink w:anchor="_Toc242303114" w:history="1">
+          <w:hyperlink w:anchor="_Toc242303747" w:history="1">
             <w:r>
               <w:rPr>
                 <w:rStyle w:val="Lienhypertexte"/>
@@ -4263,7 +4263,7 @@
               <w:rPr>
                 <w:noProof/>
               </w:rPr>
-              <w:instrText xml:space="preserve"> PAGEREF _Toc242303114 \h </w:instrText>
+              <w:instrText xml:space="preserve"> PAGEREF _Toc242303747 \h </w:instrText>
             </w:r>
             <w:r>
               <w:rPr>
@@ -4300,7 +4300,7 @@
               <w:noProof/>
             </w:rPr>
           </w:pPr>
-          <w:hyperlink w:anchor="_Toc242303115" w:history="1">
+          <w:hyperlink w:anchor="_Toc242303748" w:history="1">
             <w:r>
               <w:rPr>
                 <w:rStyle w:val="Lienhypertexte"/>
@@ -4324,7 +4324,7 @@
               <w:rPr>
                 <w:noProof/>
               </w:rPr>
-              <w:instrText xml:space="preserve"> PAGEREF _Toc242303115 \h </w:instrText>
+              <w:instrText xml:space="preserve"> PAGEREF _Toc242303748 \h </w:instrText>
             </w:r>
             <w:r>
               <w:rPr>
@@ -4361,7 +4361,7 @@
               <w:noProof/>
             </w:rPr>
           </w:pPr>
-          <w:hyperlink w:anchor="_Toc242303116" w:history="1">
+          <w:hyperlink w:anchor="_Toc242303749" w:history="1">
             <w:r>
               <w:rPr>
                 <w:rStyle w:val="Lienhypertexte"/>
@@ -4385,7 +4385,7 @@
               <w:rPr>
                 <w:noProof/>
               </w:rPr>
-              <w:instrText xml:space="preserve"> PAGEREF _Toc242303116 \h </w:instrText>
+              <w:instrText xml:space="preserve"> PAGEREF _Toc242303749 \h </w:instrText>
             </w:r>
             <w:r>
               <w:rPr>
@@ -4422,7 +4422,7 @@
               <w:noProof/>
             </w:rPr>
           </w:pPr>
-          <w:hyperlink w:anchor="_Toc242303117" w:history="1">
+          <w:hyperlink w:anchor="_Toc242303750" w:history="1">
             <w:r>
               <w:rPr>
                 <w:rStyle w:val="Lienhypertexte"/>
@@ -4446,7 +4446,7 @@
               <w:rPr>
                 <w:noProof/>
               </w:rPr>
-              <w:instrText xml:space="preserve"> PAGEREF _Toc242303117 \h </w:instrText>
+              <w:instrText xml:space="preserve"> PAGEREF _Toc242303750 \h </w:instrText>
             </w:r>
             <w:r>
               <w:rPr>
@@ -4483,7 +4483,7 @@
               <w:noProof/>
             </w:rPr>
           </w:pPr>
-          <w:hyperlink w:anchor="_Toc242303118" w:history="1">
+          <w:hyperlink w:anchor="_Toc242303751" w:history="1">
             <w:r>
               <w:rPr>
                 <w:rStyle w:val="Lienhypertexte"/>
@@ -4507,7 +4507,7 @@
               <w:rPr>
                 <w:noProof/>
               </w:rPr>
-              <w:instrText xml:space="preserve"> PAGEREF _Toc242303118 \h </w:instrText>
+              <w:instrText xml:space="preserve"> PAGEREF _Toc242303751 \h </w:instrText>
             </w:r>
             <w:r>
               <w:rPr>
@@ -4544,7 +4544,7 @@
               <w:noProof/>
             </w:rPr>
           </w:pPr>
-          <w:hyperlink w:anchor="_Toc242303119" w:history="1">
+          <w:hyperlink w:anchor="_Toc242303752" w:history="1">
             <w:r>
               <w:rPr>
                 <w:rStyle w:val="Lienhypertexte"/>
@@ -4568,7 +4568,7 @@
               <w:rPr>
                 <w:noProof/>
               </w:rPr>
-              <w:instrText xml:space="preserve"> PAGEREF _Toc242303119 \h </w:instrText>
+              <w:instrText xml:space="preserve"> PAGEREF _Toc242303752 \h </w:instrText>
             </w:r>
             <w:r>
               <w:rPr>
@@ -4605,7 +4605,7 @@
               <w:noProof/>
             </w:rPr>
           </w:pPr>
-          <w:hyperlink w:anchor="_Toc242303120" w:history="1">
+          <w:hyperlink w:anchor="_Toc242303753" w:history="1">
             <w:r>
               <w:rPr>
                 <w:rStyle w:val="Lienhypertexte"/>
@@ -4629,7 +4629,7 @@
               <w:rPr>
                 <w:noProof/>
               </w:rPr>
-              <w:instrText xml:space="preserve"> PAGEREF _Toc242303120 \h </w:instrText>
+              <w:instrText xml:space="preserve"> PAGEREF _Toc242303753 \h </w:instrText>
             </w:r>
             <w:r>
               <w:rPr>
@@ -4666,7 +4666,7 @@
               <w:noProof/>
             </w:rPr>
           </w:pPr>
-          <w:hyperlink w:anchor="_Toc242303121" w:history="1">
+          <w:hyperlink w:anchor="_Toc242303754" w:history="1">
             <w:r>
               <w:rPr>
                 <w:rStyle w:val="Lienhypertexte"/>
@@ -4690,7 +4690,7 @@
               <w:rPr>
                 <w:noProof/>
               </w:rPr>
-              <w:instrText xml:space="preserve"> PAGEREF _Toc242303121 \h </w:instrText>
+              <w:instrText xml:space="preserve"> PAGEREF _Toc242303754 \h </w:instrText>
             </w:r>
             <w:r>
               <w:rPr>
@@ -4727,7 +4727,7 @@
               <w:noProof/>
             </w:rPr>
           </w:pPr>
-          <w:hyperlink w:anchor="_Toc242303122" w:history="1">
+          <w:hyperlink w:anchor="_Toc242303755" w:history="1">
             <w:r>
               <w:rPr>
                 <w:rStyle w:val="Lienhypertexte"/>
@@ -4751,7 +4751,7 @@
               <w:rPr>
                 <w:noProof/>
               </w:rPr>
-              <w:instrText xml:space="preserve"> PAGEREF _Toc242303122 \h </w:instrText>
+              <w:instrText xml:space="preserve"> PAGEREF _Toc242303755 \h </w:instrText>
             </w:r>
             <w:r>
               <w:rPr>
@@ -4788,7 +4788,7 @@
               <w:noProof/>
             </w:rPr>
           </w:pPr>
-          <w:hyperlink w:anchor="_Toc242303123" w:history="1">
+          <w:hyperlink w:anchor="_Toc242303756" w:history="1">
             <w:r>
               <w:rPr>
                 <w:rStyle w:val="Lienhypertexte"/>
@@ -4812,7 +4812,7 @@
               <w:rPr>
                 <w:noProof/>
               </w:rPr>
-              <w:instrText xml:space="preserve"> PAGEREF _Toc242303123 \h </w:instrText>
+              <w:instrText xml:space="preserve"> PAGEREF _Toc242303756 \h </w:instrText>
             </w:r>
             <w:r>
               <w:rPr>
@@ -4864,7 +4864,7 @@
         <w:pStyle w:val="Titre1"/>
         <w:pageBreakBefore/>
       </w:pPr>
-      <w:bookmarkStart w:id="0" w:name="_Toc242303048"/>
+      <w:bookmarkStart w:id="0" w:name="_Toc242303681"/>
       <w:r>
         <w:lastRenderedPageBreak/>
         <w:t>1. Comment utiliser ce manuel</w:t>
@@ -4876,7 +4876,7 @@
         <w:pStyle w:val="Titre2"/>
         <w:keepNext/>
       </w:pPr>
-      <w:bookmarkStart w:id="1" w:name="_Toc242303049"/>
+      <w:bookmarkStart w:id="1" w:name="_Toc242303682"/>
       <w:r>
         <w:t>1.1 À qui s'adresse-t-il ?</w:t>
       </w:r>
@@ -4923,7 +4923,7 @@
         <w:pStyle w:val="Titre2"/>
         <w:keepNext/>
       </w:pPr>
-      <w:bookmarkStart w:id="2" w:name="_Toc242303050"/>
+      <w:bookmarkStart w:id="2" w:name="_Toc242303683"/>
       <w:r>
         <w:t>1.2 Les profils</w:t>
       </w:r>
@@ -5921,7 +5921,7 @@
         <w:pStyle w:val="Titre2"/>
         <w:keepNext/>
       </w:pPr>
-      <w:bookmarkStart w:id="3" w:name="_Toc242303051"/>
+      <w:bookmarkStart w:id="3" w:name="_Toc242303684"/>
       <w:r>
         <w:t>1.3 Les comptes de formation</w:t>
       </w:r>
@@ -6909,7 +6909,7 @@
         <w:pStyle w:val="Titre2"/>
         <w:keepNext/>
       </w:pPr>
-      <w:bookmarkStart w:id="4" w:name="_Toc242303052"/>
+      <w:bookmarkStart w:id="4" w:name="_Toc242303685"/>
       <w:r>
         <w:t>1.4 Les encadrés</w:t>
       </w:r>
@@ -7118,7 +7118,7 @@
         <w:pStyle w:val="Titre1"/>
         <w:pageBreakBefore/>
       </w:pPr>
-      <w:bookmarkStart w:id="5" w:name="_Toc242303053"/>
+      <w:bookmarkStart w:id="5" w:name="_Toc242303686"/>
       <w:r>
         <w:lastRenderedPageBreak/>
         <w:t>2. Présentation de la plateforme</w:t>
@@ -7130,7 +7130,7 @@
         <w:pStyle w:val="Titre2"/>
         <w:keepNext/>
       </w:pPr>
-      <w:bookmarkStart w:id="6" w:name="_Toc242303054"/>
+      <w:bookmarkStart w:id="6" w:name="_Toc242303687"/>
       <w:r>
         <w:t>2.1 Deux espaces</w:t>
       </w:r>
@@ -7189,7 +7189,7 @@
         <w:pStyle w:val="Titre2"/>
         <w:keepNext/>
       </w:pPr>
-      <w:bookmarkStart w:id="7" w:name="_Toc242303055"/>
+      <w:bookmarkStart w:id="7" w:name="_Toc242303688"/>
       <w:r>
         <w:t>2.2 Le circuit de traitement d'un dossier</w:t>
       </w:r>
@@ -8383,7 +8383,7 @@
         <w:pStyle w:val="Titre2"/>
         <w:keepNext/>
       </w:pPr>
-      <w:bookmarkStart w:id="8" w:name="_Toc242303056"/>
+      <w:bookmarkStart w:id="8" w:name="_Toc242303689"/>
       <w:r>
         <w:t>2.3 Les règles à connaître</w:t>
       </w:r>
@@ -8703,7 +8703,7 @@
         <w:pStyle w:val="Titre1"/>
         <w:pageBreakBefore/>
       </w:pPr>
-      <w:bookmarkStart w:id="9" w:name="_Toc242303057"/>
+      <w:bookmarkStart w:id="9" w:name="_Toc242303690"/>
       <w:r>
         <w:lastRenderedPageBreak/>
         <w:t>3. Se connecter et se repérer</w:t>
@@ -8715,7 +8715,7 @@
         <w:pStyle w:val="Titre2"/>
         <w:keepNext/>
       </w:pPr>
-      <w:bookmarkStart w:id="10" w:name="_Toc242303058"/>
+      <w:bookmarkStart w:id="10" w:name="_Toc242303691"/>
       <w:r>
         <w:t>3.1 La connexion</w:t>
       </w:r>
@@ -8740,7 +8740,7 @@
           <w:noProof/>
         </w:rPr>
         <w:drawing>
-          <wp:inline distT="0" distB="0" distL="0" distR="0" wp14:anchorId="4C1D3EF6" wp14:editId="19052E86">
+          <wp:inline distT="0" distB="0" distL="0" distR="0" wp14:anchorId="7F886EB7" wp14:editId="300C5EF0">
             <wp:extent cx="4953000" cy="2886075"/>
             <wp:effectExtent l="0" t="0" r="0" b="0"/>
             <wp:docPr id="1" name="con-01-page-connexion" descr="La page de connexion (l'aspect peut varier légèrement selon l'installation)" title="La page de connexion (l'aspect peut varier légèrement selon l'installation)"/>
@@ -8945,7 +8945,7 @@
         <w:pStyle w:val="Titre2"/>
         <w:keepNext/>
       </w:pPr>
-      <w:bookmarkStart w:id="11" w:name="_Toc242303059"/>
+      <w:bookmarkStart w:id="11" w:name="_Toc242303692"/>
       <w:r>
         <w:lastRenderedPageBreak/>
         <w:t>3.2 L'écran de travail</w:t>
@@ -8963,7 +8963,7 @@
           <w:noProof/>
         </w:rPr>
         <w:drawing>
-          <wp:inline distT="0" distB="0" distL="0" distR="0" wp14:anchorId="76D68545" wp14:editId="1EC3A9EB">
+          <wp:inline distT="0" distB="0" distL="0" distR="0" wp14:anchorId="65A2EBC9" wp14:editId="363C6C9D">
             <wp:extent cx="5810250" cy="3467100"/>
             <wp:effectExtent l="0" t="0" r="0" b="0"/>
             <wp:docPr id="2" name="adm-01-tableau-de-bord" descr="Le tableau de bord de l'administrateur" title="Le tableau de bord de l'administrateur"/>
@@ -9103,7 +9103,7 @@
         <w:pStyle w:val="Titre2"/>
         <w:keepNext/>
       </w:pPr>
-      <w:bookmarkStart w:id="12" w:name="_Toc242303060"/>
+      <w:bookmarkStart w:id="12" w:name="_Toc242303693"/>
       <w:r>
         <w:t>3.3 Le tableau de bord</w:t>
       </w:r>
@@ -9251,7 +9251,7 @@
         <w:pStyle w:val="Titre2"/>
         <w:keepNext/>
       </w:pPr>
-      <w:bookmarkStart w:id="13" w:name="_Toc242303061"/>
+      <w:bookmarkStart w:id="13" w:name="_Toc242303694"/>
       <w:r>
         <w:t>3.4 Votre profil, vos notifications, la déconnexion</w:t>
       </w:r>
@@ -9322,7 +9322,7 @@
         <w:pStyle w:val="Titre1"/>
         <w:pageBreakBefore/>
       </w:pPr>
-      <w:bookmarkStart w:id="14" w:name="_Toc242303062"/>
+      <w:bookmarkStart w:id="14" w:name="_Toc242303695"/>
       <w:r>
         <w:lastRenderedPageBreak/>
         <w:t>4. Profil citoyen : le portail public</w:t>
@@ -9342,7 +9342,7 @@
         <w:pStyle w:val="Titre2"/>
         <w:keepNext/>
       </w:pPr>
-      <w:bookmarkStart w:id="15" w:name="_Toc242303063"/>
+      <w:bookmarkStart w:id="15" w:name="_Toc242303696"/>
       <w:r>
         <w:t>4.1 L'accueil</w:t>
       </w:r>
@@ -9359,7 +9359,7 @@
           <w:noProof/>
         </w:rPr>
         <w:drawing>
-          <wp:inline distT="0" distB="0" distL="0" distR="0" wp14:anchorId="535A6DF8" wp14:editId="4F399584">
+          <wp:inline distT="0" distB="0" distL="0" distR="0" wp14:anchorId="471FA0C5" wp14:editId="23678853">
             <wp:extent cx="5334000" cy="3333750"/>
             <wp:effectExtent l="0" t="0" r="0" b="0"/>
             <wp:docPr id="3" name="por-01-accueil-haut" descr="L'accueil du portail" title="L'accueil du portail"/>
@@ -9539,7 +9539,7 @@
         </w:rPr>
         <w:lastRenderedPageBreak/>
         <w:drawing>
-          <wp:inline distT="0" distB="0" distL="0" distR="0" wp14:anchorId="6F29BB4C" wp14:editId="2F03445A">
+          <wp:inline distT="0" distB="0" distL="0" distR="0" wp14:anchorId="55E59B10" wp14:editId="647A9684">
             <wp:extent cx="5334000" cy="2628900"/>
             <wp:effectExtent l="0" t="0" r="0" b="0"/>
             <wp:docPr id="4" name="por-02-accueil-chiffres" descr="La section « En chiffres » de l'accueil" title="La section « En chiffres » de l'accueil"/>
@@ -9633,7 +9633,7 @@
           <w:noProof/>
         </w:rPr>
         <w:drawing>
-          <wp:inline distT="0" distB="0" distL="0" distR="0" wp14:anchorId="2B620058" wp14:editId="69B40D07">
+          <wp:inline distT="0" distB="0" distL="0" distR="0" wp14:anchorId="4DED40C3" wp14:editId="21DA4784">
             <wp:extent cx="5334000" cy="2152650"/>
             <wp:effectExtent l="0" t="0" r="0" b="0"/>
             <wp:docPr id="5" name="por-03-accueil-avant-de-signaler" descr="Les repères « Avant de signaler »" title="Les repères « Avant de signaler »"/>
@@ -9693,7 +9693,7 @@
         <w:pStyle w:val="Titre2"/>
         <w:keepNext/>
       </w:pPr>
-      <w:bookmarkStart w:id="16" w:name="_Toc242303064"/>
+      <w:bookmarkStart w:id="16" w:name="_Toc242303697"/>
       <w:r>
         <w:t>4.2 Déposer un signalement écrit</w:t>
       </w:r>
@@ -9738,7 +9738,7 @@
           <w:noProof/>
         </w:rPr>
         <w:drawing>
-          <wp:inline distT="0" distB="0" distL="0" distR="0" wp14:anchorId="3B64B650" wp14:editId="21B2DCB4">
+          <wp:inline distT="0" distB="0" distL="0" distR="0" wp14:anchorId="4DF66227" wp14:editId="00204BC9">
             <wp:extent cx="4953000" cy="5419725"/>
             <wp:effectExtent l="0" t="0" r="0" b="0"/>
             <wp:docPr id="6" name="por-14-depot-etape1-rempli" descr="Étape 1 du dépôt : décrire les faits" title="Étape 1 du dépôt : décrire les faits"/>
@@ -10010,7 +10010,7 @@
           <w:noProof/>
         </w:rPr>
         <w:drawing>
-          <wp:inline distT="0" distB="0" distL="0" distR="0" wp14:anchorId="65C99D5C" wp14:editId="02A6C691">
+          <wp:inline distT="0" distB="0" distL="0" distR="0" wp14:anchorId="72081AC9" wp14:editId="3BF876C6">
             <wp:extent cx="4953000" cy="3867150"/>
             <wp:effectExtent l="0" t="0" r="0" b="0"/>
             <wp:docPr id="7" name="por-15-depot-etape2-identite" descr="Étape 2 du dépôt : choisir de s'identifier ou non" title="Étape 2 du dépôt : choisir de s'identifier ou non"/>
@@ -10210,7 +10210,7 @@
           <w:noProof/>
         </w:rPr>
         <w:drawing>
-          <wp:inline distT="0" distB="0" distL="0" distR="0" wp14:anchorId="531C4A9E" wp14:editId="7F67741A">
+          <wp:inline distT="0" distB="0" distL="0" distR="0" wp14:anchorId="45F1656B" wp14:editId="58CC8B64">
             <wp:extent cx="4953000" cy="3019425"/>
             <wp:effectExtent l="0" t="0" r="0" b="0"/>
             <wp:docPr id="8" name="por-17-depot-etape3-confirmation" descr="Étape 3 du dépôt : relire et soumettre" title="Étape 3 du dépôt : relire et soumettre"/>
@@ -10303,7 +10303,7 @@
           <w:noProof/>
         </w:rPr>
         <w:drawing>
-          <wp:inline distT="0" distB="0" distL="0" distR="0" wp14:anchorId="3EDDFF15" wp14:editId="658FA95C">
+          <wp:inline distT="0" distB="0" distL="0" distR="0" wp14:anchorId="3A0C6D25" wp14:editId="09C3FAEA">
             <wp:extent cx="4953000" cy="3095625"/>
             <wp:effectExtent l="0" t="0" r="0" b="0"/>
             <wp:docPr id="9" name="por-18-depot-code-suivi" descr="Le code de suivi remis à la fin du dépôt" title="Le code de suivi remis à la fin du dépôt"/>
@@ -10439,7 +10439,7 @@
         <w:pStyle w:val="Titre2"/>
         <w:keepNext/>
       </w:pPr>
-      <w:bookmarkStart w:id="17" w:name="_Toc242303065"/>
+      <w:bookmarkStart w:id="17" w:name="_Toc242303698"/>
       <w:r>
         <w:lastRenderedPageBreak/>
         <w:t>4.3 Le témoignage vocal</w:t>
@@ -10465,7 +10465,7 @@
           <w:noProof/>
         </w:rPr>
         <w:drawing>
-          <wp:inline distT="0" distB="0" distL="0" distR="0" wp14:anchorId="53611B5E" wp14:editId="4F63C308">
+          <wp:inline distT="0" distB="0" distL="0" distR="0" wp14:anchorId="3E7D87A6" wp14:editId="70C9BE53">
             <wp:extent cx="4953000" cy="3486150"/>
             <wp:effectExtent l="0" t="0" r="0" b="0"/>
             <wp:docPr id="10" name="por-21-vocal" descr="La page du témoignage vocal" title="La page du témoignage vocal"/>
@@ -10525,7 +10525,7 @@
         <w:pStyle w:val="Titre2"/>
         <w:keepNext/>
       </w:pPr>
-      <w:bookmarkStart w:id="18" w:name="_Toc242303066"/>
+      <w:bookmarkStart w:id="18" w:name="_Toc242303699"/>
       <w:r>
         <w:t>4.4 Suivre son dossier</w:t>
       </w:r>
@@ -10542,7 +10542,7 @@
           <w:noProof/>
         </w:rPr>
         <w:drawing>
-          <wp:inline distT="0" distB="0" distL="0" distR="0" wp14:anchorId="413DFA99" wp14:editId="01C3A09E">
+          <wp:inline distT="0" distB="0" distL="0" distR="0" wp14:anchorId="069759E3" wp14:editId="776003F2">
             <wp:extent cx="4572000" cy="2857500"/>
             <wp:effectExtent l="0" t="0" r="0" b="0"/>
             <wp:docPr id="11" name="por-19-suivi-recherche" descr="Le suivi par code" title="Le suivi par code"/>
@@ -10627,7 +10627,7 @@
         </w:rPr>
         <w:lastRenderedPageBreak/>
         <w:drawing>
-          <wp:inline distT="0" distB="0" distL="0" distR="0" wp14:anchorId="48F5897E" wp14:editId="0EA8742E">
+          <wp:inline distT="0" distB="0" distL="0" distR="0" wp14:anchorId="39845ABE" wp14:editId="259A005E">
             <wp:extent cx="4572000" cy="2505075"/>
             <wp:effectExtent l="0" t="0" r="0" b="0"/>
             <wp:docPr id="12" name="por-20-suivi-resultat" descr="Le suivi d'un dossier déposé" title="Le suivi d'un dossier déposé"/>
@@ -10763,7 +10763,7 @@
         <w:pStyle w:val="Titre2"/>
         <w:keepNext/>
       </w:pPr>
-      <w:bookmarkStart w:id="19" w:name="_Toc242303067"/>
+      <w:bookmarkStart w:id="19" w:name="_Toc242303700"/>
       <w:r>
         <w:t>4.5 La foire aux questions, les chiffres et les pages d'information</w:t>
       </w:r>
@@ -10780,7 +10780,7 @@
           <w:noProof/>
         </w:rPr>
         <w:drawing>
-          <wp:inline distT="0" distB="0" distL="0" distR="0" wp14:anchorId="6F7DC52D" wp14:editId="47023F97">
+          <wp:inline distT="0" distB="0" distL="0" distR="0" wp14:anchorId="200CEBB8" wp14:editId="2ABBB5F5">
             <wp:extent cx="4953000" cy="2943225"/>
             <wp:effectExtent l="0" t="0" r="0" b="0"/>
             <wp:docPr id="13" name="por-09-faq" descr="La foire aux questions" title="La foire aux questions"/>
@@ -10915,7 +10915,7 @@
         </w:rPr>
         <w:lastRenderedPageBreak/>
         <w:drawing>
-          <wp:inline distT="0" distB="0" distL="0" distR="0" wp14:anchorId="3C4E6197" wp14:editId="2602C09D">
+          <wp:inline distT="0" distB="0" distL="0" distR="0" wp14:anchorId="7E402FBF" wp14:editId="7F74B7FB">
             <wp:extent cx="5334000" cy="3505200"/>
             <wp:effectExtent l="0" t="0" r="0" b="0"/>
             <wp:docPr id="14" name="por-10-chiffres" descr="La page des chiffres publics" title="La page des chiffres publics"/>
@@ -10975,7 +10975,7 @@
         <w:pStyle w:val="Titre2"/>
         <w:keepNext/>
       </w:pPr>
-      <w:bookmarkStart w:id="20" w:name="_Toc242303068"/>
+      <w:bookmarkStart w:id="20" w:name="_Toc242303701"/>
       <w:r>
         <w:t>4.6 Ce que les agents doivent répondre au public</w:t>
       </w:r>
@@ -11206,7 +11206,7 @@
         <w:pStyle w:val="Titre1"/>
         <w:pageBreakBefore/>
       </w:pPr>
-      <w:bookmarkStart w:id="21" w:name="_Toc242303069"/>
+      <w:bookmarkStart w:id="21" w:name="_Toc242303702"/>
       <w:r>
         <w:lastRenderedPageBreak/>
         <w:t>5. Profil agent du BRPD</w:t>
@@ -11246,7 +11246,7 @@
         <w:pStyle w:val="Titre2"/>
         <w:keepNext/>
       </w:pPr>
-      <w:bookmarkStart w:id="22" w:name="_Toc242303070"/>
+      <w:bookmarkStart w:id="22" w:name="_Toc242303703"/>
       <w:r>
         <w:t>5.1 Vos dossiers</w:t>
       </w:r>
@@ -11263,7 +11263,7 @@
           <w:noProof/>
         </w:rPr>
         <w:drawing>
-          <wp:inline distT="0" distB="0" distL="0" distR="0" wp14:anchorId="52A409F2" wp14:editId="7A1E6A9E">
+          <wp:inline distT="0" distB="0" distL="0" distR="0" wp14:anchorId="3BC3134B" wp14:editId="45C7E881">
             <wp:extent cx="5810250" cy="3876675"/>
             <wp:effectExtent l="0" t="0" r="0" b="0"/>
             <wp:docPr id="15" name="brpd-02-liste-dossiers" descr="La liste des dossiers" title="La liste des dossiers"/>
@@ -11557,7 +11557,7 @@
         <w:pStyle w:val="Titre2"/>
         <w:keepNext/>
       </w:pPr>
-      <w:bookmarkStart w:id="23" w:name="_Toc242303071"/>
+      <w:bookmarkStart w:id="23" w:name="_Toc242303704"/>
       <w:r>
         <w:t>5.2 Saisir un dossier reçu par un autre canal</w:t>
       </w:r>
@@ -11593,7 +11593,7 @@
         </w:rPr>
         <w:lastRenderedPageBreak/>
         <w:drawing>
-          <wp:inline distT="0" distB="0" distL="0" distR="0" wp14:anchorId="7BED2A34" wp14:editId="54790201">
+          <wp:inline distT="0" distB="0" distL="0" distR="0" wp14:anchorId="212F88E9" wp14:editId="37A429A3">
             <wp:extent cx="5810250" cy="4505325"/>
             <wp:effectExtent l="0" t="0" r="0" b="0"/>
             <wp:docPr id="16" name="brpd-07-nouveau-dossier-vide" descr="Nouveau dossier : étape 1, le dossier" title="Nouveau dossier : étape 1, le dossier"/>
@@ -11822,7 +11822,7 @@
         </w:rPr>
         <w:lastRenderedPageBreak/>
         <w:drawing>
-          <wp:inline distT="0" distB="0" distL="0" distR="0" wp14:anchorId="414EB69B" wp14:editId="03C034C6">
+          <wp:inline distT="0" distB="0" distL="0" distR="0" wp14:anchorId="2FDE27A2" wp14:editId="78A34E63">
             <wp:extent cx="5810250" cy="4714875"/>
             <wp:effectExtent l="0" t="0" r="0" b="0"/>
             <wp:docPr id="17" name="brpd-09-nouveau-dossier-declarant" descr="Nouveau dossier : étape 2, le déclarant" title="Nouveau dossier : étape 2, le déclarant"/>
@@ -11976,7 +11976,7 @@
         <w:pStyle w:val="Titre2"/>
         <w:keepNext/>
       </w:pPr>
-      <w:bookmarkStart w:id="24" w:name="_Toc242303072"/>
+      <w:bookmarkStart w:id="24" w:name="_Toc242303705"/>
       <w:r>
         <w:t>5.3 Enregistrer un dépôt en ligne</w:t>
       </w:r>
@@ -12012,7 +12012,7 @@
         </w:rPr>
         <w:lastRenderedPageBreak/>
         <w:drawing>
-          <wp:inline distT="0" distB="0" distL="0" distR="0" wp14:anchorId="7FB548F2" wp14:editId="68BC74E1">
+          <wp:inline distT="0" distB="0" distL="0" distR="0" wp14:anchorId="2C031252" wp14:editId="0CE28C10">
             <wp:extent cx="5810250" cy="4505325"/>
             <wp:effectExtent l="0" t="0" r="0" b="0"/>
             <wp:docPr id="18" name="brpd-04-dossier-soumis" descr="La fiche d'un dossier « Soumis » : le bouton Enregistrer" title="La fiche d'un dossier « Soumis » : le bouton Enregistrer"/>
@@ -12191,7 +12191,7 @@
         </w:rPr>
         <w:lastRenderedPageBreak/>
         <w:drawing>
-          <wp:inline distT="0" distB="0" distL="0" distR="0" wp14:anchorId="20DCDD71" wp14:editId="5427FBA3">
+          <wp:inline distT="0" distB="0" distL="0" distR="0" wp14:anchorId="6A240519" wp14:editId="02E46E45">
             <wp:extent cx="5810250" cy="4505325"/>
             <wp:effectExtent l="0" t="0" r="0" b="0"/>
             <wp:docPr id="19" name="brpd-05-enregistrer-dialogue" descr="La fenêtre d'enregistrement" title="La fenêtre d'enregistrement"/>
@@ -12395,7 +12395,7 @@
         <w:pStyle w:val="Titre2"/>
         <w:keepNext/>
       </w:pPr>
-      <w:bookmarkStart w:id="25" w:name="_Toc242303073"/>
+      <w:bookmarkStart w:id="25" w:name="_Toc242303706"/>
       <w:r>
         <w:t>5.4 Lire la fiche d'un dossier</w:t>
       </w:r>
@@ -12421,7 +12421,7 @@
         </w:rPr>
         <w:lastRenderedPageBreak/>
         <w:drawing>
-          <wp:inline distT="0" distB="0" distL="0" distR="0" wp14:anchorId="1CED6FEA" wp14:editId="5BEB135C">
+          <wp:inline distT="0" distB="0" distL="0" distR="0" wp14:anchorId="10670CE9" wp14:editId="5C66F0D5">
             <wp:extent cx="5810250" cy="6591300"/>
             <wp:effectExtent l="0" t="0" r="0" b="0"/>
             <wp:docPr id="20" name="adm-23-dossier-recevable" descr="La fiche d'un dossier en investigation" title="La fiche d'un dossier en investigation"/>
@@ -12661,7 +12661,7 @@
         <w:pStyle w:val="Titre2"/>
         <w:keepNext/>
       </w:pPr>
-      <w:bookmarkStart w:id="26" w:name="_Toc242303074"/>
+      <w:bookmarkStart w:id="26" w:name="_Toc242303707"/>
       <w:r>
         <w:lastRenderedPageBreak/>
         <w:t>5.5 Compléments d'information</w:t>
@@ -12711,7 +12711,7 @@
         <w:pStyle w:val="Titre2"/>
         <w:keepNext/>
       </w:pPr>
-      <w:bookmarkStart w:id="27" w:name="_Toc242303075"/>
+      <w:bookmarkStart w:id="27" w:name="_Toc242303708"/>
       <w:r>
         <w:t>5.6 Dépôt audio</w:t>
       </w:r>
@@ -12746,7 +12746,7 @@
           <w:noProof/>
         </w:rPr>
         <w:drawing>
-          <wp:inline distT="0" distB="0" distL="0" distR="0" wp14:anchorId="6452A8D4" wp14:editId="5223C93F">
+          <wp:inline distT="0" distB="0" distL="0" distR="0" wp14:anchorId="7431EFF8" wp14:editId="3AD00012">
             <wp:extent cx="5810250" cy="4714875"/>
             <wp:effectExtent l="0" t="0" r="0" b="0"/>
             <wp:docPr id="21" name="brpd-10-depot-audio" descr="La page de dépôt audio" title="La page de dépôt audio"/>
@@ -12806,7 +12806,7 @@
         <w:pStyle w:val="Titre2"/>
         <w:keepNext/>
       </w:pPr>
-      <w:bookmarkStart w:id="28" w:name="_Toc242303076"/>
+      <w:bookmarkStart w:id="28" w:name="_Toc242303709"/>
       <w:r>
         <w:t>5.7 Informations préoccupantes</w:t>
       </w:r>
@@ -12852,7 +12852,7 @@
         </w:rPr>
         <w:lastRenderedPageBreak/>
         <w:drawing>
-          <wp:inline distT="0" distB="0" distL="0" distR="0" wp14:anchorId="41EC55DF" wp14:editId="22A719A4">
+          <wp:inline distT="0" distB="0" distL="0" distR="0" wp14:anchorId="589F797F" wp14:editId="7904D77F">
             <wp:extent cx="5810250" cy="2724150"/>
             <wp:effectExtent l="0" t="0" r="0" b="0"/>
             <wp:docPr id="22" name="brpd-11-infos-preoccupantes" descr="La liste des informations préoccupantes" title="La liste des informations préoccupantes"/>
@@ -13148,7 +13148,7 @@
         <w:pStyle w:val="Titre1"/>
         <w:pageBreakBefore/>
       </w:pPr>
-      <w:bookmarkStart w:id="29" w:name="_Toc242303077"/>
+      <w:bookmarkStart w:id="29" w:name="_Toc242303710"/>
       <w:r>
         <w:lastRenderedPageBreak/>
         <w:t>6. Profil conseiller juridique</w:t>
@@ -13178,7 +13178,7 @@
         <w:pStyle w:val="Titre2"/>
         <w:keepNext/>
       </w:pPr>
-      <w:bookmarkStart w:id="30" w:name="_Toc242303078"/>
+      <w:bookmarkStart w:id="30" w:name="_Toc242303711"/>
       <w:r>
         <w:t>6.1 Vos dossiers</w:t>
       </w:r>
@@ -13195,7 +13195,7 @@
           <w:noProof/>
         </w:rPr>
         <w:drawing>
-          <wp:inline distT="0" distB="0" distL="0" distR="0" wp14:anchorId="7F8F62F2" wp14:editId="3AD3CADC">
+          <wp:inline distT="0" distB="0" distL="0" distR="0" wp14:anchorId="49CC2596" wp14:editId="37CACE79">
             <wp:extent cx="5810250" cy="3667125"/>
             <wp:effectExtent l="0" t="0" r="0" b="0"/>
             <wp:docPr id="23" name="cj-02-liste-dossiers" descr="La liste des dossiers du conseiller juridique" title="La liste des dossiers du conseiller juridique"/>
@@ -13273,7 +13273,7 @@
         <w:pStyle w:val="Titre2"/>
         <w:keepNext/>
       </w:pPr>
-      <w:bookmarkStart w:id="31" w:name="_Toc242303079"/>
+      <w:bookmarkStart w:id="31" w:name="_Toc242303712"/>
       <w:r>
         <w:t>6.2 Démarrer l'étude</w:t>
       </w:r>
@@ -13329,7 +13329,7 @@
         </w:rPr>
         <w:lastRenderedPageBreak/>
         <w:drawing>
-          <wp:inline distT="0" distB="0" distL="0" distR="0" wp14:anchorId="6A1A37F4" wp14:editId="0AE18A46">
+          <wp:inline distT="0" distB="0" distL="0" distR="0" wp14:anchorId="7A5FCFC5" wp14:editId="48B2B446">
             <wp:extent cx="5810250" cy="5238750"/>
             <wp:effectExtent l="0" t="0" r="0" b="0"/>
             <wp:docPr id="24" name="cj-03-dossier-en-etude" descr="La fiche d'un dossier en étude" title="La fiche d'un dossier en étude"/>
@@ -13447,7 +13447,7 @@
         <w:pStyle w:val="Titre2"/>
         <w:keepNext/>
       </w:pPr>
-      <w:bookmarkStart w:id="32" w:name="_Toc242303080"/>
+      <w:bookmarkStart w:id="32" w:name="_Toc242303713"/>
       <w:r>
         <w:t>6.3 Les onglets de la fiche</w:t>
       </w:r>
@@ -13464,7 +13464,7 @@
           <w:noProof/>
         </w:rPr>
         <w:drawing>
-          <wp:inline distT="0" distB="0" distL="0" distR="0" wp14:anchorId="098251DC" wp14:editId="678B21C3">
+          <wp:inline distT="0" distB="0" distL="0" distR="0" wp14:anchorId="0ABAB714" wp14:editId="380E1EFB">
             <wp:extent cx="5334000" cy="1933575"/>
             <wp:effectExtent l="0" t="0" r="0" b="0"/>
             <wp:docPr id="25" name="cj-06-onglet-parties" descr="L'onglet « Parties visées »" title="L'onglet « Parties visées »"/>
@@ -13681,7 +13681,7 @@
           <w:noProof/>
         </w:rPr>
         <w:drawing>
-          <wp:inline distT="0" distB="0" distL="0" distR="0" wp14:anchorId="5F9B228F" wp14:editId="5D89B74B">
+          <wp:inline distT="0" distB="0" distL="0" distR="0" wp14:anchorId="10C75D2D" wp14:editId="4B4E4098">
             <wp:extent cx="5334000" cy="1638300"/>
             <wp:effectExtent l="0" t="0" r="0" b="0"/>
             <wp:docPr id="26" name="cj-08-onglet-observations" descr="L'onglet « Observations »" title="L'onglet « Observations »"/>
@@ -13747,7 +13747,7 @@
           <w:noProof/>
         </w:rPr>
         <w:drawing>
-          <wp:inline distT="0" distB="0" distL="0" distR="0" wp14:anchorId="07498EF1" wp14:editId="2BFD6D19">
+          <wp:inline distT="0" distB="0" distL="0" distR="0" wp14:anchorId="1410D85E" wp14:editId="65495D1F">
             <wp:extent cx="5334000" cy="3362325"/>
             <wp:effectExtent l="0" t="0" r="0" b="0"/>
             <wp:docPr id="27" name="cj-13-ajouter-observation" descr="Ajouter une observation" title="Ajouter une observation"/>
@@ -13807,7 +13807,7 @@
         <w:pStyle w:val="Titre2"/>
         <w:keepNext/>
       </w:pPr>
-      <w:bookmarkStart w:id="33" w:name="_Toc242303081"/>
+      <w:bookmarkStart w:id="33" w:name="_Toc242303714"/>
       <w:r>
         <w:t>6.4 L'étude d'opportunité</w:t>
       </w:r>
@@ -13853,7 +13853,7 @@
         </w:rPr>
         <w:lastRenderedPageBreak/>
         <w:drawing>
-          <wp:inline distT="0" distB="0" distL="0" distR="0" wp14:anchorId="344F1EBE" wp14:editId="5A5B1D83">
+          <wp:inline distT="0" distB="0" distL="0" distR="0" wp14:anchorId="4A865955" wp14:editId="1F1E0160">
             <wp:extent cx="4953000" cy="1800225"/>
             <wp:effectExtent l="0" t="0" r="0" b="0"/>
             <wp:docPr id="28" name="cj-11-onglet-analyse" descr="L'onglet « Analyse » avant la création de l'étude" title="L'onglet « Analyse » avant la création de l'étude"/>
@@ -13919,7 +13919,7 @@
           <w:noProof/>
         </w:rPr>
         <w:drawing>
-          <wp:inline distT="0" distB="0" distL="0" distR="0" wp14:anchorId="74881728" wp14:editId="23ED614E">
+          <wp:inline distT="0" distB="0" distL="0" distR="0" wp14:anchorId="5D277E24" wp14:editId="4F1F02BE">
             <wp:extent cx="5810250" cy="4505325"/>
             <wp:effectExtent l="0" t="0" r="0" b="0"/>
             <wp:docPr id="29" name="cj-12-etude-opportunite-dialogue" descr="La fiche d'analyse première" title="La fiche d'analyse première"/>
@@ -14271,7 +14271,7 @@
         <w:pStyle w:val="Titre2"/>
         <w:keepNext/>
       </w:pPr>
-      <w:bookmarkStart w:id="34" w:name="_Toc242303082"/>
+      <w:bookmarkStart w:id="34" w:name="_Toc242303715"/>
       <w:r>
         <w:t>6.5 Demander un complément d'information</w:t>
       </w:r>
@@ -14288,7 +14288,7 @@
           <w:noProof/>
         </w:rPr>
         <w:drawing>
-          <wp:inline distT="0" distB="0" distL="0" distR="0" wp14:anchorId="64BAA5E8" wp14:editId="677B9470">
+          <wp:inline distT="0" distB="0" distL="0" distR="0" wp14:anchorId="73B920CA" wp14:editId="202BE98F">
             <wp:extent cx="5810250" cy="4505325"/>
             <wp:effectExtent l="0" t="0" r="0" b="0"/>
             <wp:docPr id="30" name="cj-04-demander-complement" descr="La demande de complément au déclarant" title="La demande de complément au déclarant"/>
@@ -14417,7 +14417,7 @@
         <w:pStyle w:val="Titre2"/>
         <w:keepNext/>
       </w:pPr>
-      <w:bookmarkStart w:id="35" w:name="_Toc242303083"/>
+      <w:bookmarkStart w:id="35" w:name="_Toc242303716"/>
       <w:r>
         <w:lastRenderedPageBreak/>
         <w:t>6.6 Soumettre au comité (CTADP)</w:t>
@@ -14435,7 +14435,7 @@
           <w:noProof/>
         </w:rPr>
         <w:drawing>
-          <wp:inline distT="0" distB="0" distL="0" distR="0" wp14:anchorId="0AFA80C1" wp14:editId="472A2D73">
+          <wp:inline distT="0" distB="0" distL="0" distR="0" wp14:anchorId="4FABD64F" wp14:editId="0E4979DB">
             <wp:extent cx="5810250" cy="4505325"/>
             <wp:effectExtent l="0" t="0" r="0" b="0"/>
             <wp:docPr id="31" name="cj-05-soumettre-ctadp" descr="La soumission au comité" title="La soumission au comité"/>
@@ -14719,7 +14719,7 @@
         <w:pStyle w:val="Titre1"/>
         <w:pageBreakBefore/>
       </w:pPr>
-      <w:bookmarkStart w:id="36" w:name="_Toc242303084"/>
+      <w:bookmarkStart w:id="36" w:name="_Toc242303717"/>
       <w:r>
         <w:lastRenderedPageBreak/>
         <w:t>7. Profil CGEA</w:t>
@@ -14759,7 +14759,7 @@
         <w:pStyle w:val="Titre2"/>
         <w:keepNext/>
       </w:pPr>
-      <w:bookmarkStart w:id="37" w:name="_Toc242303085"/>
+      <w:bookmarkStart w:id="37" w:name="_Toc242303718"/>
       <w:r>
         <w:t>7.1 Votre tableau de bord</w:t>
       </w:r>
@@ -14776,7 +14776,7 @@
           <w:noProof/>
         </w:rPr>
         <w:drawing>
-          <wp:inline distT="0" distB="0" distL="0" distR="0" wp14:anchorId="381E7D9A" wp14:editId="04C55B36">
+          <wp:inline distT="0" distB="0" distL="0" distR="0" wp14:anchorId="33D48247" wp14:editId="7A96AEB6">
             <wp:extent cx="5810250" cy="4505325"/>
             <wp:effectExtent l="0" t="0" r="0" b="0"/>
             <wp:docPr id="32" name="cgea-01-tableau-de-bord" descr="Le tableau de bord du CGEA" title="Le tableau de bord du CGEA"/>
@@ -14854,7 +14854,7 @@
         <w:pStyle w:val="Titre2"/>
         <w:keepNext/>
       </w:pPr>
-      <w:bookmarkStart w:id="38" w:name="_Toc242303086"/>
+      <w:bookmarkStart w:id="38" w:name="_Toc242303719"/>
       <w:r>
         <w:t>7.2 Affecter un dossier</w:t>
       </w:r>
@@ -14890,7 +14890,7 @@
         </w:rPr>
         <w:lastRenderedPageBreak/>
         <w:drawing>
-          <wp:inline distT="0" distB="0" distL="0" distR="0" wp14:anchorId="2248C710" wp14:editId="5D097D3D">
+          <wp:inline distT="0" distB="0" distL="0" distR="0" wp14:anchorId="01B982EB" wp14:editId="44E01C28">
             <wp:extent cx="5334000" cy="2752725"/>
             <wp:effectExtent l="0" t="0" r="0" b="0"/>
             <wp:docPr id="33" name="cge-06-onglet-affectation" descr="L'onglet « Affectation » : décision du CGE puis affectation du CGEA" title="L'onglet « Affectation » : décision du CGE puis affectation du CGEA"/>
@@ -15117,7 +15117,7 @@
         <w:pStyle w:val="Titre2"/>
         <w:keepNext/>
       </w:pPr>
-      <w:bookmarkStart w:id="39" w:name="_Toc242303087"/>
+      <w:bookmarkStart w:id="39" w:name="_Toc242303720"/>
       <w:r>
         <w:t>7.3 Les séances du comité (CTADP)</w:t>
       </w:r>
@@ -15134,7 +15134,7 @@
           <w:noProof/>
         </w:rPr>
         <w:drawing>
-          <wp:inline distT="0" distB="0" distL="0" distR="0" wp14:anchorId="5016717D" wp14:editId="080CAA92">
+          <wp:inline distT="0" distB="0" distL="0" distR="0" wp14:anchorId="64A4F982" wp14:editId="2804CBF1">
             <wp:extent cx="5810250" cy="2200275"/>
             <wp:effectExtent l="0" t="0" r="0" b="0"/>
             <wp:docPr id="34" name="cgea-02-seances" descr="La liste des séances du comité" title="La liste des séances du comité"/>
@@ -15210,7 +15210,7 @@
           <w:noProof/>
         </w:rPr>
         <w:drawing>
-          <wp:inline distT="0" distB="0" distL="0" distR="0" wp14:anchorId="68F85491" wp14:editId="19D11AFD">
+          <wp:inline distT="0" distB="0" distL="0" distR="0" wp14:anchorId="5B109C9D" wp14:editId="2755187D">
             <wp:extent cx="5810250" cy="4505325"/>
             <wp:effectExtent l="0" t="0" r="0" b="0"/>
             <wp:docPr id="35" name="cgea-03-nouvelle-seance" descr="La création d'une séance" title="La création d'une séance"/>
@@ -15362,7 +15362,7 @@
           <w:noProof/>
         </w:rPr>
         <w:drawing>
-          <wp:inline distT="0" distB="0" distL="0" distR="0" wp14:anchorId="06052D5C" wp14:editId="0FA9E6E9">
+          <wp:inline distT="0" distB="0" distL="0" distR="0" wp14:anchorId="06994B01" wp14:editId="41DF25CD">
             <wp:extent cx="5810250" cy="3667125"/>
             <wp:effectExtent l="0" t="0" r="0" b="0"/>
             <wp:docPr id="36" name="cgea-04-seance-detail" descr="Le détail d'une séance" title="Le détail d'une séance"/>
@@ -15502,7 +15502,7 @@
         </w:rPr>
         <w:lastRenderedPageBreak/>
         <w:drawing>
-          <wp:inline distT="0" distB="0" distL="0" distR="0" wp14:anchorId="040C2CE0" wp14:editId="622231A3">
+          <wp:inline distT="0" distB="0" distL="0" distR="0" wp14:anchorId="28BA0B68" wp14:editId="045457C5">
             <wp:extent cx="5810250" cy="4505325"/>
             <wp:effectExtent l="0" t="0" r="0" b="0"/>
             <wp:docPr id="37" name="cgea-07-seance-ajouter-dossier" descr="Ajouter un dossier à la séance" title="Ajouter un dossier à la séance"/>
@@ -15578,7 +15578,7 @@
           <w:noProof/>
         </w:rPr>
         <w:drawing>
-          <wp:inline distT="0" distB="0" distL="0" distR="0" wp14:anchorId="54D7371F" wp14:editId="5F6A723B">
+          <wp:inline distT="0" distB="0" distL="0" distR="0" wp14:anchorId="32B7E2E1" wp14:editId="5387A20F">
             <wp:extent cx="5810250" cy="4505325"/>
             <wp:effectExtent l="0" t="0" r="0" b="0"/>
             <wp:docPr id="38" name="cgea-08-seance-tenir" descr="La fenêtre « Tenir la séance »" title="La fenêtre « Tenir la séance »"/>
@@ -15762,7 +15762,7 @@
         <w:pStyle w:val="Titre2"/>
         <w:keepNext/>
       </w:pPr>
-      <w:bookmarkStart w:id="40" w:name="_Toc242303088"/>
+      <w:bookmarkStart w:id="40" w:name="_Toc242303721"/>
       <w:r>
         <w:t>7.4 Ouvrir une enquête</w:t>
       </w:r>
@@ -15897,7 +15897,7 @@
         <w:pStyle w:val="Titre2"/>
         <w:keepNext/>
       </w:pPr>
-      <w:bookmarkStart w:id="41" w:name="_Toc242303089"/>
+      <w:bookmarkStart w:id="41" w:name="_Toc242303722"/>
       <w:r>
         <w:lastRenderedPageBreak/>
         <w:t>7.5 Transférer, clôturer</w:t>
@@ -15957,7 +15957,7 @@
         <w:pStyle w:val="Titre2"/>
         <w:keepNext/>
       </w:pPr>
-      <w:bookmarkStart w:id="42" w:name="_Toc242303090"/>
+      <w:bookmarkStart w:id="42" w:name="_Toc242303723"/>
       <w:r>
         <w:t>7.6 Surveiller les retards</w:t>
       </w:r>
@@ -15974,7 +15974,7 @@
           <w:noProof/>
         </w:rPr>
         <w:drawing>
-          <wp:inline distT="0" distB="0" distL="0" distR="0" wp14:anchorId="11AD36B3" wp14:editId="3D182EC5">
+          <wp:inline distT="0" distB="0" distL="0" distR="0" wp14:anchorId="15610EDD" wp14:editId="4783FFF6">
             <wp:extent cx="5810250" cy="4505325"/>
             <wp:effectExtent l="0" t="0" r="0" b="0"/>
             <wp:docPr id="39" name="adm-15-depassements" descr="Les dépassements par acteur" title="Les dépassements par acteur"/>
@@ -16318,7 +16318,7 @@
         <w:pStyle w:val="Titre1"/>
         <w:pageBreakBefore/>
       </w:pPr>
-      <w:bookmarkStart w:id="43" w:name="_Toc242303091"/>
+      <w:bookmarkStart w:id="43" w:name="_Toc242303724"/>
       <w:r>
         <w:lastRenderedPageBreak/>
         <w:t>8. Profil CGE</w:t>
@@ -16348,7 +16348,7 @@
         <w:pStyle w:val="Titre2"/>
         <w:keepNext/>
       </w:pPr>
-      <w:bookmarkStart w:id="44" w:name="_Toc242303092"/>
+      <w:bookmarkStart w:id="44" w:name="_Toc242303725"/>
       <w:r>
         <w:t>8.1 Votre tableau de bord</w:t>
       </w:r>
@@ -16365,7 +16365,7 @@
           <w:noProof/>
         </w:rPr>
         <w:drawing>
-          <wp:inline distT="0" distB="0" distL="0" distR="0" wp14:anchorId="63C708D1" wp14:editId="65AA1E2E">
+          <wp:inline distT="0" distB="0" distL="0" distR="0" wp14:anchorId="2DFF6BBE" wp14:editId="3AD516AA">
             <wp:extent cx="5810250" cy="4505325"/>
             <wp:effectExtent l="0" t="0" r="0" b="0"/>
             <wp:docPr id="40" name="cge-01-tableau-de-bord" descr="Le tableau de bord du CGE" title="Le tableau de bord du CGE"/>
@@ -16425,7 +16425,7 @@
         <w:pStyle w:val="Titre2"/>
         <w:keepNext/>
       </w:pPr>
-      <w:bookmarkStart w:id="45" w:name="_Toc242303093"/>
+      <w:bookmarkStart w:id="45" w:name="_Toc242303726"/>
       <w:r>
         <w:t>8.2 Déclarer un dossier recevable ou irrecevable</w:t>
       </w:r>
@@ -16461,7 +16461,7 @@
         </w:rPr>
         <w:lastRenderedPageBreak/>
         <w:drawing>
-          <wp:inline distT="0" distB="0" distL="0" distR="0" wp14:anchorId="4A54A5E6" wp14:editId="2C6D4491">
+          <wp:inline distT="0" distB="0" distL="0" distR="0" wp14:anchorId="1BD34BE8" wp14:editId="1413B616">
             <wp:extent cx="5810250" cy="2933700"/>
             <wp:effectExtent l="0" t="0" r="0" b="0"/>
             <wp:docPr id="41" name="cge-02-dossier-ctadp" descr="La fiche d'un dossier en revue CTADP" title="La fiche d'un dossier en revue CTADP"/>
@@ -16527,7 +16527,7 @@
           <w:noProof/>
         </w:rPr>
         <w:drawing>
-          <wp:inline distT="0" distB="0" distL="0" distR="0" wp14:anchorId="76EC4A9C" wp14:editId="61F73E01">
+          <wp:inline distT="0" distB="0" distL="0" distR="0" wp14:anchorId="533D2350" wp14:editId="6B808C2D">
             <wp:extent cx="5810250" cy="4505325"/>
             <wp:effectExtent l="0" t="0" r="0" b="0"/>
             <wp:docPr id="42" name="cge-03-declarer-recevable" descr="La décision « Déclarer recevable »" title="La décision « Déclarer recevable »"/>
@@ -16734,7 +16734,7 @@
         <w:pStyle w:val="Titre2"/>
         <w:keepNext/>
       </w:pPr>
-      <w:bookmarkStart w:id="46" w:name="_Toc242303094"/>
+      <w:bookmarkStart w:id="46" w:name="_Toc242303727"/>
       <w:r>
         <w:t>8.3 Fixer la priorité</w:t>
       </w:r>
@@ -16751,7 +16751,7 @@
           <w:noProof/>
         </w:rPr>
         <w:drawing>
-          <wp:inline distT="0" distB="0" distL="0" distR="0" wp14:anchorId="6512859A" wp14:editId="129C4B9A">
+          <wp:inline distT="0" distB="0" distL="0" distR="0" wp14:anchorId="3D8E8B91" wp14:editId="208CFED6">
             <wp:extent cx="5810250" cy="4505325"/>
             <wp:effectExtent l="0" t="0" r="0" b="0"/>
             <wp:docPr id="43" name="cge-04-priorite" descr="La fenêtre de priorité" title="La fenêtre de priorité"/>
@@ -16869,7 +16869,7 @@
         <w:pStyle w:val="Titre2"/>
         <w:keepNext/>
       </w:pPr>
-      <w:bookmarkStart w:id="47" w:name="_Toc242303095"/>
+      <w:bookmarkStart w:id="47" w:name="_Toc242303728"/>
       <w:r>
         <w:lastRenderedPageBreak/>
         <w:t>8.4 Protéger un dossier : la confidentialité</w:t>
@@ -16887,7 +16887,7 @@
           <w:noProof/>
         </w:rPr>
         <w:drawing>
-          <wp:inline distT="0" distB="0" distL="0" distR="0" wp14:anchorId="110D0094" wp14:editId="3ADBF8FF">
+          <wp:inline distT="0" distB="0" distL="0" distR="0" wp14:anchorId="5C192451" wp14:editId="4B9329B1">
             <wp:extent cx="5810250" cy="4505325"/>
             <wp:effectExtent l="0" t="0" r="0" b="0"/>
             <wp:docPr id="44" name="cge-05-confidentiel" descr="Marquer un dossier confidentiel" title="Marquer un dossier confidentiel"/>
@@ -16972,7 +16972,7 @@
         <w:pStyle w:val="Titre2"/>
         <w:keepNext/>
       </w:pPr>
-      <w:bookmarkStart w:id="48" w:name="_Toc242303096"/>
+      <w:bookmarkStart w:id="48" w:name="_Toc242303729"/>
       <w:r>
         <w:lastRenderedPageBreak/>
         <w:t>8.5 Les onglets d'analyse et d'affectation</w:t>
@@ -16990,7 +16990,7 @@
           <w:noProof/>
         </w:rPr>
         <w:drawing>
-          <wp:inline distT="0" distB="0" distL="0" distR="0" wp14:anchorId="23EC1033" wp14:editId="32364BE5">
+          <wp:inline distT="0" distB="0" distL="0" distR="0" wp14:anchorId="67B34536" wp14:editId="6373279E">
             <wp:extent cx="5334000" cy="5210175"/>
             <wp:effectExtent l="0" t="0" r="0" b="0"/>
             <wp:docPr id="45" name="cge-07-onglet-analyse" descr="L'onglet « Analyse » vu par le CGE" title="L'onglet « Analyse » vu par le CGE"/>
@@ -17078,7 +17078,7 @@
         <w:pStyle w:val="Titre2"/>
         <w:keepNext/>
       </w:pPr>
-      <w:bookmarkStart w:id="49" w:name="_Toc242303097"/>
+      <w:bookmarkStart w:id="49" w:name="_Toc242303730"/>
       <w:r>
         <w:t>8.6 Décision finale et quitus</w:t>
       </w:r>
@@ -17147,7 +17147,7 @@
         <w:pStyle w:val="Titre2"/>
         <w:keepNext/>
       </w:pPr>
-      <w:bookmarkStart w:id="50" w:name="_Toc242303098"/>
+      <w:bookmarkStart w:id="50" w:name="_Toc242303731"/>
       <w:r>
         <w:t>8.7 Gérer les agents</w:t>
       </w:r>
@@ -17442,7 +17442,7 @@
         <w:pStyle w:val="Titre1"/>
         <w:pageBreakBefore/>
       </w:pPr>
-      <w:bookmarkStart w:id="51" w:name="_Toc242303099"/>
+      <w:bookmarkStart w:id="51" w:name="_Toc242303732"/>
       <w:r>
         <w:lastRenderedPageBreak/>
         <w:t>9. Profil membre du comité (CTADP)</w:t>
@@ -17482,7 +17482,7 @@
         <w:pStyle w:val="Titre2"/>
         <w:keepNext/>
       </w:pPr>
-      <w:bookmarkStart w:id="52" w:name="_Toc242303100"/>
+      <w:bookmarkStart w:id="52" w:name="_Toc242303733"/>
       <w:r>
         <w:t>9.1 Votre espace</w:t>
       </w:r>
@@ -17499,7 +17499,7 @@
           <w:noProof/>
         </w:rPr>
         <w:drawing>
-          <wp:inline distT="0" distB="0" distL="0" distR="0" wp14:anchorId="680A6216" wp14:editId="7161D449">
+          <wp:inline distT="0" distB="0" distL="0" distR="0" wp14:anchorId="53C3D407" wp14:editId="1AAA0582">
             <wp:extent cx="5810250" cy="4505325"/>
             <wp:effectExtent l="0" t="0" r="0" b="0"/>
             <wp:docPr id="46" name="ctadp-01-tableau-de-bord" descr="Le tableau de bord du membre du comité" title="Le tableau de bord du membre du comité"/>
@@ -17577,7 +17577,7 @@
         <w:pStyle w:val="Titre2"/>
         <w:keepNext/>
       </w:pPr>
-      <w:bookmarkStart w:id="53" w:name="_Toc242303101"/>
+      <w:bookmarkStart w:id="53" w:name="_Toc242303734"/>
       <w:r>
         <w:lastRenderedPageBreak/>
         <w:t>9.2 Les séances</w:t>
@@ -17595,7 +17595,7 @@
           <w:noProof/>
         </w:rPr>
         <w:drawing>
-          <wp:inline distT="0" distB="0" distL="0" distR="0" wp14:anchorId="5119DCBE" wp14:editId="68365856">
+          <wp:inline distT="0" distB="0" distL="0" distR="0" wp14:anchorId="07A21476" wp14:editId="6FF7AA3D">
             <wp:extent cx="5810250" cy="2200275"/>
             <wp:effectExtent l="0" t="0" r="0" b="0"/>
             <wp:docPr id="47" name="ctadp-02-seances" descr="La liste des séances" title="La liste des séances"/>
@@ -17695,7 +17695,7 @@
           <w:noProof/>
         </w:rPr>
         <w:drawing>
-          <wp:inline distT="0" distB="0" distL="0" distR="0" wp14:anchorId="07E7C9FD" wp14:editId="623CB438">
+          <wp:inline distT="0" distB="0" distL="0" distR="0" wp14:anchorId="0B4AC8EB" wp14:editId="4F0AA26E">
             <wp:extent cx="5810250" cy="3667125"/>
             <wp:effectExtent l="0" t="0" r="0" b="0"/>
             <wp:docPr id="48" name="ctadp-03-seance-detail" descr="Le détail d'une séance" title="Le détail d'une séance"/>
@@ -17755,7 +17755,7 @@
         <w:pStyle w:val="Titre2"/>
         <w:keepNext/>
       </w:pPr>
-      <w:bookmarkStart w:id="54" w:name="_Toc242303102"/>
+      <w:bookmarkStart w:id="54" w:name="_Toc242303735"/>
       <w:r>
         <w:t>9.3 Ce que vous pouvez faire sur un dossier</w:t>
       </w:r>
@@ -18035,7 +18035,7 @@
         <w:pStyle w:val="Titre1"/>
         <w:pageBreakBefore/>
       </w:pPr>
-      <w:bookmarkStart w:id="55" w:name="_Toc242303103"/>
+      <w:bookmarkStart w:id="55" w:name="_Toc242303736"/>
       <w:r>
         <w:lastRenderedPageBreak/>
         <w:t>10. Profil contrôleur d'État (enquêteur)</w:t>
@@ -18065,7 +18065,7 @@
         <w:pStyle w:val="Titre2"/>
         <w:keepNext/>
       </w:pPr>
-      <w:bookmarkStart w:id="56" w:name="_Toc242303104"/>
+      <w:bookmarkStart w:id="56" w:name="_Toc242303737"/>
       <w:r>
         <w:t>10.1 Vos enquêtes</w:t>
       </w:r>
@@ -18082,7 +18082,7 @@
           <w:noProof/>
         </w:rPr>
         <w:drawing>
-          <wp:inline distT="0" distB="0" distL="0" distR="0" wp14:anchorId="4DDAA2DB" wp14:editId="57A69595">
+          <wp:inline distT="0" distB="0" distL="0" distR="0" wp14:anchorId="6606459A" wp14:editId="19A91783">
             <wp:extent cx="5810250" cy="2724150"/>
             <wp:effectExtent l="0" t="0" r="0" b="0"/>
             <wp:docPr id="49" name="ce-02-enquetes-liste" descr="La liste des enquêtes" title="La liste des enquêtes"/>
@@ -18281,7 +18281,7 @@
         <w:pStyle w:val="Titre2"/>
         <w:keepNext/>
       </w:pPr>
-      <w:bookmarkStart w:id="57" w:name="_Toc242303105"/>
+      <w:bookmarkStart w:id="57" w:name="_Toc242303738"/>
       <w:r>
         <w:t>10.2 Avant de commencer : l'engagement préalable</w:t>
       </w:r>
@@ -18320,7 +18320,7 @@
         <w:pStyle w:val="Titre2"/>
         <w:keepNext/>
       </w:pPr>
-      <w:bookmarkStart w:id="58" w:name="_Toc242303106"/>
+      <w:bookmarkStart w:id="58" w:name="_Toc242303739"/>
       <w:r>
         <w:lastRenderedPageBreak/>
         <w:t>10.3 La page d'une enquête</w:t>
@@ -18338,7 +18338,7 @@
           <w:noProof/>
         </w:rPr>
         <w:drawing>
-          <wp:inline distT="0" distB="0" distL="0" distR="0" wp14:anchorId="2CC54FCB" wp14:editId="2892F058">
+          <wp:inline distT="0" distB="0" distL="0" distR="0" wp14:anchorId="06F7CC05" wp14:editId="6B5A7D9B">
             <wp:extent cx="5076825" cy="6858000"/>
             <wp:effectExtent l="0" t="0" r="0" b="0"/>
             <wp:docPr id="50" name="ce-03-enquete-detail" descr="La page d'une enquête" title="La page d'une enquête"/>
@@ -18703,7 +18703,7 @@
         <w:pStyle w:val="Titre2"/>
         <w:keepNext/>
       </w:pPr>
-      <w:bookmarkStart w:id="59" w:name="_Toc242303107"/>
+      <w:bookmarkStart w:id="59" w:name="_Toc242303740"/>
       <w:r>
         <w:t>10.4 L'équipe d'enquête</w:t>
       </w:r>
@@ -18808,7 +18808,7 @@
         <w:pStyle w:val="Titre2"/>
         <w:keepNext/>
       </w:pPr>
-      <w:bookmarkStart w:id="60" w:name="_Toc242303108"/>
+      <w:bookmarkStart w:id="60" w:name="_Toc242303741"/>
       <w:r>
         <w:t>10.5 Suspendre, prolonger, rendre compte</w:t>
       </w:r>
@@ -18887,7 +18887,7 @@
         <w:pStyle w:val="Titre2"/>
         <w:keepNext/>
       </w:pPr>
-      <w:bookmarkStart w:id="61" w:name="_Toc242303109"/>
+      <w:bookmarkStart w:id="61" w:name="_Toc242303742"/>
       <w:r>
         <w:t>10.6 Les rapports et les leçons à partager</w:t>
       </w:r>
@@ -18942,7 +18942,7 @@
           <w:noProof/>
         </w:rPr>
         <w:drawing>
-          <wp:inline distT="0" distB="0" distL="0" distR="0" wp14:anchorId="281B3264" wp14:editId="3668F8AD">
+          <wp:inline distT="0" distB="0" distL="0" distR="0" wp14:anchorId="0991A071" wp14:editId="32C4CFB7">
             <wp:extent cx="5334000" cy="2019300"/>
             <wp:effectExtent l="0" t="0" r="0" b="0"/>
             <wp:docPr id="51" name="ce-08-lecons" descr="Les leçons à partager" title="Les leçons à partager"/>
@@ -19279,7 +19279,7 @@
         <w:pStyle w:val="Titre1"/>
         <w:pageBreakBefore/>
       </w:pPr>
-      <w:bookmarkStart w:id="62" w:name="_Toc242303110"/>
+      <w:bookmarkStart w:id="62" w:name="_Toc242303743"/>
       <w:r>
         <w:lastRenderedPageBreak/>
         <w:t>11. Profil DCP</w:t>
@@ -19325,7 +19325,7 @@
           <w:noProof/>
         </w:rPr>
         <w:drawing>
-          <wp:inline distT="0" distB="0" distL="0" distR="0" wp14:anchorId="7418D039" wp14:editId="76F91091">
+          <wp:inline distT="0" distB="0" distL="0" distR="0" wp14:anchorId="43616FF4" wp14:editId="0C10C0A1">
             <wp:extent cx="5810250" cy="3467100"/>
             <wp:effectExtent l="0" t="0" r="0" b="0"/>
             <wp:docPr id="52" name="dcp-01-accueil" descr="L'espace de la DCP : un menu réduit aux statistiques" title="L'espace de la DCP : un menu réduit aux statistiques"/>
@@ -19504,7 +19504,7 @@
         </w:rPr>
         <w:lastRenderedPageBreak/>
         <w:drawing>
-          <wp:inline distT="0" distB="0" distL="0" distR="0" wp14:anchorId="4BFD803D" wp14:editId="572D7DD9">
+          <wp:inline distT="0" distB="0" distL="0" distR="0" wp14:anchorId="79BAA3EC" wp14:editId="082F80DC">
             <wp:extent cx="4476750" cy="6858000"/>
             <wp:effectExtent l="0" t="0" r="0" b="0"/>
             <wp:docPr id="53" name="dcp-02-statistiques" descr="La page des statistiques" title="La page des statistiques"/>
@@ -19752,7 +19752,7 @@
         <w:pStyle w:val="Titre1"/>
         <w:pageBreakBefore/>
       </w:pPr>
-      <w:bookmarkStart w:id="63" w:name="_Toc242303111"/>
+      <w:bookmarkStart w:id="63" w:name="_Toc242303744"/>
       <w:r>
         <w:lastRenderedPageBreak/>
         <w:t>12. Profil administrateur DDIC</w:t>
@@ -19782,7 +19782,7 @@
         <w:pStyle w:val="Titre2"/>
         <w:keepNext/>
       </w:pPr>
-      <w:bookmarkStart w:id="64" w:name="_Toc242303112"/>
+      <w:bookmarkStart w:id="64" w:name="_Toc242303745"/>
       <w:r>
         <w:t>12.1 Gérer les agents</w:t>
       </w:r>
@@ -19799,7 +19799,7 @@
           <w:noProof/>
         </w:rPr>
         <w:drawing>
-          <wp:inline distT="0" distB="0" distL="0" distR="0" wp14:anchorId="0741D7EF" wp14:editId="0405A719">
+          <wp:inline distT="0" distB="0" distL="0" distR="0" wp14:anchorId="216F2F99" wp14:editId="4181B27C">
             <wp:extent cx="5810250" cy="4505325"/>
             <wp:effectExtent l="0" t="0" r="0" b="0"/>
             <wp:docPr id="54" name="adm-09-agents" descr="La gestion des agents" title="La gestion des agents"/>
@@ -19913,7 +19913,7 @@
           <w:noProof/>
         </w:rPr>
         <w:drawing>
-          <wp:inline distT="0" distB="0" distL="0" distR="0" wp14:anchorId="67E81131" wp14:editId="4CE87DF6">
+          <wp:inline distT="0" distB="0" distL="0" distR="0" wp14:anchorId="27A917D7" wp14:editId="1D044FF3">
             <wp:extent cx="5810250" cy="5238750"/>
             <wp:effectExtent l="0" t="0" r="0" b="0"/>
             <wp:docPr id="55" name="adm-10-agent-nouveau" descr="Créer un agent" title="Créer un agent"/>
@@ -20191,7 +20191,7 @@
         <w:pStyle w:val="Titre2"/>
         <w:keepNext/>
       </w:pPr>
-      <w:bookmarkStart w:id="65" w:name="_Toc242303113"/>
+      <w:bookmarkStart w:id="65" w:name="_Toc242303746"/>
       <w:r>
         <w:lastRenderedPageBreak/>
         <w:t>12.2 Rôles et permissions</w:t>
@@ -20209,7 +20209,7 @@
           <w:noProof/>
         </w:rPr>
         <w:drawing>
-          <wp:inline distT="0" distB="0" distL="0" distR="0" wp14:anchorId="0E351532" wp14:editId="257AD5F0">
+          <wp:inline distT="0" distB="0" distL="0" distR="0" wp14:anchorId="497BE3A2" wp14:editId="30D8AD32">
             <wp:extent cx="5810250" cy="4714875"/>
             <wp:effectExtent l="0" t="0" r="0" b="0"/>
             <wp:docPr id="56" name="adm-11-roles" descr="Les rôles et leurs permissions" title="Les rôles et leurs permissions"/>
@@ -20297,7 +20297,7 @@
         <w:pStyle w:val="Titre2"/>
         <w:keepNext/>
       </w:pPr>
-      <w:bookmarkStart w:id="66" w:name="_Toc242303114"/>
+      <w:bookmarkStart w:id="66" w:name="_Toc242303747"/>
       <w:r>
         <w:lastRenderedPageBreak/>
         <w:t>12.3 Le journal d'audit</w:t>
@@ -20315,7 +20315,7 @@
           <w:noProof/>
         </w:rPr>
         <w:drawing>
-          <wp:inline distT="0" distB="0" distL="0" distR="0" wp14:anchorId="746E298F" wp14:editId="413D36D4">
+          <wp:inline distT="0" distB="0" distL="0" distR="0" wp14:anchorId="03792DDC" wp14:editId="5AE10A77">
             <wp:extent cx="5810250" cy="5238750"/>
             <wp:effectExtent l="0" t="0" r="0" b="0"/>
             <wp:docPr id="57" name="adm-12-journal-audit" descr="Le journal d'audit" title="Le journal d'audit"/>
@@ -20489,7 +20489,7 @@
         <w:pStyle w:val="Titre2"/>
         <w:keepNext/>
       </w:pPr>
-      <w:bookmarkStart w:id="67" w:name="_Toc242303115"/>
+      <w:bookmarkStart w:id="67" w:name="_Toc242303748"/>
       <w:r>
         <w:lastRenderedPageBreak/>
         <w:t>12.4 Les paramètres du portail</w:t>
@@ -20507,7 +20507,7 @@
           <w:noProof/>
         </w:rPr>
         <w:drawing>
-          <wp:inline distT="0" distB="0" distL="0" distR="0" wp14:anchorId="646D41CC" wp14:editId="4E8226B2">
+          <wp:inline distT="0" distB="0" distL="0" distR="0" wp14:anchorId="065B6441" wp14:editId="7B21D01A">
             <wp:extent cx="5810250" cy="6543675"/>
             <wp:effectExtent l="0" t="0" r="0" b="0"/>
             <wp:docPr id="58" name="adm-13-parametres-portail" descr="Les paramètres du portail" title="Les paramètres du portail"/>
@@ -20780,7 +20780,7 @@
         <w:pStyle w:val="Titre2"/>
         <w:keepNext/>
       </w:pPr>
-      <w:bookmarkStart w:id="68" w:name="_Toc242303116"/>
+      <w:bookmarkStart w:id="68" w:name="_Toc242303749"/>
       <w:r>
         <w:t>12.5 Les paramètres métier</w:t>
       </w:r>
@@ -20797,7 +20797,7 @@
           <w:noProof/>
         </w:rPr>
         <w:drawing>
-          <wp:inline distT="0" distB="0" distL="0" distR="0" wp14:anchorId="7213509B" wp14:editId="6A083142">
+          <wp:inline distT="0" distB="0" distL="0" distR="0" wp14:anchorId="5B396204" wp14:editId="437214EF">
             <wp:extent cx="5810250" cy="5762625"/>
             <wp:effectExtent l="0" t="0" r="0" b="0"/>
             <wp:docPr id="59" name="adm-20-parametres-metier" descr="Les paramètres métier : les délais" title="Les paramètres métier : les délais"/>
@@ -21886,7 +21886,7 @@
         <w:pStyle w:val="Titre2"/>
         <w:keepNext/>
       </w:pPr>
-      <w:bookmarkStart w:id="69" w:name="_Toc242303117"/>
+      <w:bookmarkStart w:id="69" w:name="_Toc242303750"/>
       <w:r>
         <w:t>12.6 La file des notifications</w:t>
       </w:r>
@@ -21903,7 +21903,7 @@
           <w:noProof/>
         </w:rPr>
         <w:drawing>
-          <wp:inline distT="0" distB="0" distL="0" distR="0" wp14:anchorId="5756A0FE" wp14:editId="316B1F52">
+          <wp:inline distT="0" distB="0" distL="0" distR="0" wp14:anchorId="0A99FABB" wp14:editId="50348C9C">
             <wp:extent cx="5810250" cy="2933700"/>
             <wp:effectExtent l="0" t="0" r="0" b="0"/>
             <wp:docPr id="60" name="adm-21-file-notifications" descr="La file d'attente des notifications" title="La file d'attente des notifications"/>
@@ -22011,7 +22011,7 @@
         <w:pStyle w:val="Titre2"/>
         <w:keepNext/>
       </w:pPr>
-      <w:bookmarkStart w:id="70" w:name="_Toc242303118"/>
+      <w:bookmarkStart w:id="70" w:name="_Toc242303751"/>
       <w:r>
         <w:lastRenderedPageBreak/>
         <w:t>12.7 Mon profil</w:t>
@@ -22029,7 +22029,7 @@
           <w:noProof/>
         </w:rPr>
         <w:drawing>
-          <wp:inline distT="0" distB="0" distL="0" distR="0" wp14:anchorId="759D479B" wp14:editId="2DD0F5B4">
+          <wp:inline distT="0" distB="0" distL="0" distR="0" wp14:anchorId="0B030AC0" wp14:editId="0EC02592">
             <wp:extent cx="5810250" cy="5286375"/>
             <wp:effectExtent l="0" t="0" r="0" b="0"/>
             <wp:docPr id="61" name="adm-14-profil" descr="La page « Mon profil »" title="La page « Mon profil »"/>
@@ -22267,7 +22267,7 @@
         <w:pStyle w:val="Titre1"/>
         <w:pageBreakBefore/>
       </w:pPr>
-      <w:bookmarkStart w:id="71" w:name="_Toc242303119"/>
+      <w:bookmarkStart w:id="71" w:name="_Toc242303752"/>
       <w:r>
         <w:lastRenderedPageBreak/>
         <w:t>Annexe A. Qui peut faire quoi</w:t>
@@ -23424,7 +23424,7 @@
         <w:pStyle w:val="Titre1"/>
         <w:pageBreakBefore/>
       </w:pPr>
-      <w:bookmarkStart w:id="72" w:name="_Toc242303120"/>
+      <w:bookmarkStart w:id="72" w:name="_Toc242303753"/>
       <w:r>
         <w:lastRenderedPageBreak/>
         <w:t>Annexe B. Les statuts d'un dossier</w:t>
@@ -24313,7 +24313,7 @@
         <w:pStyle w:val="Titre1"/>
         <w:pageBreakBefore/>
       </w:pPr>
-      <w:bookmarkStart w:id="73" w:name="_Toc242303121"/>
+      <w:bookmarkStart w:id="73" w:name="_Toc242303754"/>
       <w:r>
         <w:lastRenderedPageBreak/>
         <w:t>Annexe C. Glossaire</w:t>
@@ -25462,7 +25462,7 @@
         <w:pStyle w:val="Titre1"/>
         <w:pageBreakBefore/>
       </w:pPr>
-      <w:bookmarkStart w:id="74" w:name="_Toc242303122"/>
+      <w:bookmarkStart w:id="74" w:name="_Toc242303755"/>
       <w:r>
         <w:lastRenderedPageBreak/>
         <w:t>Annexe D. En cas de difficulté</w:t>
@@ -26091,7 +26091,7 @@
         <w:pStyle w:val="Titre1"/>
         <w:pageBreakBefore/>
       </w:pPr>
-      <w:bookmarkStart w:id="75" w:name="_Toc242303123"/>
+      <w:bookmarkStart w:id="75" w:name="_Toc242303756"/>
       <w:r>
         <w:lastRenderedPageBreak/>
         <w:t>Annexe E. Points à confirmer avant diffusion</w:t>
@@ -26702,7 +26702,14 @@
                 <w:sz w:val="20"/>
                 <w:szCs w:val="20"/>
               </w:rPr>
-              <w:t>Conformes au manuel des procédures, sauf deux écarts à confirmer : l'approbation du rapport par le CGEA (10 jours dans la plateforme, 20 jours pour le CGE et le CGEA ensemble dans le manuel) et la réponse à une demande de complément (14 jours dans la plateforme, 7 jours évoqués dans le manuel).</w:t>
+              <w:t>Les délais de l'annexe concordent avec le manuel des procédures et la fiche de workflow PGPD_GU V3, sauf deux points. (a) Approbation du rapport par le CGEA : la plateforme applique 10 jours ouvrables, alors que le manuel et le workflow donnent 20 jours ouvrables pour les décideurs (CGE et CGEA). Valeur à porter à 20 dans « Administration &gt; Paramètres métier &gt; Délais » (sans modification du code) ; les 10 jours du workflow sont ceux des amendements du rapport. (b) Réponse du déclarant à une demande de compl</w:t>
+            </w:r>
+            <w:r>
+              <w:rPr>
+                <w:sz w:val="20"/>
+                <w:szCs w:val="20"/>
+              </w:rPr>
+              <w:t>ément : la plateforme applique 14 jours ouvrables ; ni le manuel ni le workflow ne fixent ce délai (le seul délai voisin est l'enquête complémentaire du DEI, 7 jours ouvrables). Valeur propre à la plateforme, à faire valider par l'ASCE-LC.</w:t>
             </w:r>
           </w:p>
         </w:tc>
@@ -26940,10 +26947,10 @@
 <file path=word/numbering.xml><?xml version="1.0" encoding="utf-8"?>
 <w:numbering xmlns:wpc="http://schemas.microsoft.com/office/word/2010/wordprocessingCanvas" xmlns:cx="http://schemas.microsoft.com/office/drawing/2014/chartex" xmlns:cx1="http://schemas.microsoft.com/office/drawing/2015/9/8/chartex" xmlns:cx2="http://schemas.microsoft.com/office/drawing/2015/10/21/chartex" xmlns:cx3="http://schemas.microsoft.com/office/drawing/2016/5/9/chartex" xmlns:cx4="http://schemas.microsoft.com/office/drawing/2016/5/10/chartex" xmlns:cx5="http://schemas.microsoft.com/office/drawing/2016/5/11/chartex" xmlns:cx6="http://schemas.microsoft.com/office/drawing/2016/5/12/chartex" xmlns:cx7="http://schemas.microsoft.com/office/drawing/2016/5/13/chartex" xmlns:cx8="http://schemas.microsoft.com/office/drawing/2016/5/14/chartex" xmlns:mc="http://schemas.openxmlformats.org/markup-compatibility/2006" xmlns:aink="http://schemas.microsoft.com/office/drawing/2016/ink" xmlns:am3d="http://schemas.microsoft.com/office/drawing/2017/model3d" xmlns:o="urn:schemas-microsoft-com:office:office" xmlns:oel="http://schemas.microsoft.com/office/2019/extlst" xmlns:r="http://schemas.openxmlformats.org/officeDocument/2006/relationships" xmlns:m="http://schemas.openxmlformats.org/officeDocument/2006/math" xmlns:v="urn:schemas-microsoft-com:vml" xmlns:wp14="http://schemas.microsoft.com/office/word/2010/wordprocessingDrawing" xmlns:wp="http://schemas.openxmlformats.org/drawingml/2006/wordprocessingDrawing" xmlns:w10="urn:schemas-microsoft-com:office:word" xmlns:w="http://schemas.openxmlformats.org/wordprocessingml/2006/main" xmlns:w14="http://schemas.microsoft.com/office/word/2010/wordml" xmlns:w15="http://schemas.microsoft.com/office/word/2012/wordml" xmlns:w16cex="http://schemas.microsoft.com/office/word/2018/wordml/cex" xmlns:w16cid="http://schemas.microsoft.com/office/word/2016/wordml/cid" xmlns:w16="http://schemas.microsoft.com/office/word/2018/wordml" xmlns:w16du="http://schemas.microsoft.com/office/word/2023/wordml/word16du" xmlns:w16sdtdh="http://schemas.microsoft.com/office/word/2020/wordml/sdtdatahash" xmlns:w16sdtfl="http://schemas.microsoft.com/office/word/2024/wordml/sdtformatlock" xmlns:w16se="http://schemas.microsoft.com/office/word/2015/wordml/symex" xmlns:wpg="http://schemas.microsoft.com/office/word/2010/wordprocessingGroup" xmlns:wpi="http://schemas.microsoft.com/office/word/2010/wordprocessingInk" xmlns:wne="http://schemas.microsoft.com/office/word/2006/wordml" xmlns:wps="http://schemas.microsoft.com/office/word/2010/wordprocessingShape" mc:Ignorable="w14 w15 w16se w16cid w16 w16cex w16sdtdh w16sdtfl w16du wp14">
   <w:abstractNum w:abstractNumId="0" w15:restartNumberingAfterBreak="0">
-    <w:nsid w:val="07C94E72"/>
+    <w:nsid w:val="138164FA"/>
     <w:multiLevelType w:val="hybridMultilevel"/>
-    <w:tmpl w:val="612E8436"/>
-    <w:lvl w:ilvl="0" w:tplc="A9B40322">
+    <w:tmpl w:val="16E84BEA"/>
+    <w:lvl w:ilvl="0" w:tplc="9DB8310E">
       <w:start w:val="1"/>
       <w:numFmt w:val="decimal"/>
       <w:lvlText w:val="%1."/>
@@ -26952,52 +26959,52 @@
         <w:ind w:left="540" w:hanging="360"/>
       </w:pPr>
     </w:lvl>
-    <w:lvl w:ilvl="1" w:tplc="9F146D08">
+    <w:lvl w:ilvl="1" w:tplc="4D529E86">
       <w:numFmt w:val="decimal"/>
       <w:lvlText w:val=""/>
       <w:lvlJc w:val="left"/>
     </w:lvl>
-    <w:lvl w:ilvl="2" w:tplc="6F1641B4">
+    <w:lvl w:ilvl="2" w:tplc="F2809C76">
       <w:numFmt w:val="decimal"/>
       <w:lvlText w:val=""/>
       <w:lvlJc w:val="left"/>
     </w:lvl>
-    <w:lvl w:ilvl="3" w:tplc="0BA07E4C">
+    <w:lvl w:ilvl="3" w:tplc="FD6A8082">
       <w:numFmt w:val="decimal"/>
       <w:lvlText w:val=""/>
       <w:lvlJc w:val="left"/>
     </w:lvl>
-    <w:lvl w:ilvl="4" w:tplc="9E4E885C">
+    <w:lvl w:ilvl="4" w:tplc="A1E0C04C">
       <w:numFmt w:val="decimal"/>
       <w:lvlText w:val=""/>
       <w:lvlJc w:val="left"/>
     </w:lvl>
-    <w:lvl w:ilvl="5" w:tplc="BB2AE14A">
+    <w:lvl w:ilvl="5" w:tplc="B114CCFC">
       <w:numFmt w:val="decimal"/>
       <w:lvlText w:val=""/>
       <w:lvlJc w:val="left"/>
     </w:lvl>
-    <w:lvl w:ilvl="6" w:tplc="95568E04">
+    <w:lvl w:ilvl="6" w:tplc="590EC9CA">
       <w:numFmt w:val="decimal"/>
       <w:lvlText w:val=""/>
       <w:lvlJc w:val="left"/>
     </w:lvl>
-    <w:lvl w:ilvl="7" w:tplc="BDF4F342">
+    <w:lvl w:ilvl="7" w:tplc="EA4CF352">
       <w:numFmt w:val="decimal"/>
       <w:lvlText w:val=""/>
       <w:lvlJc w:val="left"/>
     </w:lvl>
-    <w:lvl w:ilvl="8" w:tplc="B8B47986">
+    <w:lvl w:ilvl="8" w:tplc="147C3034">
       <w:numFmt w:val="decimal"/>
       <w:lvlText w:val=""/>
       <w:lvlJc w:val="left"/>
     </w:lvl>
   </w:abstractNum>
   <w:abstractNum w:abstractNumId="1" w15:restartNumberingAfterBreak="0">
-    <w:nsid w:val="0EAF09DC"/>
+    <w:nsid w:val="17CA65BF"/>
     <w:multiLevelType w:val="hybridMultilevel"/>
-    <w:tmpl w:val="E9342D7C"/>
-    <w:lvl w:ilvl="0" w:tplc="66E828F4">
+    <w:tmpl w:val="15C463B4"/>
+    <w:lvl w:ilvl="0" w:tplc="661CA04E">
       <w:start w:val="1"/>
       <w:numFmt w:val="decimal"/>
       <w:lvlText w:val="%1."/>
@@ -27006,52 +27013,52 @@
         <w:ind w:left="540" w:hanging="360"/>
       </w:pPr>
     </w:lvl>
-    <w:lvl w:ilvl="1" w:tplc="9B76ADC0">
+    <w:lvl w:ilvl="1" w:tplc="5DB2DF2A">
       <w:numFmt w:val="decimal"/>
       <w:lvlText w:val=""/>
       <w:lvlJc w:val="left"/>
     </w:lvl>
-    <w:lvl w:ilvl="2" w:tplc="292E4E82">
+    <w:lvl w:ilvl="2" w:tplc="0F965FA2">
       <w:numFmt w:val="decimal"/>
       <w:lvlText w:val=""/>
       <w:lvlJc w:val="left"/>
     </w:lvl>
-    <w:lvl w:ilvl="3" w:tplc="3CF6F8D2">
+    <w:lvl w:ilvl="3" w:tplc="5080B032">
       <w:numFmt w:val="decimal"/>
       <w:lvlText w:val=""/>
       <w:lvlJc w:val="left"/>
     </w:lvl>
-    <w:lvl w:ilvl="4" w:tplc="199A8642">
+    <w:lvl w:ilvl="4" w:tplc="FB5E025C">
       <w:numFmt w:val="decimal"/>
       <w:lvlText w:val=""/>
       <w:lvlJc w:val="left"/>
     </w:lvl>
-    <w:lvl w:ilvl="5" w:tplc="0D804650">
+    <w:lvl w:ilvl="5" w:tplc="BF687174">
       <w:numFmt w:val="decimal"/>
       <w:lvlText w:val=""/>
       <w:lvlJc w:val="left"/>
     </w:lvl>
-    <w:lvl w:ilvl="6" w:tplc="BE2291CA">
+    <w:lvl w:ilvl="6" w:tplc="DA3CBCEC">
       <w:numFmt w:val="decimal"/>
       <w:lvlText w:val=""/>
       <w:lvlJc w:val="left"/>
     </w:lvl>
-    <w:lvl w:ilvl="7" w:tplc="6B064DE2">
+    <w:lvl w:ilvl="7" w:tplc="34866FB2">
       <w:numFmt w:val="decimal"/>
       <w:lvlText w:val=""/>
       <w:lvlJc w:val="left"/>
     </w:lvl>
-    <w:lvl w:ilvl="8" w:tplc="4CB06A84">
+    <w:lvl w:ilvl="8" w:tplc="77FECA7A">
       <w:numFmt w:val="decimal"/>
       <w:lvlText w:val=""/>
       <w:lvlJc w:val="left"/>
     </w:lvl>
   </w:abstractNum>
   <w:abstractNum w:abstractNumId="2" w15:restartNumberingAfterBreak="0">
-    <w:nsid w:val="0F0867D5"/>
+    <w:nsid w:val="18262A53"/>
     <w:multiLevelType w:val="hybridMultilevel"/>
-    <w:tmpl w:val="260619F6"/>
-    <w:lvl w:ilvl="0" w:tplc="6E2AAACC">
+    <w:tmpl w:val="F062A04C"/>
+    <w:lvl w:ilvl="0" w:tplc="00088F56">
       <w:start w:val="1"/>
       <w:numFmt w:val="decimal"/>
       <w:lvlText w:val="%1."/>
@@ -27060,52 +27067,52 @@
         <w:ind w:left="540" w:hanging="360"/>
       </w:pPr>
     </w:lvl>
-    <w:lvl w:ilvl="1" w:tplc="F1E210A2">
+    <w:lvl w:ilvl="1" w:tplc="37D2F828">
       <w:numFmt w:val="decimal"/>
       <w:lvlText w:val=""/>
       <w:lvlJc w:val="left"/>
     </w:lvl>
-    <w:lvl w:ilvl="2" w:tplc="6B82D79C">
+    <w:lvl w:ilvl="2" w:tplc="97E6E38C">
       <w:numFmt w:val="decimal"/>
       <w:lvlText w:val=""/>
       <w:lvlJc w:val="left"/>
     </w:lvl>
-    <w:lvl w:ilvl="3" w:tplc="2FB6AFB4">
+    <w:lvl w:ilvl="3" w:tplc="2AB4B9C4">
       <w:numFmt w:val="decimal"/>
       <w:lvlText w:val=""/>
       <w:lvlJc w:val="left"/>
     </w:lvl>
-    <w:lvl w:ilvl="4" w:tplc="3C4ED3BC">
+    <w:lvl w:ilvl="4" w:tplc="43963D70">
       <w:numFmt w:val="decimal"/>
       <w:lvlText w:val=""/>
       <w:lvlJc w:val="left"/>
     </w:lvl>
-    <w:lvl w:ilvl="5" w:tplc="57A24AA6">
+    <w:lvl w:ilvl="5" w:tplc="5B983D3E">
       <w:numFmt w:val="decimal"/>
       <w:lvlText w:val=""/>
       <w:lvlJc w:val="left"/>
     </w:lvl>
-    <w:lvl w:ilvl="6" w:tplc="439C2284">
+    <w:lvl w:ilvl="6" w:tplc="E7F08D8A">
       <w:numFmt w:val="decimal"/>
       <w:lvlText w:val=""/>
       <w:lvlJc w:val="left"/>
     </w:lvl>
-    <w:lvl w:ilvl="7" w:tplc="7478B7D4">
+    <w:lvl w:ilvl="7" w:tplc="4850B3DE">
       <w:numFmt w:val="decimal"/>
       <w:lvlText w:val=""/>
       <w:lvlJc w:val="left"/>
     </w:lvl>
-    <w:lvl w:ilvl="8" w:tplc="C95ED87C">
+    <w:lvl w:ilvl="8" w:tplc="E00CA8B6">
       <w:numFmt w:val="decimal"/>
       <w:lvlText w:val=""/>
       <w:lvlJc w:val="left"/>
     </w:lvl>
   </w:abstractNum>
   <w:abstractNum w:abstractNumId="3" w15:restartNumberingAfterBreak="0">
-    <w:nsid w:val="1FF37692"/>
+    <w:nsid w:val="28AD29D1"/>
     <w:multiLevelType w:val="hybridMultilevel"/>
-    <w:tmpl w:val="0E94C654"/>
-    <w:lvl w:ilvl="0" w:tplc="F6246900">
+    <w:tmpl w:val="E3C6BE8A"/>
+    <w:lvl w:ilvl="0" w:tplc="31169EA2">
       <w:start w:val="1"/>
       <w:numFmt w:val="decimal"/>
       <w:lvlText w:val="%1."/>
@@ -27114,106 +27121,196 @@
         <w:ind w:left="540" w:hanging="360"/>
       </w:pPr>
     </w:lvl>
-    <w:lvl w:ilvl="1" w:tplc="9D624AD8">
+    <w:lvl w:ilvl="1" w:tplc="1E2E2ACA">
       <w:numFmt w:val="decimal"/>
       <w:lvlText w:val=""/>
       <w:lvlJc w:val="left"/>
     </w:lvl>
-    <w:lvl w:ilvl="2" w:tplc="BF20AEE6">
+    <w:lvl w:ilvl="2" w:tplc="EF32DB64">
       <w:numFmt w:val="decimal"/>
       <w:lvlText w:val=""/>
       <w:lvlJc w:val="left"/>
     </w:lvl>
-    <w:lvl w:ilvl="3" w:tplc="3A043D46">
+    <w:lvl w:ilvl="3" w:tplc="44C6F72A">
       <w:numFmt w:val="decimal"/>
       <w:lvlText w:val=""/>
       <w:lvlJc w:val="left"/>
     </w:lvl>
-    <w:lvl w:ilvl="4" w:tplc="0E32D880">
+    <w:lvl w:ilvl="4" w:tplc="88ACB8B0">
       <w:numFmt w:val="decimal"/>
       <w:lvlText w:val=""/>
       <w:lvlJc w:val="left"/>
     </w:lvl>
-    <w:lvl w:ilvl="5" w:tplc="34168CF0">
+    <w:lvl w:ilvl="5" w:tplc="D3A02306">
       <w:numFmt w:val="decimal"/>
       <w:lvlText w:val=""/>
       <w:lvlJc w:val="left"/>
     </w:lvl>
-    <w:lvl w:ilvl="6" w:tplc="462EC994">
+    <w:lvl w:ilvl="6" w:tplc="F32A1812">
       <w:numFmt w:val="decimal"/>
       <w:lvlText w:val=""/>
       <w:lvlJc w:val="left"/>
     </w:lvl>
-    <w:lvl w:ilvl="7" w:tplc="E56614AC">
+    <w:lvl w:ilvl="7" w:tplc="BFEC49A0">
       <w:numFmt w:val="decimal"/>
       <w:lvlText w:val=""/>
       <w:lvlJc w:val="left"/>
     </w:lvl>
-    <w:lvl w:ilvl="8" w:tplc="6F7C5032">
+    <w:lvl w:ilvl="8" w:tplc="F798219C">
       <w:numFmt w:val="decimal"/>
       <w:lvlText w:val=""/>
       <w:lvlJc w:val="left"/>
     </w:lvl>
   </w:abstractNum>
   <w:abstractNum w:abstractNumId="4" w15:restartNumberingAfterBreak="0">
-    <w:nsid w:val="365635FE"/>
+    <w:nsid w:val="30321F40"/>
     <w:multiLevelType w:val="hybridMultilevel"/>
-    <w:tmpl w:val="041A9450"/>
-    <w:lvl w:ilvl="0" w:tplc="3BCC6DD0">
+    <w:tmpl w:val="1814F6F8"/>
+    <w:lvl w:ilvl="0" w:tplc="27EAA102">
       <w:start w:val="1"/>
-      <w:numFmt w:val="decimal"/>
-      <w:lvlText w:val="%1."/>
+      <w:numFmt w:val="bullet"/>
+      <w:lvlText w:val="•"/>
       <w:lvlJc w:val="left"/>
       <w:pPr>
-        <w:ind w:left="540" w:hanging="360"/>
+        <w:ind w:left="540" w:hanging="270"/>
       </w:pPr>
     </w:lvl>
-    <w:lvl w:ilvl="1" w:tplc="32B6B912">
+    <w:lvl w:ilvl="1" w:tplc="573E54E4" w:tentative="1">
+      <w:start w:val="1"/>
+      <w:numFmt w:val="bullet"/>
+      <w:lvlText w:val="–"/>
+      <w:lvlJc w:val="left"/>
+      <w:pPr>
+        <w:ind w:left="1000" w:hanging="270"/>
+      </w:pPr>
+    </w:lvl>
+    <w:lvl w:ilvl="2" w:tplc="3490C390">
       <w:numFmt w:val="decimal"/>
       <w:lvlText w:val=""/>
       <w:lvlJc w:val="left"/>
     </w:lvl>
-    <w:lvl w:ilvl="2" w:tplc="628E59BA">
+    <w:lvl w:ilvl="3" w:tplc="2334C552">
       <w:numFmt w:val="decimal"/>
       <w:lvlText w:val=""/>
       <w:lvlJc w:val="left"/>
     </w:lvl>
-    <w:lvl w:ilvl="3" w:tplc="AD9AA126">
+    <w:lvl w:ilvl="4" w:tplc="956E4C86">
       <w:numFmt w:val="decimal"/>
       <w:lvlText w:val=""/>
       <w:lvlJc w:val="left"/>
     </w:lvl>
-    <w:lvl w:ilvl="4" w:tplc="98A0CAB8">
+    <w:lvl w:ilvl="5" w:tplc="0CC0A174">
       <w:numFmt w:val="decimal"/>
       <w:lvlText w:val=""/>
       <w:lvlJc w:val="left"/>
     </w:lvl>
-    <w:lvl w:ilvl="5" w:tplc="A27AB2A2">
+    <w:lvl w:ilvl="6" w:tplc="87EABFE8">
       <w:numFmt w:val="decimal"/>
       <w:lvlText w:val=""/>
       <w:lvlJc w:val="left"/>
     </w:lvl>
-    <w:lvl w:ilvl="6" w:tplc="688E7AF0">
+    <w:lvl w:ilvl="7" w:tplc="D8C815E6">
       <w:numFmt w:val="decimal"/>
       <w:lvlText w:val=""/>
       <w:lvlJc w:val="left"/>
     </w:lvl>
-    <w:lvl w:ilvl="7" w:tplc="CAA47162">
-      <w:numFmt w:val="decimal"/>
-      <w:lvlText w:val=""/>
-      <w:lvlJc w:val="left"/>
-    </w:lvl>
-    <w:lvl w:ilvl="8" w:tplc="57F60524">
+    <w:lvl w:ilvl="8" w:tplc="6CB48C50">
       <w:numFmt w:val="decimal"/>
       <w:lvlText w:val=""/>
       <w:lvlJc w:val="left"/>
     </w:lvl>
   </w:abstractNum>
   <w:abstractNum w:abstractNumId="5" w15:restartNumberingAfterBreak="0">
-    <w:nsid w:val="40B34AC2"/>
+    <w:nsid w:val="336970B8"/>
     <w:multiLevelType w:val="hybridMultilevel"/>
-    <w:tmpl w:val="8FC27A7A"/>
-    <w:lvl w:ilvl="0" w:tplc="FF8E8582">
+    <w:tmpl w:val="82C66A9C"/>
+    <w:lvl w:ilvl="0" w:tplc="747884D0" w:tentative="1">
+      <w:start w:val="1"/>
+      <w:numFmt w:val="bullet"/>
+      <w:lvlText w:val="●"/>
+      <w:lvlJc w:val="left"/>
+      <w:pPr>
+        <w:ind w:left="720" w:hanging="360"/>
+      </w:pPr>
+    </w:lvl>
+    <w:lvl w:ilvl="1" w:tplc="92B803C8" w:tentative="1">
+      <w:start w:val="1"/>
+      <w:numFmt w:val="bullet"/>
+      <w:lvlText w:val="○"/>
+      <w:lvlJc w:val="left"/>
+      <w:pPr>
+        <w:ind w:left="1440" w:hanging="360"/>
+      </w:pPr>
+    </w:lvl>
+    <w:lvl w:ilvl="2" w:tplc="87CCFDD2" w:tentative="1">
+      <w:start w:val="1"/>
+      <w:numFmt w:val="bullet"/>
+      <w:lvlText w:val="■"/>
+      <w:lvlJc w:val="left"/>
+      <w:pPr>
+        <w:ind w:left="2160" w:hanging="360"/>
+      </w:pPr>
+    </w:lvl>
+    <w:lvl w:ilvl="3" w:tplc="0F84AE30" w:tentative="1">
+      <w:start w:val="1"/>
+      <w:numFmt w:val="bullet"/>
+      <w:lvlText w:val="●"/>
+      <w:lvlJc w:val="left"/>
+      <w:pPr>
+        <w:ind w:left="2880" w:hanging="360"/>
+      </w:pPr>
+    </w:lvl>
+    <w:lvl w:ilvl="4" w:tplc="0D7C920C" w:tentative="1">
+      <w:start w:val="1"/>
+      <w:numFmt w:val="bullet"/>
+      <w:lvlText w:val="○"/>
+      <w:lvlJc w:val="left"/>
+      <w:pPr>
+        <w:ind w:left="3600" w:hanging="360"/>
+      </w:pPr>
+    </w:lvl>
+    <w:lvl w:ilvl="5" w:tplc="63C8672E" w:tentative="1">
+      <w:start w:val="1"/>
+      <w:numFmt w:val="bullet"/>
+      <w:lvlText w:val="■"/>
+      <w:lvlJc w:val="left"/>
+      <w:pPr>
+        <w:ind w:left="4320" w:hanging="360"/>
+      </w:pPr>
+    </w:lvl>
+    <w:lvl w:ilvl="6" w:tplc="D79E87A6" w:tentative="1">
+      <w:start w:val="1"/>
+      <w:numFmt w:val="bullet"/>
+      <w:lvlText w:val="●"/>
+      <w:lvlJc w:val="left"/>
+      <w:pPr>
+        <w:ind w:left="5040" w:hanging="360"/>
+      </w:pPr>
+    </w:lvl>
+    <w:lvl w:ilvl="7" w:tplc="5B60DE8A" w:tentative="1">
+      <w:start w:val="1"/>
+      <w:numFmt w:val="bullet"/>
+      <w:lvlText w:val="●"/>
+      <w:lvlJc w:val="left"/>
+      <w:pPr>
+        <w:ind w:left="5760" w:hanging="360"/>
+      </w:pPr>
+    </w:lvl>
+    <w:lvl w:ilvl="8" w:tplc="EA22C1EE" w:tentative="1">
+      <w:start w:val="1"/>
+      <w:numFmt w:val="bullet"/>
+      <w:lvlText w:val="●"/>
+      <w:lvlJc w:val="left"/>
+      <w:pPr>
+        <w:ind w:left="6480" w:hanging="360"/>
+      </w:pPr>
+    </w:lvl>
+  </w:abstractNum>
+  <w:abstractNum w:abstractNumId="6" w15:restartNumberingAfterBreak="0">
+    <w:nsid w:val="382C2A64"/>
+    <w:multiLevelType w:val="hybridMultilevel"/>
+    <w:tmpl w:val="E4D8B8DC"/>
+    <w:lvl w:ilvl="0" w:tplc="887CA626">
       <w:start w:val="1"/>
       <w:numFmt w:val="decimal"/>
       <w:lvlText w:val="%1."/>
@@ -27222,196 +27319,52 @@
         <w:ind w:left="540" w:hanging="360"/>
       </w:pPr>
     </w:lvl>
-    <w:lvl w:ilvl="1" w:tplc="3EF0EF22">
+    <w:lvl w:ilvl="1" w:tplc="B2F4AC1A">
       <w:numFmt w:val="decimal"/>
       <w:lvlText w:val=""/>
       <w:lvlJc w:val="left"/>
     </w:lvl>
-    <w:lvl w:ilvl="2" w:tplc="6DC6E62E">
+    <w:lvl w:ilvl="2" w:tplc="D0CE1EB6">
       <w:numFmt w:val="decimal"/>
       <w:lvlText w:val=""/>
       <w:lvlJc w:val="left"/>
     </w:lvl>
-    <w:lvl w:ilvl="3" w:tplc="2B92FAD6">
+    <w:lvl w:ilvl="3" w:tplc="8CB440AA">
       <w:numFmt w:val="decimal"/>
       <w:lvlText w:val=""/>
       <w:lvlJc w:val="left"/>
     </w:lvl>
-    <w:lvl w:ilvl="4" w:tplc="B01CCF9C">
+    <w:lvl w:ilvl="4" w:tplc="25E29096">
       <w:numFmt w:val="decimal"/>
       <w:lvlText w:val=""/>
       <w:lvlJc w:val="left"/>
     </w:lvl>
-    <w:lvl w:ilvl="5" w:tplc="50CAB19E">
+    <w:lvl w:ilvl="5" w:tplc="54EAF682">
       <w:numFmt w:val="decimal"/>
       <w:lvlText w:val=""/>
       <w:lvlJc w:val="left"/>
     </w:lvl>
-    <w:lvl w:ilvl="6" w:tplc="8EC6D0F0">
+    <w:lvl w:ilvl="6" w:tplc="9334BDB2">
       <w:numFmt w:val="decimal"/>
       <w:lvlText w:val=""/>
       <w:lvlJc w:val="left"/>
     </w:lvl>
-    <w:lvl w:ilvl="7" w:tplc="0284C99C">
+    <w:lvl w:ilvl="7" w:tplc="F5F418B6">
       <w:numFmt w:val="decimal"/>
       <w:lvlText w:val=""/>
       <w:lvlJc w:val="left"/>
     </w:lvl>
-    <w:lvl w:ilvl="8" w:tplc="D90424F2">
-      <w:numFmt w:val="decimal"/>
-      <w:lvlText w:val=""/>
-      <w:lvlJc w:val="left"/>
-    </w:lvl>
-  </w:abstractNum>
-  <w:abstractNum w:abstractNumId="6" w15:restartNumberingAfterBreak="0">
-    <w:nsid w:val="4DD8134E"/>
-    <w:multiLevelType w:val="hybridMultilevel"/>
-    <w:tmpl w:val="AE3834B4"/>
-    <w:lvl w:ilvl="0" w:tplc="622A4344">
-      <w:start w:val="1"/>
-      <w:numFmt w:val="bullet"/>
-      <w:lvlText w:val="•"/>
-      <w:lvlJc w:val="left"/>
-      <w:pPr>
-        <w:ind w:left="540" w:hanging="270"/>
-      </w:pPr>
-    </w:lvl>
-    <w:lvl w:ilvl="1" w:tplc="DFBA92B2" w:tentative="1">
-      <w:start w:val="1"/>
-      <w:numFmt w:val="bullet"/>
-      <w:lvlText w:val="–"/>
-      <w:lvlJc w:val="left"/>
-      <w:pPr>
-        <w:ind w:left="1000" w:hanging="270"/>
-      </w:pPr>
-    </w:lvl>
-    <w:lvl w:ilvl="2" w:tplc="2DAED886">
-      <w:numFmt w:val="decimal"/>
-      <w:lvlText w:val=""/>
-      <w:lvlJc w:val="left"/>
-    </w:lvl>
-    <w:lvl w:ilvl="3" w:tplc="1708F6B8">
-      <w:numFmt w:val="decimal"/>
-      <w:lvlText w:val=""/>
-      <w:lvlJc w:val="left"/>
-    </w:lvl>
-    <w:lvl w:ilvl="4" w:tplc="7A7AFA78">
-      <w:numFmt w:val="decimal"/>
-      <w:lvlText w:val=""/>
-      <w:lvlJc w:val="left"/>
-    </w:lvl>
-    <w:lvl w:ilvl="5" w:tplc="5FC0DD9A">
-      <w:numFmt w:val="decimal"/>
-      <w:lvlText w:val=""/>
-      <w:lvlJc w:val="left"/>
-    </w:lvl>
-    <w:lvl w:ilvl="6" w:tplc="15C8E6D2">
-      <w:numFmt w:val="decimal"/>
-      <w:lvlText w:val=""/>
-      <w:lvlJc w:val="left"/>
-    </w:lvl>
-    <w:lvl w:ilvl="7" w:tplc="A8DC8564">
-      <w:numFmt w:val="decimal"/>
-      <w:lvlText w:val=""/>
-      <w:lvlJc w:val="left"/>
-    </w:lvl>
-    <w:lvl w:ilvl="8" w:tplc="BBBCC162">
+    <w:lvl w:ilvl="8" w:tplc="6900A4C4">
       <w:numFmt w:val="decimal"/>
       <w:lvlText w:val=""/>
       <w:lvlJc w:val="left"/>
     </w:lvl>
   </w:abstractNum>
   <w:abstractNum w:abstractNumId="7" w15:restartNumberingAfterBreak="0">
-    <w:nsid w:val="580620A8"/>
+    <w:nsid w:val="3B5322BA"/>
     <w:multiLevelType w:val="hybridMultilevel"/>
-    <w:tmpl w:val="1DBE8A5A"/>
-    <w:lvl w:ilvl="0" w:tplc="1F264E8A" w:tentative="1">
-      <w:start w:val="1"/>
-      <w:numFmt w:val="bullet"/>
-      <w:lvlText w:val="●"/>
-      <w:lvlJc w:val="left"/>
-      <w:pPr>
-        <w:ind w:left="720" w:hanging="360"/>
-      </w:pPr>
-    </w:lvl>
-    <w:lvl w:ilvl="1" w:tplc="9B2EE020" w:tentative="1">
-      <w:start w:val="1"/>
-      <w:numFmt w:val="bullet"/>
-      <w:lvlText w:val="○"/>
-      <w:lvlJc w:val="left"/>
-      <w:pPr>
-        <w:ind w:left="1440" w:hanging="360"/>
-      </w:pPr>
-    </w:lvl>
-    <w:lvl w:ilvl="2" w:tplc="DA940C7A" w:tentative="1">
-      <w:start w:val="1"/>
-      <w:numFmt w:val="bullet"/>
-      <w:lvlText w:val="■"/>
-      <w:lvlJc w:val="left"/>
-      <w:pPr>
-        <w:ind w:left="2160" w:hanging="360"/>
-      </w:pPr>
-    </w:lvl>
-    <w:lvl w:ilvl="3" w:tplc="15C0E714" w:tentative="1">
-      <w:start w:val="1"/>
-      <w:numFmt w:val="bullet"/>
-      <w:lvlText w:val="●"/>
-      <w:lvlJc w:val="left"/>
-      <w:pPr>
-        <w:ind w:left="2880" w:hanging="360"/>
-      </w:pPr>
-    </w:lvl>
-    <w:lvl w:ilvl="4" w:tplc="6BE6E196" w:tentative="1">
-      <w:start w:val="1"/>
-      <w:numFmt w:val="bullet"/>
-      <w:lvlText w:val="○"/>
-      <w:lvlJc w:val="left"/>
-      <w:pPr>
-        <w:ind w:left="3600" w:hanging="360"/>
-      </w:pPr>
-    </w:lvl>
-    <w:lvl w:ilvl="5" w:tplc="F620E5B2" w:tentative="1">
-      <w:start w:val="1"/>
-      <w:numFmt w:val="bullet"/>
-      <w:lvlText w:val="■"/>
-      <w:lvlJc w:val="left"/>
-      <w:pPr>
-        <w:ind w:left="4320" w:hanging="360"/>
-      </w:pPr>
-    </w:lvl>
-    <w:lvl w:ilvl="6" w:tplc="722A416C" w:tentative="1">
-      <w:start w:val="1"/>
-      <w:numFmt w:val="bullet"/>
-      <w:lvlText w:val="●"/>
-      <w:lvlJc w:val="left"/>
-      <w:pPr>
-        <w:ind w:left="5040" w:hanging="360"/>
-      </w:pPr>
-    </w:lvl>
-    <w:lvl w:ilvl="7" w:tplc="4D307C82" w:tentative="1">
-      <w:start w:val="1"/>
-      <w:numFmt w:val="bullet"/>
-      <w:lvlText w:val="●"/>
-      <w:lvlJc w:val="left"/>
-      <w:pPr>
-        <w:ind w:left="5760" w:hanging="360"/>
-      </w:pPr>
-    </w:lvl>
-    <w:lvl w:ilvl="8" w:tplc="FE56EC46" w:tentative="1">
-      <w:start w:val="1"/>
-      <w:numFmt w:val="bullet"/>
-      <w:lvlText w:val="●"/>
-      <w:lvlJc w:val="left"/>
-      <w:pPr>
-        <w:ind w:left="6480" w:hanging="360"/>
-      </w:pPr>
-    </w:lvl>
-  </w:abstractNum>
-  <w:abstractNum w:abstractNumId="8" w15:restartNumberingAfterBreak="0">
-    <w:nsid w:val="5F406D31"/>
-    <w:multiLevelType w:val="hybridMultilevel"/>
-    <w:tmpl w:val="8E1C43F2"/>
-    <w:lvl w:ilvl="0" w:tplc="1CAA010E">
+    <w:tmpl w:val="D00273E6"/>
+    <w:lvl w:ilvl="0" w:tplc="A7B411F0">
       <w:start w:val="1"/>
       <w:numFmt w:val="decimal"/>
       <w:lvlText w:val="%1."/>
@@ -27420,97 +27373,151 @@
         <w:ind w:left="540" w:hanging="360"/>
       </w:pPr>
     </w:lvl>
-    <w:lvl w:ilvl="1" w:tplc="D954E566">
+    <w:lvl w:ilvl="1" w:tplc="60FAB8EC">
       <w:numFmt w:val="decimal"/>
       <w:lvlText w:val=""/>
       <w:lvlJc w:val="left"/>
     </w:lvl>
-    <w:lvl w:ilvl="2" w:tplc="2FAAED64">
+    <w:lvl w:ilvl="2" w:tplc="CF428C08">
       <w:numFmt w:val="decimal"/>
       <w:lvlText w:val=""/>
       <w:lvlJc w:val="left"/>
     </w:lvl>
-    <w:lvl w:ilvl="3" w:tplc="B9A69D18">
+    <w:lvl w:ilvl="3" w:tplc="95F66BD0">
       <w:numFmt w:val="decimal"/>
       <w:lvlText w:val=""/>
       <w:lvlJc w:val="left"/>
     </w:lvl>
-    <w:lvl w:ilvl="4" w:tplc="3C304E3C">
+    <w:lvl w:ilvl="4" w:tplc="9EF82934">
       <w:numFmt w:val="decimal"/>
       <w:lvlText w:val=""/>
       <w:lvlJc w:val="left"/>
     </w:lvl>
-    <w:lvl w:ilvl="5" w:tplc="C562DA54">
+    <w:lvl w:ilvl="5" w:tplc="FACAA25A">
       <w:numFmt w:val="decimal"/>
       <w:lvlText w:val=""/>
       <w:lvlJc w:val="left"/>
     </w:lvl>
-    <w:lvl w:ilvl="6" w:tplc="4CBE6EA6">
+    <w:lvl w:ilvl="6" w:tplc="EB16415C">
       <w:numFmt w:val="decimal"/>
       <w:lvlText w:val=""/>
       <w:lvlJc w:val="left"/>
     </w:lvl>
-    <w:lvl w:ilvl="7" w:tplc="580E855A">
+    <w:lvl w:ilvl="7" w:tplc="F57E7A76">
       <w:numFmt w:val="decimal"/>
       <w:lvlText w:val=""/>
       <w:lvlJc w:val="left"/>
     </w:lvl>
-    <w:lvl w:ilvl="8" w:tplc="5290D554">
+    <w:lvl w:ilvl="8" w:tplc="9962D064">
       <w:numFmt w:val="decimal"/>
       <w:lvlText w:val=""/>
       <w:lvlJc w:val="left"/>
     </w:lvl>
   </w:abstractNum>
-  <w:num w:numId="1" w16cid:durableId="538859621">
+  <w:abstractNum w:abstractNumId="8" w15:restartNumberingAfterBreak="0">
+    <w:nsid w:val="63853E24"/>
+    <w:multiLevelType w:val="hybridMultilevel"/>
+    <w:tmpl w:val="32343DBC"/>
+    <w:lvl w:ilvl="0" w:tplc="B434BDC2">
+      <w:start w:val="1"/>
+      <w:numFmt w:val="decimal"/>
+      <w:lvlText w:val="%1."/>
+      <w:lvlJc w:val="left"/>
+      <w:pPr>
+        <w:ind w:left="540" w:hanging="360"/>
+      </w:pPr>
+    </w:lvl>
+    <w:lvl w:ilvl="1" w:tplc="3DB6F330">
+      <w:numFmt w:val="decimal"/>
+      <w:lvlText w:val=""/>
+      <w:lvlJc w:val="left"/>
+    </w:lvl>
+    <w:lvl w:ilvl="2" w:tplc="FDE6E4DA">
+      <w:numFmt w:val="decimal"/>
+      <w:lvlText w:val=""/>
+      <w:lvlJc w:val="left"/>
+    </w:lvl>
+    <w:lvl w:ilvl="3" w:tplc="FDAEB862">
+      <w:numFmt w:val="decimal"/>
+      <w:lvlText w:val=""/>
+      <w:lvlJc w:val="left"/>
+    </w:lvl>
+    <w:lvl w:ilvl="4" w:tplc="0A76A058">
+      <w:numFmt w:val="decimal"/>
+      <w:lvlText w:val=""/>
+      <w:lvlJc w:val="left"/>
+    </w:lvl>
+    <w:lvl w:ilvl="5" w:tplc="CA3036AE">
+      <w:numFmt w:val="decimal"/>
+      <w:lvlText w:val=""/>
+      <w:lvlJc w:val="left"/>
+    </w:lvl>
+    <w:lvl w:ilvl="6" w:tplc="1D5CA4B6">
+      <w:numFmt w:val="decimal"/>
+      <w:lvlText w:val=""/>
+      <w:lvlJc w:val="left"/>
+    </w:lvl>
+    <w:lvl w:ilvl="7" w:tplc="4D10CCC2">
+      <w:numFmt w:val="decimal"/>
+      <w:lvlText w:val=""/>
+      <w:lvlJc w:val="left"/>
+    </w:lvl>
+    <w:lvl w:ilvl="8" w:tplc="C8B0B694">
+      <w:numFmt w:val="decimal"/>
+      <w:lvlText w:val=""/>
+      <w:lvlJc w:val="left"/>
+    </w:lvl>
+  </w:abstractNum>
+  <w:num w:numId="1" w16cid:durableId="864321457">
+    <w:abstractNumId w:val="5"/>
+    <w:lvlOverride w:ilvl="0">
+      <w:startOverride w:val="1"/>
+    </w:lvlOverride>
+  </w:num>
+  <w:num w:numId="2" w16cid:durableId="2066949188">
+    <w:abstractNumId w:val="4"/>
+    <w:lvlOverride w:ilvl="0">
+      <w:startOverride w:val="1"/>
+    </w:lvlOverride>
+  </w:num>
+  <w:num w:numId="3" w16cid:durableId="488711431">
+    <w:abstractNumId w:val="3"/>
+    <w:lvlOverride w:ilvl="0">
+      <w:startOverride w:val="1"/>
+    </w:lvlOverride>
+  </w:num>
+  <w:num w:numId="4" w16cid:durableId="873079483">
+    <w:abstractNumId w:val="0"/>
+    <w:lvlOverride w:ilvl="0">
+      <w:startOverride w:val="1"/>
+    </w:lvlOverride>
+  </w:num>
+  <w:num w:numId="5" w16cid:durableId="1303189772">
     <w:abstractNumId w:val="7"/>
     <w:lvlOverride w:ilvl="0">
       <w:startOverride w:val="1"/>
     </w:lvlOverride>
   </w:num>
-  <w:num w:numId="2" w16cid:durableId="1024205637">
+  <w:num w:numId="6" w16cid:durableId="330106884">
     <w:abstractNumId w:val="6"/>
     <w:lvlOverride w:ilvl="0">
       <w:startOverride w:val="1"/>
     </w:lvlOverride>
   </w:num>
-  <w:num w:numId="3" w16cid:durableId="1436100368">
-    <w:abstractNumId w:val="4"/>
+  <w:num w:numId="7" w16cid:durableId="1117220034">
+    <w:abstractNumId w:val="1"/>
     <w:lvlOverride w:ilvl="0">
       <w:startOverride w:val="1"/>
     </w:lvlOverride>
   </w:num>
-  <w:num w:numId="4" w16cid:durableId="1933271641">
+  <w:num w:numId="8" w16cid:durableId="303512889">
     <w:abstractNumId w:val="8"/>
     <w:lvlOverride w:ilvl="0">
       <w:startOverride w:val="1"/>
     </w:lvlOverride>
   </w:num>
-  <w:num w:numId="5" w16cid:durableId="648629922">
-    <w:abstractNumId w:val="5"/>
-    <w:lvlOverride w:ilvl="0">
-      <w:startOverride w:val="1"/>
-    </w:lvlOverride>
-  </w:num>
-  <w:num w:numId="6" w16cid:durableId="369039953">
+  <w:num w:numId="9" w16cid:durableId="1723169887">
     <w:abstractNumId w:val="2"/>
-    <w:lvlOverride w:ilvl="0">
-      <w:startOverride w:val="1"/>
-    </w:lvlOverride>
-  </w:num>
-  <w:num w:numId="7" w16cid:durableId="1158763776">
-    <w:abstractNumId w:val="0"/>
-    <w:lvlOverride w:ilvl="0">
-      <w:startOverride w:val="1"/>
-    </w:lvlOverride>
-  </w:num>
-  <w:num w:numId="8" w16cid:durableId="1046098987">
-    <w:abstractNumId w:val="1"/>
-    <w:lvlOverride w:ilvl="0">
-      <w:startOverride w:val="1"/>
-    </w:lvlOverride>
-  </w:num>
-  <w:num w:numId="9" w16cid:durableId="457845572">
-    <w:abstractNumId w:val="3"/>
     <w:lvlOverride w:ilvl="0">
       <w:startOverride w:val="1"/>
     </w:lvlOverride>
@@ -28149,7 +28156,7 @@
     <w:autoRedefine/>
     <w:uiPriority w:val="39"/>
     <w:unhideWhenUsed/>
-    <w:rsid w:val="00D01FD9"/>
+    <w:rsid w:val="00B84997"/>
     <w:pPr>
       <w:spacing w:after="100"/>
     </w:pPr>
@@ -28161,7 +28168,7 @@
     <w:autoRedefine/>
     <w:uiPriority w:val="39"/>
     <w:unhideWhenUsed/>
-    <w:rsid w:val="00D01FD9"/>
+    <w:rsid w:val="00B84997"/>
     <w:pPr>
       <w:spacing w:after="100"/>
       <w:ind w:left="220"/>

</xml_diff>